<commit_message>
The End of the Lost: apply reviewer corrections (Rev 20:10 grammar, 2 Thess 1:9, Matt 25:46, labels, editorial fixes)
Co-Authored-By: Claude Sonnet 5.5 <noreply@anthropic.com>
Claude-Session: https://claude.ai/code/session_019KSmWUdVBWY1ogjaJqRPqC
</commit_message>
<xml_diff>
--- a/build-tools/commentary/endoflost/out/volume.docx
+++ b/build-tools/commentary/endoflost/out/volume.docx
@@ -100,7 +100,7 @@
         </w:rPr>
         <w:t>2. How the Case Is Argued</w:t>
         <w:tab/>
-        <w:t>3</w:t>
+        <w:t>4</w:t>
       </w:r>
     </w:p>
     <w:p>
@@ -212,7 +212,7 @@
         </w:rPr>
         <w:t>9. Objections and Replies</w:t>
         <w:tab/>
-        <w:t>37</w:t>
+        <w:t>38</w:t>
       </w:r>
     </w:p>
     <w:p>
@@ -228,7 +228,7 @@
         </w:rPr>
         <w:t>Conclusion</w:t>
         <w:tab/>
-        <w:t>42</w:t>
+        <w:t>43</w:t>
       </w:r>
     </w:p>
     <w:p>
@@ -244,7 +244,7 @@
         </w:rPr>
         <w:t>Appendix A. The Passages at a Glance</w:t>
         <w:tab/>
-        <w:t>44</w:t>
+        <w:t>45</w:t>
       </w:r>
     </w:p>
     <w:p>
@@ -260,7 +260,7 @@
         </w:rPr>
         <w:t>Appendix B. The Key Passages in Full</w:t>
         <w:tab/>
-        <w:t>45</w:t>
+        <w:t>46</w:t>
       </w:r>
     </w:p>
     <w:p>
@@ -276,7 +276,7 @@
         </w:rPr>
         <w:t>Appendix C. Where the Passages Are Read</w:t>
         <w:tab/>
-        <w:t>50</w:t>
+        <w:t>51</w:t>
       </w:r>
     </w:p>
     <w:p>
@@ -292,7 +292,7 @@
         </w:rPr>
         <w:t>Bibliography</w:t>
         <w:tab/>
-        <w:t>57</w:t>
+        <w:t>58</w:t>
       </w:r>
     </w:p>
     <w:p>
@@ -352,7 +352,7 @@
           <w:rFonts w:ascii="Roboto" w:hAnsi="Roboto" w:eastAsia="Roboto" w:cs="Roboto"/>
           <w:sz w:val="20"/>
         </w:rPr>
-        <w:t>Three things about the method. First, the volume reads the King James Version only, and every Scripture quotation is checked word for word against it. Second, each chapter opens with a claim, reads its passages in order, and closes with a short table and a list of what the volume takes from the passages, so that the reader can see what has been argued and test it. Third, where a modern writer is named, the volume says what that writer holds, in its own words, and gives the writer’s words only where it has read them in a free full text.</w:t>
+        <w:t>Three things about the method. First, the King James Version is the volume’s base English text, and every Scripture quotation is checked word for word against it. Where lexical or grammatical questions affect the argument, the relevant Hebrew or Greek wording is examined without replacing the passage’s context with a word-study argument. Second, each chapter opens with a claim, reads its passages in order, and closes with a short table and a list of what the volume takes from the passages, so that the reader can see what has been argued and test it. Third, where a modern writer is named, the volume says what that writer holds, in its own words, and gives the writer’s words only where it has read them in a free full text.</w:t>
       </w:r>
     </w:p>
     <w:p>
@@ -364,7 +364,7 @@
           <w:rFonts w:ascii="Roboto" w:hAnsi="Roboto" w:eastAsia="Roboto" w:cs="Roboto"/>
           <w:sz w:val="20"/>
         </w:rPr>
-        <w:t>The volume does not take up what its neighbours argue. Who is judged, where and when belongs to Volume 5 of the Prophecy &amp; Mystery Commentary Series, Separate Courts, and to Studies 31, 49 and 68. The words for the unseen world and the lake of fire, reported as written, belong to Study 79, which takes no position and is not changed by this volume. The account in Luke 16 belongs to Parable Study 24, and the Lamb and the foundation of the world to Study 80. This volume cites those places and does not repeat them.</w:t>
+        <w:t>The volume does not take up everything its neighbours argue. Questions concerning the distinct courts of Scripture are treated fully in Volume 5 of the Prophecy &amp; Mystery Commentary Series, Separate Courts, and in Studies 31, 49 and 68. This volume does not reproduce that complete architecture, but chapter 8 examines the great white throne to the extent necessary to identify the company under judgment and interpret the lake of fire and the second death. The words for the unseen world and the lake of fire, reported as written, belong to Study 79, which takes no position and is not changed by this volume. The account in Luke 16 belongs to Parable Study 24, and the Lamb and the foundation of the world to Study 80. On those matters this volume cites the places and does not repeat them.</w:t>
       </w:r>
     </w:p>
     <w:p>
@@ -663,7 +663,7 @@
                 <w:rFonts w:ascii="Roboto" w:hAnsi="Roboto" w:eastAsia="Roboto" w:cs="Roboto"/>
                 <w:sz w:val="20"/>
               </w:rPr>
-              <w:t>Everlasting destruction from the presence of the Lord is read from its context as an enduring judicial exclusion, not from the preposition alone.</w:t>
+              <w:t>Everlasting destruction from the presence of the Lord is read from its context as an irreversible judicial penalty; the preposition may name exclusion or source, and the verse does not by itself state continuing experience.</w:t>
             </w:r>
           </w:p>
         </w:tc>
@@ -775,7 +775,7 @@
                 <w:rFonts w:ascii="Roboto" w:hAnsi="Roboto" w:eastAsia="Roboto" w:cs="Roboto"/>
                 <w:sz w:val="20"/>
               </w:rPr>
-              <w:t>In Revelation the torment has no rest day nor night, the beast and the false prophet are still in the lake after the thousand years, and the second death is described by what the lake contains and does.</w:t>
+              <w:t>In Revelation the worshippers of the beast are tormented and have no rest day nor night, the plural statement of torment at 20:10 takes in the beast and the false prophet cast in a thousand years before, and the second death is described by what the lake contains and does.</w:t>
             </w:r>
           </w:p>
         </w:tc>
@@ -1503,7 +1503,7 @@
           <w:rFonts w:ascii="Roboto" w:hAnsi="Roboto" w:eastAsia="Roboto" w:cs="Roboto"/>
           <w:sz w:val="20"/>
         </w:rPr>
-        <w:t>Each conclusion in the chapters that follow is marked as one of three kinds. A conclusion is Stated where the verse says it in so many words. It is Shown by the context where the verse does not say it but the verses around it do, or the passage it quotes does. It is Inferred where the volume draws it by reasoning from what is stated and shown. A reader who accepts the first and the second and doubts the third knows exactly what he doubts. The volume holds that the case needs all three, and that it is weakest where it is inferred. It says so at those points.</w:t>
+        <w:t>Each conclusion in the chapters that follow is marked as one of three kinds. A conclusion is Stated where the verse says it in so many words. It is shown by the context where the verse does not say it but the verses around it do, or the passage it quotes does. It is Inferred where the volume draws it by reasoning from what is stated and shown. A reader who accepts the first and the second and doubts the third knows exactly what he doubts. The volume holds that the case needs all three, and that it is weakest where it is inferred. It says so at those points.</w:t>
       </w:r>
     </w:p>
     <w:p>
@@ -1837,7 +1837,7 @@
                 <w:rFonts w:ascii="Roboto" w:hAnsi="Roboto" w:eastAsia="Roboto" w:cs="Roboto"/>
                 <w:sz w:val="20"/>
               </w:rPr>
-              <w:t>10</w:t>
+              <w:t>Conclusion</w:t>
             </w:r>
           </w:p>
         </w:tc>
@@ -1974,7 +1974,7 @@
           <w:rFonts w:ascii="Roboto" w:hAnsi="Roboto" w:eastAsia="Roboto" w:cs="Roboto"/>
           <w:sz w:val="20"/>
         </w:rPr>
-        <w:t>Each conclusion is marked Stated, Shown by the context, or Inferred.</w:t>
+        <w:t>Each conclusion is marked Stated, shown by the context, or Inferred.</w:t>
       </w:r>
     </w:p>
     <w:p>
@@ -2985,7 +2985,7 @@
           <w:rFonts w:ascii="Roboto" w:hAnsi="Roboto" w:eastAsia="Roboto" w:cs="Roboto"/>
           <w:sz w:val="20"/>
         </w:rPr>
-        <w:t>Three statements follow, and the volume marks them. It is Stated that destroy, perish, lost and death are used in Scripture of things that cease and of things that remain. It is Shown by the context that the second use is not rare: it occurs in the Gospels, the law, the prophets and the letters, of persons, nations and things. It is Inferred that a destruction verse set beside a judgment after death cannot be read from the word alone, and that the passage and its neighbours have to decide.</w:t>
+        <w:t>Three statements follow, and the volume marks them. It is Stated that destroy, perish, lost and death are used in Scripture of things that cease and of things that remain. It is shown by the context that the second use is not rare: it occurs in the Gospels, the law, the prophets and the letters, of persons, nations and things. It is Inferred that a destruction verse set beside a judgment after death cannot be read from the word alone, and that the passage and its neighbours have to decide.</w:t>
       </w:r>
     </w:p>
     <w:p>
@@ -3875,7 +3875,7 @@
           <w:rFonts w:ascii="Roboto" w:hAnsi="Roboto" w:eastAsia="Roboto" w:cs="Roboto"/>
           <w:sz w:val="20"/>
         </w:rPr>
-        <w:t>The two accounts give the same two parties and the same two fears, in different words. Where Matthew says that God is able to destroy soul and body in hell, Luke says that He, after He hath killed, hath power to cast into hell. The volume reads the second as shedding light on the first. In Luke the power is stated in two steps, a killing and then a casting, and the casting is into hell. In Matthew the destroying is “in hell”. The place is the same and the power is the same. The volume holds that this is Shown by the context and not Stated: the Lord does not say in either place that the two sayings are one, and a reader who takes the Matthew verse alone is not wrong to ask what the destroying is. The parallel is the nearest answer the text gives, and it describes a casting, not a ceasing.</w:t>
+        <w:t>The two accounts give the same two parties and the same two fears, in different words. Where Matthew says that God is able to destroy soul and body in hell, Luke says that He, after He hath killed, hath power to cast into hell. The volume reads the second as shedding light on the first. In Luke the power is stated in two steps, a killing and then a casting, and the casting is into hell. In Matthew the destroying is “in hell”. The place is the same and the power is the same. The volume holds that this is shown by the context and not Stated: the Lord does not say in either place that the two sayings are one, and a reader who takes the Matthew verse alone is not wrong to ask what the destroying is. The parallel is the nearest answer the text gives, and it describes a casting, not a ceasing.</w:t>
       </w:r>
     </w:p>
     <w:p>
@@ -4553,7 +4553,7 @@
           <w:rFonts w:ascii="Roboto" w:hAnsi="Roboto" w:eastAsia="Roboto" w:cs="Roboto"/>
           <w:sz w:val="20"/>
         </w:rPr>
-        <w:t>Luke 12:5 describes the same power as a casting into hell after the killing, and the volume holds this Shown by the context.</w:t>
+        <w:t>Luke 12:5 describes the same power as a casting into hell after the killing, and the volume holds this shown by the context.</w:t>
       </w:r>
     </w:p>
     <w:p>
@@ -4648,7 +4648,7 @@
           <w:rFonts w:ascii="Roboto" w:hAnsi="Roboto" w:eastAsia="Roboto" w:cs="Roboto"/>
           <w:sz w:val="20"/>
         </w:rPr>
-        <w:t>Claim: Paul’s words on “everlasting destruction from the presence of the Lord” are read in the sentence that carries them, and that sentence is judicial. It speaks of a penalty paid, set against a rest given to the saints, and it names an exclusion from the Lord’s presence that does not end. The preposition alone does not carry the doctrine, and this chapter does not ask it to.</w:t>
+        <w:t>Claim: Paul describes an everlasting judicial destruction associated with the presence and glorious power of the Lord. The immediate context permits an exclusion reading, but the preposition may also identify the Lord’s presence as the source of the judgment. The verse establishes an irreversible penalty; it does not by itself establish continuing conscious experience. The sentence is judicial and sets the penalty against a rest given to the saints.</w:t>
       </w:r>
     </w:p>
     <w:p>
@@ -5194,7 +5194,7 @@
           <w:rFonts w:ascii="Roboto" w:hAnsi="Roboto" w:eastAsia="Roboto" w:cs="Roboto"/>
           <w:sz w:val="20"/>
         </w:rPr>
-        <w:t>The second is the contrast with the saints. The same sentence says that the saints will have “rest” when the Lord is revealed (verse 7), and that the Lord is “glorified in his saints” and “admired in all them that believe” at His coming (verse 10). The persons who are punished are described by what they are away from: “from the presence of the Lord, and from the glory of his power” (verse 9). The presence and the glory are the place where the saints are given rest and the Lord is admired. The sentence sets the two fates side by side, and the second is the loss of what the first receives. That is Shown by the context.</w:t>
+        <w:t>The second is the contrast with the saints. The same sentence says that the saints will have “rest” when the Lord is revealed (verse 7), and that the Lord is “glorified in his saints” and “admired in all them that believe” at His coming (verse 10). The persons who are punished are described by what they are away from: “from the presence of the Lord, and from the glory of his power” (verse 9). The presence and the glory are the place where the saints are given rest and the Lord is admired. The sentence sets the two fates side by side, and the second is, on the exclusion reading, the loss of what the first receives. That is shown by the context, with the caution of section 5.5 that the preposition may also name the source of the judgment.</w:t>
       </w:r>
     </w:p>
     <w:p>
@@ -5244,7 +5244,7 @@
           <w:rFonts w:ascii="Roboto" w:hAnsi="Roboto" w:eastAsia="Roboto" w:cs="Roboto"/>
           <w:sz w:val="20"/>
         </w:rPr>
-        <w:t>It rests on the setting, and the setting favours the first reading without requiring it. The sentence has been speaking of rest for the troubled saints, and of the Lord glorified in them. The persons it turns to have been described as those who “know not God” and “obey not the gospel” (2 Thessalonians 1:8). The penalty named for them is a destruction that does not end, from the presence of the One whom the saints are with. Read so, the verse states an enduring exclusion. The wording of the clause has a likeness in the prophet’s picture of the day of the Lord, in which men go “into the holes of the rocks, and into the caves of the earth, for fear of the LORD, and for the glory of his majesty, when he ariseth to shake terribly the earth” (Isaiah 2:19). The volume notes the likeness of idea and does not claim that Paul is quoting.</w:t>
+        <w:t>It rests on the setting, and the setting favours the first reading without requiring it. The sentence has been speaking of rest for the troubled saints, and of the Lord glorified in them. The persons it turns to have been described as those who “know not God” and “obey not the gospel” (2 Thessalonians 1:8). The penalty named for them is a destruction that does not end, from the presence of the One whom the saints are with. Read so, the verse describes an enduring exclusion; the setting permits this reading and does not require it. The wording of the clause has a likeness in the prophet’s picture of the day of the Lord, in which men go “into the holes of the rocks, and into the caves of the earth, for fear of the LORD, and for the glory of his majesty, when he ariseth to shake terribly the earth” (Isaiah 2:19). The volume notes the likeness of idea and does not claim that Paul is quoting.</w:t>
       </w:r>
     </w:p>
     <w:p>
@@ -5517,7 +5517,7 @@
                 <w:rFonts w:ascii="Roboto" w:hAnsi="Roboto" w:eastAsia="Roboto" w:cs="Roboto"/>
                 <w:sz w:val="20"/>
               </w:rPr>
-              <w:t>Rest and glory for the saints, exclusion from the presence for the lost</w:t>
+              <w:t>Rest and glory for the saints, penalty from the presence of the Lord for the lost</w:t>
             </w:r>
           </w:p>
         </w:tc>
@@ -5534,7 +5534,7 @@
                 <w:rFonts w:ascii="Roboto" w:hAnsi="Roboto" w:eastAsia="Roboto" w:cs="Roboto"/>
                 <w:sz w:val="20"/>
               </w:rPr>
-              <w:t>Shown by the context</w:t>
+              <w:t>shown by the context</w:t>
             </w:r>
           </w:p>
         </w:tc>
@@ -5556,7 +5556,7 @@
                 <w:rFonts w:ascii="Roboto" w:hAnsi="Roboto" w:eastAsia="Roboto" w:cs="Roboto"/>
                 <w:sz w:val="20"/>
               </w:rPr>
-              <w:t>The exclusion is enduring</w:t>
+              <w:t>The penalty is irreversible, and the setting permits an exclusion reading</w:t>
             </w:r>
           </w:p>
         </w:tc>
@@ -5573,7 +5573,7 @@
                 <w:rFonts w:ascii="Roboto" w:hAnsi="Roboto" w:eastAsia="Roboto" w:cs="Roboto"/>
                 <w:sz w:val="20"/>
               </w:rPr>
-              <w:t>Read from the adjective, the judicial words and the Gospels’ shut door</w:t>
+              <w:t>Read from the adjective, the judicial words and the Gospels’ shut door; the preposition may also name source</w:t>
             </w:r>
           </w:p>
         </w:tc>
@@ -5863,7 +5863,7 @@
           <w:rFonts w:ascii="Roboto" w:hAnsi="Roboto" w:eastAsia="Roboto" w:cs="Roboto"/>
           <w:sz w:val="20"/>
         </w:rPr>
-        <w:t>The preposition is read as an enduring exclusion from the setting, not from the preposition; the verse does not state whether the persons continue to experience it.</w:t>
+        <w:t>The verse establishes an irreversible penalty. The setting permits an exclusion reading, the preposition may also name the Lord’s presence as the source of the judgment, and the verse does not state whether the persons continue to experience it.</w:t>
       </w:r>
     </w:p>
     <w:p>
@@ -5886,7 +5886,7 @@
           <w:rFonts w:ascii="Roboto" w:hAnsi="Roboto" w:eastAsia="Roboto" w:cs="Roboto"/>
           <w:sz w:val="20"/>
         </w:rPr>
-        <w:t>Claim: Scripture sets one adjective on both the life of the righteous and the punishment of the wicked, and sets it on the contempt of Daniel 12:2 and on the fire of Jude 7. The adjective can describe a result that lasts, and the volume says so. In these passages, read in their settings, the result that is said to last is one that persons undergo, and the passages do not describe it as a thing completed and finished.</w:t>
+        <w:t>Claim: Scripture sets one adjective on both the life of the righteous and the punishment of the wicked, and sets it on the contempt of Daniel 12:2 and on the fire of Jude 7. The adjective can describe a result that lasts, and the volume says so. In these passages, read in their settings, the result that is said to last is one that persons go into, and the passages do not describe it as a thing completed and finished.</w:t>
       </w:r>
     </w:p>
     <w:p>
@@ -5936,7 +5936,7 @@
           <w:rFonts w:ascii="Roboto" w:hAnsi="Roboto" w:eastAsia="Roboto" w:cs="Roboto"/>
           <w:sz w:val="20"/>
         </w:rPr>
-        <w:t>It grants it and asks what the verse says the persons do. The righteous go “into life eternal”, and the wicked “shall go away into everlasting punishment”. In both clauses the persons are the ones who go, and the thing they go into is a state. Those who go into everlasting punishment are described as going into it, not as being ended by it. The noun for punishment is, moreover, a noun for an infliction that is undergone. It is used in only one other place in the New Testament, in the verse, “There is no fear in love; but perfect love casteth out fear: because fear hath torment” (1 John 4:18), where what it names is a thing felt by one who is afraid. The volume does not make this a lexical proof and does not rest the verse on it. It notes that the one other place in which the noun stands is one in which the thing named is felt.</w:t>
+        <w:t>It grants it and asks what the verse says the persons do. The righteous go “into life eternal”, and the wicked “shall go away into everlasting punishment”. Both groups proceed to their assigned destinies, and the same adjective qualifies punishment and life. The parallel strongly establishes the permanence of both outcomes, though the verse alone does not explain how the punishment is experienced. The noun for punishment is used in only one other place in the New Testament, in the verse, “There is no fear in love; but perfect love casteth out fear: because fear hath torment” (1 John 4:18), where what it names is a thing felt by one who is afraid. The volume does not make this a lexical proof, and the noun alone does not settle the duration or the manner of the punishment. It notes that the one other place in which the noun stands is one in which the thing named is felt.</w:t>
       </w:r>
     </w:p>
     <w:p>
@@ -6718,7 +6718,7 @@
           <w:rFonts w:ascii="Roboto" w:hAnsi="Roboto" w:eastAsia="Roboto" w:cs="Roboto"/>
           <w:sz w:val="20"/>
         </w:rPr>
-        <w:t>The chapter began with a claim, and the claim has been kept. The adjective in these three passages can describe a result. It can also describe a state that lasts. No grammar settles which, and the volume does not pretend it does. What settles it, if anything does, is what the passages say the persons do and undergo. In Matthew 25 they go away into the punishment and into the fire shared with the devil and his angels. In Daniel 12 they awake to a shame that does not end. In Jude 7 the cities are an example of a vengeance suffered. In each, the persons are the subject of what is said, and the verb is not the verb of ending.</w:t>
+        <w:t>The chapter began with a claim, and the claim has been kept. The adjective in these three passages can describe a result. It can also describe a state that lasts. No grammar settles which, and the volume does not pretend it does. What settles it, if anything does, is what the passages say the persons do and what is done to them. In Matthew 25 they go away into the punishment and into the fire shared with the devil and his angels. In Daniel 12 they awake to a shame that does not end. In Jude 7 the cities are an example of a vengeance suffered. In each, the persons are the subject of what is said, and the verb is not the verb of ending.</w:t>
       </w:r>
     </w:p>
     <w:p>
@@ -6730,7 +6730,7 @@
           <w:rFonts w:ascii="Roboto" w:hAnsi="Roboto" w:eastAsia="Roboto" w:cs="Roboto"/>
           <w:sz w:val="20"/>
         </w:rPr>
-        <w:t>The Scripture also says that “the wrath of God abideth” on the one who believes not the Son (John 3:36), and “abideth” is a word for what remains and does not pass. The statement is made of the living and is not a statement about the age to come, and the volume uses it only to say that the New Testament speaks of wrath that remains on persons. The adjectives of this chapter are of the same kind: they speak of persons and a state, and of a state that does not lapse.</w:t>
+        <w:t>The Scripture also says that “the wrath of God abideth” on the one who believes not the Son (John 3:36), and “abideth” is a word for what remains and does not pass. The statement is made of the living and is not a statement about the age to come, and the volume uses it only to say that the New Testament speaks of wrath that remains on persons. The adjectives of this chapter are of the same kind: they speak of persons and of an outcome that does not lapse.</w:t>
       </w:r>
     </w:p>
     <w:p>
@@ -7594,7 +7594,7 @@
           <w:rFonts w:ascii="Roboto" w:hAnsi="Roboto" w:eastAsia="Roboto" w:cs="Roboto"/>
           <w:sz w:val="20"/>
         </w:rPr>
-        <w:t>The phrase is an expression of a person’s distress. It is not what happens to the fuel of a fire. The tares are burned in the fire (Matthew 13:40), and the volume does not build on the parable’s picture of burning. It notes that the Lord places the wailing at the furnace: “there shall be wailing”. The word “there” is the word that tells the reader that what is described is a condition at the place, and a condition of persons who are able to wail. This is Shown by the context. The parables are read in their own place in the Parable Studies, and this volume uses them only for the phrase.</w:t>
+        <w:t>The phrase is an expression of a person’s distress. It is not what happens to the fuel of a fire. The tares are burned in the fire (Matthew 13:40), and the volume does not build on the parable’s picture of burning. It notes that the Lord places the wailing at the furnace: “there shall be wailing”. The word “there” is the word that tells the reader that what is described is a condition at the place, and a condition of persons who are able to wail. This is shown by the context. The parables are read in their own place in the Parable Studies, and this volume uses them only for the phrase.</w:t>
       </w:r>
     </w:p>
     <w:p>
@@ -8192,7 +8192,7 @@
           <w:rFonts w:ascii="Roboto" w:hAnsi="Roboto" w:eastAsia="Roboto" w:cs="Roboto"/>
           <w:sz w:val="20"/>
         </w:rPr>
-        <w:t>Claim: in Revelation the final punishment is described by the persons who undergo it. The third angel says that they have no rest day nor night. The seer says that the beast and the false prophet are in the lake of fire a thousand years after they were cast into it, and that the devil is cast in where they are. The lake is called the second death, and Revelation’s own use of death does not describe the person’s ceasing. This chapter reads the passages in five parts and says in the last what stands at the throne and who.</w:t>
+        <w:t>Claim: in Revelation the final punishment is described by the persons who are in it. The third angel says that they are tormented and have no rest day nor night. The seer says that the beast and the false prophet were cast alive into the lake of fire, that the devil is cast in a thousand years later, and that a plural statement of torment, day and night for ever and ever, follows. The lake is called the second death, and Revelation’s own portrayal of the first death does not describe the person’s ceasing. This chapter reads the passages in five parts and says in the last what stands at the throne and who.</w:t>
       </w:r>
     </w:p>
     <w:p>
@@ -8278,7 +8278,7 @@
           <w:rFonts w:ascii="Roboto" w:hAnsi="Roboto" w:eastAsia="Roboto" w:cs="Roboto"/>
           <w:sz w:val="20"/>
         </w:rPr>
-        <w:t>The last clause is the one that carries the weight, and it is not about smoke. “They have no rest day nor night”. The verb is the verb of having, in the present, and what is said of them is that they have no rest. A person who does not exist has neither rest nor lack of rest. The statement is of persons in a state, and the state is a negative of what the saints are given. Two verses later the voice from heaven says of those who die in the Lord, “that they may rest from their labours” (Revelation 14:13). The same chapter sets the rest of the dead in the Lord against the no rest of the worshippers of the beast, and the second is described by the continuance of day and night. This is Stated in the sentence and Shown by the verse that follows it.</w:t>
+        <w:t>The last clause is the one on which the argument leans, and the volume says plainly what it does and does not state. The passage explicitly says three things: they shall be tormented; the smoke of their torment ascendeth up for ever and ever; and they have no rest day nor night. The words “for ever and ever” belong to the smoke and are not set on the no-rest clause. What the no-rest clause says is said of persons, and a person who does not exist has neither rest nor lack of rest. It is also the negative of what the saints are given: two verses later the voice from heaven says of those who die in the Lord, “that they may rest from their labours” (Revelation 14:13). The conclusion that the experience does not end emerges most strongly when this passage is read beside Revelation 20:10 (section 8.2), and not by inserting “for ever and ever” into the no-rest clause. The three statements are Stated in the sentence; the contrast with the saints’ rest is shown by the verse that follows; and the conclusion of unending experience is Inferred from the two passages together.</w:t>
       </w:r>
     </w:p>
     <w:p>
@@ -8290,7 +8290,7 @@
           <w:rFonts w:ascii="Roboto" w:hAnsi="Roboto" w:eastAsia="Roboto" w:cs="Roboto"/>
           <w:sz w:val="20"/>
         </w:rPr>
-        <w:t>The writer who holds that the lost cease to exist has two replies, and the volume gives both. The first is that “day nor night” describes the time during which the torment goes on and does not say that the time is without end, and that the “for ever and ever” of the sentence belongs to the smoke. The second is that Revelation’s language is symbolic throughout and that a smoke is a symbol. The volume answers the first by pointing to the second half of Revelation 20:10, where the phrase “day and night for ever and ever” is set on the verb of torment itself (section 8.2). It answers the second by noting that the book’s symbols are used of realities, and that when it says “he shall be tormented” it describes persons. The volume does not say that the reply is without difficulty. It says that the sentence, read whole, describes persons who have no rest, and that this is said in the same words as the verses in which a man is tormented by a scorpion’s sting.</w:t>
+        <w:t>The writer who holds that the lost cease to exist has two replies, and the volume gives both. The first is that “day nor night” describes the time during which the torment goes on and does not say that the time is without end, and that the “for ever and ever” of the sentence belongs to the smoke. The second is that Revelation’s language is symbolic throughout and that a smoke is a symbol. The volume grants the first as to the grammar of the clause, and it answers it by pointing to the second half of Revelation 20:10, where the phrase “day and night for ever and ever” is set on the verb of torment itself (section 8.2). It answers the second by noting that the book’s symbols are used of realities, and that when it says “he shall be tormented” it describes persons. The volume does not say that the reply is without difficulty. It says that the sentence, read whole, describes persons who have no rest, and that this is said in the same words as the verses in which a man is tormented by a scorpion’s sting.</w:t>
       </w:r>
     </w:p>
     <w:p>
@@ -8665,7 +8665,7 @@
           <w:rFonts w:ascii="Roboto" w:hAnsi="Roboto" w:eastAsia="Roboto" w:cs="Roboto"/>
           <w:sz w:val="20"/>
         </w:rPr>
-        <w:t>The verb is “are”. The beast and the false prophet were cast alive into the lake at the beginning of the thousand years, and at the end of the thousand years they are there. The seer does not say that they were. He says that they are, and that the devil is cast in where they are. A reader who holds that the lake destroys at once what is cast into it has to give an account of two persons who were cast in a thousand years earlier and are still named as being there. The volume reads the beast and the false prophet as persons, as Volume 2 of the Prophetic Commentary Series, The Beast and the False Prophet, does, and it takes “cast alive” in the nineteenth chapter as the plain sense of persons being thrown into the lake without having died.</w:t>
+        <w:t>The King James Version supplies the word “are” in “where the beast and the false prophet are”. The Greek text does not contain an explicit verb corresponding to the supplied “are”, and the volume does not build on that word. The stronger evidence is the plural statement that follows: “shall be tormented day and night for ever and ever”. In the natural reading of the sentence, the devil, the beast, and the false prophet are included in the plural subject. The passage therefore presents all three as sharing the torment of the lake, although the continued presence of the beast and false prophet should be classified as shown by the construction rather than established by an explicit present-tense verb. The beast and the false prophet were cast alive into the lake at the beginning of the thousand years (Revelation 19:20), and the devil is cast into the same lake at the end of them. A reader who holds that the lake destroys at once what is cast into it has to give an account of two persons who were cast in a thousand years earlier and are named with the devil in the statement of torment. The volume reads the beast and the false prophet as persons, as Volume 2 of the Prophetic Commentary Series, The Beast and the False Prophet, does, and it takes “cast alive” in the nineteenth chapter as the plain sense of persons being thrown into the lake without having died.</w:t>
       </w:r>
     </w:p>
     <w:p>
@@ -8677,7 +8677,7 @@
           <w:rFonts w:ascii="Roboto" w:hAnsi="Roboto" w:eastAsia="Roboto" w:cs="Roboto"/>
           <w:sz w:val="20"/>
         </w:rPr>
-        <w:t>The second half of the verse is the statement about the three: “shall be tormented day and night for ever and ever”. The verb of torment is plural, and the three are the subject: the devil, the beast and the false prophet. The phrase “day and night” is the phrase of Revelation 14:11, and “for ever and ever” is the strongest phrase of duration that the book has. The same words are used of the One who “liveth for ever and ever” (Revelation 4:9, 10; 10:6), of the Lord Christ who “shall reign for ever and ever” (Revelation 11:15), and of the saints, of whom it is said at the end that they “shall reign for ever and ever” (Revelation 22:5). The book does not use a weaker phrase when it speaks of the lake. It uses the phrase that it uses of God’s life and of the saints’ reign.</w:t>
+        <w:t>The second half of the verse is the statement about the three: “shall be tormented day and night for ever and ever”. The verb of torment is plural, and the natural reading takes the three as its subject: the devil, the beast and the false prophet. The phrase “day and night” is the phrase of Revelation 14:11, and “for ever and ever” is the strongest phrase of duration that the book has. The same words are used of the One who “liveth for ever and ever” (Revelation 4:9, 10; 10:6), of the Lord Christ who “shall reign for ever and ever” (Revelation 11:15), and of the saints, of whom it is said at the end that they “shall reign for ever and ever” (Revelation 22:5). The book does not use a weaker phrase when it speaks of the lake. It uses the phrase that it uses of God’s life and of the saints’ reign.</w:t>
       </w:r>
     </w:p>
     <w:p>
@@ -8701,7 +8701,7 @@
           <w:rFonts w:ascii="Roboto" w:hAnsi="Roboto" w:eastAsia="Roboto" w:cs="Roboto"/>
           <w:sz w:val="20"/>
         </w:rPr>
-        <w:t>This passage is marked as follows. That the beast and the false prophet were cast alive into the lake is Stated (19:20). That they are in it at 20:10 is Stated. That the devil is cast in where they are is Stated. That all three are tormented day and night for ever and ever is Stated by the verb and the phrase. That the three are persons who continue to be is Shown by the context. That the lake destroys on contact is not stated, and the passage contradicts it.</w:t>
+        <w:t>This passage is marked as follows. That the beast and the false prophet were cast alive into the lake is Stated (19:20). That the devil is later cast into the same lake is Stated (20:10). That the plural statement of torment embraces the devil, the beast and the false prophet is shown by the grammar and the context. That the beast and the false prophet remain conscious throughout the thousand years is Inferred from the combined sequence and the plural statement of torment. That the lake destroys on contact is not stated by the passage.</w:t>
       </w:r>
     </w:p>
     <w:p>
@@ -8751,7 +8751,7 @@
           <w:rFonts w:ascii="Roboto" w:hAnsi="Roboto" w:eastAsia="Roboto" w:cs="Roboto"/>
           <w:sz w:val="20"/>
         </w:rPr>
-        <w:t>What the book says of death is no less to the point. The fourth seal reveals a pale horse: “his name that sat on him was Death, and Hell followed with him” (Revelation 6:8). Death is a rider and Hell follows. When the dead are judged, “the sea gave up the dead which were in it; and death and hell delivered up the dead which were in them” (Revelation 20:13). The dead are persons. They are in Death and Hades, they are given up, and they stand: “I saw the dead, small and great, stand before God” (Revelation 20:12). In the book’s own usage, the first death does not end the person. It places him in the realm of the dead, where he is kept until he is brought out and stands before the throne.</w:t>
+        <w:t>What the book says of death is no less to the point. The fourth seal reveals a pale horse: “his name that sat on him was Death, and Hell followed with him” (Revelation 6:8). Death is a rider and Hell follows. When the dead are judged, “the sea gave up the dead which were in it; and death and hell delivered up the dead which were in them” (Revelation 20:13). The dead are persons. They are in Death and Hades, they are given up, and they stand: “I saw the dead, small and great, stand before God” (Revelation 20:12). In the book’s portrayal, those held in the first death continue as persons: they are in the realm of the dead, where they are kept until they are brought out and stand before the throne.</w:t>
       </w:r>
     </w:p>
     <w:p>
@@ -8763,7 +8763,7 @@
           <w:rFonts w:ascii="Roboto" w:hAnsi="Roboto" w:eastAsia="Roboto" w:cs="Roboto"/>
           <w:sz w:val="20"/>
         </w:rPr>
-        <w:t>This is the point of the section. Revelation’s own word for death is not a word for the person’s ceasing. In the book the dead exist, and are judged, and stand. A second death that is named by the same word and is called a death in the same sense is, in the book’s own frame, a second condition of death for persons who exist, and the description of the lake, with its torment, its burning and its “part”, tells what the condition is. The volume holds that the second death is the lake’s name for the state of those in it, and that the book does not use it of their ceasing. This is Inferred from Revelation’s use of death, Shown by the context of the lake’s description, and it is the volume’s reading. A different book, or a different verse, may use death of the end of a life, as in Genesis 7, and the volume has said so (chapter 3). The reading is of Revelation by Revelation.</w:t>
+        <w:t>This is the point of the section, and it is a narrow one. Revelation portrays those held in the first death as continuing persons who are subsequently raised and judged. This establishes that “death” within Revelation does not inherently mean cessation of existence. The volume therefore reads “second death” in light of the lake’s own descriptions, its torment, its burning and its “part”, rather than assuming that the word death means extinction. That the second death names the condition of persons in the lake is Inferred from Revelation’s use of death and from the context of the lake’s description. It is the volume’s reading, and it is not a demonstration that the second death must function as the first does. A different book, or a different verse, may use death of the end of a life, as in Genesis 7, and the volume has said so (chapter 3). The reading is of Revelation by Revelation.</w:t>
       </w:r>
     </w:p>
     <w:p>
@@ -8963,7 +8963,7 @@
                 <w:rFonts w:ascii="Roboto" w:hAnsi="Roboto" w:eastAsia="Roboto" w:cs="Roboto"/>
                 <w:sz w:val="20"/>
               </w:rPr>
-              <w:t>The beast and the false prophet are in it after a thousand years</w:t>
+              <w:t>The beast and the false prophet were cast alive into the lake</w:t>
             </w:r>
           </w:p>
         </w:tc>
@@ -8980,7 +8980,7 @@
                 <w:rFonts w:ascii="Roboto" w:hAnsi="Roboto" w:eastAsia="Roboto" w:cs="Roboto"/>
                 <w:sz w:val="20"/>
               </w:rPr>
-              <w:t>Revelation 19:20; 20:10</w:t>
+              <w:t>Revelation 19:20</w:t>
             </w:r>
           </w:p>
         </w:tc>
@@ -9019,7 +9019,7 @@
                 <w:rFonts w:ascii="Roboto" w:hAnsi="Roboto" w:eastAsia="Roboto" w:cs="Roboto"/>
                 <w:sz w:val="20"/>
               </w:rPr>
-              <w:t>The three are tormented day and night for ever and ever</w:t>
+              <w:t>The devil is later cast into the same lake</w:t>
             </w:r>
           </w:p>
         </w:tc>
@@ -9075,7 +9075,7 @@
                 <w:rFonts w:ascii="Roboto" w:hAnsi="Roboto" w:eastAsia="Roboto" w:cs="Roboto"/>
                 <w:sz w:val="20"/>
               </w:rPr>
-              <w:t>The lake burneth with fire and brimstone</w:t>
+              <w:t>The plural statement of torment embraces the devil, the beast and the false prophet</w:t>
             </w:r>
           </w:p>
         </w:tc>
@@ -9092,7 +9092,7 @@
                 <w:rFonts w:ascii="Roboto" w:hAnsi="Roboto" w:eastAsia="Roboto" w:cs="Roboto"/>
                 <w:sz w:val="20"/>
               </w:rPr>
-              <w:t>Revelation 21:8</w:t>
+              <w:t>Revelation 20:10</w:t>
             </w:r>
           </w:p>
         </w:tc>
@@ -9109,7 +9109,7 @@
                 <w:rFonts w:ascii="Roboto" w:hAnsi="Roboto" w:eastAsia="Roboto" w:cs="Roboto"/>
                 <w:sz w:val="20"/>
               </w:rPr>
-              <w:t>Stated</w:t>
+              <w:t>shown by the grammar and the context</w:t>
             </w:r>
           </w:p>
         </w:tc>
@@ -9131,7 +9131,7 @@
                 <w:rFonts w:ascii="Roboto" w:hAnsi="Roboto" w:eastAsia="Roboto" w:cs="Roboto"/>
                 <w:sz w:val="20"/>
               </w:rPr>
-              <w:t>The dead stand before God and are judged</w:t>
+              <w:t>The beast and the false prophet remain conscious through the thousand years</w:t>
             </w:r>
           </w:p>
         </w:tc>
@@ -9148,7 +9148,7 @@
                 <w:rFonts w:ascii="Roboto" w:hAnsi="Roboto" w:eastAsia="Roboto" w:cs="Roboto"/>
                 <w:sz w:val="20"/>
               </w:rPr>
-              <w:t>Revelation 20:12, 13</w:t>
+              <w:t>Revelation 19:20; 20:10</w:t>
             </w:r>
           </w:p>
         </w:tc>
@@ -9165,7 +9165,7 @@
                 <w:rFonts w:ascii="Roboto" w:hAnsi="Roboto" w:eastAsia="Roboto" w:cs="Roboto"/>
                 <w:sz w:val="20"/>
               </w:rPr>
-              <w:t>Stated</w:t>
+              <w:t>Inferred</w:t>
             </w:r>
           </w:p>
         </w:tc>
@@ -9187,7 +9187,7 @@
                 <w:rFonts w:ascii="Roboto" w:hAnsi="Roboto" w:eastAsia="Roboto" w:cs="Roboto"/>
                 <w:sz w:val="20"/>
               </w:rPr>
-              <w:t>Death in the book does not describe the person’s ceasing</w:t>
+              <w:t>The lake burneth with fire and brimstone</w:t>
             </w:r>
           </w:p>
         </w:tc>
@@ -9204,7 +9204,7 @@
                 <w:rFonts w:ascii="Roboto" w:hAnsi="Roboto" w:eastAsia="Roboto" w:cs="Roboto"/>
                 <w:sz w:val="20"/>
               </w:rPr>
-              <w:t>Revelation 6:8; 20:12–14</w:t>
+              <w:t>Revelation 21:8</w:t>
             </w:r>
           </w:p>
         </w:tc>
@@ -9221,7 +9221,7 @@
                 <w:rFonts w:ascii="Roboto" w:hAnsi="Roboto" w:eastAsia="Roboto" w:cs="Roboto"/>
                 <w:sz w:val="20"/>
               </w:rPr>
-              <w:t>Shown by the context</w:t>
+              <w:t>Stated</w:t>
             </w:r>
           </w:p>
         </w:tc>
@@ -9243,6 +9243,118 @@
                 <w:rFonts w:ascii="Roboto" w:hAnsi="Roboto" w:eastAsia="Roboto" w:cs="Roboto"/>
                 <w:sz w:val="20"/>
               </w:rPr>
+              <w:t>The dead stand before God and are judged</w:t>
+            </w:r>
+          </w:p>
+        </w:tc>
+        <w:tc>
+          <w:tcPr>
+            <w:tcW w:w="2284" w:type="dxa"/>
+          </w:tcPr>
+          <w:p>
+            <w:pPr>
+              <w:spacing w:after="0" w:before="0" w:line="259" w:lineRule="auto"/>
+            </w:pPr>
+            <w:r>
+              <w:rPr>
+                <w:rFonts w:ascii="Roboto" w:hAnsi="Roboto" w:eastAsia="Roboto" w:cs="Roboto"/>
+                <w:sz w:val="20"/>
+              </w:rPr>
+              <w:t>Revelation 20:12, 13</w:t>
+            </w:r>
+          </w:p>
+        </w:tc>
+        <w:tc>
+          <w:tcPr>
+            <w:tcW w:w="1828" w:type="dxa"/>
+          </w:tcPr>
+          <w:p>
+            <w:pPr>
+              <w:spacing w:after="0" w:before="0" w:line="259" w:lineRule="auto"/>
+            </w:pPr>
+            <w:r>
+              <w:rPr>
+                <w:rFonts w:ascii="Roboto" w:hAnsi="Roboto" w:eastAsia="Roboto" w:cs="Roboto"/>
+                <w:sz w:val="20"/>
+              </w:rPr>
+              <w:t>Stated</w:t>
+            </w:r>
+          </w:p>
+        </w:tc>
+      </w:tr>
+      <w:tr>
+        <w:trPr>
+          <w:cantSplit/>
+        </w:trPr>
+        <w:tc>
+          <w:tcPr>
+            <w:tcW w:w="3503" w:type="dxa"/>
+          </w:tcPr>
+          <w:p>
+            <w:pPr>
+              <w:spacing w:after="0" w:before="0" w:line="259" w:lineRule="auto"/>
+            </w:pPr>
+            <w:r>
+              <w:rPr>
+                <w:rFonts w:ascii="Roboto" w:hAnsi="Roboto" w:eastAsia="Roboto" w:cs="Roboto"/>
+                <w:sz w:val="20"/>
+              </w:rPr>
+              <w:t>Death in the book does not inherently describe the person’s ceasing</w:t>
+            </w:r>
+          </w:p>
+        </w:tc>
+        <w:tc>
+          <w:tcPr>
+            <w:tcW w:w="2284" w:type="dxa"/>
+          </w:tcPr>
+          <w:p>
+            <w:pPr>
+              <w:spacing w:after="0" w:before="0" w:line="259" w:lineRule="auto"/>
+            </w:pPr>
+            <w:r>
+              <w:rPr>
+                <w:rFonts w:ascii="Roboto" w:hAnsi="Roboto" w:eastAsia="Roboto" w:cs="Roboto"/>
+                <w:sz w:val="20"/>
+              </w:rPr>
+              <w:t>Revelation 6:8; 20:12–14</w:t>
+            </w:r>
+          </w:p>
+        </w:tc>
+        <w:tc>
+          <w:tcPr>
+            <w:tcW w:w="1828" w:type="dxa"/>
+          </w:tcPr>
+          <w:p>
+            <w:pPr>
+              <w:spacing w:after="0" w:before="0" w:line="259" w:lineRule="auto"/>
+            </w:pPr>
+            <w:r>
+              <w:rPr>
+                <w:rFonts w:ascii="Roboto" w:hAnsi="Roboto" w:eastAsia="Roboto" w:cs="Roboto"/>
+                <w:sz w:val="20"/>
+              </w:rPr>
+              <w:t>shown by the context</w:t>
+            </w:r>
+          </w:p>
+        </w:tc>
+      </w:tr>
+      <w:tr>
+        <w:trPr>
+          <w:cantSplit/>
+        </w:trPr>
+        <w:tc>
+          <w:tcPr>
+            <w:tcW w:w="3503" w:type="dxa"/>
+          </w:tcPr>
+          <w:p>
+            <w:pPr>
+              <w:spacing w:after="0" w:before="0" w:line="259" w:lineRule="auto"/>
+            </w:pPr>
+            <w:r>
+              <w:rPr>
+                <w:rFonts w:ascii="Roboto" w:hAnsi="Roboto" w:eastAsia="Roboto" w:cs="Roboto"/>
+                <w:sz w:val="20"/>
+              </w:rPr>
               <w:t>The second death names the condition of persons in the lake</w:t>
             </w:r>
           </w:p>
@@ -9342,7 +9454,7 @@
           <w:rFonts w:ascii="Roboto" w:hAnsi="Roboto" w:eastAsia="Roboto" w:cs="Roboto"/>
           <w:sz w:val="20"/>
         </w:rPr>
-        <w:t>The writer who holds that the lost cease to exist grants this and says that the grading is in the measure of suffering before the end. The volume grants that this is a possible reading, and that degrees alone do not decide the question. It says that a punishment which can be more tolerable or less, which is a measure of stripes, and which is said to be “greater” and “sorer”, is described as something the persons have, with a content and a measure. That is Shown by the context. It does not say that the content is never completed. It says that the descriptions the Scripture uses are the descriptions of an infliction, and not of a ceasing.</w:t>
+        <w:t>The writer who holds that the lost cease to exist grants this and says that the grading is in the measure of suffering before the end. The volume grants that this is a possible reading, and that degrees alone do not decide the question. It says that a punishment which can be more tolerable or less, which is a measure of stripes, and which is said to be “greater” and “sorer”, is described as something the persons have, with a content and a measure. That is shown by the context. It does not say that the content is never completed. It says that the descriptions the Scripture uses are the descriptions of an infliction, and not of a ceasing.</w:t>
       </w:r>
     </w:p>
     <w:p>
@@ -9394,7 +9506,7 @@
           <w:rFonts w:ascii="Roboto" w:hAnsi="Roboto" w:eastAsia="Roboto" w:cs="Roboto"/>
           <w:sz w:val="20"/>
         </w:rPr>
-        <w:t>Revelation 20:12 does not call the company by a name beyond “the dead, small and great”. Verse 13 adds that the sea, Death and Hades give up their dead, which says where they were, and that they are judged “every man according to their works”. The identification of this company with “the rest of the dead” is a conclusion drawn from the sequence of the chapter. In verse 4 the seer sees thrones and those who sat upon them, and “the souls of them that were beheaded for the witness of Jesus, and for the word of God”, who “lived and reigned with Christ a thousand years”. Verse 5 says, “But the rest of the dead lived not again until the thousand years were finished. This is the first resurrection.” The thousand years end in verse 7, and the throne stands in verse 11. The dead who stand before the throne are the dead who lived again when the thousand years were finished, and this is the group verse 5 calls the rest of the dead. The volume marks this as Shown by the context and Inferred from the sequence. It is not Stated in verse 12. Verse 12 does not say “the rest”.</w:t>
+        <w:t>Revelation 20:12 does not call the company by a name beyond “the dead, small and great”. Verse 13 adds that the sea, Death and Hades give up their dead, which says where they were, and that they are judged “every man according to their works”. The identification of this company with “the rest of the dead” is a conclusion drawn from the sequence of the chapter. In verse 4 the seer sees thrones and those who sat upon them, and “the souls of them that were beheaded for the witness of Jesus, and for the word of God”, who “lived and reigned with Christ a thousand years”. Verse 5 says, “But the rest of the dead lived not again until the thousand years were finished. This is the first resurrection.” The thousand years end in verse 7, and the throne stands in verse 11. The dead who stand before the throne are the dead who lived again when the thousand years were finished, and this is the group verse 5 calls the rest of the dead. The volume marks this as shown by the context and Inferred from the sequence. It is not Stated in verse 12. Verse 12 does not say “the rest”.</w:t>
       </w:r>
     </w:p>
     <w:p>
@@ -9420,7 +9532,7 @@
           <w:rFonts w:ascii="Roboto" w:hAnsi="Roboto" w:eastAsia="Roboto" w:cs="Roboto"/>
           <w:sz w:val="20"/>
         </w:rPr>
-        <w:t>Two companies are not at the throne for the judgment that ends in the lake. The first is the company of the first resurrection. Of them the text says, “Blessed and holy is he that hath part in the first resurrection: on such the second death hath no power” (Revelation 20:6). The second death is the lake (Revelation 20:14), and those on whom it has no power are not cast into it. They are not among those who stand to be judged by the books for that casting, and the volume holds that they are outside the throne’s sentence. This is Stated in verse 6 for the power of the second death, and it is Shown by the context for their absence from the throne.</w:t>
+        <w:t>Two companies are not at the throne for the judgment that ends in the lake. The first is the company of the first resurrection. Of them the text says, “Blessed and holy is he that hath part in the first resurrection: on such the second death hath no power” (Revelation 20:6). The second death is the lake (Revelation 20:14), and those on whom it has no power are not cast into it. Because the second death has no power over the first-resurrection company, they cannot be included among those condemned to the lake. The volume therefore distinguishes them from the company subjected to the throne’s final sentence. This is Stated in verse 6 for the power of the second death, and it is shown by the context for their absence from the throne.</w:t>
       </w:r>
     </w:p>
     <w:p>
@@ -9432,7 +9544,7 @@
           <w:rFonts w:ascii="Roboto" w:hAnsi="Roboto" w:eastAsia="Roboto" w:cs="Roboto"/>
           <w:sz w:val="20"/>
         </w:rPr>
-        <w:t>The second is the Body of Christ. The Body’s accounting is set elsewhere: “we shall all stand before the judgment seat of Christ” (Romans 14:10), and “we must all appear before the judgment seat of Christ; that every one may receive the things done in his body, according to that he hath done, whether it be good or bad” (2 Corinthians 5:10). That is a different court, with a different seat, a different people and a different end, and its nature is the subject of Volume 5 of the Prophecy &amp; Mystery Commentary Series, Separate Courts. The Body does not appear in the scenes of Revelation, and the great white throne is not its judgment.</w:t>
+        <w:t>The second is the Body of Christ. The Body’s accounting is set elsewhere: “we shall all stand before the judgment seat of Christ” (Romans 14:10), and “we must all appear before the judgment seat of Christ; that every one may receive the things done in his body, according to that he hath done, whether it be good or bad” (2 Corinthians 5:10). That is a different court, with a different seat, a different people and a different end, and its nature is the subject of Volume 5 of the Prophecy &amp; Mystery Commentary Series, Separate Courts. That the Body does not appear in the scenes of Revelation, and that the great white throne is not its judgment, is a conclusion the volume draws from the audience and setting of Revelation as a whole. It is marked Inferred, and it is not established by Romans 14:10 and 2 Corinthians 5:10 alone, which show only that the Body’s accounting is set at another seat.</w:t>
       </w:r>
     </w:p>
     <w:p>
@@ -9508,7 +9620,7 @@
           <w:rFonts w:ascii="Roboto" w:hAnsi="Roboto" w:eastAsia="Roboto" w:cs="Roboto"/>
           <w:sz w:val="20"/>
         </w:rPr>
-        <w:t>Those texts describe people who live in the thousand years and who are saved, and who die. They do not say what becomes of those who die believing in that age, whether they are raised at the beginning or the end, whether they stand at the throne, and by what record. The volume has asked the question and examined these passages, and the text does not answer it. The volume leaves it open and does not fill the gap. Nothing in the argument about the lake depends on the answer.</w:t>
+        <w:t>The prophetic passages describe mortal life and death within the kingdom setting, surviving nations worshipping the King, and saved nations in the New Earth. They do not explicitly explain when kingdom believers who die are raised or whether any appear at the Great White Throne. The volume has asked the question and examined these passages, and the text does not answer it. The volume leaves it open and does not fill the gap. Nothing in the argument about the lake depends on the answer.</w:t>
       </w:r>
     </w:p>
     <w:p>
@@ -9682,7 +9794,7 @@
                 <w:rFonts w:ascii="Roboto" w:hAnsi="Roboto" w:eastAsia="Roboto" w:cs="Roboto"/>
                 <w:sz w:val="20"/>
               </w:rPr>
-              <w:t>The dead, small and great, who give up from the sea, Death and Hades</w:t>
+              <w:t>The dead, small and great, whom the sea, Death, and Hades give up</w:t>
             </w:r>
           </w:p>
         </w:tc>
@@ -9756,7 +9868,7 @@
                 <w:rFonts w:ascii="Roboto" w:hAnsi="Roboto" w:eastAsia="Roboto" w:cs="Roboto"/>
                 <w:sz w:val="20"/>
               </w:rPr>
-              <w:t>Shown by the context; Inferred</w:t>
+              <w:t>shown by the context; Inferred</w:t>
             </w:r>
           </w:p>
         </w:tc>
@@ -9851,7 +9963,7 @@
                 <w:rFonts w:ascii="Roboto" w:hAnsi="Roboto" w:eastAsia="Roboto" w:cs="Roboto"/>
                 <w:sz w:val="20"/>
               </w:rPr>
-              <w:t>Its accounting is the judgment seat of Christ</w:t>
+              <w:t>Its accounting is the judgment seat of Christ; the Body’s absence from Revelation’s scenes is the volume’s conclusion from the book’s audience and setting</w:t>
             </w:r>
           </w:p>
         </w:tc>
@@ -9868,7 +9980,7 @@
                 <w:rFonts w:ascii="Roboto" w:hAnsi="Roboto" w:eastAsia="Roboto" w:cs="Roboto"/>
                 <w:sz w:val="20"/>
               </w:rPr>
-              <w:t>Shown by the context (Romans 14:10; 2 Corinthians 5:10)</w:t>
+              <w:t>Inferred (Romans 14:10; 2 Corinthians 5:10 set its accounting at another seat)</w:t>
             </w:r>
           </w:p>
         </w:tc>
@@ -10093,7 +10205,7 @@
           <w:rFonts w:ascii="Roboto" w:hAnsi="Roboto" w:eastAsia="Roboto" w:cs="Roboto"/>
           <w:sz w:val="20"/>
         </w:rPr>
-        <w:t>At Revelation 20:10 the beast and the false prophet are said to be in the lake a thousand years after they were cast in, and the devil is cast in where they are; the three are tormented day and night for ever and ever.</w:t>
+        <w:t>The beast and the false prophet were cast alive into the lake, the devil is cast into it a thousand years later, and the plural statement of torment at Revelation 20:10 takes in all three; the supplied “are” is not relied on.</w:t>
       </w:r>
     </w:p>
     <w:p>
@@ -10117,7 +10229,7 @@
           <w:rFonts w:ascii="Roboto" w:hAnsi="Roboto" w:eastAsia="Roboto" w:cs="Roboto"/>
           <w:sz w:val="20"/>
         </w:rPr>
-        <w:t>The lake is called the second death; in the book’s own use death does not describe the person’s ceasing, since the dead exist, stand and are judged.</w:t>
+        <w:t>The lake is called the second death; in the book’s own portrayal the dead exist, stand and are judged, so death does not inherently mean the person’s ceasing.</w:t>
       </w:r>
     </w:p>
     <w:p>
@@ -10165,7 +10277,7 @@
           <w:rFonts w:ascii="Roboto" w:hAnsi="Roboto" w:eastAsia="Roboto" w:cs="Roboto"/>
           <w:sz w:val="20"/>
         </w:rPr>
-        <w:t>The great white throne company is identified with the rest of the dead from the sequence of the chapter, marked as Inferred; the Body and the first-resurrection company are not there for the sentence.</w:t>
+        <w:t>The great white throne company is identified with the rest of the dead from the sequence of the chapter, marked as Inferred; the first-resurrection company is distinguished from it by Revelation 20:6, and the Body’s absence is a conclusion from the book’s audience and setting.</w:t>
       </w:r>
     </w:p>
     <w:p>
@@ -10238,7 +10350,7 @@
           <w:rFonts w:ascii="Roboto" w:hAnsi="Roboto" w:eastAsia="Roboto" w:cs="Roboto"/>
           <w:sz w:val="20"/>
         </w:rPr>
-        <w:t>On the side that holds the lost cease to exist, five writers are named. Basil Atkinson, an English conditionalist of the last century, is known here through Robert Peterson’s study of his exegesis, and his positions are described as Peterson reports them. Edward Fudge, in The Fire That Consumes, gives the fullest scriptural case for conditional immortality in English. John Stott, in a dialogue with David Edwards published in 1988, said that he held the view, tentatively, and asked for it to be debated. Clark Pinnock argued in an article of 1990 that the finally impenitent are destroyed. John Wenham, in The Goodness of God, took the same position. The primary texts of Fudge, Stott, Pinnock and Wenham are not free to read, and the volume describes their positions in its own words, naming the author and the work, without quotation marks.</w:t>
+        <w:t>On the side that holds the lost cease to exist, five writers are named. Basil Atkinson, an English conditionalist of the last century, is known here through Robert Peterson’s study of his exegesis, and his positions are described as Peterson reports them. Edward Fudge, in The Fire That Consumes, gives the fullest scriptural case for conditional immortality in English. John Stott, in a dialogue with David Edwards published in 1988, said that he held the view, tentatively, and asked for it to be debated. Clark Pinnock argued in an article of 1990 that the finally impenitent are destroyed. John Wenham, in The Goodness of God, took the same position. The primary texts of Fudge, Stott, Pinnock and Wenham were not accessible or available at the time of this writing, and the volume describes their positions in its own words, naming the author and the work, without quotation marks.</w:t>
       </w:r>
     </w:p>
     <w:p>
@@ -10338,7 +10450,7 @@
           <w:rFonts w:ascii="Roboto" w:hAnsi="Roboto" w:eastAsia="Roboto" w:cs="Roboto"/>
           <w:sz w:val="20"/>
         </w:rPr>
-        <w:t>What is granted. The adjective is used in this way in Hebrews 9:12, 5:9 and 6:2. Chapter 6 granted that it can describe a result and that Matthew 25:46 does not by itself decide the question.</w:t>
+        <w:t>What is granted. The adjective is used in this way in Hebrews 9:12, Hebrews 5:9 and Hebrews 6:2. Chapter 6 granted that it can describe a result and that Matthew 25:46 does not by itself decide the question.</w:t>
       </w:r>
     </w:p>
     <w:p>
@@ -10350,7 +10462,7 @@
           <w:rFonts w:ascii="Roboto" w:hAnsi="Roboto" w:eastAsia="Roboto" w:cs="Roboto"/>
           <w:sz w:val="20"/>
         </w:rPr>
-        <w:t>The reply. Peterson’s answer to Atkinson’s rule is that it is unsupported by the language and that it breaks the parallel with “life eternal”. The volume goes with the first of his points in part and with the second in full. It does not rest on a grammatical rule about nouns of action, and it does not say that the adjective carries the case. It says that the persons “go away into everlasting punishment” as the righteous go into life, and that the passages about the persons in the lake, taken with the adjective, describe a state that persons undergo and are not described as finishing. Peterson judges the conditionalist exegesis of Revelation 14:10, 11 “an evasion of the text and not a literal exegesis”, and the volume does not use words so strong. It says that an exegesis which gives the account of the smoke and passes over “no rest day nor night” has not answered the verse.</w:t>
+        <w:t>The reply. Peterson’s answer to Atkinson’s rule is that it is unsupported by the language and that it breaks the parallel with “life eternal”. The volume goes with the first of his points in part and with the second in full. It does not rest on a grammatical rule about nouns of action, and it does not say that the adjective carries the case. It says that the persons “go away into everlasting punishment” as the righteous go into life, and that the passages about the persons in the lake, taken with the adjective, describe persons who are in the lake and are not described as finishing. Peterson judges the conditionalist exegesis of Revelation 14:10, 11 “an evasion of the text and not a literal exegesis”, and the volume does not use words so strong. It says that an exegesis which gives the account of the smoke and passes over “no rest day nor night” has not answered the verse.</w:t>
       </w:r>
     </w:p>
     <w:p>
@@ -10450,7 +10562,7 @@
           <w:rFonts w:ascii="Roboto" w:hAnsi="Roboto" w:eastAsia="Roboto" w:cs="Roboto"/>
           <w:sz w:val="20"/>
         </w:rPr>
-        <w:t>The reply. The volume does not stand on the smoke. It stands on the persons, who are tormented in the presence of the holy angels and of the Lamb, who have no rest day nor night, and who are, in the case of the beast and the false prophet, still in the lake a thousand years after they were cast in. The objection answers the sentence about the smoke and does not answer the sentence about the persons. Peterson’s judgment of the conditionalist reading is that it must be labelled an evasion of the text. The volume’s judgment is milder and the same: the reading leaves two clauses of the third angel’s warning, and the verb “are” of Revelation 20:10, without an account.</w:t>
+        <w:t>The reply. The volume does not stand on the smoke. It stands on the persons, who are tormented in the presence of the holy angels and of the Lamb, who have no rest day nor night, and who, in the plural statement of Revelation 20:10, include the beast and the false prophet cast in a thousand years before the devil. The objection answers the sentence about the smoke and does not answer the sentence about the persons. Peterson’s judgment of the conditionalist reading is that it must be labelled an evasion of the text. The volume’s judgment is milder and the same: the reading leaves two clauses of the third angel’s warning, and the plural statement of torment in Revelation 20:10, without an account.</w:t>
       </w:r>
     </w:p>
     <w:p>
@@ -10770,7 +10882,7 @@
                 <w:rFonts w:ascii="Roboto" w:hAnsi="Roboto" w:eastAsia="Roboto" w:cs="Roboto"/>
                 <w:sz w:val="20"/>
               </w:rPr>
-              <w:t>Fudge; Atkinson</w:t>
+              <w:t>Fudge; Atkinson (as Peterson reports)</w:t>
             </w:r>
           </w:p>
         </w:tc>
@@ -10845,7 +10957,7 @@
                 <w:rFonts w:ascii="Roboto" w:hAnsi="Roboto" w:eastAsia="Roboto" w:cs="Roboto"/>
                 <w:sz w:val="20"/>
               </w:rPr>
-              <w:t>Atkinson; Fudge</w:t>
+              <w:t>Atkinson (as Peterson reports); Fudge</w:t>
             </w:r>
           </w:p>
         </w:tc>
@@ -10862,7 +10974,7 @@
                 <w:rFonts w:ascii="Roboto" w:hAnsi="Roboto" w:eastAsia="Roboto" w:cs="Roboto"/>
                 <w:sz w:val="20"/>
               </w:rPr>
-              <w:t>It does in Hebrews 9:12, 5:9, 6:2</w:t>
+              <w:t>It does in Hebrews 9:12; 5:9; 6:2</w:t>
             </w:r>
           </w:p>
         </w:tc>
@@ -10918,7 +11030,7 @@
                 <w:rFonts w:ascii="Roboto" w:hAnsi="Roboto" w:eastAsia="Roboto" w:cs="Roboto"/>
                 <w:sz w:val="20"/>
               </w:rPr>
-              <w:t>Atkinson; Fudge</w:t>
+              <w:t>Atkinson (as Peterson reports); Fudge</w:t>
             </w:r>
           </w:p>
         </w:tc>
@@ -10991,7 +11103,7 @@
                 <w:rFonts w:ascii="Roboto" w:hAnsi="Roboto" w:eastAsia="Roboto" w:cs="Roboto"/>
                 <w:sz w:val="20"/>
               </w:rPr>
-              <w:t>Atkinson</w:t>
+              <w:t>Atkinson (as Peterson reports)</w:t>
             </w:r>
           </w:p>
         </w:tc>
@@ -11025,7 +11137,7 @@
                 <w:rFonts w:ascii="Roboto" w:hAnsi="Roboto" w:eastAsia="Roboto" w:cs="Roboto"/>
                 <w:sz w:val="20"/>
               </w:rPr>
-              <w:t>No rest day nor night and the verb “are” are not answered (chapter 8)</w:t>
+              <w:t>No rest day nor night and the plural statement of torment are not answered (chapter 8)</w:t>
             </w:r>
           </w:p>
         </w:tc>
@@ -11210,7 +11322,7 @@
                 <w:rFonts w:ascii="Roboto" w:hAnsi="Roboto" w:eastAsia="Roboto" w:cs="Roboto"/>
                 <w:sz w:val="20"/>
               </w:rPr>
-              <w:t>Fudge; Atkinson</w:t>
+              <w:t>Fudge; Atkinson (as Peterson reports)</w:t>
             </w:r>
           </w:p>
         </w:tc>
@@ -11273,7 +11385,7 @@
           <w:rFonts w:ascii="Roboto" w:hAnsi="Roboto" w:eastAsia="Roboto" w:cs="Roboto"/>
           <w:sz w:val="20"/>
         </w:rPr>
-        <w:t>The writers on the other side have asked real questions and the volume has tried to answer them without making their case weaker than it is. The reader who has followed the replies will see where they come to rest. The words of destruction do not decide the question in either direction. The adjective of duration can be read as a result and also as a state. The picture of the fire and the worm is a picture of corpses in Isaiah and of a casting in the Gospels. The smoke may be a monument. What remains, when all of this is granted, is the statement of Revelation about persons who are tormented, who have no rest day nor night, and who are in the lake a thousand years after they were cast in. The volume holds that this remains because it is in the text, and that nothing in the objections has removed it.</w:t>
+        <w:t>The writers on the other side have asked real questions and the volume has tried to answer them without making their case weaker than it is. The reader who has followed the replies will see where they come to rest. The words of destruction do not decide the question in either direction. The adjective of duration can be read as a result and also as a state. The picture of the fire and the worm is a picture of corpses in Isaiah and of a casting in the Gospels. The smoke may be a monument. What remains, when all of this is granted, is the statement of Revelation about persons who are tormented, who have no rest day nor night, and whose plural statement of torment at Revelation 20:10 takes in the beast and the false prophet cast in a thousand years before. The volume holds that this remains because it is in the text, and that nothing in the objections has removed it.</w:t>
       </w:r>
     </w:p>
     <w:p>
@@ -11454,7 +11566,7 @@
           <w:rFonts w:ascii="Roboto" w:hAnsi="Roboto" w:eastAsia="Roboto" w:cs="Roboto"/>
           <w:sz w:val="20"/>
         </w:rPr>
-        <w:t>Scripture uses the words of death and destruction both of an ending and of a ruin that remains, and no one of them settles what becomes of the lost. The Lord tells the Twelve that God is able to destroy soul and body in hell, and Paul calls the end of the enemies of the cross destruction. Paul says that those who know not God shall be punished with everlasting destruction from the presence of the Lord, set against the rest and glory of the saints. The Lord sets one adjective on the punishment and on the life, speaks of a fire that is not quenched and a worm that dieth not, and places wailing and gnashing of teeth at the furnace into which the wicked are cast. Revelation says that the worshippers of the beast are tormented in the presence of the Lamb and have no rest day nor night, that the beast and the false prophet are in the lake of fire a thousand years after they were cast into it, that the devil is cast in where they are, and that all three are tormented day and night for ever and ever. It calls the lake the second death, and in the same book the dead exist, stand and are judged. The passages that say the wicked shall be no more speak of the earth and of the living. Taken together, each in its own setting, the passages on final judgment describe a punishment that is irreversible and enduring and that persons undergo, and none of them states that the persons cease to exist. Any reading that adds a ceasing, or an endless awareness where no verse says it, goes beyond what the text states.</w:t>
+        <w:t>Scripture uses the words of death and destruction both of an ending and of a ruin that remains, and no one of them settles what becomes of the lost. The Lord tells the Twelve that God is able to destroy soul and body in hell, and Paul calls the end of the enemies of the cross destruction. Paul says that those who know not God shall be punished with everlasting destruction from the presence of the Lord, an irreversible penalty set against the rest and glory of the saints, whether the preposition names exclusion or source. The Lord sets one adjective on the punishment and on the life, speaks of a fire that is not quenched and a worm that dieth not, and places wailing and gnashing of teeth at the furnace into which the wicked are cast. Revelation says that the worshippers of the beast are tormented in the presence of the Lamb and have no rest day nor night, that the beast and the false prophet were cast alive into the lake of fire, that the devil is cast in a thousand years later, and that the plural statement of torment, day and night for ever and ever, takes in all three. It calls the lake the second death, and in the same book the dead exist, stand and are judged. The passages that say the wicked shall be no more speak of the earth and of the living. Taken together, each in its own setting, the passages on final judgment describe a punishment that is irreversible and enduring and that persons undergo, and none of them states that the persons cease to exist. Any reading that adds a ceasing, or an endless awareness where no verse says it, goes beyond what the text states.</w:t>
       </w:r>
     </w:p>
     <w:p>
@@ -11883,7 +11995,7 @@
                 <w:rFonts w:ascii="Roboto" w:hAnsi="Roboto" w:eastAsia="Roboto" w:cs="Roboto"/>
                 <w:sz w:val="20"/>
               </w:rPr>
-              <w:t>They are tormented, have no rest day nor night, and are in the lake after a thousand years</w:t>
+              <w:t>They are tormented and have no rest day nor night; the plural statement of torment at 20:10 takes in the beast and the false prophet cast in a thousand years before</w:t>
             </w:r>
           </w:p>
         </w:tc>
@@ -12754,7 +12866,7 @@
                 <w:rFonts w:ascii="Roboto" w:hAnsi="Roboto" w:eastAsia="Roboto" w:cs="Roboto"/>
                 <w:sz w:val="20"/>
               </w:rPr>
-              <w:t>Cast alive into the lake; still there after a thousand years; tormented day and night for ever and ever</w:t>
+              <w:t>Cast alive into the lake; the devil cast in later; a plural statement of torment day and night for ever and ever</w:t>
             </w:r>
           </w:p>
         </w:tc>
@@ -15012,7 +15124,7 @@
                 <w:rFonts w:ascii="Roboto" w:hAnsi="Roboto" w:eastAsia="Roboto" w:cs="Roboto"/>
                 <w:sz w:val="20"/>
               </w:rPr>
-              <w:t>ch. 2, p. 4; ch. 3, pp. 9, 10; ch. 9, p. 38</w:t>
+              <w:t>ch. 2, p. 4; ch. 3, pp. 9, 10; ch. 9, p. 39</w:t>
             </w:r>
           </w:p>
         </w:tc>
@@ -15062,7 +15174,7 @@
                 <w:rFonts w:ascii="Roboto" w:hAnsi="Roboto" w:eastAsia="Roboto" w:cs="Roboto"/>
                 <w:sz w:val="20"/>
               </w:rPr>
-              <w:t>ch. 9, p. 38</w:t>
+              <w:t>ch. 9, p. 39</w:t>
             </w:r>
           </w:p>
         </w:tc>
@@ -15209,7 +15321,7 @@
                 <w:rFonts w:ascii="Roboto" w:hAnsi="Roboto" w:eastAsia="Roboto" w:cs="Roboto"/>
                 <w:sz w:val="20"/>
               </w:rPr>
-              <w:t>ch. 3, pp. 6, 10; Conclusion, p. 43</w:t>
+              <w:t>ch. 3, pp. 6, 10; Conclusion, p. 44</w:t>
             </w:r>
           </w:p>
         </w:tc>
@@ -15356,7 +15468,7 @@
                 <w:rFonts w:ascii="Roboto" w:hAnsi="Roboto" w:eastAsia="Roboto" w:cs="Roboto"/>
                 <w:sz w:val="20"/>
               </w:rPr>
-              <w:t>ch. 3, pp. 6, 7, 10</w:t>
+              <w:t>ch. 3, pp. 7, 10</w:t>
             </w:r>
           </w:p>
         </w:tc>
@@ -15405,7 +15517,7 @@
                 <w:rFonts w:ascii="Roboto" w:hAnsi="Roboto" w:eastAsia="Roboto" w:cs="Roboto"/>
                 <w:sz w:val="20"/>
               </w:rPr>
-              <w:t>ch. 9, p. 40</w:t>
+              <w:t>ch. 9, p. 41</w:t>
             </w:r>
           </w:p>
         </w:tc>
@@ -15454,7 +15566,7 @@
                 <w:rFonts w:ascii="Roboto" w:hAnsi="Roboto" w:eastAsia="Roboto" w:cs="Roboto"/>
                 <w:sz w:val="20"/>
               </w:rPr>
-              <w:t>Conclusion, p. 43</w:t>
+              <w:t>Conclusion, p. 44</w:t>
             </w:r>
           </w:p>
         </w:tc>
@@ -15552,7 +15664,7 @@
                 <w:rFonts w:ascii="Roboto" w:hAnsi="Roboto" w:eastAsia="Roboto" w:cs="Roboto"/>
                 <w:sz w:val="20"/>
               </w:rPr>
-              <w:t>ch. 9, p. 40</w:t>
+              <w:t>ch. 9, p. 41</w:t>
             </w:r>
           </w:p>
         </w:tc>
@@ -15846,7 +15958,7 @@
                 <w:rFonts w:ascii="Roboto" w:hAnsi="Roboto" w:eastAsia="Roboto" w:cs="Roboto"/>
                 <w:sz w:val="20"/>
               </w:rPr>
-              <w:t>ch. 8, p. 35</w:t>
+              <w:t>ch. 8, p. 36</w:t>
             </w:r>
           </w:p>
         </w:tc>
@@ -16056,7 +16168,7 @@
                 <w:rFonts w:ascii="Roboto" w:hAnsi="Roboto" w:eastAsia="Roboto" w:cs="Roboto"/>
                 <w:sz w:val="20"/>
               </w:rPr>
-              <w:t>ch. 6, p. 20; ch. 7, pp. 24, 25, 27, 28; ch. 9, pp. 39, 41; Conclusion, p. 43</w:t>
+              <w:t>ch. 6, p. 20; ch. 7, pp. 24, 25, 27, 28; ch. 9, pp. 39, 42; Conclusion, p. 44</w:t>
             </w:r>
           </w:p>
         </w:tc>
@@ -16357,7 +16469,7 @@
                 <w:rFonts w:ascii="Roboto" w:hAnsi="Roboto" w:eastAsia="Roboto" w:cs="Roboto"/>
                 <w:sz w:val="20"/>
               </w:rPr>
-              <w:t>ch. 2, p. 4; ch. 3, p. 9; ch. 9, p. 40; Conclusion, p. 43</w:t>
+              <w:t>ch. 2, p. 4; ch. 3, p. 9; ch. 9, p. 41; Conclusion, p. 44</w:t>
             </w:r>
           </w:p>
         </w:tc>
@@ -16455,7 +16567,7 @@
                 <w:rFonts w:ascii="Roboto" w:hAnsi="Roboto" w:eastAsia="Roboto" w:cs="Roboto"/>
                 <w:sz w:val="20"/>
               </w:rPr>
-              <w:t>ch. 3, pp. 6, 7, 10</w:t>
+              <w:t>ch. 3, pp. 7, 10</w:t>
             </w:r>
           </w:p>
         </w:tc>
@@ -16504,7 +16616,7 @@
                 <w:rFonts w:ascii="Roboto" w:hAnsi="Roboto" w:eastAsia="Roboto" w:cs="Roboto"/>
                 <w:sz w:val="20"/>
               </w:rPr>
-              <w:t>ch. 8, p. 31</w:t>
+              <w:t>ch. 8, p. 32</w:t>
             </w:r>
           </w:p>
         </w:tc>
@@ -16609,7 +16721,7 @@
                 <w:rFonts w:ascii="Roboto" w:hAnsi="Roboto" w:eastAsia="Roboto" w:cs="Roboto"/>
                 <w:sz w:val="20"/>
               </w:rPr>
-              <w:t>ch. 6, pp. 18, 20, 22; Conclusion, p. 43</w:t>
+              <w:t>ch. 6, pp. 18, 20, 22; Conclusion, p. 44</w:t>
             </w:r>
           </w:p>
         </w:tc>
@@ -16714,7 +16826,7 @@
                 <w:rFonts w:ascii="Roboto" w:hAnsi="Roboto" w:eastAsia="Roboto" w:cs="Roboto"/>
                 <w:sz w:val="20"/>
               </w:rPr>
-              <w:t>ch. 8, p. 35</w:t>
+              <w:t>ch. 8, p. 36</w:t>
             </w:r>
           </w:p>
         </w:tc>
@@ -16763,7 +16875,7 @@
                 <w:rFonts w:ascii="Roboto" w:hAnsi="Roboto" w:eastAsia="Roboto" w:cs="Roboto"/>
                 <w:sz w:val="20"/>
               </w:rPr>
-              <w:t>ch. 9, p. 40</w:t>
+              <w:t>ch. 9, p. 41</w:t>
             </w:r>
           </w:p>
         </w:tc>
@@ -16812,7 +16924,7 @@
                 <w:rFonts w:ascii="Roboto" w:hAnsi="Roboto" w:eastAsia="Roboto" w:cs="Roboto"/>
                 <w:sz w:val="20"/>
               </w:rPr>
-              <w:t>Conclusion, p. 43</w:t>
+              <w:t>Conclusion, p. 44</w:t>
             </w:r>
           </w:p>
         </w:tc>
@@ -17008,7 +17120,7 @@
                 <w:rFonts w:ascii="Roboto" w:hAnsi="Roboto" w:eastAsia="Roboto" w:cs="Roboto"/>
                 <w:sz w:val="20"/>
               </w:rPr>
-              <w:t>ch. 2, p. 4; ch. 5, p. 17</w:t>
+              <w:t>ch. 2, p. 5; ch. 5, p. 17</w:t>
             </w:r>
           </w:p>
         </w:tc>
@@ -17155,7 +17267,7 @@
                 <w:rFonts w:ascii="Roboto" w:hAnsi="Roboto" w:eastAsia="Roboto" w:cs="Roboto"/>
                 <w:sz w:val="20"/>
               </w:rPr>
-              <w:t>ch. 4, p. 10</w:t>
+              <w:t>ch. 4, p. 11</w:t>
             </w:r>
           </w:p>
         </w:tc>
@@ -17211,7 +17323,7 @@
                 <w:rFonts w:ascii="Roboto" w:hAnsi="Roboto" w:eastAsia="Roboto" w:cs="Roboto"/>
                 <w:sz w:val="20"/>
               </w:rPr>
-              <w:t>ch. 3, pp. 7, 8, 10</w:t>
+              <w:t>ch. 3, pp. 7, 9, 10</w:t>
             </w:r>
           </w:p>
         </w:tc>
@@ -17323,7 +17435,7 @@
                 <w:rFonts w:ascii="Roboto" w:hAnsi="Roboto" w:eastAsia="Roboto" w:cs="Roboto"/>
                 <w:sz w:val="20"/>
               </w:rPr>
-              <w:t>ch. 4, p. 10</w:t>
+              <w:t>ch. 4, p. 11</w:t>
             </w:r>
           </w:p>
         </w:tc>
@@ -17379,7 +17491,7 @@
                 <w:rFonts w:ascii="Roboto" w:hAnsi="Roboto" w:eastAsia="Roboto" w:cs="Roboto"/>
                 <w:sz w:val="20"/>
               </w:rPr>
-              <w:t>ch. 4, p. 10</w:t>
+              <w:t>ch. 4, p. 11</w:t>
             </w:r>
           </w:p>
         </w:tc>
@@ -17484,7 +17596,7 @@
                 <w:rFonts w:ascii="Roboto" w:hAnsi="Roboto" w:eastAsia="Roboto" w:cs="Roboto"/>
                 <w:sz w:val="20"/>
               </w:rPr>
-              <w:t>ch. 4, p. 10</w:t>
+              <w:t>ch. 4, p. 11</w:t>
             </w:r>
           </w:p>
         </w:tc>
@@ -17596,7 +17708,7 @@
                 <w:rFonts w:ascii="Roboto" w:hAnsi="Roboto" w:eastAsia="Roboto" w:cs="Roboto"/>
                 <w:sz w:val="20"/>
               </w:rPr>
-              <w:t>ch. 2, p. 4; ch. 4, pp. 10, 11, 12, 13, 14; ch. 5, p. 16; ch. 7, p. 26; ch. 9, pp. 38, 40; Conclusion, p. 43</w:t>
+              <w:t>ch. 2, p. 4; ch. 4, pp. 11, 12, 13, 14; ch. 5, p. 16; ch. 7, p. 26; ch. 9, pp. 38, 41; Conclusion, p. 44</w:t>
             </w:r>
           </w:p>
         </w:tc>
@@ -17750,7 +17862,7 @@
                 <w:rFonts w:ascii="Roboto" w:hAnsi="Roboto" w:eastAsia="Roboto" w:cs="Roboto"/>
                 <w:sz w:val="20"/>
               </w:rPr>
-              <w:t>ch. 3, pp. 6, 7, 10</w:t>
+              <w:t>ch. 3, pp. 7, 10</w:t>
             </w:r>
           </w:p>
         </w:tc>
@@ -17946,7 +18058,7 @@
                 <w:rFonts w:ascii="Roboto" w:hAnsi="Roboto" w:eastAsia="Roboto" w:cs="Roboto"/>
                 <w:sz w:val="20"/>
               </w:rPr>
-              <w:t>ch. 3, p. 7</w:t>
+              <w:t>ch. 3, p. 8</w:t>
             </w:r>
           </w:p>
         </w:tc>
@@ -18289,7 +18401,7 @@
                 <w:rFonts w:ascii="Roboto" w:hAnsi="Roboto" w:eastAsia="Roboto" w:cs="Roboto"/>
                 <w:sz w:val="20"/>
               </w:rPr>
-              <w:t>ch. 2, p. 4</w:t>
+              <w:t>ch. 2, p. 5</w:t>
             </w:r>
           </w:p>
         </w:tc>
@@ -18611,7 +18723,7 @@
                 <w:rFonts w:ascii="Roboto" w:hAnsi="Roboto" w:eastAsia="Roboto" w:cs="Roboto"/>
                 <w:sz w:val="20"/>
               </w:rPr>
-              <w:t>ch. 2, p. 4; ch. 6, pp. 18, 19, 22; ch. 9, p. 38; Conclusion, p. 43</w:t>
+              <w:t>ch. 2, p. 4; ch. 6, pp. 19, 20, 22; ch. 9, p. 39; Conclusion, p. 44</w:t>
             </w:r>
           </w:p>
         </w:tc>
@@ -18667,7 +18779,7 @@
                 <w:rFonts w:ascii="Roboto" w:hAnsi="Roboto" w:eastAsia="Roboto" w:cs="Roboto"/>
                 <w:sz w:val="20"/>
               </w:rPr>
-              <w:t>ch. 3, p. 8; ch. 4, p. 12</w:t>
+              <w:t>ch. 3, p. 8; ch. 4, p. 13</w:t>
             </w:r>
           </w:p>
         </w:tc>
@@ -18982,7 +19094,7 @@
                 <w:rFonts w:ascii="Roboto" w:hAnsi="Roboto" w:eastAsia="Roboto" w:cs="Roboto"/>
                 <w:sz w:val="20"/>
               </w:rPr>
-              <w:t>ch. 7, pp. 27, 28; Conclusion, p. 43</w:t>
+              <w:t>ch. 7, pp. 27, 28; Conclusion, p. 44</w:t>
             </w:r>
           </w:p>
         </w:tc>
@@ -19094,7 +19206,7 @@
                 <w:rFonts w:ascii="Roboto" w:hAnsi="Roboto" w:eastAsia="Roboto" w:cs="Roboto"/>
                 <w:sz w:val="20"/>
               </w:rPr>
-              <w:t>ch. 9, p. 39</w:t>
+              <w:t>ch. 9, p. 40</w:t>
             </w:r>
           </w:p>
         </w:tc>
@@ -19150,7 +19262,7 @@
                 <w:rFonts w:ascii="Roboto" w:hAnsi="Roboto" w:eastAsia="Roboto" w:cs="Roboto"/>
                 <w:sz w:val="20"/>
               </w:rPr>
-              <w:t>ch. 3, p. 8; ch. 4, p. 12</w:t>
+              <w:t>ch. 3, p. 8; ch. 4, p. 13</w:t>
             </w:r>
           </w:p>
         </w:tc>
@@ -19367,7 +19479,7 @@
                 <w:rFonts w:ascii="Roboto" w:hAnsi="Roboto" w:eastAsia="Roboto" w:cs="Roboto"/>
                 <w:sz w:val="20"/>
               </w:rPr>
-              <w:t>ch. 4, pp. 11, 12, 14; Conclusion, p. 43</w:t>
+              <w:t>ch. 4, pp. 11, 12, 14; Conclusion, p. 44</w:t>
             </w:r>
           </w:p>
         </w:tc>
@@ -19717,7 +19829,7 @@
                 <w:rFonts w:ascii="Roboto" w:hAnsi="Roboto" w:eastAsia="Roboto" w:cs="Roboto"/>
                 <w:sz w:val="20"/>
               </w:rPr>
-              <w:t>ch. 2, p. 4; ch. 3, pp. 7, 8, 9, 10; ch. 9, p. 38; Conclusion, p. 43</w:t>
+              <w:t>ch. 2, p. 4; ch. 3, pp. 8, 9, 10; ch. 9, p. 38; Conclusion, p. 44</w:t>
             </w:r>
           </w:p>
         </w:tc>
@@ -19766,7 +19878,7 @@
                 <w:rFonts w:ascii="Roboto" w:hAnsi="Roboto" w:eastAsia="Roboto" w:cs="Roboto"/>
                 <w:sz w:val="20"/>
               </w:rPr>
-              <w:t>ch. 3, p. 7</w:t>
+              <w:t>ch. 3, p. 8</w:t>
             </w:r>
           </w:p>
         </w:tc>
@@ -19962,7 +20074,7 @@
                 <w:rFonts w:ascii="Roboto" w:hAnsi="Roboto" w:eastAsia="Roboto" w:cs="Roboto"/>
                 <w:sz w:val="20"/>
               </w:rPr>
-              <w:t>ch. 4, p. 12</w:t>
+              <w:t>ch. 4, p. 13</w:t>
             </w:r>
           </w:p>
         </w:tc>
@@ -20109,7 +20221,7 @@
                 <w:rFonts w:ascii="Roboto" w:hAnsi="Roboto" w:eastAsia="Roboto" w:cs="Roboto"/>
                 <w:sz w:val="20"/>
               </w:rPr>
-              <w:t>ch. 8, pp. 35, 36</w:t>
+              <w:t>ch. 8, pp. 35, 37</w:t>
             </w:r>
           </w:p>
         </w:tc>
@@ -20158,7 +20270,7 @@
                 <w:rFonts w:ascii="Roboto" w:hAnsi="Roboto" w:eastAsia="Roboto" w:cs="Roboto"/>
                 <w:sz w:val="20"/>
               </w:rPr>
-              <w:t>ch. 3, pp. 8, 9, 10; ch. 5, p. 16; ch. 9, p. 38; Conclusion, p. 43</w:t>
+              <w:t>ch. 3, pp. 8, 9, 10; ch. 5, p. 16; ch. 9, p. 38; Conclusion, p. 44</w:t>
             </w:r>
           </w:p>
         </w:tc>
@@ -20256,7 +20368,7 @@
                 <w:rFonts w:ascii="Roboto" w:hAnsi="Roboto" w:eastAsia="Roboto" w:cs="Roboto"/>
                 <w:sz w:val="20"/>
               </w:rPr>
-              <w:t>ch. 8, pp. 35, 36</w:t>
+              <w:t>ch. 8, pp. 35, 37</w:t>
             </w:r>
           </w:p>
         </w:tc>
@@ -20305,7 +20417,7 @@
                 <w:rFonts w:ascii="Roboto" w:hAnsi="Roboto" w:eastAsia="Roboto" w:cs="Roboto"/>
                 <w:sz w:val="20"/>
               </w:rPr>
-              <w:t>ch. 2, p. 4; ch. 3, pp. 9, 10; ch. 9, p. 38</w:t>
+              <w:t>ch. 2, p. 4; ch. 3, pp. 9, 10; ch. 9, p. 39</w:t>
             </w:r>
           </w:p>
         </w:tc>
@@ -20676,7 +20788,7 @@
                 <w:rFonts w:ascii="Roboto" w:hAnsi="Roboto" w:eastAsia="Roboto" w:cs="Roboto"/>
                 <w:sz w:val="20"/>
               </w:rPr>
-              <w:t>ch. 5, p. 14</w:t>
+              <w:t>ch. 5, p. 15</w:t>
             </w:r>
           </w:p>
         </w:tc>
@@ -20725,7 +20837,7 @@
                 <w:rFonts w:ascii="Roboto" w:hAnsi="Roboto" w:eastAsia="Roboto" w:cs="Roboto"/>
                 <w:sz w:val="20"/>
               </w:rPr>
-              <w:t>ch. 5, p. 14</w:t>
+              <w:t>ch. 5, p. 15</w:t>
             </w:r>
           </w:p>
         </w:tc>
@@ -20893,7 +21005,7 @@
                 <w:rFonts w:ascii="Roboto" w:hAnsi="Roboto" w:eastAsia="Roboto" w:cs="Roboto"/>
                 <w:sz w:val="20"/>
               </w:rPr>
-              <w:t>ch. 5, p. 15; Conclusion, p. 43</w:t>
+              <w:t>ch. 5, p. 15; Conclusion, p. 44</w:t>
             </w:r>
           </w:p>
         </w:tc>
@@ -21061,7 +21173,7 @@
                 <w:rFonts w:ascii="Roboto" w:hAnsi="Roboto" w:eastAsia="Roboto" w:cs="Roboto"/>
                 <w:sz w:val="20"/>
               </w:rPr>
-              <w:t>ch. 2, p. 4; ch. 5, pp. 15, 16</w:t>
+              <w:t>ch. 2, pp. 4, 5; ch. 5, p. 16</w:t>
             </w:r>
           </w:p>
         </w:tc>
@@ -21222,7 +21334,7 @@
                 <w:rFonts w:ascii="Roboto" w:hAnsi="Roboto" w:eastAsia="Roboto" w:cs="Roboto"/>
                 <w:sz w:val="20"/>
               </w:rPr>
-              <w:t>ch. 6, p. 19</w:t>
+              <w:t>ch. 6, p. 19; ch. 9, pp. 39, 42</w:t>
             </w:r>
           </w:p>
         </w:tc>
@@ -21271,7 +21383,7 @@
                 <w:rFonts w:ascii="Roboto" w:hAnsi="Roboto" w:eastAsia="Roboto" w:cs="Roboto"/>
                 <w:sz w:val="20"/>
               </w:rPr>
-              <w:t>ch. 2, p. 4; ch. 6, p. 19</w:t>
+              <w:t>ch. 2, p. 5; ch. 6, p. 19; ch. 9, pp. 39, 42</w:t>
             </w:r>
           </w:p>
         </w:tc>
@@ -21320,7 +21432,7 @@
                 <w:rFonts w:ascii="Roboto" w:hAnsi="Roboto" w:eastAsia="Roboto" w:cs="Roboto"/>
                 <w:sz w:val="20"/>
               </w:rPr>
-              <w:t>ch. 6, p. 19</w:t>
+              <w:t>ch. 6, p. 19; ch. 9, pp. 39, 42</w:t>
             </w:r>
           </w:p>
         </w:tc>
@@ -21352,7 +21464,7 @@
                 <w:rFonts w:ascii="Roboto" w:hAnsi="Roboto" w:eastAsia="Roboto" w:cs="Roboto"/>
                 <w:sz w:val="20"/>
               </w:rPr>
-              <w:t>Hebrews 9:12, 5</w:t>
+              <w:t>Hebrews 10:29</w:t>
             </w:r>
           </w:p>
         </w:tc>
@@ -21369,7 +21481,7 @@
                 <w:rFonts w:ascii="Roboto" w:hAnsi="Roboto" w:eastAsia="Roboto" w:cs="Roboto"/>
                 <w:sz w:val="20"/>
               </w:rPr>
-              <w:t>ch. 9, pp. 38, 41</w:t>
+              <w:t>ch. 8, p. 34</w:t>
             </w:r>
           </w:p>
         </w:tc>
@@ -21401,7 +21513,7 @@
                 <w:rFonts w:ascii="Roboto" w:hAnsi="Roboto" w:eastAsia="Roboto" w:cs="Roboto"/>
                 <w:sz w:val="20"/>
               </w:rPr>
-              <w:t>Hebrews 10:29</w:t>
+              <w:t>2 Peter 2:6</w:t>
             </w:r>
           </w:p>
         </w:tc>
@@ -21418,7 +21530,7 @@
                 <w:rFonts w:ascii="Roboto" w:hAnsi="Roboto" w:eastAsia="Roboto" w:cs="Roboto"/>
                 <w:sz w:val="20"/>
               </w:rPr>
-              <w:t>ch. 8, p. 34</w:t>
+              <w:t>ch. 6, p. 21</w:t>
             </w:r>
           </w:p>
         </w:tc>
@@ -21450,7 +21562,7 @@
                 <w:rFonts w:ascii="Roboto" w:hAnsi="Roboto" w:eastAsia="Roboto" w:cs="Roboto"/>
                 <w:sz w:val="20"/>
               </w:rPr>
-              <w:t>2 Peter 2:6</w:t>
+              <w:t>2 Peter 3:5</w:t>
             </w:r>
           </w:p>
         </w:tc>
@@ -21467,7 +21579,7 @@
                 <w:rFonts w:ascii="Roboto" w:hAnsi="Roboto" w:eastAsia="Roboto" w:cs="Roboto"/>
                 <w:sz w:val="20"/>
               </w:rPr>
-              <w:t>ch. 6, p. 21</w:t>
+              <w:t>ch. 3, p. 8</w:t>
             </w:r>
           </w:p>
         </w:tc>
@@ -21499,7 +21611,7 @@
                 <w:rFonts w:ascii="Roboto" w:hAnsi="Roboto" w:eastAsia="Roboto" w:cs="Roboto"/>
                 <w:sz w:val="20"/>
               </w:rPr>
-              <w:t>2 Peter 3:5</w:t>
+              <w:t>2 Peter 3:6</w:t>
             </w:r>
           </w:p>
         </w:tc>
@@ -21516,7 +21628,7 @@
                 <w:rFonts w:ascii="Roboto" w:hAnsi="Roboto" w:eastAsia="Roboto" w:cs="Roboto"/>
                 <w:sz w:val="20"/>
               </w:rPr>
-              <w:t>ch. 3, p. 8</w:t>
+              <w:t>ch. 3, pp. 8, 10</w:t>
             </w:r>
           </w:p>
         </w:tc>
@@ -21548,7 +21660,7 @@
                 <w:rFonts w:ascii="Roboto" w:hAnsi="Roboto" w:eastAsia="Roboto" w:cs="Roboto"/>
                 <w:sz w:val="20"/>
               </w:rPr>
-              <w:t>2 Peter 3:6</w:t>
+              <w:t>2 Peter 3:7</w:t>
             </w:r>
           </w:p>
         </w:tc>
@@ -21565,7 +21677,7 @@
                 <w:rFonts w:ascii="Roboto" w:hAnsi="Roboto" w:eastAsia="Roboto" w:cs="Roboto"/>
                 <w:sz w:val="20"/>
               </w:rPr>
-              <w:t>ch. 3, pp. 8, 10</w:t>
+              <w:t>ch. 3, p. 8</w:t>
             </w:r>
           </w:p>
         </w:tc>
@@ -21597,7 +21709,7 @@
                 <w:rFonts w:ascii="Roboto" w:hAnsi="Roboto" w:eastAsia="Roboto" w:cs="Roboto"/>
                 <w:sz w:val="20"/>
               </w:rPr>
-              <w:t>2 Peter 3:7</w:t>
+              <w:t>1 John 4:18</w:t>
             </w:r>
           </w:p>
         </w:tc>
@@ -21614,7 +21726,7 @@
                 <w:rFonts w:ascii="Roboto" w:hAnsi="Roboto" w:eastAsia="Roboto" w:cs="Roboto"/>
                 <w:sz w:val="20"/>
               </w:rPr>
-              <w:t>ch. 3, p. 8</w:t>
+              <w:t>ch. 6, p. 19</w:t>
             </w:r>
           </w:p>
         </w:tc>
@@ -21646,7 +21758,7 @@
                 <w:rFonts w:ascii="Roboto" w:hAnsi="Roboto" w:eastAsia="Roboto" w:cs="Roboto"/>
                 <w:sz w:val="20"/>
               </w:rPr>
-              <w:t>1 John 4:18</w:t>
+              <w:t>Jude 1:1</w:t>
             </w:r>
           </w:p>
         </w:tc>
@@ -21663,7 +21775,7 @@
                 <w:rFonts w:ascii="Roboto" w:hAnsi="Roboto" w:eastAsia="Roboto" w:cs="Roboto"/>
                 <w:sz w:val="20"/>
               </w:rPr>
-              <w:t>ch. 6, p. 19</w:t>
+              <w:t>ch. 6, p. 21</w:t>
             </w:r>
           </w:p>
         </w:tc>
@@ -21695,7 +21807,7 @@
                 <w:rFonts w:ascii="Roboto" w:hAnsi="Roboto" w:eastAsia="Roboto" w:cs="Roboto"/>
                 <w:sz w:val="20"/>
               </w:rPr>
-              <w:t>Jude 1:1</w:t>
+              <w:t>Jude 1:4</w:t>
             </w:r>
           </w:p>
         </w:tc>
@@ -21744,7 +21856,7 @@
                 <w:rFonts w:ascii="Roboto" w:hAnsi="Roboto" w:eastAsia="Roboto" w:cs="Roboto"/>
                 <w:sz w:val="20"/>
               </w:rPr>
-              <w:t>Jude 1:4</w:t>
+              <w:t>Jude 1:5</w:t>
             </w:r>
           </w:p>
         </w:tc>
@@ -21773,6 +21885,13 @@
             <w:pPr>
               <w:spacing w:after="0" w:before="0" w:line="259" w:lineRule="auto"/>
             </w:pPr>
+            <w:r>
+              <w:rPr>
+                <w:rFonts w:ascii="Roboto" w:hAnsi="Roboto" w:eastAsia="Roboto" w:cs="Roboto"/>
+                <w:sz w:val="20"/>
+              </w:rPr>
+              <w:t>In full, Appendix B</w:t>
+            </w:r>
           </w:p>
         </w:tc>
       </w:tr>
@@ -21793,7 +21912,7 @@
                 <w:rFonts w:ascii="Roboto" w:hAnsi="Roboto" w:eastAsia="Roboto" w:cs="Roboto"/>
                 <w:sz w:val="20"/>
               </w:rPr>
-              <w:t>Jude 1:5</w:t>
+              <w:t>Jude 1:6</w:t>
             </w:r>
           </w:p>
         </w:tc>
@@ -21849,7 +21968,7 @@
                 <w:rFonts w:ascii="Roboto" w:hAnsi="Roboto" w:eastAsia="Roboto" w:cs="Roboto"/>
                 <w:sz w:val="20"/>
               </w:rPr>
-              <w:t>Jude 1:6</w:t>
+              <w:t>Jude 1:7</w:t>
             </w:r>
           </w:p>
         </w:tc>
@@ -21866,7 +21985,7 @@
                 <w:rFonts w:ascii="Roboto" w:hAnsi="Roboto" w:eastAsia="Roboto" w:cs="Roboto"/>
                 <w:sz w:val="20"/>
               </w:rPr>
-              <w:t>ch. 6, p. 21</w:t>
+              <w:t>ch. 6, pp. 18, 21, 22; Conclusion, p. 44</w:t>
             </w:r>
           </w:p>
         </w:tc>
@@ -21905,7 +22024,7 @@
                 <w:rFonts w:ascii="Roboto" w:hAnsi="Roboto" w:eastAsia="Roboto" w:cs="Roboto"/>
                 <w:sz w:val="20"/>
               </w:rPr>
-              <w:t>Jude 1:7</w:t>
+              <w:t>Jude 1:13</w:t>
             </w:r>
           </w:p>
         </w:tc>
@@ -21922,7 +22041,7 @@
                 <w:rFonts w:ascii="Roboto" w:hAnsi="Roboto" w:eastAsia="Roboto" w:cs="Roboto"/>
                 <w:sz w:val="20"/>
               </w:rPr>
-              <w:t>ch. 6, pp. 18, 21, 22; Conclusion, p. 43</w:t>
+              <w:t>ch. 6, p. 21</w:t>
             </w:r>
           </w:p>
         </w:tc>
@@ -21961,7 +22080,7 @@
                 <w:rFonts w:ascii="Roboto" w:hAnsi="Roboto" w:eastAsia="Roboto" w:cs="Roboto"/>
                 <w:sz w:val="20"/>
               </w:rPr>
-              <w:t>Jude 1:13</w:t>
+              <w:t>Revelation 1:1</w:t>
             </w:r>
           </w:p>
         </w:tc>
@@ -21978,7 +22097,7 @@
                 <w:rFonts w:ascii="Roboto" w:hAnsi="Roboto" w:eastAsia="Roboto" w:cs="Roboto"/>
                 <w:sz w:val="20"/>
               </w:rPr>
-              <w:t>ch. 6, p. 21</w:t>
+              <w:t>ch. 8, p. 28</w:t>
             </w:r>
           </w:p>
         </w:tc>
@@ -21990,13 +22109,6 @@
             <w:pPr>
               <w:spacing w:after="0" w:before="0" w:line="259" w:lineRule="auto"/>
             </w:pPr>
-            <w:r>
-              <w:rPr>
-                <w:rFonts w:ascii="Roboto" w:hAnsi="Roboto" w:eastAsia="Roboto" w:cs="Roboto"/>
-                <w:sz w:val="20"/>
-              </w:rPr>
-              <w:t>In full, Appendix B</w:t>
-            </w:r>
           </w:p>
         </w:tc>
       </w:tr>
@@ -22017,7 +22129,7 @@
                 <w:rFonts w:ascii="Roboto" w:hAnsi="Roboto" w:eastAsia="Roboto" w:cs="Roboto"/>
                 <w:sz w:val="20"/>
               </w:rPr>
-              <w:t>Revelation 1:1</w:t>
+              <w:t>Revelation 1:4</w:t>
             </w:r>
           </w:p>
         </w:tc>
@@ -22066,7 +22178,7 @@
                 <w:rFonts w:ascii="Roboto" w:hAnsi="Roboto" w:eastAsia="Roboto" w:cs="Roboto"/>
                 <w:sz w:val="20"/>
               </w:rPr>
-              <w:t>Revelation 1:4</w:t>
+              <w:t>Revelation 2:11</w:t>
             </w:r>
           </w:p>
         </w:tc>
@@ -22083,7 +22195,7 @@
                 <w:rFonts w:ascii="Roboto" w:hAnsi="Roboto" w:eastAsia="Roboto" w:cs="Roboto"/>
                 <w:sz w:val="20"/>
               </w:rPr>
-              <w:t>ch. 8, p. 28</w:t>
+              <w:t>ch. 8, p. 32</w:t>
             </w:r>
           </w:p>
         </w:tc>
@@ -22115,7 +22227,7 @@
                 <w:rFonts w:ascii="Roboto" w:hAnsi="Roboto" w:eastAsia="Roboto" w:cs="Roboto"/>
                 <w:sz w:val="20"/>
               </w:rPr>
-              <w:t>Revelation 2:11</w:t>
+              <w:t>Revelation 3:5</w:t>
             </w:r>
           </w:p>
         </w:tc>
@@ -22132,7 +22244,7 @@
                 <w:rFonts w:ascii="Roboto" w:hAnsi="Roboto" w:eastAsia="Roboto" w:cs="Roboto"/>
                 <w:sz w:val="20"/>
               </w:rPr>
-              <w:t>ch. 8, p. 32</w:t>
+              <w:t>ch. 8, p. 36</w:t>
             </w:r>
           </w:p>
         </w:tc>
@@ -22164,7 +22276,7 @@
                 <w:rFonts w:ascii="Roboto" w:hAnsi="Roboto" w:eastAsia="Roboto" w:cs="Roboto"/>
                 <w:sz w:val="20"/>
               </w:rPr>
-              <w:t>Revelation 3:5</w:t>
+              <w:t>Revelation 4:9, 10</w:t>
             </w:r>
           </w:p>
         </w:tc>
@@ -22181,7 +22293,7 @@
                 <w:rFonts w:ascii="Roboto" w:hAnsi="Roboto" w:eastAsia="Roboto" w:cs="Roboto"/>
                 <w:sz w:val="20"/>
               </w:rPr>
-              <w:t>ch. 8, p. 35</w:t>
+              <w:t>ch. 8, p. 31</w:t>
             </w:r>
           </w:p>
         </w:tc>
@@ -22213,7 +22325,7 @@
                 <w:rFonts w:ascii="Roboto" w:hAnsi="Roboto" w:eastAsia="Roboto" w:cs="Roboto"/>
                 <w:sz w:val="20"/>
               </w:rPr>
-              <w:t>Revelation 4:9, 10</w:t>
+              <w:t>Revelation 6:8</w:t>
             </w:r>
           </w:p>
         </w:tc>
@@ -22230,7 +22342,7 @@
                 <w:rFonts w:ascii="Roboto" w:hAnsi="Roboto" w:eastAsia="Roboto" w:cs="Roboto"/>
                 <w:sz w:val="20"/>
               </w:rPr>
-              <w:t>ch. 8, p. 31</w:t>
+              <w:t>ch. 8, pp. 32, 34</w:t>
             </w:r>
           </w:p>
         </w:tc>
@@ -22262,7 +22374,7 @@
                 <w:rFonts w:ascii="Roboto" w:hAnsi="Roboto" w:eastAsia="Roboto" w:cs="Roboto"/>
                 <w:sz w:val="20"/>
               </w:rPr>
-              <w:t>Revelation 6:8</w:t>
+              <w:t>Revelation 9:5</w:t>
             </w:r>
           </w:p>
         </w:tc>
@@ -22279,7 +22391,7 @@
                 <w:rFonts w:ascii="Roboto" w:hAnsi="Roboto" w:eastAsia="Roboto" w:cs="Roboto"/>
                 <w:sz w:val="20"/>
               </w:rPr>
-              <w:t>ch. 8, pp. 32, 33</w:t>
+              <w:t>ch. 8, p. 29</w:t>
             </w:r>
           </w:p>
         </w:tc>
@@ -22311,7 +22423,7 @@
                 <w:rFonts w:ascii="Roboto" w:hAnsi="Roboto" w:eastAsia="Roboto" w:cs="Roboto"/>
                 <w:sz w:val="20"/>
               </w:rPr>
-              <w:t>Revelation 9:5</w:t>
+              <w:t>Revelation 9:5, 6</w:t>
             </w:r>
           </w:p>
         </w:tc>
@@ -22328,7 +22440,7 @@
                 <w:rFonts w:ascii="Roboto" w:hAnsi="Roboto" w:eastAsia="Roboto" w:cs="Roboto"/>
                 <w:sz w:val="20"/>
               </w:rPr>
-              <w:t>ch. 8, p. 29</w:t>
+              <w:t>ch. 8, p. 30</w:t>
             </w:r>
           </w:p>
         </w:tc>
@@ -22360,7 +22472,7 @@
                 <w:rFonts w:ascii="Roboto" w:hAnsi="Roboto" w:eastAsia="Roboto" w:cs="Roboto"/>
                 <w:sz w:val="20"/>
               </w:rPr>
-              <w:t>Revelation 9:5, 6</w:t>
+              <w:t>Revelation 9:6</w:t>
             </w:r>
           </w:p>
         </w:tc>
@@ -22377,7 +22489,7 @@
                 <w:rFonts w:ascii="Roboto" w:hAnsi="Roboto" w:eastAsia="Roboto" w:cs="Roboto"/>
                 <w:sz w:val="20"/>
               </w:rPr>
-              <w:t>ch. 8, p. 30</w:t>
+              <w:t>ch. 8, p. 29</w:t>
             </w:r>
           </w:p>
         </w:tc>
@@ -22409,7 +22521,7 @@
                 <w:rFonts w:ascii="Roboto" w:hAnsi="Roboto" w:eastAsia="Roboto" w:cs="Roboto"/>
                 <w:sz w:val="20"/>
               </w:rPr>
-              <w:t>Revelation 9:6</w:t>
+              <w:t>Revelation 10:6</w:t>
             </w:r>
           </w:p>
         </w:tc>
@@ -22426,7 +22538,7 @@
                 <w:rFonts w:ascii="Roboto" w:hAnsi="Roboto" w:eastAsia="Roboto" w:cs="Roboto"/>
                 <w:sz w:val="20"/>
               </w:rPr>
-              <w:t>ch. 8, p. 29</w:t>
+              <w:t>ch. 8, p. 31</w:t>
             </w:r>
           </w:p>
         </w:tc>
@@ -22458,7 +22570,7 @@
                 <w:rFonts w:ascii="Roboto" w:hAnsi="Roboto" w:eastAsia="Roboto" w:cs="Roboto"/>
                 <w:sz w:val="20"/>
               </w:rPr>
-              <w:t>Revelation 10:6</w:t>
+              <w:t>Revelation 11:10</w:t>
             </w:r>
           </w:p>
         </w:tc>
@@ -22475,7 +22587,7 @@
                 <w:rFonts w:ascii="Roboto" w:hAnsi="Roboto" w:eastAsia="Roboto" w:cs="Roboto"/>
                 <w:sz w:val="20"/>
               </w:rPr>
-              <w:t>ch. 8, p. 31</w:t>
+              <w:t>ch. 8, pp. 29, 30</w:t>
             </w:r>
           </w:p>
         </w:tc>
@@ -22507,7 +22619,7 @@
                 <w:rFonts w:ascii="Roboto" w:hAnsi="Roboto" w:eastAsia="Roboto" w:cs="Roboto"/>
                 <w:sz w:val="20"/>
               </w:rPr>
-              <w:t>Revelation 11:10</w:t>
+              <w:t>Revelation 11:15</w:t>
             </w:r>
           </w:p>
         </w:tc>
@@ -22524,7 +22636,7 @@
                 <w:rFonts w:ascii="Roboto" w:hAnsi="Roboto" w:eastAsia="Roboto" w:cs="Roboto"/>
                 <w:sz w:val="20"/>
               </w:rPr>
-              <w:t>ch. 8, pp. 29, 30</w:t>
+              <w:t>ch. 8, p. 32</w:t>
             </w:r>
           </w:p>
         </w:tc>
@@ -22556,7 +22668,7 @@
                 <w:rFonts w:ascii="Roboto" w:hAnsi="Roboto" w:eastAsia="Roboto" w:cs="Roboto"/>
                 <w:sz w:val="20"/>
               </w:rPr>
-              <w:t>Revelation 11:15</w:t>
+              <w:t>Revelation 14:1</w:t>
             </w:r>
           </w:p>
         </w:tc>
@@ -22573,7 +22685,7 @@
                 <w:rFonts w:ascii="Roboto" w:hAnsi="Roboto" w:eastAsia="Roboto" w:cs="Roboto"/>
                 <w:sz w:val="20"/>
               </w:rPr>
-              <w:t>ch. 8, p. 31</w:t>
+              <w:t>ch. 8, p. 28</w:t>
             </w:r>
           </w:p>
         </w:tc>
@@ -22605,7 +22717,7 @@
                 <w:rFonts w:ascii="Roboto" w:hAnsi="Roboto" w:eastAsia="Roboto" w:cs="Roboto"/>
                 <w:sz w:val="20"/>
               </w:rPr>
-              <w:t>Revelation 14:1</w:t>
+              <w:t>Revelation 14:6</w:t>
             </w:r>
           </w:p>
         </w:tc>
@@ -22634,6 +22746,13 @@
             <w:pPr>
               <w:spacing w:after="0" w:before="0" w:line="259" w:lineRule="auto"/>
             </w:pPr>
+            <w:r>
+              <w:rPr>
+                <w:rFonts w:ascii="Roboto" w:hAnsi="Roboto" w:eastAsia="Roboto" w:cs="Roboto"/>
+                <w:sz w:val="20"/>
+              </w:rPr>
+              <w:t>In full, Appendix B</w:t>
+            </w:r>
           </w:p>
         </w:tc>
       </w:tr>
@@ -22654,7 +22773,7 @@
                 <w:rFonts w:ascii="Roboto" w:hAnsi="Roboto" w:eastAsia="Roboto" w:cs="Roboto"/>
                 <w:sz w:val="20"/>
               </w:rPr>
-              <w:t>Revelation 14:6</w:t>
+              <w:t>Revelation 14:9–11</w:t>
             </w:r>
           </w:p>
         </w:tc>
@@ -22671,7 +22790,7 @@
                 <w:rFonts w:ascii="Roboto" w:hAnsi="Roboto" w:eastAsia="Roboto" w:cs="Roboto"/>
                 <w:sz w:val="20"/>
               </w:rPr>
-              <w:t>ch. 8, p. 28</w:t>
+              <w:t>ch. 8, pp. 28, 29, 37</w:t>
             </w:r>
           </w:p>
         </w:tc>
@@ -22710,7 +22829,7 @@
                 <w:rFonts w:ascii="Roboto" w:hAnsi="Roboto" w:eastAsia="Roboto" w:cs="Roboto"/>
                 <w:sz w:val="20"/>
               </w:rPr>
-              <w:t>Revelation 14:9–11</w:t>
+              <w:t>Revelation 14:10, 11</w:t>
             </w:r>
           </w:p>
         </w:tc>
@@ -22727,7 +22846,7 @@
                 <w:rFonts w:ascii="Roboto" w:hAnsi="Roboto" w:eastAsia="Roboto" w:cs="Roboto"/>
                 <w:sz w:val="20"/>
               </w:rPr>
-              <w:t>ch. 8, pp. 28, 29, 36</w:t>
+              <w:t>ch. 2, p. 5; ch. 8, p. 30; ch. 9, p. 39</w:t>
             </w:r>
           </w:p>
         </w:tc>
@@ -22766,7 +22885,7 @@
                 <w:rFonts w:ascii="Roboto" w:hAnsi="Roboto" w:eastAsia="Roboto" w:cs="Roboto"/>
                 <w:sz w:val="20"/>
               </w:rPr>
-              <w:t>Revelation 14:10, 11</w:t>
+              <w:t>Revelation 14:11</w:t>
             </w:r>
           </w:p>
         </w:tc>
@@ -22783,7 +22902,7 @@
                 <w:rFonts w:ascii="Roboto" w:hAnsi="Roboto" w:eastAsia="Roboto" w:cs="Roboto"/>
                 <w:sz w:val="20"/>
               </w:rPr>
-              <w:t>ch. 2, p. 4; ch. 8, p. 30; ch. 9, p. 38</w:t>
+              <w:t>ch. 8, p. 31</w:t>
             </w:r>
           </w:p>
         </w:tc>
@@ -22822,7 +22941,7 @@
                 <w:rFonts w:ascii="Roboto" w:hAnsi="Roboto" w:eastAsia="Roboto" w:cs="Roboto"/>
                 <w:sz w:val="20"/>
               </w:rPr>
-              <w:t>Revelation 14:11</w:t>
+              <w:t>Revelation 14:13</w:t>
             </w:r>
           </w:p>
         </w:tc>
@@ -22839,7 +22958,7 @@
                 <w:rFonts w:ascii="Roboto" w:hAnsi="Roboto" w:eastAsia="Roboto" w:cs="Roboto"/>
                 <w:sz w:val="20"/>
               </w:rPr>
-              <w:t>ch. 8, p. 31</w:t>
+              <w:t>ch. 8, p. 29</w:t>
             </w:r>
           </w:p>
         </w:tc>
@@ -22878,7 +22997,7 @@
                 <w:rFonts w:ascii="Roboto" w:hAnsi="Roboto" w:eastAsia="Roboto" w:cs="Roboto"/>
                 <w:sz w:val="20"/>
               </w:rPr>
-              <w:t>Revelation 14:13</w:t>
+              <w:t>Revelation 16:7</w:t>
             </w:r>
           </w:p>
         </w:tc>
@@ -22895,7 +23014,7 @@
                 <w:rFonts w:ascii="Roboto" w:hAnsi="Roboto" w:eastAsia="Roboto" w:cs="Roboto"/>
                 <w:sz w:val="20"/>
               </w:rPr>
-              <w:t>ch. 8, p. 29</w:t>
+              <w:t>ch. 9, p. 40</w:t>
             </w:r>
           </w:p>
         </w:tc>
@@ -22907,13 +23026,6 @@
             <w:pPr>
               <w:spacing w:after="0" w:before="0" w:line="259" w:lineRule="auto"/>
             </w:pPr>
-            <w:r>
-              <w:rPr>
-                <w:rFonts w:ascii="Roboto" w:hAnsi="Roboto" w:eastAsia="Roboto" w:cs="Roboto"/>
-                <w:sz w:val="20"/>
-              </w:rPr>
-              <w:t>In full, Appendix B</w:t>
-            </w:r>
           </w:p>
         </w:tc>
       </w:tr>
@@ -22934,7 +23046,7 @@
                 <w:rFonts w:ascii="Roboto" w:hAnsi="Roboto" w:eastAsia="Roboto" w:cs="Roboto"/>
                 <w:sz w:val="20"/>
               </w:rPr>
-              <w:t>Revelation 16:7</w:t>
+              <w:t>Revelation 16:10, 11</w:t>
             </w:r>
           </w:p>
         </w:tc>
@@ -22951,7 +23063,7 @@
                 <w:rFonts w:ascii="Roboto" w:hAnsi="Roboto" w:eastAsia="Roboto" w:cs="Roboto"/>
                 <w:sz w:val="20"/>
               </w:rPr>
-              <w:t>ch. 9, p. 40</w:t>
+              <w:t>ch. 8, pp. 29, 31</w:t>
             </w:r>
           </w:p>
         </w:tc>
@@ -22983,7 +23095,7 @@
                 <w:rFonts w:ascii="Roboto" w:hAnsi="Roboto" w:eastAsia="Roboto" w:cs="Roboto"/>
                 <w:sz w:val="20"/>
               </w:rPr>
-              <w:t>Revelation 16:10, 11</w:t>
+              <w:t>Revelation 19:2</w:t>
             </w:r>
           </w:p>
         </w:tc>
@@ -23000,7 +23112,7 @@
                 <w:rFonts w:ascii="Roboto" w:hAnsi="Roboto" w:eastAsia="Roboto" w:cs="Roboto"/>
                 <w:sz w:val="20"/>
               </w:rPr>
-              <w:t>ch. 8, pp. 29, 30</w:t>
+              <w:t>ch. 9, p. 40</w:t>
             </w:r>
           </w:p>
         </w:tc>
@@ -23032,7 +23144,7 @@
                 <w:rFonts w:ascii="Roboto" w:hAnsi="Roboto" w:eastAsia="Roboto" w:cs="Roboto"/>
                 <w:sz w:val="20"/>
               </w:rPr>
-              <w:t>Revelation 19:2</w:t>
+              <w:t>Revelation 19:3</w:t>
             </w:r>
           </w:p>
         </w:tc>
@@ -23049,7 +23161,7 @@
                 <w:rFonts w:ascii="Roboto" w:hAnsi="Roboto" w:eastAsia="Roboto" w:cs="Roboto"/>
                 <w:sz w:val="20"/>
               </w:rPr>
-              <w:t>ch. 9, p. 40</w:t>
+              <w:t>ch. 8, p. 29; ch. 9, pp. 40, 42</w:t>
             </w:r>
           </w:p>
         </w:tc>
@@ -23081,7 +23193,7 @@
                 <w:rFonts w:ascii="Roboto" w:hAnsi="Roboto" w:eastAsia="Roboto" w:cs="Roboto"/>
                 <w:sz w:val="20"/>
               </w:rPr>
-              <w:t>Revelation 19:3</w:t>
+              <w:t>Revelation 19:20</w:t>
             </w:r>
           </w:p>
         </w:tc>
@@ -23098,7 +23210,7 @@
                 <w:rFonts w:ascii="Roboto" w:hAnsi="Roboto" w:eastAsia="Roboto" w:cs="Roboto"/>
                 <w:sz w:val="20"/>
               </w:rPr>
-              <w:t>ch. 8, p. 29; ch. 9, pp. 39, 41</w:t>
+              <w:t>ch. 8, pp. 31, 32, 33</w:t>
             </w:r>
           </w:p>
         </w:tc>
@@ -23110,6 +23222,13 @@
             <w:pPr>
               <w:spacing w:after="0" w:before="0" w:line="259" w:lineRule="auto"/>
             </w:pPr>
+            <w:r>
+              <w:rPr>
+                <w:rFonts w:ascii="Roboto" w:hAnsi="Roboto" w:eastAsia="Roboto" w:cs="Roboto"/>
+                <w:sz w:val="20"/>
+              </w:rPr>
+              <w:t>In full, Appendix B</w:t>
+            </w:r>
           </w:p>
         </w:tc>
       </w:tr>
@@ -23130,7 +23249,7 @@
                 <w:rFonts w:ascii="Roboto" w:hAnsi="Roboto" w:eastAsia="Roboto" w:cs="Roboto"/>
                 <w:sz w:val="20"/>
               </w:rPr>
-              <w:t>Revelation 19:20</w:t>
+              <w:t>Revelation 19:21</w:t>
             </w:r>
           </w:p>
         </w:tc>
@@ -23147,7 +23266,7 @@
                 <w:rFonts w:ascii="Roboto" w:hAnsi="Roboto" w:eastAsia="Roboto" w:cs="Roboto"/>
                 <w:sz w:val="20"/>
               </w:rPr>
-              <w:t>ch. 8, pp. 31, 32, 33</w:t>
+              <w:t>ch. 8, p. 31</w:t>
             </w:r>
           </w:p>
         </w:tc>
@@ -23186,7 +23305,7 @@
                 <w:rFonts w:ascii="Roboto" w:hAnsi="Roboto" w:eastAsia="Roboto" w:cs="Roboto"/>
                 <w:sz w:val="20"/>
               </w:rPr>
-              <w:t>Revelation 19:21</w:t>
+              <w:t>Revelation 20:1–3</w:t>
             </w:r>
           </w:p>
         </w:tc>
@@ -23242,7 +23361,7 @@
                 <w:rFonts w:ascii="Roboto" w:hAnsi="Roboto" w:eastAsia="Roboto" w:cs="Roboto"/>
                 <w:sz w:val="20"/>
               </w:rPr>
-              <w:t>Revelation 20:1–3</w:t>
+              <w:t>Revelation 20:6</w:t>
             </w:r>
           </w:p>
         </w:tc>
@@ -23259,7 +23378,7 @@
                 <w:rFonts w:ascii="Roboto" w:hAnsi="Roboto" w:eastAsia="Roboto" w:cs="Roboto"/>
                 <w:sz w:val="20"/>
               </w:rPr>
-              <w:t>ch. 8, p. 31</w:t>
+              <w:t>ch. 8, pp. 32, 35, 37</w:t>
             </w:r>
           </w:p>
         </w:tc>
@@ -23298,7 +23417,7 @@
                 <w:rFonts w:ascii="Roboto" w:hAnsi="Roboto" w:eastAsia="Roboto" w:cs="Roboto"/>
                 <w:sz w:val="20"/>
               </w:rPr>
-              <w:t>Revelation 20:6</w:t>
+              <w:t>Revelation 20:7–9</w:t>
             </w:r>
           </w:p>
         </w:tc>
@@ -23315,7 +23434,7 @@
                 <w:rFonts w:ascii="Roboto" w:hAnsi="Roboto" w:eastAsia="Roboto" w:cs="Roboto"/>
                 <w:sz w:val="20"/>
               </w:rPr>
-              <w:t>ch. 8, pp. 32, 35</w:t>
+              <w:t>ch. 8, p. 31</w:t>
             </w:r>
           </w:p>
         </w:tc>
@@ -23354,7 +23473,7 @@
                 <w:rFonts w:ascii="Roboto" w:hAnsi="Roboto" w:eastAsia="Roboto" w:cs="Roboto"/>
                 <w:sz w:val="20"/>
               </w:rPr>
-              <w:t>Revelation 20:7–9</w:t>
+              <w:t>Revelation 20:8, 9</w:t>
             </w:r>
           </w:p>
         </w:tc>
@@ -23371,7 +23490,7 @@
                 <w:rFonts w:ascii="Roboto" w:hAnsi="Roboto" w:eastAsia="Roboto" w:cs="Roboto"/>
                 <w:sz w:val="20"/>
               </w:rPr>
-              <w:t>ch. 8, p. 31</w:t>
+              <w:t>ch. 8, p. 36</w:t>
             </w:r>
           </w:p>
         </w:tc>
@@ -23410,7 +23529,7 @@
                 <w:rFonts w:ascii="Roboto" w:hAnsi="Roboto" w:eastAsia="Roboto" w:cs="Roboto"/>
                 <w:sz w:val="20"/>
               </w:rPr>
-              <w:t>Revelation 20:8, 9</w:t>
+              <w:t>Revelation 20:9</w:t>
             </w:r>
           </w:p>
         </w:tc>
@@ -23427,7 +23546,7 @@
                 <w:rFonts w:ascii="Roboto" w:hAnsi="Roboto" w:eastAsia="Roboto" w:cs="Roboto"/>
                 <w:sz w:val="20"/>
               </w:rPr>
-              <w:t>ch. 8, p. 35</w:t>
+              <w:t>ch. 9, p. 41</w:t>
             </w:r>
           </w:p>
         </w:tc>
@@ -23466,7 +23585,7 @@
                 <w:rFonts w:ascii="Roboto" w:hAnsi="Roboto" w:eastAsia="Roboto" w:cs="Roboto"/>
                 <w:sz w:val="20"/>
               </w:rPr>
-              <w:t>Revelation 20:9</w:t>
+              <w:t>Revelation 20:10</w:t>
             </w:r>
           </w:p>
         </w:tc>
@@ -23483,7 +23602,7 @@
                 <w:rFonts w:ascii="Roboto" w:hAnsi="Roboto" w:eastAsia="Roboto" w:cs="Roboto"/>
                 <w:sz w:val="20"/>
               </w:rPr>
-              <w:t>ch. 9, pp. 40, 41</w:t>
+              <w:t>ch. 2, p. 5; ch. 6, p. 20; ch. 8, pp. 29, 30, 31, 32, 33, 37; ch. 9, pp. 40, 42</w:t>
             </w:r>
           </w:p>
         </w:tc>
@@ -23522,7 +23641,7 @@
                 <w:rFonts w:ascii="Roboto" w:hAnsi="Roboto" w:eastAsia="Roboto" w:cs="Roboto"/>
                 <w:sz w:val="20"/>
               </w:rPr>
-              <w:t>Revelation 20:10</w:t>
+              <w:t>Revelation 20:10, 14</w:t>
             </w:r>
           </w:p>
         </w:tc>
@@ -23539,7 +23658,7 @@
                 <w:rFonts w:ascii="Roboto" w:hAnsi="Roboto" w:eastAsia="Roboto" w:cs="Roboto"/>
                 <w:sz w:val="20"/>
               </w:rPr>
-              <w:t>ch. 2, p. 4; ch. 6, p. 20; ch. 8, pp. 29, 31, 32, 33, 37; ch. 9, p. 39</w:t>
+              <w:t>ch. 8, p. 34</w:t>
             </w:r>
           </w:p>
         </w:tc>
@@ -23578,7 +23697,7 @@
                 <w:rFonts w:ascii="Roboto" w:hAnsi="Roboto" w:eastAsia="Roboto" w:cs="Roboto"/>
                 <w:sz w:val="20"/>
               </w:rPr>
-              <w:t>Revelation 20:10, 14</w:t>
+              <w:t>Revelation 20:11</w:t>
             </w:r>
           </w:p>
         </w:tc>
@@ -23595,7 +23714,7 @@
                 <w:rFonts w:ascii="Roboto" w:hAnsi="Roboto" w:eastAsia="Roboto" w:cs="Roboto"/>
                 <w:sz w:val="20"/>
               </w:rPr>
-              <w:t>ch. 8, p. 33</w:t>
+              <w:t>ch. 5, p. 17; ch. 8, p. 34</w:t>
             </w:r>
           </w:p>
         </w:tc>
@@ -23634,7 +23753,7 @@
                 <w:rFonts w:ascii="Roboto" w:hAnsi="Roboto" w:eastAsia="Roboto" w:cs="Roboto"/>
                 <w:sz w:val="20"/>
               </w:rPr>
-              <w:t>Revelation 20:11</w:t>
+              <w:t>Revelation 20:11–15</w:t>
             </w:r>
           </w:p>
         </w:tc>
@@ -23651,7 +23770,7 @@
                 <w:rFonts w:ascii="Roboto" w:hAnsi="Roboto" w:eastAsia="Roboto" w:cs="Roboto"/>
                 <w:sz w:val="20"/>
               </w:rPr>
-              <w:t>ch. 5, p. 17; ch. 8, p. 33</w:t>
+              <w:t>ch. 2, p. 5; ch. 8, p. 34</w:t>
             </w:r>
           </w:p>
         </w:tc>
@@ -23690,7 +23809,7 @@
                 <w:rFonts w:ascii="Roboto" w:hAnsi="Roboto" w:eastAsia="Roboto" w:cs="Roboto"/>
                 <w:sz w:val="20"/>
               </w:rPr>
-              <w:t>Revelation 20:11–15</w:t>
+              <w:t>Revelation 20:12</w:t>
             </w:r>
           </w:p>
         </w:tc>
@@ -23707,7 +23826,7 @@
                 <w:rFonts w:ascii="Roboto" w:hAnsi="Roboto" w:eastAsia="Roboto" w:cs="Roboto"/>
                 <w:sz w:val="20"/>
               </w:rPr>
-              <w:t>ch. 2, p. 4; ch. 8, p. 33</w:t>
+              <w:t>ch. 8, pp. 33, 34, 35</w:t>
             </w:r>
           </w:p>
         </w:tc>
@@ -23746,7 +23865,7 @@
                 <w:rFonts w:ascii="Roboto" w:hAnsi="Roboto" w:eastAsia="Roboto" w:cs="Roboto"/>
                 <w:sz w:val="20"/>
               </w:rPr>
-              <w:t>Revelation 20:12</w:t>
+              <w:t>Revelation 20:12, 13</w:t>
             </w:r>
           </w:p>
         </w:tc>
@@ -23763,7 +23882,7 @@
                 <w:rFonts w:ascii="Roboto" w:hAnsi="Roboto" w:eastAsia="Roboto" w:cs="Roboto"/>
                 <w:sz w:val="20"/>
               </w:rPr>
-              <w:t>ch. 8, pp. 32, 33, 34, 35</w:t>
+              <w:t>ch. 8, p. 34</w:t>
             </w:r>
           </w:p>
         </w:tc>
@@ -23802,7 +23921,7 @@
                 <w:rFonts w:ascii="Roboto" w:hAnsi="Roboto" w:eastAsia="Roboto" w:cs="Roboto"/>
                 <w:sz w:val="20"/>
               </w:rPr>
-              <w:t>Revelation 20:12, 13</w:t>
+              <w:t>Revelation 20:12–14</w:t>
             </w:r>
           </w:p>
         </w:tc>
@@ -23819,7 +23938,7 @@
                 <w:rFonts w:ascii="Roboto" w:hAnsi="Roboto" w:eastAsia="Roboto" w:cs="Roboto"/>
                 <w:sz w:val="20"/>
               </w:rPr>
-              <w:t>ch. 8, p. 33</w:t>
+              <w:t>ch. 8, p. 34</w:t>
             </w:r>
           </w:p>
         </w:tc>
@@ -23858,7 +23977,7 @@
                 <w:rFonts w:ascii="Roboto" w:hAnsi="Roboto" w:eastAsia="Roboto" w:cs="Roboto"/>
                 <w:sz w:val="20"/>
               </w:rPr>
-              <w:t>Revelation 20:12–14</w:t>
+              <w:t>Revelation 20:13</w:t>
             </w:r>
           </w:p>
         </w:tc>
@@ -23875,7 +23994,7 @@
                 <w:rFonts w:ascii="Roboto" w:hAnsi="Roboto" w:eastAsia="Roboto" w:cs="Roboto"/>
                 <w:sz w:val="20"/>
               </w:rPr>
-              <w:t>ch. 8, p. 33</w:t>
+              <w:t>ch. 8, pp. 33, 34</w:t>
             </w:r>
           </w:p>
         </w:tc>
@@ -23914,7 +24033,7 @@
                 <w:rFonts w:ascii="Roboto" w:hAnsi="Roboto" w:eastAsia="Roboto" w:cs="Roboto"/>
                 <w:sz w:val="20"/>
               </w:rPr>
-              <w:t>Revelation 20:13</w:t>
+              <w:t>Revelation 20:14</w:t>
             </w:r>
           </w:p>
         </w:tc>
@@ -23931,7 +24050,7 @@
                 <w:rFonts w:ascii="Roboto" w:hAnsi="Roboto" w:eastAsia="Roboto" w:cs="Roboto"/>
                 <w:sz w:val="20"/>
               </w:rPr>
-              <w:t>ch. 8, pp. 32, 33</w:t>
+              <w:t>ch. 2, p. 5; ch. 8, pp. 32, 33, 35</w:t>
             </w:r>
           </w:p>
         </w:tc>
@@ -23970,7 +24089,7 @@
                 <w:rFonts w:ascii="Roboto" w:hAnsi="Roboto" w:eastAsia="Roboto" w:cs="Roboto"/>
                 <w:sz w:val="20"/>
               </w:rPr>
-              <w:t>Revelation 20:14</w:t>
+              <w:t>Revelation 20:14, 15</w:t>
             </w:r>
           </w:p>
         </w:tc>
@@ -23987,7 +24106,7 @@
                 <w:rFonts w:ascii="Roboto" w:hAnsi="Roboto" w:eastAsia="Roboto" w:cs="Roboto"/>
                 <w:sz w:val="20"/>
               </w:rPr>
-              <w:t>ch. 2, p. 4; ch. 8, pp. 32, 33, 35</w:t>
+              <w:t>ch. 8, p. 34</w:t>
             </w:r>
           </w:p>
         </w:tc>
@@ -24026,7 +24145,7 @@
                 <w:rFonts w:ascii="Roboto" w:hAnsi="Roboto" w:eastAsia="Roboto" w:cs="Roboto"/>
                 <w:sz w:val="20"/>
               </w:rPr>
-              <w:t>Revelation 20:14, 15</w:t>
+              <w:t>Revelation 20:15</w:t>
             </w:r>
           </w:p>
         </w:tc>
@@ -24043,7 +24162,7 @@
                 <w:rFonts w:ascii="Roboto" w:hAnsi="Roboto" w:eastAsia="Roboto" w:cs="Roboto"/>
                 <w:sz w:val="20"/>
               </w:rPr>
-              <w:t>ch. 8, p. 33</w:t>
+              <w:t>ch. 8, pp. 32, 36</w:t>
             </w:r>
           </w:p>
         </w:tc>
@@ -24082,7 +24201,7 @@
                 <w:rFonts w:ascii="Roboto" w:hAnsi="Roboto" w:eastAsia="Roboto" w:cs="Roboto"/>
                 <w:sz w:val="20"/>
               </w:rPr>
-              <w:t>Revelation 20:15</w:t>
+              <w:t>Revelation 21:4</w:t>
             </w:r>
           </w:p>
         </w:tc>
@@ -24099,7 +24218,7 @@
                 <w:rFonts w:ascii="Roboto" w:hAnsi="Roboto" w:eastAsia="Roboto" w:cs="Roboto"/>
                 <w:sz w:val="20"/>
               </w:rPr>
-              <w:t>ch. 8, pp. 32, 35</w:t>
+              <w:t>ch. 8, p. 33</w:t>
             </w:r>
           </w:p>
         </w:tc>
@@ -24138,7 +24257,7 @@
                 <w:rFonts w:ascii="Roboto" w:hAnsi="Roboto" w:eastAsia="Roboto" w:cs="Roboto"/>
                 <w:sz w:val="20"/>
               </w:rPr>
-              <w:t>Revelation 21:4</w:t>
+              <w:t>Revelation 21:8</w:t>
             </w:r>
           </w:p>
         </w:tc>
@@ -24155,7 +24274,7 @@
                 <w:rFonts w:ascii="Roboto" w:hAnsi="Roboto" w:eastAsia="Roboto" w:cs="Roboto"/>
                 <w:sz w:val="20"/>
               </w:rPr>
-              <w:t>ch. 8, p. 33</w:t>
+              <w:t>ch. 2, p. 5; ch. 8, pp. 32, 33, 34</w:t>
             </w:r>
           </w:p>
         </w:tc>
@@ -24194,7 +24313,7 @@
                 <w:rFonts w:ascii="Roboto" w:hAnsi="Roboto" w:eastAsia="Roboto" w:cs="Roboto"/>
                 <w:sz w:val="20"/>
               </w:rPr>
-              <w:t>Revelation 21:8</w:t>
+              <w:t>Revelation 21:24</w:t>
             </w:r>
           </w:p>
         </w:tc>
@@ -24211,7 +24330,7 @@
                 <w:rFonts w:ascii="Roboto" w:hAnsi="Roboto" w:eastAsia="Roboto" w:cs="Roboto"/>
                 <w:sz w:val="20"/>
               </w:rPr>
-              <w:t>ch. 2, p. 4; ch. 8, pp. 32, 33</w:t>
+              <w:t>ch. 8, p. 36</w:t>
             </w:r>
           </w:p>
         </w:tc>
@@ -24223,13 +24342,6 @@
             <w:pPr>
               <w:spacing w:after="0" w:before="0" w:line="259" w:lineRule="auto"/>
             </w:pPr>
-            <w:r>
-              <w:rPr>
-                <w:rFonts w:ascii="Roboto" w:hAnsi="Roboto" w:eastAsia="Roboto" w:cs="Roboto"/>
-                <w:sz w:val="20"/>
-              </w:rPr>
-              <w:t>In full, Appendix B</w:t>
-            </w:r>
           </w:p>
         </w:tc>
       </w:tr>
@@ -24250,7 +24362,7 @@
                 <w:rFonts w:ascii="Roboto" w:hAnsi="Roboto" w:eastAsia="Roboto" w:cs="Roboto"/>
                 <w:sz w:val="20"/>
               </w:rPr>
-              <w:t>Revelation 21:24</w:t>
+              <w:t>Revelation 21:27</w:t>
             </w:r>
           </w:p>
         </w:tc>
@@ -24267,7 +24379,7 @@
                 <w:rFonts w:ascii="Roboto" w:hAnsi="Roboto" w:eastAsia="Roboto" w:cs="Roboto"/>
                 <w:sz w:val="20"/>
               </w:rPr>
-              <w:t>ch. 8, p. 35</w:t>
+              <w:t>ch. 8, pp. 33, 36</w:t>
             </w:r>
           </w:p>
         </w:tc>
@@ -24299,7 +24411,7 @@
                 <w:rFonts w:ascii="Roboto" w:hAnsi="Roboto" w:eastAsia="Roboto" w:cs="Roboto"/>
                 <w:sz w:val="20"/>
               </w:rPr>
-              <w:t>Revelation 21:27</w:t>
+              <w:t>Revelation 22:5</w:t>
             </w:r>
           </w:p>
         </w:tc>
@@ -24316,56 +24428,7 @@
                 <w:rFonts w:ascii="Roboto" w:hAnsi="Roboto" w:eastAsia="Roboto" w:cs="Roboto"/>
                 <w:sz w:val="20"/>
               </w:rPr>
-              <w:t>ch. 8, pp. 33, 35</w:t>
-            </w:r>
-          </w:p>
-        </w:tc>
-        <w:tc>
-          <w:tcPr>
-            <w:tcW w:w="1903" w:type="dxa"/>
-          </w:tcPr>
-          <w:p>
-            <w:pPr>
-              <w:spacing w:after="0" w:before="0" w:line="259" w:lineRule="auto"/>
-            </w:pPr>
-          </w:p>
-        </w:tc>
-      </w:tr>
-      <w:tr>
-        <w:trPr>
-          <w:cantSplit/>
-        </w:trPr>
-        <w:tc>
-          <w:tcPr>
-            <w:tcW w:w="1904" w:type="dxa"/>
-          </w:tcPr>
-          <w:p>
-            <w:pPr>
-              <w:spacing w:after="0" w:before="0" w:line="259" w:lineRule="auto"/>
-            </w:pPr>
-            <w:r>
-              <w:rPr>
-                <w:rFonts w:ascii="Roboto" w:hAnsi="Roboto" w:eastAsia="Roboto" w:cs="Roboto"/>
-                <w:sz w:val="20"/>
-              </w:rPr>
-              <w:t>Revelation 22:5</w:t>
-            </w:r>
-          </w:p>
-        </w:tc>
-        <w:tc>
-          <w:tcPr>
-            <w:tcW w:w="3808" w:type="dxa"/>
-          </w:tcPr>
-          <w:p>
-            <w:pPr>
-              <w:spacing w:after="0" w:before="0" w:line="259" w:lineRule="auto"/>
-            </w:pPr>
-            <w:r>
-              <w:rPr>
-                <w:rFonts w:ascii="Roboto" w:hAnsi="Roboto" w:eastAsia="Roboto" w:cs="Roboto"/>
-                <w:sz w:val="20"/>
-              </w:rPr>
-              <w:t>ch. 8, p. 31</w:t>
+              <w:t>ch. 8, p. 32</w:t>
             </w:r>
           </w:p>
         </w:tc>
@@ -24503,7 +24566,7 @@
           <w:rFonts w:ascii="Roboto" w:hAnsi="Roboto" w:eastAsia="Roboto" w:cs="Roboto"/>
           <w:sz w:val="20"/>
         </w:rPr>
-        <w:t xml:space="preserve"> 111, no. 3 (1997): 198–217. Quoted briefly from the free full text. Atkinson’s positions are described as Peterson reports them.</w:t>
+        <w:t xml:space="preserve"> 111, no. 3 (1997): 198–217. Quoted briefly from the free full text. Atkinson’s positions are known here only as Peterson reports them and are described so.</w:t>
       </w:r>
     </w:p>
     <w:p>

</xml_diff>

<commit_message>
The End of the Lost: answer-first rewrite of objections and replies, openings conformed in chapters 2-8
Co-Authored-By: Claude Sonnet 5.5 <noreply@anthropic.com>
Claude-Session: https://claude.ai/code/session_019KSmWUdVBWY1ogjaJqRPqC
</commit_message>
<xml_diff>
--- a/build-tools/commentary/endoflost/out/volume.docx
+++ b/build-tools/commentary/endoflost/out/volume.docx
@@ -228,7 +228,7 @@
         </w:rPr>
         <w:t>Conclusion</w:t>
         <w:tab/>
-        <w:t>43</w:t>
+        <w:t>44</w:t>
       </w:r>
     </w:p>
     <w:p>
@@ -244,7 +244,7 @@
         </w:rPr>
         <w:t>Appendix A. The Passages at a Glance</w:t>
         <w:tab/>
-        <w:t>45</w:t>
+        <w:t>46</w:t>
       </w:r>
     </w:p>
     <w:p>
@@ -260,7 +260,7 @@
         </w:rPr>
         <w:t>Appendix B. The Key Passages in Full</w:t>
         <w:tab/>
-        <w:t>46</w:t>
+        <w:t>47</w:t>
       </w:r>
     </w:p>
     <w:p>
@@ -276,7 +276,7 @@
         </w:rPr>
         <w:t>Appendix C. Where the Passages Are Read</w:t>
         <w:tab/>
-        <w:t>51</w:t>
+        <w:t>52</w:t>
       </w:r>
     </w:p>
     <w:p>
@@ -292,7 +292,7 @@
         </w:rPr>
         <w:t>Bibliography</w:t>
         <w:tab/>
-        <w:t>58</w:t>
+        <w:t>59</w:t>
       </w:r>
     </w:p>
     <w:p>
@@ -2023,7 +2023,7 @@
           <w:rFonts w:ascii="Roboto" w:hAnsi="Roboto" w:eastAsia="Roboto" w:cs="Roboto"/>
           <w:sz w:val="20"/>
         </w:rPr>
-        <w:t>The words of destruction and death sometimes describe an end, and the volume says so first. Of the flood the record says, “All in whose nostrils was the breath of life, of all that was in the dry land, died” (Genesis 7:22), and in the next verse, “every living substance was destroyed which was upon the face of the ground” (Genesis 7:23). Destroyed and died stand side by side, and the destroying is the dying. When Nebuchadnezzar was angry with the wise men, he “commanded to destroy all the wise men of Babylon” (Daniel 2:12), and the destroying is killing. When the Pharisees “held a council against him, how they might destroy him” (Matthew 12:14), the word is again the word for taking life. Of the sons of Korah’s company the record is that “they perished from among the congregation” (Numbers 16:33) after the earth closed upon them.</w:t>
+        <w:t>Destroy, perish and die describe an end wherever a verse tells of a person put to death, and the volume sets that evidence out first so that the rest of the chapter can be read against it. Of the flood the record says, “All in whose nostrils was the breath of life, of all that was in the dry land, died” (Genesis 7:22), and in the next verse, “every living substance was destroyed which was upon the face of the ground” (Genesis 7:23). Destroyed and died stand side by side, and the destroying is the dying. When Nebuchadnezzar was angry with the wise men, he “commanded to destroy all the wise men of Babylon” (Daniel 2:12), and the destroying is killing. When the Pharisees “held a council against him, how they might destroy him” (Matthew 12:14), the word is again the word for taking life. Of the sons of Korah’s company the record is that “they perished from among the congregation” (Numbers 16:33) after the earth closed upon them.</w:t>
       </w:r>
     </w:p>
     <w:p>
@@ -2035,7 +2035,7 @@
           <w:rFonts w:ascii="Roboto" w:hAnsi="Roboto" w:eastAsia="Roboto" w:cs="Roboto"/>
           <w:sz w:val="20"/>
         </w:rPr>
-        <w:t>These are plain, and an annihilationist is right to cite them. Where a verse tells of a person put to death, destroy and perish describe the death. The volume does not deny it. The question is whether that is the only use of the words, and whether a verse in which they stand beside a judgment after death must be read as these are.</w:t>
+        <w:t>These verses prove that destroy and perish can describe death, and the volume does not deny it. They do not prove that every verse in which the words stand beside a judgment after death must be read as these are. That is the question the chapter answers.</w:t>
       </w:r>
     </w:p>
     <w:p>
@@ -3901,7 +3901,7 @@
           <w:rFonts w:ascii="Roboto" w:hAnsi="Roboto" w:eastAsia="Roboto" w:cs="Roboto"/>
           <w:sz w:val="20"/>
         </w:rPr>
-        <w:t>A writer who holds that the lost cease to exist reads the verse as the plainest statement of his case. God is able to destroy the soul. If the soul can be destroyed, it is not by nature beyond the reach of its Maker, and the ordinary idea that the soul cannot die is not found in this verse. The volume grants both points. Matthew 10:28 does not teach that the soul is indestructible, and nothing in this volume rests on the idea that it is. The verse also treats the soul and the body together as the object of the power, which is the opposite of the picture in which the body perishes and the soul goes on untouched.</w:t>
+        <w:t>Matthew 10:28 does not teach that the soul is indestructible, and nothing in this volume rests on the idea that it is. The writer who holds that the lost cease to exist reads the verse as the plainest statement of his case: God is able to destroy the soul, so the soul is not by nature beyond the reach of its Maker. The volume agrees with both points. The verse also treats the soul and the body together as the object of the power, which is the opposite of the picture in which the body perishes and the soul goes on untouched.</w:t>
       </w:r>
     </w:p>
     <w:p>
@@ -3913,7 +3913,7 @@
           <w:rFonts w:ascii="Roboto" w:hAnsi="Roboto" w:eastAsia="Roboto" w:cs="Roboto"/>
           <w:sz w:val="20"/>
         </w:rPr>
-        <w:t>The writer goes a step further and reads “destroy” as the act of ending the person, and “able” as a statement of what God will do. The first step is possible. The second is a conclusion the verse does not draw. A power is not an outcome, and the Lord in the same chapter speaks of degrees in the day of judgment, which is a statement about the condition of those judged and not only about their removal. The volume therefore does not say that Matthew 10:28 proves a continuing experience. It says that the verse states a power and a place, that Luke 12:5 describes the exercise of the power as a casting into hell, and that neither verse says what the person is afterwards.</w:t>
+        <w:t>Matthew 10:28 states a power and not an outcome. The writer who holds that the lost cease to exist goes a step further and reads “destroy” as the act of ending the person, and “able” as a statement of what God will do. The first step is possible. The second is a conclusion the verse does not draw. A power is not an outcome, and the Lord in the same chapter speaks of degrees in the day of judgment, which is a statement about the condition of those judged and not only about their removal. The volume therefore does not say that Matthew 10:28 proves a continuing experience, and it does not say that the verse proves a ceasing. It says that the verse states a power and a place, that Luke 12:5 describes the exercise of the power as a casting into hell, and that neither verse says what the person is afterwards.</w:t>
       </w:r>
     </w:p>
     <w:p>
@@ -3951,7 +3951,7 @@
           <w:rFonts w:ascii="Roboto" w:hAnsi="Roboto" w:eastAsia="Roboto" w:cs="Roboto"/>
           <w:sz w:val="20"/>
         </w:rPr>
-        <w:t>These uses do not decide the sense of the word at Matthew 10:28. They show that the noun does not always mean an extinction. In a verse where a person is lost, wasted, condemned or fitted for ruin, the word names what has happened to him, and the question whether he continues is not answered by the word. The question has to be answered by the passage.</w:t>
+        <w:t>The word alone does not decide the sense at Matthew 10:28, and these uses show why: the noun does not always mean an extinction. In a verse where a person is lost, wasted, condemned or fitted for ruin, the word names what has happened to him, and the question whether he continues is not answered by the word. The question has to be answered by the passage.</w:t>
       </w:r>
     </w:p>
     <w:p>
@@ -4027,7 +4027,7 @@
           <w:rFonts w:ascii="Roboto" w:hAnsi="Roboto" w:eastAsia="Roboto" w:cs="Roboto"/>
           <w:sz w:val="20"/>
         </w:rPr>
-        <w:t>The reader who has followed the chapter will see what has been done. Two verses that carry much of the weight in the conditionalist case have been read in their settings and given their full force: the soul can be destroyed by God, and the end of the enemies of the cross is destruction. Neither has been made to say more than it says. The verse in Matthew states a power and a place and is paralleled by a verse that describes the exercise of the power as casting into hell. The verse in Philippians states an end and a name. Whether the destruction is a ceasing or a ruin that remains is not settled by either. It is settled, if it is settled, by the passages that go on to describe what follows the judgment, and the next chapters turn to them.</w:t>
+        <w:t>The two verses that carry much of the weight in the conditionalist case state a power and an end, and neither states that the person ceases. Each has been read in its setting and given its full force: the soul can be destroyed by God, and the end of the enemies of the cross is destruction. Neither has been made to say more than it says. The verse in Matthew states a power and a place and is paralleled by a verse that describes the exercise of the power as casting into hell. The verse in Philippians states an end and a name. Whether the destruction is a ceasing or a ruin that remains is not settled by either. It is settled by the passages that go on to describe what follows the judgment, and the next chapters turn to them.</w:t>
       </w:r>
     </w:p>
     <w:p>
@@ -5232,7 +5232,7 @@
           <w:rFonts w:ascii="Roboto" w:hAnsi="Roboto" w:eastAsia="Roboto" w:cs="Roboto"/>
           <w:sz w:val="20"/>
         </w:rPr>
-        <w:t>The clause in question reads “from the presence of the Lord, and from the glory of his power”. The preposition can be read in two ways. It can name the place from which the lost are removed, so that the penalty is a casting away from the Lord. It can name the source, so that the destruction comes forth from the Lord’s presence as the earth and the heaven “fled away” from the face of Him that sat on the throne (Revelation 20:11). The writer who holds that the lost cease to exist may take either reading and find his view in it, and the writer who holds that they continue may do the same. The volume does not rest the case on the preposition.</w:t>
+        <w:t>The preposition in the clause “from the presence of the Lord, and from the glory of his power” can be read in two ways, and neither reading decides between ceasing and continuing. It can name the place from which the lost are removed, so that the penalty is a casting away from the Lord. It can name the source, so that the destruction comes forth from the Lord’s presence as the earth and the heaven “fled away” from the face of Him that sat on the throne (Revelation 20:11). The writer who holds that the lost cease to exist may take either reading and find his view in it, and the writer who holds that they continue may do the same. The volume does not rest the case on the preposition.</w:t>
       </w:r>
     </w:p>
     <w:p>
@@ -5256,7 +5256,7 @@
           <w:rFonts w:ascii="Roboto" w:hAnsi="Roboto" w:eastAsia="Roboto" w:cs="Roboto"/>
           <w:sz w:val="20"/>
         </w:rPr>
-        <w:t>The verse does not describe the experience of those excluded. It does not use the word torment, and the volume does not say that it states continuing consciousness. It states a penalty that is everlasting, a destruction, and an exclusion from the presence of the Lord. Whether the penalty includes the experience of being under it is a question for the passages that speak of it directly, and the volume turns to them in chapters 7 and 8. A reader who says that the verse is consistent with the annihilation of the persons has said what is true: it is consistent with it. The volume’s reply is that the verse is also consistent with the persons’ continuing, that it does not decide between the two, and that the verses which do decide are read in their places.</w:t>
+        <w:t>The verse establishes an everlasting penalty, and it does not describe the experience of those under it. It does not use the word torment, and the volume does not say that it states continuing consciousness. It states a penalty that is everlasting, a destruction, and an exclusion from the presence of the Lord. Whether the penalty includes the experience of being under it is a question for the passages that speak of it directly, and the volume turns to them in chapters 7 and 8. The verse is consistent with the annihilation of the persons, and it is equally consistent with their continuing. It does not decide between the two, and the verses that do decide are read in their places.</w:t>
       </w:r>
     </w:p>
     <w:p>
@@ -5924,7 +5924,7 @@
           <w:rFonts w:ascii="Roboto" w:hAnsi="Roboto" w:eastAsia="Roboto" w:cs="Roboto"/>
           <w:sz w:val="20"/>
         </w:rPr>
-        <w:t>This is the strongest single support the volume takes from the verse, and it is not a proof taken alone. The writer on the other side answers that the adjective describes the quality or the result of what it qualifies. The life is of the age to come and it lasts, because the persons live it. The punishment is of the age to come and its result lasts, because the persons are gone. The reply is not an evasion. The New Testament speaks of “eternal redemption” (Hebrews 9:12), and the redemption is not a process still going on: it was obtained once, by the blood, and its result is for ever. It speaks of “eternal salvation” (Hebrews 5:9) and of “eternal judgment” (Hebrews 6:2), and in each the adjective states that the result does not lapse. The volume grants that the adjective has this use.</w:t>
+        <w:t>The parallel in Matthew 25:46 is the strongest single support the volume takes from the verse, and the volume does not use it as a proof taken alone. The writer on the other side answers that the adjective describes the quality or the result of what it qualifies. The life is of the age to come and it lasts, because the persons live it. The punishment is of the age to come and its result lasts, because the persons are gone. The reply is not an evasion. The New Testament speaks of “eternal redemption” (Hebrews 9:12), and the redemption is not a process still going on: it was obtained once, by the blood, and its result is for ever. It speaks of “eternal salvation” (Hebrews 5:9) and of “eternal judgment” (Hebrews 6:2), and in each the adjective states that the result does not lapse. The volume grants that the adjective has this use.</w:t>
       </w:r>
     </w:p>
     <w:p>
@@ -6361,7 +6361,7 @@
           <w:rFonts w:ascii="Roboto" w:hAnsi="Roboto" w:eastAsia="Roboto" w:cs="Roboto"/>
           <w:sz w:val="20"/>
         </w:rPr>
-        <w:t>This is Inferred, not Stated, and the volume says so. A reader who holds that the persons cease can answer that the contempt is the memory in which they are held. That reading is not impossible. The volume holds that the verse says more naturally what it appears to say, that those who awake to shame awake to a lasting shame, and that it is stated in a verse where the same adjective is set on the life of the others. The verse does not bear the whole case, and it does not need to.</w:t>
+        <w:t>Daniel 12:2 says that the persons awake to a lasting shame, and the volume marks the conclusion that they continue as Inferred, not Stated. A reader who holds that the persons cease can answer that the contempt is the memory in which they are held, and the reading is possible. The volume holds that the verse more naturally says what it appears to say, in a verse where the same adjective is set on the life of the others. The verse does not bear the whole case, and it contributes directly to the cumulative case.</w:t>
       </w:r>
     </w:p>
     <w:p>
@@ -6399,7 +6399,7 @@
           <w:rFonts w:ascii="Roboto" w:hAnsi="Roboto" w:eastAsia="Roboto" w:cs="Roboto"/>
           <w:sz w:val="20"/>
         </w:rPr>
-        <w:t>The annihilationist reading of the last example is a strong one. The cities of the plain are not burning today. Peter says that God turned “the cities of Sodom and Gomorrha into ashes”, “making them an ensample unto those that after should live ungodly” (2 Peter 2:6). The fire that destroyed them was God’s, and it is called eternal because its result is permanent: the cities are gone and will not return. On this reading “eternal fire” in Jude 7 is the same kind of statement as “eternal redemption”, a statement about a result, and the cities are the example of what that fire does. The volume grants all of it. If Jude 7 stood alone it would be a verse on which the two sides could differ and neither could say that the verse decides.</w:t>
+        <w:t>Jude 7 can be read as a statement about a result, and the volume grants it; the verse does not stand alone, and read with its neighbours it points past the ashes. The annihilationist reading of the last example is a strong one. The cities of the plain are not burning today. Peter says that God turned “the cities of Sodom and Gomorrha into ashes”, “making them an ensample unto those that after should live ungodly” (2 Peter 2:6). The fire that destroyed them was God’s, and it is called eternal because its result is permanent: the cities are gone and will not return. On this reading “eternal fire” in Jude 7 is the same kind of statement as “eternal redemption”, a statement about a result, and the cities are the example of what that fire does. The volume grants all of it. If Jude 7 stood alone it would be a verse on which the two sides could differ and neither could say that the verse decides.</w:t>
       </w:r>
     </w:p>
     <w:p>
@@ -6411,7 +6411,7 @@
           <w:rFonts w:ascii="Roboto" w:hAnsi="Roboto" w:eastAsia="Roboto" w:cs="Roboto"/>
           <w:sz w:val="20"/>
         </w:rPr>
-        <w:t>It does not stand alone. The cities are “set forth for an example”, and an example is an example of something other than itself, of the vengeance of eternal fire that those who follow the same course will suffer. The verse goes on, in the same sentence, to say that the cities are “suffering” it, in the words of the King James Version, and the persons who gave themselves over are the ones named as the subject of the suffering. The preceding verse speaks of angels held “in everlasting chains under darkness”, and a verse later the false teachers are “wandering stars, to whom is reserved the blackness of darkness for ever” (Jude 1:13). A reader who says that Jude’s examples are all of results and not of states has to give an account of chains, darkness reserved, and a suffering. The volume does not say that these decide the question. It says that Jude 7 is one of several places in which the language is more naturally read as describing a condition of the persons than the end of them, and that it takes its place in the cumulative case.</w:t>
+        <w:t>It does not stand alone. The cities are “set forth for an example”, and an example is an example of something other than itself, of the vengeance of eternal fire that those who follow the same course will suffer. The verse goes on, in the same sentence, to say that the cities are “suffering” it, in the words of the King James Version, and the persons who gave themselves over are the ones named as the subject of the suffering. The preceding verse speaks of angels held “in everlasting chains under darkness”, and a verse later the false teachers are “wandering stars, to whom is reserved the blackness of darkness for ever” (Jude 1:13). A reader who says that Jude’s examples are all of results and not of states has to give an account of chains, darkness reserved, and a suffering. Jude 7 does not decide the question alone. It is one of several places in which the language is more naturally read as describing a condition of the persons than the end of them, and it contributes directly to the cumulative case.</w:t>
       </w:r>
     </w:p>
     <w:p>
@@ -6718,7 +6718,7 @@
           <w:rFonts w:ascii="Roboto" w:hAnsi="Roboto" w:eastAsia="Roboto" w:cs="Roboto"/>
           <w:sz w:val="20"/>
         </w:rPr>
-        <w:t>The chapter began with a claim, and the claim has been kept. The adjective in these three passages can describe a result. It can also describe a state that lasts. No grammar settles which, and the volume does not pretend it does. What settles it, if anything does, is what the passages say the persons do and what is done to them. In Matthew 25 they go away into the punishment and into the fire shared with the devil and his angels. In Daniel 12 they awake to a shame that does not end. In Jude 7 the cities are an example of a vengeance suffered. In each, the persons are the subject of what is said, and the verb is not the verb of ending.</w:t>
+        <w:t>The adjective in these three passages establishes permanence, and the descriptions of the persons say what the permanence is. The adjective can describe a result, and it can describe a state that lasts; no grammar settles which, and the volume does not pretend it does. What settles it is what the passages say the persons do and what is done to them. In Matthew 25 they go away into the punishment and into the fire shared with the devil and his angels. In Daniel 12 they awake to a shame that does not end. In Jude 7 the cities are an example of a vengeance suffered. In each, the persons are the subject of what is said, and the verb is not the verb of ending.</w:t>
       </w:r>
     </w:p>
     <w:p>
@@ -7037,7 +7037,7 @@
           <w:rFonts w:ascii="Roboto" w:hAnsi="Roboto" w:eastAsia="Roboto" w:cs="Roboto"/>
           <w:sz w:val="20"/>
         </w:rPr>
-        <w:t>The second point on the other side is about the word “quenched”. In the Old Testament a fire that is not quenched is a fire that no one can put out, and it burns until what it burns is finished. Of Jerusalem the Lord says, “then will I kindle a fire in the gates thereof, and it shall devour the palaces of Jerusalem, and it shall not be quenched” (Jeremiah 17:27). Of the forest of the south, “the flaming flame shall not be quenched, and all faces from the south to the north shall be burned therein” (Ezekiel 20:47). The fire in Jerusalem’s gates is not burning today, and the unquenched fire of Ezekiel’s forest did its work and ended. John’s words at the Jordan of the one who comes after him carry the same idea: he “will burn up the chaff with unquenchable fire” (Matthew 3:12), and chaff is burned up. The volume grants all of this. An unquenchable fire is a fire that cannot be put out, and the phrase does not say that what is thrown into it never burns away.</w:t>
+        <w:t>The second point on the other side is about the word “quenched”. In the Old Testament a fire that is not quenched is a fire that no one can put out, and it burns until what it burns is finished. Of Jerusalem the Lord says, “then will I kindle a fire in the gates thereof, and it shall devour the palaces of Jerusalem, and it shall not be quenched” (Jeremiah 17:27). Of the forest of the south, “the flaming flame shall not be quenched, and all faces from the south to the north shall be burned therein” (Ezekiel 20:47). The fire in Jerusalem’s gates is not burning today, and the unquenched fire of Ezekiel’s forest did its work and ended. John’s words at the Jordan of the one who comes after him carry the same idea: he “will burn up the chaff with unquenchable fire” (Matthew 3:12), and chaff is burned up. The volume grants all of this. An unquenchable fire is a fire that cannot be put out, and the phrase does not say that what is thrown into it never burns away. That is the limit of the point: an unquenchable fire cannot by itself establish endless conscious punishment, and it cannot by itself establish annihilation.</w:t>
       </w:r>
     </w:p>
     <w:p>
@@ -7480,7 +7480,7 @@
           <w:rFonts w:ascii="Roboto" w:hAnsi="Roboto" w:eastAsia="Roboto" w:cs="Roboto"/>
           <w:sz w:val="20"/>
         </w:rPr>
-        <w:t>This is Inferred, and the volume marks it. The Lord does not say whether the persons in the place are conscious or whether their worm feeds on what is alive. A reader who holds that the Lord’s picture is the same as Isaiah’s, a picture of the finished destruction of those who are gone, can say so, and the words do not forbid it. The volume holds that the Lord’s sentence is more naturally read as placing the persons in the fire and the worm, and that the “their” of the worm and the “cast” of the persons are the Lord’s own additions to what the prophet had said. It does not rest the case on the verse.</w:t>
+        <w:t>The Lord’s sentence places living persons in the fire and the worm, and the volume marks this as Inferred. He does not say whether the persons in the place are conscious or whether their worm feeds on what is alive. A reader who holds that the Lord’s picture is the same as Isaiah’s, a picture of the finished destruction of those who are gone, can say so, and the words do not forbid it. The volume holds that the Lord’s sentence is more naturally read as placing the persons in the fire and the worm, and that the “their” of the worm and the “cast” of the persons are the Lord’s own additions to what the prophet had said. It does not rest the case on the verse.</w:t>
       </w:r>
     </w:p>
     <w:p>
@@ -7556,7 +7556,7 @@
           <w:rFonts w:ascii="Roboto" w:hAnsi="Roboto" w:eastAsia="Roboto" w:cs="Roboto"/>
           <w:sz w:val="20"/>
         </w:rPr>
-        <w:t>The volume grants the point in full and draws the line where it falls. Isaiah’s smoke that goes up for ever is the smoke of a land and a nation, and what it says is that the desolation is not undone. The oracle does not describe persons tormented, and the volume does not use it to say that they are. It shows that Scripture speaks of a fire that does not go out and a smoke that does not cease in connection with a judgment that finished its object, and that the words “for ever” in such a place describe the permanence of the ruin. Where Revelation takes up the same imagery of persons, as it does in chapter 14, the words are the words of persons, with “no rest day nor night”. The Edom oracle is cited in the Prophets Series, in Volume 3, The Nations Judged, with its own question, and this volume takes only the idiom from it.</w:t>
+        <w:t>Isaiah 34 shows that smoke going up for ever can mark the permanence of a ruin, and the volume grants it in full; the oracle describes a land and not persons tormented, so it cannot be set against the passages that do. Isaiah’s smoke that goes up for ever is the smoke of a land and a nation, and what it says is that the desolation is not undone. The oracle does not describe persons tormented, and the volume does not use it to say that they are. It shows that Scripture speaks of a fire that does not go out and a smoke that does not cease in connection with a judgment that finished its object, and that the words “for ever” in such a place describe the permanence of the ruin. Where Revelation takes up the same imagery of persons, as it does in chapter 14, the words are the words of persons, with “no rest day nor night”. The Edom oracle is cited in the Prophets Series, in Volume 3, The Nations Judged, with its own question, and this volume takes only the idiom from it.</w:t>
       </w:r>
     </w:p>
     <w:p>
@@ -8727,7 +8727,7 @@
           <w:rFonts w:ascii="Roboto" w:hAnsi="Roboto" w:eastAsia="Roboto" w:cs="Roboto"/>
           <w:sz w:val="20"/>
         </w:rPr>
-        <w:t>The question of this section is a narrow one, and it is not answered beforehand. Revelation calls the lake of fire “the second death” (Revelation 20:14; 21:8). Does the name require that those who are cast into it cease to exist? The volume does not define death before it has read the book. It asks what the book says the second death is, and what it says death is wherever it uses the word.</w:t>
+        <w:t>The name “the second death” does not require that those cast into the lake cease to exist. Revelation calls the lake of fire “the second death” (Revelation 20:14; 21:8), and the volume argues that the name is read from what the book says the lake is and what it says death is, and not from a definition of death brought to the book.</w:t>
       </w:r>
     </w:p>
     <w:p>
@@ -9454,7 +9454,7 @@
           <w:rFonts w:ascii="Roboto" w:hAnsi="Roboto" w:eastAsia="Roboto" w:cs="Roboto"/>
           <w:sz w:val="20"/>
         </w:rPr>
-        <w:t>The writer who holds that the lost cease to exist grants this and says that the grading is in the measure of suffering before the end. The volume grants that this is a possible reading, and that degrees alone do not decide the question. It says that a punishment which can be more tolerable or less, which is a measure of stripes, and which is said to be “greater” and “sorer”, is described as something the persons have, with a content and a measure. That is shown by the context. It does not say that the content is never completed. It says that the descriptions the Scripture uses are the descriptions of an infliction, and not of a ceasing.</w:t>
+        <w:t>The grading of the judgment shows that the punishment is described as an infliction with a content and a measure, and not as a ceasing. A punishment which can be more tolerable or less, which is a measure of stripes, and which is said to be “greater” and “sorer”, is described as something the persons have. That is shown by the context. The writer who holds that the lost cease to exist grants the grading and says that it is the measure of suffering before the end. The volume grants that this reading is possible and that degrees alone do not decide the question; the passage does not say that the content is never completed, and the descriptions the Scripture uses are the descriptions of an infliction.</w:t>
       </w:r>
     </w:p>
     <w:p>
@@ -9480,7 +9480,7 @@
           <w:rFonts w:ascii="Roboto" w:hAnsi="Roboto" w:eastAsia="Roboto" w:cs="Roboto"/>
           <w:sz w:val="20"/>
         </w:rPr>
-        <w:t>The question is a natural one, and the passage raises it. Who are “the dead, small and great”? The volume asks it because its own subject requires an answer. The people whom the text says are cast into the lake are the people whose punishment the volume describes, and it is fair to ask who they are. The answer is argued from the chapter, and each step is marked.</w:t>
+        <w:t>The question is a natural one, and the passage raises it. Who are “the dead, small and great”? The volume asks it because its own subject requires an answer. The people whom the text says are cast into the lake are the people whose punishment the volume describes, and it is fair to ask who they are. The volume’s answer is that the company is the rest of the dead of verse 5, argued from the sequence of the chapter, and each step is marked.</w:t>
       </w:r>
     </w:p>
     <w:p>
@@ -10324,7 +10324,7 @@
           <w:rFonts w:ascii="Roboto" w:hAnsi="Roboto" w:eastAsia="Roboto" w:cs="Roboto"/>
           <w:sz w:val="20"/>
         </w:rPr>
-        <w:t>Claim: the case against annihilationism is not strengthened by weakening the other side. The writers who hold that the lost cease to exist argue from Scripture, and their strongest arguments are stated here in their own best form, beside the writers who answer them. Each objection is answered from Scripture, and what is granted is said first.</w:t>
+        <w:t>Claim: the volume answers each objection directly. Every objection is stated in its strongest concise form, answered in the first sentences of the reply, proved from Scripture, qualified by what is conceded, and closed with a one-sentence verdict. The writers who hold that the lost cease to exist argue from Scripture, and their arguments are stated here fairly, beside the writers who answer them.</w:t>
       </w:r>
     </w:p>
     <w:p>
@@ -10400,7 +10400,7 @@
           <w:rFonts w:ascii="Roboto" w:hAnsi="Roboto" w:eastAsia="Roboto" w:cs="Roboto"/>
           <w:sz w:val="20"/>
         </w:rPr>
-        <w:t>What is granted. The words do describe an ending in many verses, as chapter 3 showed from Genesis 7, Daniel 2 and Matthew 12. The soul is not indestructible by nature, and Matthew 10:28 does not say that it is. The objection from the ordinary sense of the words is a fair one, and the volume has not tried to weaken it.</w:t>
+        <w:t>The reply. The words of destruction do not establish annihilation, because Scripture uses the same words of persons and things that go on existing. The objection treats a word as if it were the meaning. Destroy, perish and death name a ruin or a loss, and the passage decides whether the ruin ends the person’s existence. A lost sheep is a sheep that is alive, a waste of ointment is ointment that was spent and is not gone from the world, and a man delivered to Satan “for the destruction of the flesh” is a man who is saved (1 Corinthians 5:5). Death itself is used of one who is alive. Of the son who came home the father says, “this my son was dead, and is alive again” (Luke 15:24), and the apostle says of the saints, “you hath he quickened, who were dead in trespasses and sins” (Ephesians 2:1). Woodier reads death in Genesis 2:17 as separation and not extinction, pointing to the broken fellowship and the exclusion from the garden in Genesis 3. The volume adds a plain observation from the text: the man who was told that in the day he ate he should surely die went on living, and “all the days that Adam lived were nine hundred and thirty years: and he died” (Genesis 5:5). The first death cannot be read as the man’s ceasing on the day he ate.</w:t>
       </w:r>
     </w:p>
     <w:p>
@@ -10412,11 +10412,23 @@
           <w:rFonts w:ascii="Roboto" w:hAnsi="Roboto" w:eastAsia="Roboto" w:cs="Roboto"/>
           <w:sz w:val="20"/>
         </w:rPr>
-        <w:t>The reply. The ordinary sense of the words is not one sense. A lost sheep is a sheep that is alive, a waste of ointment is ointment that was spent and is not gone from the world, and a man delivered to Satan “for the destruction of the flesh” is a man who is saved (1 Corinthians 5:5). Death itself is used of one who is alive. Of the son who came home the father says, “this my son was dead, and is alive again” (Luke 15:24), and the apostle says of the saints, “you hath he quickened, who were dead in trespasses and sins” (Ephesians 2:1). Woodier reads death in Genesis 2:17 as separation and not extinction, pointing to the broken fellowship and the exclusion from the garden in Genesis 3. The volume adds a plain observation from the text: the man who was told that in the day he ate he should surely die went on living, and “all the days that Adam lived were nine hundred and thirty years: and he died” (Genesis 5:5). The first death cannot be read as the man’s ceasing on the day he ate. The question is therefore what the words mean in a given passage, and that is decided by the passage. Chapters 4 and 5 read the two verses the objection leans on most and found that each states a power or an end and says nothing of its manner.</w:t>
+        <w:t>The two verses the objection leans on most were read in chapters 4 and 5. Matthew 10:28 states God’s authority to destroy soul and body in hell, and it does not define that destruction as cessation of existence. 2 Thessalonians 1:9 states an everlasting, irreversible penalty, and it does not state its manner. Annihilation therefore cannot be derived from the word “destroy” alone.</w:t>
       </w:r>
     </w:p>
     <w:p>
       <w:pPr>
+        <w:jc w:val="left"/>
+      </w:pPr>
+      <w:r>
+        <w:rPr>
+          <w:rFonts w:ascii="Roboto" w:hAnsi="Roboto" w:eastAsia="Roboto" w:cs="Roboto"/>
+          <w:sz w:val="20"/>
+        </w:rPr>
+        <w:t>What is conceded. The words do describe an ending in many verses, as chapter 3 showed from Genesis 7, Daniel 2 and Matthew 12, and Scripture nowhere says that the soul is indestructible by nature. These points show that the words can mean an ending. They do not show that they mean the persons’ ceasing to exist in any passage on final judgment. Verdict: the objection proves that words of destruction can name an ending, and it does not overturn the thesis, because the passage and not the word decides what the destruction is.</w:t>
+      </w:r>
+    </w:p>
+    <w:p>
+      <w:pPr>
         <w:keepNext/>
         <w:spacing w:before="80" w:after="80"/>
       </w:pPr>
@@ -10450,7 +10462,7 @@
           <w:rFonts w:ascii="Roboto" w:hAnsi="Roboto" w:eastAsia="Roboto" w:cs="Roboto"/>
           <w:sz w:val="20"/>
         </w:rPr>
-        <w:t>What is granted. The adjective is used in this way in Hebrews 9:12, Hebrews 5:9 and Hebrews 6:2. Chapter 6 granted that it can describe a result and that Matthew 25:46 does not by itself decide the question.</w:t>
+        <w:t>The reply. The adjective does not by itself settle the question, and the volume does not rest on it. What it establishes is permanence: the punishment is not reversed and does not lapse. The objection’s mistake is to treat a grammatical rule about nouns of action as if it decided what the persons undergo. That is decided by the passages that describe the persons. In Matthew 25:46 the same adjective qualifies punishment and life, and the persons go away into both, so the parallel strongly establishes the permanence of both outcomes. Peterson’s answer to Atkinson’s rule is that it is unsupported by the language and that it breaks the parallel with “life eternal”, and the volume goes with the first of his points in part and with the second in full. The passages about the persons in the lake then say what the adjective alone cannot: they are tormented, they have no rest day nor night, and the statement of Revelation 20:10 is of a torment that runs day and night for ever and ever. Peterson judges the conditionalist exegesis of Revelation 14:10, 11 “an evasion of the text and not a literal exegesis”, and the volume does not use words so strong. It says that an exegesis which gives the account of the smoke and passes over “no rest day nor night” has not answered the verse.</w:t>
       </w:r>
     </w:p>
     <w:p>
@@ -10462,7 +10474,7 @@
           <w:rFonts w:ascii="Roboto" w:hAnsi="Roboto" w:eastAsia="Roboto" w:cs="Roboto"/>
           <w:sz w:val="20"/>
         </w:rPr>
-        <w:t>The reply. Peterson’s answer to Atkinson’s rule is that it is unsupported by the language and that it breaks the parallel with “life eternal”. The volume goes with the first of his points in part and with the second in full. It does not rest on a grammatical rule about nouns of action, and it does not say that the adjective carries the case. It says that the persons “go away into everlasting punishment” as the righteous go into life, and that the passages about the persons in the lake, taken with the adjective, describe persons who are in the lake and are not described as finishing. Peterson judges the conditionalist exegesis of Revelation 14:10, 11 “an evasion of the text and not a literal exegesis”, and the volume does not use words so strong. It says that an exegesis which gives the account of the smoke and passes over “no rest day nor night” has not answered the verse.</w:t>
+        <w:t>What is conceded. The adjective is used of a result in Hebrews 9:12, Hebrews 5:9 and Hebrews 6:2, and Matthew 25:46 does not by itself explain how the punishment is experienced (chapter 6). Verdict: the objection shows that “eternal” can name a lasting result, and it does not overturn the thesis, because the thesis rests on the passages that describe the persons and not on the adjective.</w:t>
       </w:r>
     </w:p>
     <w:p>
@@ -10500,7 +10512,7 @@
           <w:rFonts w:ascii="Roboto" w:hAnsi="Roboto" w:eastAsia="Roboto" w:cs="Roboto"/>
           <w:sz w:val="20"/>
         </w:rPr>
-        <w:t>What is granted. Isaiah 66:24 is a picture of corpses. Unquenchable fire is fire that cannot be put out, and it can end when its fuel is gone. Isaiah 34:10 uses the language of fire for ever of a land that is not burning now. Chapter 7 granted all of this.</w:t>
+        <w:t>The reply. The fact that unquenchable fire can consume its object does not establish annihilation. It proves only that “unquenchable” by itself cannot establish endless conscious punishment. The larger question must be answered by the passages that describe what happens to the persons under final judgment. In Mark 9 the Lord does not say “carcases”. He says of a man with two hands that he is cast into hell, into the fire that never shall be quenched, where their worm dieth not. He sets the casting against entering into life, and He adds that every one shall be salted with fire (Mark 9:49). The fire is a place into which the living are cast, and the picture the Lord takes from Isaiah is the picture of what is at that place. The volume marks this step as Inferred and does not claim more. Peterson finds Atkinson’s exegesis of Mark 9:43, 48 “problematic on a number of counts”, and counts among them, not least, his understanding of Isaiah 66:24.</w:t>
       </w:r>
     </w:p>
     <w:p>
@@ -10512,7 +10524,7 @@
           <w:rFonts w:ascii="Roboto" w:hAnsi="Roboto" w:eastAsia="Roboto" w:cs="Roboto"/>
           <w:sz w:val="20"/>
         </w:rPr>
-        <w:t>The reply. Peterson finds Atkinson’s exegesis of Mark 9:43, 48 “problematic on a number of counts”, and counts among them, not least, his understanding of Isaiah 66:24. The volume’s own reply is the one chapter 7 gave. The Lord does not say “carcases”. He says of a man with two hands that he is cast into hell, into the fire that never shall be quenched, where their worm dieth not. He sets the casting against entering into life, and He adds that every one shall be salted with fire (Mark 9:49). The fire is a place the living are cast into, and the picture the Lord takes from Isaiah is the picture of what is at that place. The volume marks the step as Inferred and does not claim more.</w:t>
+        <w:t>What is conceded. Isaiah 66:24 is a picture of corpses, unquenchable fire is fire that cannot be put out, and it can end when its fuel is gone. Isaiah 34:10 uses the language of fire for ever of a land that is not burning now (chapter 7). Verdict: the objection proves that an unquenchable fire may finish its work, and it does not overturn the thesis, because the Lord’s own words place living persons in the fire and the question of their end is answered elsewhere.</w:t>
       </w:r>
     </w:p>
     <w:p>
@@ -10550,7 +10562,7 @@
           <w:rFonts w:ascii="Roboto" w:hAnsi="Roboto" w:eastAsia="Roboto" w:cs="Roboto"/>
           <w:sz w:val="20"/>
         </w:rPr>
-        <w:t>What is granted. The smoke alone does not prove conscious torment, and Revelation 19:3 shows that the book uses the image of a city. The symbols of the book are real symbols.</w:t>
+        <w:t>The reply. Revelation 14:11 does not independently establish every aspect of final punishment. Nevertheless, it explicitly describes torment and the absence of rest. Read with Revelation 20:10, it contributes directly to the cumulative case for continuing conscious punishment. The objection answers the sentence about the smoke and does not answer the sentence about the persons. The persons are tormented in the presence of the holy angels and of the Lamb, and they have no rest day nor night. In the plural statement of Revelation 20:10 the torment day and night for ever and ever takes in the beast and the false prophet, cast in a thousand years before the devil. Peterson’s judgment of the conditionalist reading is that it must be labelled an evasion of the text. The volume’s judgment is milder and the same: the reading leaves two clauses of the third angel’s warning, and the plural statement of torment in Revelation 20:10, without an account.</w:t>
       </w:r>
     </w:p>
     <w:p>
@@ -10562,7 +10574,7 @@
           <w:rFonts w:ascii="Roboto" w:hAnsi="Roboto" w:eastAsia="Roboto" w:cs="Roboto"/>
           <w:sz w:val="20"/>
         </w:rPr>
-        <w:t>The reply. The volume does not stand on the smoke. It stands on the persons, who are tormented in the presence of the holy angels and of the Lamb, who have no rest day nor night, and who, in the plural statement of Revelation 20:10, include the beast and the false prophet cast in a thousand years before the devil. The objection answers the sentence about the smoke and does not answer the sentence about the persons. Peterson’s judgment of the conditionalist reading is that it must be labelled an evasion of the text. The volume’s judgment is milder and the same: the reading leaves two clauses of the third angel’s warning, and the plural statement of torment in Revelation 20:10, without an account.</w:t>
+        <w:t>What is conceded. The smoke alone does not prove conscious torment, and Revelation 19:3 shows that the book uses the image of a city. “For ever and ever” in 14:11 is set on the smoke and not on the no-rest clause. Verdict: the objection proves that the smoke by itself may mark a permanent ruin, and it does not overturn the thesis, because the persons’ torment and lack of rest are stated in the same passage and confirmed in 20:10.</w:t>
       </w:r>
     </w:p>
     <w:p>
@@ -10600,7 +10612,7 @@
           <w:rFonts w:ascii="Roboto" w:hAnsi="Roboto" w:eastAsia="Roboto" w:cs="Roboto"/>
           <w:sz w:val="20"/>
         </w:rPr>
-        <w:t>What is granted. The objection is made in earnest and by writers who love the Scripture. A reader who feels its weight is not to be dismissed, and the volume agrees with Stott that the question must be examined and not ruled out of order.</w:t>
+        <w:t>The reply. The objection from justice is an argument from what the reader thinks God would do, and it does not decide what the text says He will do. Its mistake is to turn a question of proportion that Scripture does not state into an exegetical rule. The volume does not meet it with a rule of proportion either: the argument that sin against an infinite God deserves infinite punishment is used by Woodier and by older traditionalists, and the volume does not use it, because no verse states it. It answers from what Scripture does say. The Judge of all the earth does right (Genesis 18:25). His judgments are “true and righteous” (Revelation 16:7; 19:2), and Paul’s answer to the question whether God is unrighteous who taketh vengeance is, “God forbid: for then how shall God judge the world?” (Romans 3:5, 6). The judgment is graded (chapter 8), it is of persons by their works, and it is the Lord’s own judgment, spoken by the Lord Himself in the passages the volume has read. Saville, who rejects annihilationism, argues in his article that “extinction cannot be an infinite punishment”, because a punishment that is retributive must be experienced, and he concludes against several traditionalists that extinction is a punishment. The volume notes that his argument is a doctrinal one and does not use it as exegesis.</w:t>
       </w:r>
     </w:p>
     <w:p>
@@ -10612,7 +10624,7 @@
           <w:rFonts w:ascii="Roboto" w:hAnsi="Roboto" w:eastAsia="Roboto" w:cs="Roboto"/>
           <w:sz w:val="20"/>
         </w:rPr>
-        <w:t>The reply. The volume does not meet the objection with a rule of proportion that the Scripture does not state. The argument that sin against an infinite God deserves infinite punishment is used by Woodier and by older traditionalists, and the volume does not use it, because no verse states it. It answers from what Scripture does say. The Judge of all the earth does right (Genesis 18:25). His judgments are “true and righteous” (Revelation 16:7; 19:2), and Paul’s answer to the question whether God is unrighteous who taketh vengeance is, “God forbid: for then how shall God judge the world?” (Romans 3:5, 6). The judgment is graded (chapter 8). The judgment is of persons by their works, and it is the Lord’s own judgment, spoken by the Lord Himself in the passages the volume has read. Saville, who rejects annihilationism, argues in his article that “extinction cannot be an infinite punishment”, because a punishment that is retributive must be experienced, and he concludes against several traditionalists that extinction is a punishment. The volume notes that his argument is a doctrinal one and does not use it as exegesis. It notes also that the justice objection, taken as an exegetical argument, is an argument from what the reader thinks God would do, and that the volume’s task is to say what the text says He will do.</w:t>
+        <w:t>What is conceded. The objection is made in earnest and by writers who love the Scripture, and the volume agrees with Stott that the question must be examined and not ruled out of order. Verdict: the objection is a real question about God’s justice, and it does not overturn the thesis, because Scripture states that the Judge does right and gives no rule of proportion by which the text could be overruled.</w:t>
       </w:r>
     </w:p>
     <w:p>
@@ -10650,7 +10662,7 @@
           <w:rFonts w:ascii="Roboto" w:hAnsi="Roboto" w:eastAsia="Roboto" w:cs="Roboto"/>
           <w:sz w:val="20"/>
         </w:rPr>
-        <w:t>What is granted. The doctrine of the soul’s natural immortality is not stated in Scripture in so many words, and the volume does not rest on it. Matthew 10:28 says that God is able to destroy the soul.</w:t>
+        <w:t>The reply. The volume’s case does not depend on the soul’s natural immortality, so the objection does not touch it. A person may hold that only God has immortality in the sense of life in himself, and that the lost are kept in being by God’s will, and still hold that the passages on the lake describe a continuing experience. The persons are in the lake because the text puts them there and says they are tormented. That is a statement about what God does with them, and it does not require a doctrine of what they are. Saville’s own judgment is that the argument is not decisive.</w:t>
       </w:r>
     </w:p>
     <w:p>
@@ -10662,7 +10674,7 @@
           <w:rFonts w:ascii="Roboto" w:hAnsi="Roboto" w:eastAsia="Roboto" w:cs="Roboto"/>
           <w:sz w:val="20"/>
         </w:rPr>
-        <w:t>The reply. The volume’s case does not depend on the soul’s immortality, and Saville’s own judgment of the argument is that it is not decisive. A person may hold that only God has immortality in the sense of life in himself, and that the lost are kept in being by God’s will, and still hold that the passages on the lake describe a continuing experience. The persons are in the lake because the text puts them there and says they are tormented. That is a statement about what God does with them, and it does not require a doctrine of what they are.</w:t>
+        <w:t>What is conceded. The doctrine of the soul’s natural immortality is not stated in Scripture in so many words, and Matthew 10:28 says that God is able to destroy the soul. Verdict: the objection may be right about the origin of the doctrine, and it does not overturn the thesis, because the thesis rests on what the passages say God does with the persons and not on what the soul is by nature.</w:t>
       </w:r>
     </w:p>
     <w:p>
@@ -10700,7 +10712,7 @@
           <w:rFonts w:ascii="Roboto" w:hAnsi="Roboto" w:eastAsia="Roboto" w:cs="Roboto"/>
           <w:sz w:val="20"/>
         </w:rPr>
-        <w:t>What is granted. These verses say that the wicked do not last. They are among the strongest in the conditionalist case, and they are true statements of what happens to the wicked in the settings they describe.</w:t>
+        <w:t>The reply. These passages speak of the end of the wicked on the earth, and they do not describe the lake, so they cannot be set against the passages that do. The decisive distinction is the setting. Psalm 37 is about who shall inherit the land: “the meek shall inherit the earth” (Psalm 37:11), and the wicked “shall not be” in the place that the righteous dwell in. The prophecy of Malachi is of the day of the Lord on Israel’s land, in which the wicked are stubble, and the verse does not say what comes after. Ezekiel 18 answers the proverb of the fathers and the children in the land of Israel (Ezekiel 18:2, 3) and speaks of the death and life of Israelites under the law in their own day. The fire of Revelation 20:9 devours a living host that has surrounded the camp of the saints, and the next verse, with the devil cast into the lake, speaks of what follows. In all five the verb is of what happens to the living in the age in which they live.</w:t>
       </w:r>
     </w:p>
     <w:p>
@@ -10712,7 +10724,7 @@
           <w:rFonts w:ascii="Roboto" w:hAnsi="Roboto" w:eastAsia="Roboto" w:cs="Roboto"/>
           <w:sz w:val="20"/>
         </w:rPr>
-        <w:t>The reply. The settings are earthly. Psalm 37 is about who shall inherit the land: “the meek shall inherit the earth” (Psalm 37:11), and the wicked “shall not be” in the place that the righteous dwell in. The prophecy of Malachi is of the day of the Lord on Israel’s land, in which the wicked are stubble, and the verse does not say what comes after. Ezekiel 18 answers the proverb of the fathers and the children in the land of Israel (Ezekiel 18:2, 3) and speaks of the death and life of Israelites under the law in their own day. The fire of Revelation 20:9 devours a living host that has surrounded the camp of the saints, and the next verse, with the devil cast into the lake, speaks of what follows. In all five the verb is of what happens to the living in the age in which they live. The volume grants that these passages speak of the end of the wicked on the earth and does not say that they speak of the lake. It says that they cannot be set against the passages that do.</w:t>
+        <w:t>What is conceded. These verses say that the wicked do not last, they are among the strongest in the conditionalist case, and they are true statements of what happens to the wicked in the settings they describe. Verdict: the objection proves that the wicked perish from the earth, and it does not overturn the thesis, because it answers a question about the earth and the living and not a question about the lake.</w:t>
       </w:r>
     </w:p>
     <w:p>
@@ -10820,7 +10832,7 @@
                 <w:color w:val="FFFFFF"/>
                 <w:sz w:val="20"/>
               </w:rPr>
-              <w:t>What is granted</w:t>
+              <w:t>What is conceded</w:t>
             </w:r>
           </w:p>
         </w:tc>
@@ -10841,7 +10853,7 @@
                 <w:color w:val="FFFFFF"/>
                 <w:sz w:val="20"/>
               </w:rPr>
-              <w:t>The reply</w:t>
+              <w:t>The answer</w:t>
             </w:r>
           </w:p>
         </w:tc>
@@ -11385,7 +11397,7 @@
           <w:rFonts w:ascii="Roboto" w:hAnsi="Roboto" w:eastAsia="Roboto" w:cs="Roboto"/>
           <w:sz w:val="20"/>
         </w:rPr>
-        <w:t>The writers on the other side have asked real questions and the volume has tried to answer them without making their case weaker than it is. The reader who has followed the replies will see where they come to rest. The words of destruction do not decide the question in either direction. The adjective of duration can be read as a result and also as a state. The picture of the fire and the worm is a picture of corpses in Isaiah and of a casting in the Gospels. The smoke may be a monument. What remains, when all of this is granted, is the statement of Revelation about persons who are tormented, who have no rest day nor night, and whose plural statement of torment at Revelation 20:10 takes in the beast and the false prophet cast in a thousand years before. The volume holds that this remains because it is in the text, and that nothing in the objections has removed it.</w:t>
+        <w:t>The objections do not overturn the thesis. Words of destruction can name an ending, and they also name the ruin of persons who go on existing, so they do not decide the question. The adjective of duration establishes permanence, and the passages about the persons say what the permanence is. The picture of the fire and the worm is a picture of corpses in Isaiah and of a casting of the living in the Gospels. The smoke may be a monument, and the persons beside it are tormented and have no rest day nor night. What remains when every concession is made is the statement of Revelation about persons who are tormented, who have no rest day nor night, and whose plural statement of torment at Revelation 20:10 takes in the beast and the false prophet cast in a thousand years before. That remains because it is in the text, and nothing in the objections has removed it.</w:t>
       </w:r>
     </w:p>
     <w:p>
@@ -11447,7 +11459,7 @@
           <w:rFonts w:ascii="Roboto" w:hAnsi="Roboto" w:eastAsia="Roboto" w:cs="Roboto"/>
           <w:sz w:val="20"/>
         </w:rPr>
-        <w:t>The objection from the words of destruction is granted in part: the words describe an ending in many verses; they also describe the loss of persons who live.</w:t>
+        <w:t>The words of destruction can name an ending and also the ruin of persons who live; the passage, not the word, decides.</w:t>
       </w:r>
     </w:p>
     <w:p>
@@ -11471,7 +11483,7 @@
           <w:rFonts w:ascii="Roboto" w:hAnsi="Roboto" w:eastAsia="Roboto" w:cs="Roboto"/>
           <w:sz w:val="20"/>
         </w:rPr>
-        <w:t>The objection from the word eternal is granted in part: the adjective can name a result; the persons go into the punishment as into life.</w:t>
+        <w:t>The adjective “eternal” establishes permanence; the passages about the persons say what the punishment is.</w:t>
       </w:r>
     </w:p>
     <w:p>
@@ -11495,7 +11507,7 @@
           <w:rFonts w:ascii="Roboto" w:hAnsi="Roboto" w:eastAsia="Roboto" w:cs="Roboto"/>
           <w:sz w:val="20"/>
         </w:rPr>
-        <w:t>The objections from the fire and the worm and from the smoke are granted at the points where the Old Testament uses the images of a finished ruin, and answered from the Lord’s use of the picture and from the sentences about persons in Revelation.</w:t>
+        <w:t>The fire and the worm and the smoke are conceded where the Old Testament uses them of a finished ruin, and answered from the Lord’s casting of living persons into the fire and from the sentences about persons in Revelation.</w:t>
       </w:r>
     </w:p>
     <w:p>
@@ -15321,7 +15333,7 @@
                 <w:rFonts w:ascii="Roboto" w:hAnsi="Roboto" w:eastAsia="Roboto" w:cs="Roboto"/>
                 <w:sz w:val="20"/>
               </w:rPr>
-              <w:t>ch. 3, pp. 6, 10; Conclusion, p. 44</w:t>
+              <w:t>ch. 3, pp. 7, 10; Conclusion, p. 45</w:t>
             </w:r>
           </w:p>
         </w:tc>
@@ -15370,7 +15382,7 @@
                 <w:rFonts w:ascii="Roboto" w:hAnsi="Roboto" w:eastAsia="Roboto" w:cs="Roboto"/>
                 <w:sz w:val="20"/>
               </w:rPr>
-              <w:t>ch. 9, p. 40</w:t>
+              <w:t>ch. 9, p. 41</w:t>
             </w:r>
           </w:p>
         </w:tc>
@@ -15517,7 +15529,7 @@
                 <w:rFonts w:ascii="Roboto" w:hAnsi="Roboto" w:eastAsia="Roboto" w:cs="Roboto"/>
                 <w:sz w:val="20"/>
               </w:rPr>
-              <w:t>ch. 9, p. 41</w:t>
+              <w:t>ch. 9, p. 42</w:t>
             </w:r>
           </w:p>
         </w:tc>
@@ -15566,7 +15578,7 @@
                 <w:rFonts w:ascii="Roboto" w:hAnsi="Roboto" w:eastAsia="Roboto" w:cs="Roboto"/>
                 <w:sz w:val="20"/>
               </w:rPr>
-              <w:t>Conclusion, p. 44</w:t>
+              <w:t>Conclusion, p. 45</w:t>
             </w:r>
           </w:p>
         </w:tc>
@@ -15615,7 +15627,7 @@
                 <w:rFonts w:ascii="Roboto" w:hAnsi="Roboto" w:eastAsia="Roboto" w:cs="Roboto"/>
                 <w:sz w:val="20"/>
               </w:rPr>
-              <w:t>ch. 9, p. 41</w:t>
+              <w:t>ch. 9, p. 42</w:t>
             </w:r>
           </w:p>
         </w:tc>
@@ -15664,7 +15676,7 @@
                 <w:rFonts w:ascii="Roboto" w:hAnsi="Roboto" w:eastAsia="Roboto" w:cs="Roboto"/>
                 <w:sz w:val="20"/>
               </w:rPr>
-              <w:t>ch. 9, p. 41</w:t>
+              <w:t>ch. 9, p. 42</w:t>
             </w:r>
           </w:p>
         </w:tc>
@@ -15713,7 +15725,7 @@
                 <w:rFonts w:ascii="Roboto" w:hAnsi="Roboto" w:eastAsia="Roboto" w:cs="Roboto"/>
                 <w:sz w:val="20"/>
               </w:rPr>
-              <w:t>ch. 3, p. 7</w:t>
+              <w:t>ch. 3, p. 8</w:t>
             </w:r>
           </w:p>
         </w:tc>
@@ -15909,7 +15921,7 @@
                 <w:rFonts w:ascii="Roboto" w:hAnsi="Roboto" w:eastAsia="Roboto" w:cs="Roboto"/>
                 <w:sz w:val="20"/>
               </w:rPr>
-              <w:t>ch. 9, p. 39</w:t>
+              <w:t>ch. 9, p. 40</w:t>
             </w:r>
           </w:p>
         </w:tc>
@@ -16168,7 +16180,7 @@
                 <w:rFonts w:ascii="Roboto" w:hAnsi="Roboto" w:eastAsia="Roboto" w:cs="Roboto"/>
                 <w:sz w:val="20"/>
               </w:rPr>
-              <w:t>ch. 6, p. 20; ch. 7, pp. 24, 25, 27, 28; ch. 9, pp. 39, 42; Conclusion, p. 44</w:t>
+              <w:t>ch. 6, p. 21; ch. 7, pp. 24, 25, 27, 28; ch. 9, pp. 40, 43; Conclusion, p. 45</w:t>
             </w:r>
           </w:p>
         </w:tc>
@@ -16273,7 +16285,7 @@
                 <w:rFonts w:ascii="Roboto" w:hAnsi="Roboto" w:eastAsia="Roboto" w:cs="Roboto"/>
                 <w:sz w:val="20"/>
               </w:rPr>
-              <w:t>ch. 7, pp. 24, 25, 28; ch. 9, p. 39</w:t>
+              <w:t>ch. 7, pp. 24, 25, 28; ch. 9, p. 40</w:t>
             </w:r>
           </w:p>
         </w:tc>
@@ -16420,7 +16432,7 @@
                 <w:rFonts w:ascii="Roboto" w:hAnsi="Roboto" w:eastAsia="Roboto" w:cs="Roboto"/>
                 <w:sz w:val="20"/>
               </w:rPr>
-              <w:t>ch. 9, p. 41</w:t>
+              <w:t>ch. 9, p. 42</w:t>
             </w:r>
           </w:p>
         </w:tc>
@@ -16469,7 +16481,7 @@
                 <w:rFonts w:ascii="Roboto" w:hAnsi="Roboto" w:eastAsia="Roboto" w:cs="Roboto"/>
                 <w:sz w:val="20"/>
               </w:rPr>
-              <w:t>ch. 2, p. 4; ch. 3, p. 9; ch. 9, p. 41; Conclusion, p. 44</w:t>
+              <w:t>ch. 2, p. 4; ch. 3, p. 9; ch. 9, p. 42; Conclusion, p. 45</w:t>
             </w:r>
           </w:p>
         </w:tc>
@@ -16518,7 +16530,7 @@
                 <w:rFonts w:ascii="Roboto" w:hAnsi="Roboto" w:eastAsia="Roboto" w:cs="Roboto"/>
                 <w:sz w:val="20"/>
               </w:rPr>
-              <w:t>ch. 7, pp. 24, 25, 28; ch. 9, p. 39</w:t>
+              <w:t>ch. 7, pp. 24, 25, 28; ch. 9, p. 40</w:t>
             </w:r>
           </w:p>
         </w:tc>
@@ -16721,7 +16733,7 @@
                 <w:rFonts w:ascii="Roboto" w:hAnsi="Roboto" w:eastAsia="Roboto" w:cs="Roboto"/>
                 <w:sz w:val="20"/>
               </w:rPr>
-              <w:t>ch. 6, pp. 18, 20, 22; Conclusion, p. 44</w:t>
+              <w:t>ch. 6, pp. 18, 20, 21, 22; Conclusion, p. 45</w:t>
             </w:r>
           </w:p>
         </w:tc>
@@ -16875,7 +16887,7 @@
                 <w:rFonts w:ascii="Roboto" w:hAnsi="Roboto" w:eastAsia="Roboto" w:cs="Roboto"/>
                 <w:sz w:val="20"/>
               </w:rPr>
-              <w:t>ch. 9, p. 41</w:t>
+              <w:t>ch. 9, p. 42</w:t>
             </w:r>
           </w:p>
         </w:tc>
@@ -16924,7 +16936,7 @@
                 <w:rFonts w:ascii="Roboto" w:hAnsi="Roboto" w:eastAsia="Roboto" w:cs="Roboto"/>
                 <w:sz w:val="20"/>
               </w:rPr>
-              <w:t>Conclusion, p. 44</w:t>
+              <w:t>Conclusion, p. 45</w:t>
             </w:r>
           </w:p>
         </w:tc>
@@ -17708,7 +17720,7 @@
                 <w:rFonts w:ascii="Roboto" w:hAnsi="Roboto" w:eastAsia="Roboto" w:cs="Roboto"/>
                 <w:sz w:val="20"/>
               </w:rPr>
-              <w:t>ch. 2, p. 4; ch. 4, pp. 11, 12, 13, 14; ch. 5, p. 16; ch. 7, p. 26; ch. 9, pp. 38, 41; Conclusion, p. 44</w:t>
+              <w:t>ch. 2, p. 4; ch. 4, pp. 11, 12, 13, 14; ch. 5, p. 16; ch. 7, p. 26; ch. 9, pp. 39, 42; Conclusion, p. 45</w:t>
             </w:r>
           </w:p>
         </w:tc>
@@ -18723,7 +18735,7 @@
                 <w:rFonts w:ascii="Roboto" w:hAnsi="Roboto" w:eastAsia="Roboto" w:cs="Roboto"/>
                 <w:sz w:val="20"/>
               </w:rPr>
-              <w:t>ch. 2, p. 4; ch. 6, pp. 19, 20, 22; ch. 9, p. 39; Conclusion, p. 44</w:t>
+              <w:t>ch. 2, p. 4; ch. 6, pp. 19, 20, 22; ch. 9, pp. 39, 40; Conclusion, p. 45</w:t>
             </w:r>
           </w:p>
         </w:tc>
@@ -19038,7 +19050,7 @@
                 <w:rFonts w:ascii="Roboto" w:hAnsi="Roboto" w:eastAsia="Roboto" w:cs="Roboto"/>
                 <w:sz w:val="20"/>
               </w:rPr>
-              <w:t>ch. 9, p. 39</w:t>
+              <w:t>ch. 9, p. 40</w:t>
             </w:r>
           </w:p>
         </w:tc>
@@ -19094,7 +19106,7 @@
                 <w:rFonts w:ascii="Roboto" w:hAnsi="Roboto" w:eastAsia="Roboto" w:cs="Roboto"/>
                 <w:sz w:val="20"/>
               </w:rPr>
-              <w:t>ch. 7, pp. 27, 28; Conclusion, p. 44</w:t>
+              <w:t>ch. 7, pp. 27, 28; Conclusion, p. 45</w:t>
             </w:r>
           </w:p>
         </w:tc>
@@ -19150,7 +19162,7 @@
                 <w:rFonts w:ascii="Roboto" w:hAnsi="Roboto" w:eastAsia="Roboto" w:cs="Roboto"/>
                 <w:sz w:val="20"/>
               </w:rPr>
-              <w:t>ch. 7, pp. 23, 25; ch. 9, p. 39</w:t>
+              <w:t>ch. 7, pp. 23, 25; ch. 9, p. 40</w:t>
             </w:r>
           </w:p>
         </w:tc>
@@ -19479,7 +19491,7 @@
                 <w:rFonts w:ascii="Roboto" w:hAnsi="Roboto" w:eastAsia="Roboto" w:cs="Roboto"/>
                 <w:sz w:val="20"/>
               </w:rPr>
-              <w:t>ch. 4, pp. 11, 12, 14; Conclusion, p. 44</w:t>
+              <w:t>ch. 4, pp. 11, 12, 14; Conclusion, p. 45</w:t>
             </w:r>
           </w:p>
         </w:tc>
@@ -19829,7 +19841,7 @@
                 <w:rFonts w:ascii="Roboto" w:hAnsi="Roboto" w:eastAsia="Roboto" w:cs="Roboto"/>
                 <w:sz w:val="20"/>
               </w:rPr>
-              <w:t>ch. 2, p. 4; ch. 3, pp. 8, 9, 10; ch. 9, p. 38; Conclusion, p. 44</w:t>
+              <w:t>ch. 2, p. 4; ch. 3, pp. 8, 9, 10; ch. 9, p. 39; Conclusion, p. 45</w:t>
             </w:r>
           </w:p>
         </w:tc>
@@ -20123,7 +20135,7 @@
                 <w:rFonts w:ascii="Roboto" w:hAnsi="Roboto" w:eastAsia="Roboto" w:cs="Roboto"/>
                 <w:sz w:val="20"/>
               </w:rPr>
-              <w:t>ch. 9, p. 40</w:t>
+              <w:t>ch. 9, p. 41</w:t>
             </w:r>
           </w:p>
         </w:tc>
@@ -20270,7 +20282,7 @@
                 <w:rFonts w:ascii="Roboto" w:hAnsi="Roboto" w:eastAsia="Roboto" w:cs="Roboto"/>
                 <w:sz w:val="20"/>
               </w:rPr>
-              <w:t>ch. 3, pp. 8, 9, 10; ch. 5, p. 16; ch. 9, p. 38; Conclusion, p. 44</w:t>
+              <w:t>ch. 3, pp. 8, 9, 10; ch. 5, p. 16; ch. 9, p. 39; Conclusion, p. 45</w:t>
             </w:r>
           </w:p>
         </w:tc>
@@ -21005,7 +21017,7 @@
                 <w:rFonts w:ascii="Roboto" w:hAnsi="Roboto" w:eastAsia="Roboto" w:cs="Roboto"/>
                 <w:sz w:val="20"/>
               </w:rPr>
-              <w:t>ch. 5, p. 15; Conclusion, p. 44</w:t>
+              <w:t>ch. 5, p. 15; Conclusion, p. 45</w:t>
             </w:r>
           </w:p>
         </w:tc>
@@ -21173,7 +21185,7 @@
                 <w:rFonts w:ascii="Roboto" w:hAnsi="Roboto" w:eastAsia="Roboto" w:cs="Roboto"/>
                 <w:sz w:val="20"/>
               </w:rPr>
-              <w:t>ch. 2, pp. 4, 5; ch. 5, p. 16</w:t>
+              <w:t>ch. 2, pp. 4, 5; ch. 5, p. 16; ch. 9, p. 39</w:t>
             </w:r>
           </w:p>
         </w:tc>
@@ -21334,7 +21346,7 @@
                 <w:rFonts w:ascii="Roboto" w:hAnsi="Roboto" w:eastAsia="Roboto" w:cs="Roboto"/>
                 <w:sz w:val="20"/>
               </w:rPr>
-              <w:t>ch. 6, p. 19; ch. 9, pp. 39, 42</w:t>
+              <w:t>ch. 6, p. 19; ch. 9, pp. 40, 43</w:t>
             </w:r>
           </w:p>
         </w:tc>
@@ -21383,7 +21395,7 @@
                 <w:rFonts w:ascii="Roboto" w:hAnsi="Roboto" w:eastAsia="Roboto" w:cs="Roboto"/>
                 <w:sz w:val="20"/>
               </w:rPr>
-              <w:t>ch. 2, p. 5; ch. 6, p. 19; ch. 9, pp. 39, 42</w:t>
+              <w:t>ch. 2, p. 5; ch. 6, pp. 19, 20; ch. 9, pp. 40, 43</w:t>
             </w:r>
           </w:p>
         </w:tc>
@@ -21432,7 +21444,7 @@
                 <w:rFonts w:ascii="Roboto" w:hAnsi="Roboto" w:eastAsia="Roboto" w:cs="Roboto"/>
                 <w:sz w:val="20"/>
               </w:rPr>
-              <w:t>ch. 6, p. 19; ch. 9, pp. 39, 42</w:t>
+              <w:t>ch. 6, p. 19; ch. 9, pp. 40, 43</w:t>
             </w:r>
           </w:p>
         </w:tc>
@@ -21985,7 +21997,7 @@
                 <w:rFonts w:ascii="Roboto" w:hAnsi="Roboto" w:eastAsia="Roboto" w:cs="Roboto"/>
                 <w:sz w:val="20"/>
               </w:rPr>
-              <w:t>ch. 6, pp. 18, 21, 22; Conclusion, p. 44</w:t>
+              <w:t>ch. 6, pp. 18, 21, 22, 23; Conclusion, p. 45</w:t>
             </w:r>
           </w:p>
         </w:tc>
@@ -22902,7 +22914,7 @@
                 <w:rFonts w:ascii="Roboto" w:hAnsi="Roboto" w:eastAsia="Roboto" w:cs="Roboto"/>
                 <w:sz w:val="20"/>
               </w:rPr>
-              <w:t>ch. 8, p. 31</w:t>
+              <w:t>ch. 8, p. 31; ch. 9, p. 40</w:t>
             </w:r>
           </w:p>
         </w:tc>
@@ -23014,7 +23026,7 @@
                 <w:rFonts w:ascii="Roboto" w:hAnsi="Roboto" w:eastAsia="Roboto" w:cs="Roboto"/>
                 <w:sz w:val="20"/>
               </w:rPr>
-              <w:t>ch. 9, p. 40</w:t>
+              <w:t>ch. 9, p. 41</w:t>
             </w:r>
           </w:p>
         </w:tc>
@@ -23112,7 +23124,7 @@
                 <w:rFonts w:ascii="Roboto" w:hAnsi="Roboto" w:eastAsia="Roboto" w:cs="Roboto"/>
                 <w:sz w:val="20"/>
               </w:rPr>
-              <w:t>ch. 9, p. 40</w:t>
+              <w:t>ch. 9, p. 41</w:t>
             </w:r>
           </w:p>
         </w:tc>
@@ -23161,7 +23173,7 @@
                 <w:rFonts w:ascii="Roboto" w:hAnsi="Roboto" w:eastAsia="Roboto" w:cs="Roboto"/>
                 <w:sz w:val="20"/>
               </w:rPr>
-              <w:t>ch. 8, p. 29; ch. 9, pp. 40, 42</w:t>
+              <w:t>ch. 8, p. 29; ch. 9, pp. 40, 41, 43</w:t>
             </w:r>
           </w:p>
         </w:tc>
@@ -23546,7 +23558,7 @@
                 <w:rFonts w:ascii="Roboto" w:hAnsi="Roboto" w:eastAsia="Roboto" w:cs="Roboto"/>
                 <w:sz w:val="20"/>
               </w:rPr>
-              <w:t>ch. 9, p. 41</w:t>
+              <w:t>ch. 9, p. 42</w:t>
             </w:r>
           </w:p>
         </w:tc>
@@ -23602,7 +23614,7 @@
                 <w:rFonts w:ascii="Roboto" w:hAnsi="Roboto" w:eastAsia="Roboto" w:cs="Roboto"/>
                 <w:sz w:val="20"/>
               </w:rPr>
-              <w:t>ch. 2, p. 5; ch. 6, p. 20; ch. 8, pp. 29, 30, 31, 32, 33, 37; ch. 9, pp. 40, 42</w:t>
+              <w:t>ch. 2, p. 5; ch. 6, p. 20; ch. 8, pp. 29, 30, 31, 32, 33, 37; ch. 9, pp. 39, 40, 41, 43</w:t>
             </w:r>
           </w:p>
         </w:tc>
@@ -23826,7 +23838,7 @@
                 <w:rFonts w:ascii="Roboto" w:hAnsi="Roboto" w:eastAsia="Roboto" w:cs="Roboto"/>
                 <w:sz w:val="20"/>
               </w:rPr>
-              <w:t>ch. 8, pp. 33, 34, 35</w:t>
+              <w:t>ch. 8, pp. 33, 34, 35, 36</w:t>
             </w:r>
           </w:p>
         </w:tc>

</xml_diff>

<commit_message>
The End of the Lost: sharpen the justice and earthly-judgment verdicts
Co-Authored-By: Claude Sonnet 5.5 <noreply@anthropic.com>
Claude-Session: https://claude.ai/code/session_019KSmWUdVBWY1ogjaJqRPqC
</commit_message>
<xml_diff>
--- a/build-tools/commentary/endoflost/out/volume.docx
+++ b/build-tools/commentary/endoflost/out/volume.docx
@@ -10624,7 +10624,7 @@
           <w:rFonts w:ascii="Roboto" w:hAnsi="Roboto" w:eastAsia="Roboto" w:cs="Roboto"/>
           <w:sz w:val="20"/>
         </w:rPr>
-        <w:t>What is conceded. The objection is made in earnest and by writers who love the Scripture, and the volume agrees with Stott that the question must be examined and not ruled out of order. Verdict: the objection is a real question about God’s justice, and it does not overturn the thesis, because Scripture states that the Judge does right and gives no rule of proportion by which the text could be overruled.</w:t>
+        <w:t>What is conceded. The objection is made in earnest and by writers who love the Scripture, and the volume agrees with Stott that the question must be examined and not ruled out of order. Verdict: the objection raises a genuine moral question but supplies no exegetical evidence for annihilation. Scripture declares God’s judgments righteous and provides no proportionality rule by which its own testimony may be set aside.</w:t>
       </w:r>
     </w:p>
     <w:p>
@@ -10724,7 +10724,7 @@
           <w:rFonts w:ascii="Roboto" w:hAnsi="Roboto" w:eastAsia="Roboto" w:cs="Roboto"/>
           <w:sz w:val="20"/>
         </w:rPr>
-        <w:t>What is conceded. These verses say that the wicked do not last, they are among the strongest in the conditionalist case, and they are true statements of what happens to the wicked in the settings they describe. Verdict: the objection proves that the wicked perish from the earth, and it does not overturn the thesis, because it answers a question about the earth and the living and not a question about the lake.</w:t>
+        <w:t>What is conceded. These verses say that the wicked do not last, they are among the strongest in the conditionalist case, and they are true statements of what happens to the wicked in the settings they describe. Verdict: these passages establish the death, destruction, or removal they describe within their earthly settings. They do not describe the final condition of those cast into the lake of fire and therefore cannot establish annihilation.</w:t>
       </w:r>
     </w:p>
     <w:p>

</xml_diff>

<commit_message>
The End of the Lost: affirmative position, new section 8.4 (one lake), thesis, objections and conclusion aligned
Co-Authored-By: Claude Sonnet 5.5 <noreply@anthropic.com>
Claude-Session: https://claude.ai/code/session_019KSmWUdVBWY1ogjaJqRPqC
</commit_message>
<xml_diff>
--- a/build-tools/commentary/endoflost/out/volume.docx
+++ b/build-tools/commentary/endoflost/out/volume.docx
@@ -116,7 +116,7 @@
         </w:rPr>
         <w:t>3. Death, Destruction and Perishing in Their Own Contexts</w:t>
         <w:tab/>
-        <w:t>6</w:t>
+        <w:t>7</w:t>
       </w:r>
     </w:p>
     <w:p>
@@ -132,7 +132,7 @@
         </w:rPr>
         <w:t>4. Matthew 10:28 and Philippians 3:19</w:t>
         <w:tab/>
-        <w:t>10</w:t>
+        <w:t>11</w:t>
       </w:r>
     </w:p>
     <w:p>
@@ -148,7 +148,7 @@
         </w:rPr>
         <w:t>5. 2 Thessalonians 1:7–10</w:t>
         <w:tab/>
-        <w:t>14</w:t>
+        <w:t>15</w:t>
       </w:r>
     </w:p>
     <w:p>
@@ -164,7 +164,7 @@
         </w:rPr>
         <w:t>6. “Eternal”: Matthew 25:46, Daniel 12:2 and Jude 7</w:t>
         <w:tab/>
-        <w:t>18</w:t>
+        <w:t>19</w:t>
       </w:r>
     </w:p>
     <w:p>
@@ -212,7 +212,7 @@
         </w:rPr>
         <w:t>9. Objections and Replies</w:t>
         <w:tab/>
-        <w:t>38</w:t>
+        <w:t>42</w:t>
       </w:r>
     </w:p>
     <w:p>
@@ -228,7 +228,7 @@
         </w:rPr>
         <w:t>Conclusion</w:t>
         <w:tab/>
-        <w:t>44</w:t>
+        <w:t>49</w:t>
       </w:r>
     </w:p>
     <w:p>
@@ -244,7 +244,7 @@
         </w:rPr>
         <w:t>Appendix A. The Passages at a Glance</w:t>
         <w:tab/>
-        <w:t>46</w:t>
+        <w:t>52</w:t>
       </w:r>
     </w:p>
     <w:p>
@@ -260,7 +260,7 @@
         </w:rPr>
         <w:t>Appendix B. The Key Passages in Full</w:t>
         <w:tab/>
-        <w:t>47</w:t>
+        <w:t>53</w:t>
       </w:r>
     </w:p>
     <w:p>
@@ -276,7 +276,7 @@
         </w:rPr>
         <w:t>Appendix C. Where the Passages Are Read</w:t>
         <w:tab/>
-        <w:t>52</w:t>
+        <w:t>58</w:t>
       </w:r>
     </w:p>
     <w:p>
@@ -292,7 +292,7 @@
         </w:rPr>
         <w:t>Bibliography</w:t>
         <w:tab/>
-        <w:t>59</w:t>
+        <w:t>65</w:t>
       </w:r>
     </w:p>
     <w:p>
@@ -340,7 +340,7 @@
           <w:rFonts w:ascii="Roboto" w:hAnsi="Roboto" w:eastAsia="Roboto" w:cs="Roboto"/>
           <w:sz w:val="20"/>
         </w:rPr>
-        <w:t>The position is this. The words Scripture uses for the end of the lost are not one word, and none of them settles the question by itself. Death, destruction, perishing, punishment, torment, exclusion, the second death and judgment each stand in their own passage with their own audience, and each has to be read there. A word that sometimes describes a thing coming to an end also describes, in other verses, a thing that remains in being and is ruined. Read cumulatively and each in its place, the passages that speak of final judgment tell of a punishment that cannot be reversed and does not end, and where the text says so, of an experience that continues. They do not require that the lost cease to exist.</w:t>
+        <w:t>The position is this. The words Scripture uses for the end of the lost are not one word, and none of them settles the question by itself. Death, destruction, perishing, punishment, torment, exclusion, the second death and judgment each stand in their own passage with their own audience, and each has to be read there. A word that sometimes describes a thing coming to an end also describes, in other verses, a thing that remains in being and is ruined. Read cumulatively and each in its place, the passages that speak of final judgment establish a punishment that cannot be reversed and does not end. Revelation shows what that punishment is: one lake of fire, the second death, in which torment goes on day and night for ever and ever. Every person finally cast into it remains under its conscious punishment for ever and does not cease to exist.</w:t>
       </w:r>
     </w:p>
     <w:p>
@@ -402,7 +402,7 @@
           <w:rFonts w:ascii="Roboto" w:hAnsi="Roboto" w:eastAsia="Roboto" w:cs="Roboto"/>
           <w:sz w:val="20"/>
         </w:rPr>
-        <w:t>Destruction language in Scripture does not by itself establish that the lost cease to exist. Its meaning is fixed by context, and the words for death, destruction, punishment, torment, exclusion, the second death and judgment are not one word. Taken together, each in its own setting, the passages on final judgment establish a punishment that is irreversible and enduring, and where the text says so, a continuing experience of it. They do not require cessation of existence. No single Greek word and no single proof text carries the case, and the volume does not rest it on one.</w:t>
+        <w:t>Destruction language in Scripture does not by itself establish annihilation. Its meaning is determined by context, and the biblical language of death, destruction, punishment, torment, exclusion, the second death and final judgment must be read cumulatively rather than collapsed into a single word or image. Taken together, the final-judgment passages establish irreversible and everlasting punishment. Revelation describes human beings under torment without rest, identifies the lake of fire as the second death, and describes that lake as the place of torment day and night for ever and ever. Those finally cast into the lake therefore do not cease to exist; they remain under its conscious punishment for ever. No single Greek word or isolated proof text carries this conclusion. The cumulative testimony of the passages does.</w:t>
       </w:r>
     </w:p>
     <w:p>
@@ -416,7 +416,7 @@
           <w:rFonts w:ascii="Roboto" w:hAnsi="Roboto" w:eastAsia="Roboto" w:cs="Roboto"/>
           <w:sz w:val="20"/>
         </w:rPr>
-        <w:t>The thesis in five statements.</w:t>
+        <w:t>The thesis in six statements.</w:t>
       </w:r>
     </w:p>
     <w:tbl>
@@ -441,9 +441,9 @@
         </w:tblBorders>
       </w:tblPr>
       <w:tblGrid>
-        <w:gridCol w:w="1218"/>
+        <w:gridCol w:w="914"/>
         <w:gridCol w:w="4721"/>
-        <w:gridCol w:w="1676"/>
+        <w:gridCol w:w="1980"/>
       </w:tblGrid>
       <w:tr>
         <w:trPr>
@@ -452,7 +452,7 @@
         </w:trPr>
         <w:tc>
           <w:tcPr>
-            <w:tcW w:w="1218" w:type="dxa"/>
+            <w:tcW w:w="914" w:type="dxa"/>
             <w:shd w:val="clear" w:color="auto" w:fill="3B6E91"/>
           </w:tcPr>
           <w:p>
@@ -494,7 +494,7 @@
         </w:tc>
         <w:tc>
           <w:tcPr>
-            <w:tcW w:w="1676" w:type="dxa"/>
+            <w:tcW w:w="1980" w:type="dxa"/>
             <w:shd w:val="clear" w:color="auto" w:fill="3B6E91"/>
           </w:tcPr>
           <w:p>
@@ -520,7 +520,7 @@
         </w:trPr>
         <w:tc>
           <w:tcPr>
-            <w:tcW w:w="1218" w:type="dxa"/>
+            <w:tcW w:w="914" w:type="dxa"/>
           </w:tcPr>
           <w:p>
             <w:pPr>
@@ -556,7 +556,7 @@
         </w:tc>
         <w:tc>
           <w:tcPr>
-            <w:tcW w:w="1676" w:type="dxa"/>
+            <w:tcW w:w="1980" w:type="dxa"/>
           </w:tcPr>
           <w:p>
             <w:pPr>
@@ -579,7 +579,7 @@
         </w:trPr>
         <w:tc>
           <w:tcPr>
-            <w:tcW w:w="1218" w:type="dxa"/>
+            <w:tcW w:w="914" w:type="dxa"/>
           </w:tcPr>
           <w:p>
             <w:pPr>
@@ -613,7 +613,7 @@
         </w:tc>
         <w:tc>
           <w:tcPr>
-            <w:tcW w:w="1676" w:type="dxa"/>
+            <w:tcW w:w="1980" w:type="dxa"/>
           </w:tcPr>
           <w:p>
             <w:pPr>
@@ -635,7 +635,7 @@
         </w:trPr>
         <w:tc>
           <w:tcPr>
-            <w:tcW w:w="1218" w:type="dxa"/>
+            <w:tcW w:w="914" w:type="dxa"/>
           </w:tcPr>
           <w:p>
             <w:pPr>
@@ -669,7 +669,7 @@
         </w:tc>
         <w:tc>
           <w:tcPr>
-            <w:tcW w:w="1676" w:type="dxa"/>
+            <w:tcW w:w="1980" w:type="dxa"/>
           </w:tcPr>
           <w:p>
             <w:pPr>
@@ -691,7 +691,7 @@
         </w:trPr>
         <w:tc>
           <w:tcPr>
-            <w:tcW w:w="1218" w:type="dxa"/>
+            <w:tcW w:w="914" w:type="dxa"/>
           </w:tcPr>
           <w:p>
             <w:pPr>
@@ -725,7 +725,7 @@
         </w:tc>
         <w:tc>
           <w:tcPr>
-            <w:tcW w:w="1676" w:type="dxa"/>
+            <w:tcW w:w="1980" w:type="dxa"/>
           </w:tcPr>
           <w:p>
             <w:pPr>
@@ -747,7 +747,7 @@
         </w:trPr>
         <w:tc>
           <w:tcPr>
-            <w:tcW w:w="1218" w:type="dxa"/>
+            <w:tcW w:w="914" w:type="dxa"/>
           </w:tcPr>
           <w:p>
             <w:pPr>
@@ -775,24 +775,80 @@
                 <w:rFonts w:ascii="Roboto" w:hAnsi="Roboto" w:eastAsia="Roboto" w:cs="Roboto"/>
                 <w:sz w:val="20"/>
               </w:rPr>
-              <w:t>In Revelation the worshippers of the beast are tormented and have no rest day nor night, the plural statement of torment at 20:10 takes in the beast and the false prophet cast in a thousand years before, and the second death is described by what the lake contains and does.</w:t>
-            </w:r>
-          </w:p>
-        </w:tc>
-        <w:tc>
-          <w:tcPr>
-            <w:tcW w:w="1676" w:type="dxa"/>
-          </w:tcPr>
-          <w:p>
-            <w:pPr>
-              <w:spacing w:after="0" w:before="0" w:line="259" w:lineRule="auto"/>
-            </w:pPr>
-            <w:r>
-              <w:rPr>
-                <w:rFonts w:ascii="Roboto" w:hAnsi="Roboto" w:eastAsia="Roboto" w:cs="Roboto"/>
-                <w:sz w:val="20"/>
-              </w:rPr>
-              <w:t>Chapter 8</w:t>
+              <w:t>In Revelation the human worshippers of the beast are tormented with fire and brimstone and have no rest day nor night, and the lake of fire is the place of torment day and night for ever and ever.</w:t>
+            </w:r>
+          </w:p>
+        </w:tc>
+        <w:tc>
+          <w:tcPr>
+            <w:tcW w:w="1980" w:type="dxa"/>
+          </w:tcPr>
+          <w:p>
+            <w:pPr>
+              <w:spacing w:after="0" w:before="0" w:line="259" w:lineRule="auto"/>
+            </w:pPr>
+            <w:r>
+              <w:rPr>
+                <w:rFonts w:ascii="Roboto" w:hAnsi="Roboto" w:eastAsia="Roboto" w:cs="Roboto"/>
+                <w:sz w:val="20"/>
+              </w:rPr>
+              <w:t>Sections 8.1 and 8.2</w:t>
+            </w:r>
+          </w:p>
+        </w:tc>
+      </w:tr>
+      <w:tr>
+        <w:trPr>
+          <w:cantSplit/>
+        </w:trPr>
+        <w:tc>
+          <w:tcPr>
+            <w:tcW w:w="914" w:type="dxa"/>
+          </w:tcPr>
+          <w:p>
+            <w:pPr>
+              <w:spacing w:after="0" w:before="0" w:line="259" w:lineRule="auto"/>
+            </w:pPr>
+            <w:r>
+              <w:rPr>
+                <w:rFonts w:ascii="Roboto" w:hAnsi="Roboto" w:eastAsia="Roboto" w:cs="Roboto"/>
+                <w:sz w:val="20"/>
+              </w:rPr>
+              <w:t>6</w:t>
+            </w:r>
+          </w:p>
+        </w:tc>
+        <w:tc>
+          <w:tcPr>
+            <w:tcW w:w="4721" w:type="dxa"/>
+          </w:tcPr>
+          <w:p>
+            <w:pPr>
+              <w:spacing w:after="0" w:before="0" w:line="259" w:lineRule="auto"/>
+            </w:pPr>
+            <w:r>
+              <w:rPr>
+                <w:rFonts w:ascii="Roboto" w:hAnsi="Roboto" w:eastAsia="Roboto" w:cs="Roboto"/>
+                <w:sz w:val="20"/>
+              </w:rPr>
+              <w:t>The lake of fire is one lake, called the second death; the human lost cast into it remain under its punishment for ever, and the second death is not extinction.</w:t>
+            </w:r>
+          </w:p>
+        </w:tc>
+        <w:tc>
+          <w:tcPr>
+            <w:tcW w:w="1980" w:type="dxa"/>
+          </w:tcPr>
+          <w:p>
+            <w:pPr>
+              <w:spacing w:after="0" w:before="0" w:line="259" w:lineRule="auto"/>
+            </w:pPr>
+            <w:r>
+              <w:rPr>
+                <w:rFonts w:ascii="Roboto" w:hAnsi="Roboto" w:eastAsia="Roboto" w:cs="Roboto"/>
+                <w:sz w:val="20"/>
+              </w:rPr>
+              <w:t>Sections 8.3 and 8.4</w:t>
             </w:r>
           </w:p>
         </w:tc>
@@ -1503,7 +1559,7 @@
           <w:rFonts w:ascii="Roboto" w:hAnsi="Roboto" w:eastAsia="Roboto" w:cs="Roboto"/>
           <w:sz w:val="20"/>
         </w:rPr>
-        <w:t>Each conclusion in the chapters that follow is marked as one of three kinds. A conclusion is Stated where the verse says it in so many words. It is shown by the context where the verse does not say it but the verses around it do, or the passage it quotes does. It is Inferred where the volume draws it by reasoning from what is stated and shown. A reader who accepts the first and the second and doubts the third knows exactly what he doubts. The volume holds that the case needs all three, and that it is weakest where it is inferred. It says so at those points.</w:t>
+        <w:t>Each conclusion in the chapters that follow is marked as one of three kinds. A conclusion is Stated where the verse says it in so many words. It is shown by the context where the verse does not say it but the verses around it do, or the passage it quotes does. It is Inferred where the volume draws it by reasoning from what is stated and shown. A reader who accepts the first and the second and doubts the third knows exactly what he doubts. Inferred does not mean uncertain: a conclusion that several passages require together is firmly established, even when no one verse states the whole of it in one sentence. The volume holds that the case needs all three kinds, and it marks each conclusion so that the reader can see which statements are the text’s own words and which are the conclusion drawn from them.</w:t>
       </w:r>
     </w:p>
     <w:p>
@@ -8192,7 +8248,7 @@
           <w:rFonts w:ascii="Roboto" w:hAnsi="Roboto" w:eastAsia="Roboto" w:cs="Roboto"/>
           <w:sz w:val="20"/>
         </w:rPr>
-        <w:t>Claim: in Revelation the final punishment is described by the persons who are in it. The third angel says that they are tormented and have no rest day nor night. The seer says that the beast and the false prophet were cast alive into the lake of fire, that the devil is cast in a thousand years later, and that a plural statement of torment, day and night for ever and ever, follows. The lake is called the second death, and Revelation’s own portrayal of the first death does not describe the person’s ceasing. This chapter reads the passages in five parts and says in the last what stands at the throne and who.</w:t>
+        <w:t>Claim: in Revelation the lake of fire is one place of enduring torment, and every person finally cast into it remains under its punishment for ever and does not cease to exist. The third angel says that the human worshippers of the beast are tormented and have no rest day nor night. The seer says that the beast and the false prophet were cast alive into the lake, that the devil is cast in a thousand years later, and that torment day and night for ever and ever follows. The lake is called the second death, and Revelation’s own portrayal of the first death does not describe the person’s ceasing. This chapter reads the passages in six parts: the third angel’s warning, the verse on the devil, the second death, the one lake and the human lost cast into it, the sentence at the throne, and who stands there.</w:t>
       </w:r>
     </w:p>
     <w:p>
@@ -8727,7 +8783,7 @@
           <w:rFonts w:ascii="Roboto" w:hAnsi="Roboto" w:eastAsia="Roboto" w:cs="Roboto"/>
           <w:sz w:val="20"/>
         </w:rPr>
-        <w:t>The name “the second death” does not require that those cast into the lake cease to exist. Revelation calls the lake of fire “the second death” (Revelation 20:14; 21:8), and the volume argues that the name is read from what the book says the lake is and what it says death is, and not from a definition of death brought to the book.</w:t>
+        <w:t>The name “the second death” does not require that those cast into the lake cease to exist, and the lake’s own description, read in section 8.4, shows that they do not. Revelation calls the lake of fire “the second death” (Revelation 20:14; 21:8), and the volume argues that the name is read from what the book says the lake is and what it says death is, and not from a definition of death brought to the book.</w:t>
       </w:r>
     </w:p>
     <w:p>
@@ -9406,7 +9462,7 @@
           <w:b/>
           <w:sz w:val="20"/>
         </w:rPr>
-        <w:t>8.4 Revelation 20:11–15 read for what it establishes of final punishment</w:t>
+        <w:t>8.4 One lake, and who is cast into it</w:t>
       </w:r>
     </w:p>
     <w:p>
@@ -9418,19 +9474,21 @@
           <w:rFonts w:ascii="Roboto" w:hAnsi="Roboto" w:eastAsia="Roboto" w:cs="Roboto"/>
           <w:sz w:val="20"/>
         </w:rPr>
-        <w:t>The throne scene is read here for one thing: what it says about the punishment that follows. The seer writes, “And I saw a great white throne, and him that sat on it, from whose face the earth and the heaven fled away; and there was found no place for them” (Revelation 20:11). The dead “small and great” stand before God, books are opened, and “the dead were judged out of those things which were written in the books, according to their works” (Revelation 20:12). The sea, Death and Hades give up their dead, and “they were judged every man according to their works” (Revelation 20:13). Then the sentence is carried out: “And death and hell were cast into the lake of fire. This is the second death. And whosoever was not found written in the book of life was cast into the lake of fire” (Revelation 20:14, 15).</w:t>
+        <w:t>The lake of fire is one place with one revealed character, and the human lost who are cast into it remain under its punishment for ever. The conclusion is not the statement of any single verse, and the volume does not present it as one. It is built in six steps, and each step is marked, so that the reader can see which parts are the text’s own words and which are the conclusion drawn from them. The conclusion is Inferred, and Inferred here does not mean uncertain: a conclusion that several passages require together is firmly established, even when no one verse says the whole of it in one sentence.</w:t>
       </w:r>
     </w:p>
     <w:p>
       <w:pPr>
-        <w:jc w:val="left"/>
-      </w:pPr>
-      <w:r>
-        <w:rPr>
-          <w:rFonts w:ascii="Roboto" w:hAnsi="Roboto" w:eastAsia="Roboto" w:cs="Roboto"/>
-          <w:sz w:val="20"/>
-        </w:rPr>
-        <w:t>Three things follow from the text, and they are the volume’s only claims from it. The first is that the judgment is individual and according to works: each is judged “every man according to their works” (Revelation 20:13). The second is that the sentence is a casting into the lake, which is an act done to persons. The third is that the passage does not say that the lake is emptied or that those cast into it cease. It says that they are cast in, and the preceding section has shown what the book says of the lake.</w:t>
+        <w:keepNext/>
+        <w:spacing w:before="80" w:after="80"/>
+      </w:pPr>
+      <w:r>
+        <w:rPr>
+          <w:rFonts w:ascii="Roboto" w:hAnsi="Roboto" w:eastAsia="Roboto" w:cs="Roboto"/>
+          <w:b/>
+          <w:sz w:val="20"/>
+        </w:rPr>
+        <w:t>Step one: the nature of the lake</w:t>
       </w:r>
     </w:p>
     <w:p>
@@ -9442,23 +9500,443 @@
           <w:rFonts w:ascii="Roboto" w:hAnsi="Roboto" w:eastAsia="Roboto" w:cs="Roboto"/>
           <w:sz w:val="20"/>
         </w:rPr>
-        <w:t>A judgment that is according to works is a judgment in which the persons are not all treated alike. The Lord said as much in the days of His ministry to Israel. Of Tyre and Sidon He said that it would be “more tolerable” for them “at the day of judgment” than for the cities that saw His works (Matthew 11:22), and of Sodom the same (Matthew 11:24). Of the servant who knew his lord’s will and did it not He said that he “shall be beaten with many stripes”, and of him who knew not, “few stripes” (Luke 12:47, 48). Of the scribes and Pharisees He said, “ye shall receive the greater damnation” (Matthew 23:14), and the letter to the Hebrews speaks of “sorer punishment” for him who has trodden under foot the Son of God (Hebrews 10:29). These words were spoken to Israel and to the Hebrew readers, and they are witnesses of what Scripture reveals of the day of judgment and not words to the Body. They state that the punishment is graded.</w:t>
+        <w:t>Revelation 20:10 gives the lake its character. The devil “was cast into the lake of fire and brimstone, where the beast and the false prophet are, and shall be tormented day and night for ever and ever”. The sentence names a place, a fire and a brimstone, and then says what is done to those in it: they are tormented, without a pause (“day and night”) and without a term (“for ever and ever”). That the devil is cast into the lake and tormented there for ever and ever is Stated. That the beast and the false prophet are included in the plural statement of torment is shown by the grammar and the context (section 8.2). The lake is therefore described, in the verse that first says what happens in it, as a place of enduring torment, and it is described so before any human dead are said to be cast into it at the throne.</w:t>
       </w:r>
     </w:p>
     <w:p>
       <w:pPr>
-        <w:jc w:val="left"/>
-      </w:pPr>
-      <w:r>
-        <w:rPr>
-          <w:rFonts w:ascii="Roboto" w:hAnsi="Roboto" w:eastAsia="Roboto" w:cs="Roboto"/>
-          <w:sz w:val="20"/>
-        </w:rPr>
-        <w:t>The grading of the judgment shows that the punishment is described as an infliction with a content and a measure, and not as a ceasing. A punishment which can be more tolerable or less, which is a measure of stripes, and which is said to be “greater” and “sorer”, is described as something the persons have. That is shown by the context. The writer who holds that the lost cease to exist grants the grading and says that it is the measure of suffering before the end. The volume grants that this reading is possible and that degrees alone do not decide the question; the passage does not say that the content is never completed, and the descriptions the Scripture uses are the descriptions of an infliction.</w:t>
+        <w:keepNext/>
+        <w:spacing w:before="80" w:after="80"/>
+      </w:pPr>
+      <w:r>
+        <w:rPr>
+          <w:rFonts w:ascii="Roboto" w:hAnsi="Roboto" w:eastAsia="Roboto" w:cs="Roboto"/>
+          <w:b/>
+          <w:sz w:val="20"/>
+        </w:rPr>
+        <w:t>Step two: one lake, not several</w:t>
       </w:r>
     </w:p>
     <w:p>
       <w:pPr>
+        <w:jc w:val="left"/>
+      </w:pPr>
+      <w:r>
+        <w:rPr>
+          <w:rFonts w:ascii="Roboto" w:hAnsi="Roboto" w:eastAsia="Roboto" w:cs="Roboto"/>
+          <w:sz w:val="20"/>
+        </w:rPr>
+        <w:t>The book does not speak of several fires. It speaks of one lake, and it names it in the same way each time it speaks of it. The table sets the passages side by side.</w:t>
+      </w:r>
+    </w:p>
+    <w:p>
+      <w:pPr>
+        <w:keepNext/>
+        <w:spacing w:after="200"/>
+        <w:jc w:val="left"/>
+      </w:pPr>
+      <w:r>
+        <w:rPr>
+          <w:rFonts w:ascii="Roboto" w:hAnsi="Roboto" w:eastAsia="Roboto" w:cs="Roboto"/>
+          <w:sz w:val="20"/>
+        </w:rPr>
+        <w:t>How Revelation names the lake.</w:t>
+      </w:r>
+    </w:p>
+    <w:tbl>
+      <w:tblPr>
+        <w:tblLook w:firstColumn="1" w:firstRow="1" w:lastColumn="0" w:lastRow="0" w:noHBand="0" w:noVBand="1" w:val="04A0"/>
+        <w:tblCellMar>
+          <w:top w:w="60" w:type="dxa"/>
+          <w:left w:w="100" w:type="dxa"/>
+          <w:bottom w:w="60" w:type="dxa"/>
+          <w:right w:w="100" w:type="dxa"/>
+        </w:tblCellMar>
+        <w:tblW w:w="7615" w:type="dxa"/>
+        <w:tblInd w:w="100" w:type="dxa"/>
+        <w:tblLayout w:type="fixed"/>
+        <w:tblBorders>
+          <w:top w:val="single" w:sz="6" w:space="0" w:color="1B3350"/>
+          <w:left w:val="single" w:sz="6" w:space="0" w:color="1B3350"/>
+          <w:bottom w:val="single" w:sz="6" w:space="0" w:color="1B3350"/>
+          <w:right w:val="single" w:sz="6" w:space="0" w:color="1B3350"/>
+          <w:insideH w:val="single" w:sz="6" w:space="0" w:color="1B3350"/>
+          <w:insideV w:val="single" w:sz="6" w:space="0" w:color="1B3350"/>
+        </w:tblBorders>
+      </w:tblPr>
+      <w:tblGrid>
+        <w:gridCol w:w="1523"/>
+        <w:gridCol w:w="3198"/>
+        <w:gridCol w:w="2894"/>
+      </w:tblGrid>
+      <w:tr>
+        <w:trPr>
+          <w:cantSplit/>
+          <w:tblHeader/>
+        </w:trPr>
+        <w:tc>
+          <w:tcPr>
+            <w:tcW w:w="1523" w:type="dxa"/>
+            <w:shd w:val="clear" w:color="auto" w:fill="3B6E91"/>
+          </w:tcPr>
+          <w:p>
+            <w:pPr>
+              <w:keepNext/>
+              <w:spacing w:after="0" w:before="0" w:line="259" w:lineRule="auto"/>
+            </w:pPr>
+            <w:r>
+              <w:rPr>
+                <w:rFonts w:ascii="Roboto" w:hAnsi="Roboto" w:eastAsia="Roboto" w:cs="Roboto"/>
+                <w:b/>
+                <w:color w:val="FFFFFF"/>
+                <w:sz w:val="20"/>
+              </w:rPr>
+              <w:t>Passage</w:t>
+            </w:r>
+          </w:p>
+        </w:tc>
+        <w:tc>
+          <w:tcPr>
+            <w:tcW w:w="3198" w:type="dxa"/>
+            <w:shd w:val="clear" w:color="auto" w:fill="3B6E91"/>
+          </w:tcPr>
+          <w:p>
+            <w:pPr>
+              <w:keepNext/>
+              <w:spacing w:after="0" w:before="0" w:line="259" w:lineRule="auto"/>
+            </w:pPr>
+            <w:r>
+              <w:rPr>
+                <w:rFonts w:ascii="Roboto" w:hAnsi="Roboto" w:eastAsia="Roboto" w:cs="Roboto"/>
+                <w:b/>
+                <w:color w:val="FFFFFF"/>
+                <w:sz w:val="20"/>
+              </w:rPr>
+              <w:t>How the lake is named</w:t>
+            </w:r>
+          </w:p>
+        </w:tc>
+        <w:tc>
+          <w:tcPr>
+            <w:tcW w:w="2894" w:type="dxa"/>
+            <w:shd w:val="clear" w:color="auto" w:fill="3B6E91"/>
+          </w:tcPr>
+          <w:p>
+            <w:pPr>
+              <w:keepNext/>
+              <w:spacing w:after="0" w:before="0" w:line="259" w:lineRule="auto"/>
+            </w:pPr>
+            <w:r>
+              <w:rPr>
+                <w:rFonts w:ascii="Roboto" w:hAnsi="Roboto" w:eastAsia="Roboto" w:cs="Roboto"/>
+                <w:b/>
+                <w:color w:val="FFFFFF"/>
+                <w:sz w:val="20"/>
+              </w:rPr>
+              <w:t>Who is in it or is cast into it</w:t>
+            </w:r>
+          </w:p>
+        </w:tc>
+      </w:tr>
+      <w:tr>
+        <w:trPr>
+          <w:cantSplit/>
+        </w:trPr>
+        <w:tc>
+          <w:tcPr>
+            <w:tcW w:w="1523" w:type="dxa"/>
+          </w:tcPr>
+          <w:p>
+            <w:pPr>
+              <w:keepNext/>
+              <w:spacing w:after="0" w:before="0" w:line="259" w:lineRule="auto"/>
+            </w:pPr>
+            <w:r>
+              <w:rPr>
+                <w:rFonts w:ascii="Roboto" w:hAnsi="Roboto" w:eastAsia="Roboto" w:cs="Roboto"/>
+                <w:sz w:val="20"/>
+              </w:rPr>
+              <w:t>Revelation 19:20</w:t>
+            </w:r>
+          </w:p>
+        </w:tc>
+        <w:tc>
+          <w:tcPr>
+            <w:tcW w:w="3198" w:type="dxa"/>
+          </w:tcPr>
+          <w:p>
+            <w:pPr>
+              <w:keepNext/>
+              <w:spacing w:after="0" w:before="0" w:line="259" w:lineRule="auto"/>
+            </w:pPr>
+            <w:r>
+              <w:rPr>
+                <w:rFonts w:ascii="Roboto" w:hAnsi="Roboto" w:eastAsia="Roboto" w:cs="Roboto"/>
+                <w:sz w:val="20"/>
+              </w:rPr>
+              <w:t>“a lake of fire burning with brimstone”</w:t>
+            </w:r>
+          </w:p>
+        </w:tc>
+        <w:tc>
+          <w:tcPr>
+            <w:tcW w:w="2894" w:type="dxa"/>
+          </w:tcPr>
+          <w:p>
+            <w:pPr>
+              <w:keepNext/>
+              <w:spacing w:after="0" w:before="0" w:line="259" w:lineRule="auto"/>
+            </w:pPr>
+            <w:r>
+              <w:rPr>
+                <w:rFonts w:ascii="Roboto" w:hAnsi="Roboto" w:eastAsia="Roboto" w:cs="Roboto"/>
+                <w:sz w:val="20"/>
+              </w:rPr>
+              <w:t>The beast and the false prophet, cast alive</w:t>
+            </w:r>
+          </w:p>
+        </w:tc>
+      </w:tr>
+      <w:tr>
+        <w:trPr>
+          <w:cantSplit/>
+        </w:trPr>
+        <w:tc>
+          <w:tcPr>
+            <w:tcW w:w="1523" w:type="dxa"/>
+          </w:tcPr>
+          <w:p>
+            <w:pPr>
+              <w:spacing w:after="0" w:before="0" w:line="259" w:lineRule="auto"/>
+            </w:pPr>
+            <w:r>
+              <w:rPr>
+                <w:rFonts w:ascii="Roboto" w:hAnsi="Roboto" w:eastAsia="Roboto" w:cs="Roboto"/>
+                <w:sz w:val="20"/>
+              </w:rPr>
+              <w:t>Revelation 20:10</w:t>
+            </w:r>
+          </w:p>
+        </w:tc>
+        <w:tc>
+          <w:tcPr>
+            <w:tcW w:w="3198" w:type="dxa"/>
+          </w:tcPr>
+          <w:p>
+            <w:pPr>
+              <w:spacing w:after="0" w:before="0" w:line="259" w:lineRule="auto"/>
+            </w:pPr>
+            <w:r>
+              <w:rPr>
+                <w:rFonts w:ascii="Roboto" w:hAnsi="Roboto" w:eastAsia="Roboto" w:cs="Roboto"/>
+                <w:sz w:val="20"/>
+              </w:rPr>
+              <w:t>“the lake of fire and brimstone”</w:t>
+            </w:r>
+          </w:p>
+        </w:tc>
+        <w:tc>
+          <w:tcPr>
+            <w:tcW w:w="2894" w:type="dxa"/>
+          </w:tcPr>
+          <w:p>
+            <w:pPr>
+              <w:spacing w:after="0" w:before="0" w:line="259" w:lineRule="auto"/>
+            </w:pPr>
+            <w:r>
+              <w:rPr>
+                <w:rFonts w:ascii="Roboto" w:hAnsi="Roboto" w:eastAsia="Roboto" w:cs="Roboto"/>
+                <w:sz w:val="20"/>
+              </w:rPr>
+              <w:t>The devil, cast in where the beast and the false prophet are; tormented day and night for ever and ever</w:t>
+            </w:r>
+          </w:p>
+        </w:tc>
+      </w:tr>
+      <w:tr>
+        <w:trPr>
+          <w:cantSplit/>
+        </w:trPr>
+        <w:tc>
+          <w:tcPr>
+            <w:tcW w:w="1523" w:type="dxa"/>
+          </w:tcPr>
+          <w:p>
+            <w:pPr>
+              <w:spacing w:after="0" w:before="0" w:line="259" w:lineRule="auto"/>
+            </w:pPr>
+            <w:r>
+              <w:rPr>
+                <w:rFonts w:ascii="Roboto" w:hAnsi="Roboto" w:eastAsia="Roboto" w:cs="Roboto"/>
+                <w:sz w:val="20"/>
+              </w:rPr>
+              <w:t>Revelation 20:14</w:t>
+            </w:r>
+          </w:p>
+        </w:tc>
+        <w:tc>
+          <w:tcPr>
+            <w:tcW w:w="3198" w:type="dxa"/>
+          </w:tcPr>
+          <w:p>
+            <w:pPr>
+              <w:spacing w:after="0" w:before="0" w:line="259" w:lineRule="auto"/>
+            </w:pPr>
+            <w:r>
+              <w:rPr>
+                <w:rFonts w:ascii="Roboto" w:hAnsi="Roboto" w:eastAsia="Roboto" w:cs="Roboto"/>
+                <w:sz w:val="20"/>
+              </w:rPr>
+              <w:t>“the lake of fire”, “the second death”</w:t>
+            </w:r>
+          </w:p>
+        </w:tc>
+        <w:tc>
+          <w:tcPr>
+            <w:tcW w:w="2894" w:type="dxa"/>
+          </w:tcPr>
+          <w:p>
+            <w:pPr>
+              <w:spacing w:after="0" w:before="0" w:line="259" w:lineRule="auto"/>
+            </w:pPr>
+            <w:r>
+              <w:rPr>
+                <w:rFonts w:ascii="Roboto" w:hAnsi="Roboto" w:eastAsia="Roboto" w:cs="Roboto"/>
+                <w:sz w:val="20"/>
+              </w:rPr>
+              <w:t>Death and Hell, cast in</w:t>
+            </w:r>
+          </w:p>
+        </w:tc>
+      </w:tr>
+      <w:tr>
+        <w:trPr>
+          <w:cantSplit/>
+        </w:trPr>
+        <w:tc>
+          <w:tcPr>
+            <w:tcW w:w="1523" w:type="dxa"/>
+          </w:tcPr>
+          <w:p>
+            <w:pPr>
+              <w:spacing w:after="0" w:before="0" w:line="259" w:lineRule="auto"/>
+            </w:pPr>
+            <w:r>
+              <w:rPr>
+                <w:rFonts w:ascii="Roboto" w:hAnsi="Roboto" w:eastAsia="Roboto" w:cs="Roboto"/>
+                <w:sz w:val="20"/>
+              </w:rPr>
+              <w:t>Revelation 20:15</w:t>
+            </w:r>
+          </w:p>
+        </w:tc>
+        <w:tc>
+          <w:tcPr>
+            <w:tcW w:w="3198" w:type="dxa"/>
+          </w:tcPr>
+          <w:p>
+            <w:pPr>
+              <w:spacing w:after="0" w:before="0" w:line="259" w:lineRule="auto"/>
+            </w:pPr>
+            <w:r>
+              <w:rPr>
+                <w:rFonts w:ascii="Roboto" w:hAnsi="Roboto" w:eastAsia="Roboto" w:cs="Roboto"/>
+                <w:sz w:val="20"/>
+              </w:rPr>
+              <w:t>“the lake of fire”</w:t>
+            </w:r>
+          </w:p>
+        </w:tc>
+        <w:tc>
+          <w:tcPr>
+            <w:tcW w:w="2894" w:type="dxa"/>
+          </w:tcPr>
+          <w:p>
+            <w:pPr>
+              <w:spacing w:after="0" w:before="0" w:line="259" w:lineRule="auto"/>
+            </w:pPr>
+            <w:r>
+              <w:rPr>
+                <w:rFonts w:ascii="Roboto" w:hAnsi="Roboto" w:eastAsia="Roboto" w:cs="Roboto"/>
+                <w:sz w:val="20"/>
+              </w:rPr>
+              <w:t>Whosoever was not found written in the book of life, cast in</w:t>
+            </w:r>
+          </w:p>
+        </w:tc>
+      </w:tr>
+      <w:tr>
+        <w:trPr>
+          <w:cantSplit/>
+        </w:trPr>
+        <w:tc>
+          <w:tcPr>
+            <w:tcW w:w="1523" w:type="dxa"/>
+          </w:tcPr>
+          <w:p>
+            <w:pPr>
+              <w:spacing w:after="0" w:before="0" w:line="259" w:lineRule="auto"/>
+            </w:pPr>
+            <w:r>
+              <w:rPr>
+                <w:rFonts w:ascii="Roboto" w:hAnsi="Roboto" w:eastAsia="Roboto" w:cs="Roboto"/>
+                <w:sz w:val="20"/>
+              </w:rPr>
+              <w:t>Revelation 21:8</w:t>
+            </w:r>
+          </w:p>
+        </w:tc>
+        <w:tc>
+          <w:tcPr>
+            <w:tcW w:w="3198" w:type="dxa"/>
+          </w:tcPr>
+          <w:p>
+            <w:pPr>
+              <w:spacing w:after="0" w:before="0" w:line="259" w:lineRule="auto"/>
+            </w:pPr>
+            <w:r>
+              <w:rPr>
+                <w:rFonts w:ascii="Roboto" w:hAnsi="Roboto" w:eastAsia="Roboto" w:cs="Roboto"/>
+                <w:sz w:val="20"/>
+              </w:rPr>
+              <w:t>“the lake which burneth with fire and brimstone: which is the second death”</w:t>
+            </w:r>
+          </w:p>
+        </w:tc>
+        <w:tc>
+          <w:tcPr>
+            <w:tcW w:w="2894" w:type="dxa"/>
+          </w:tcPr>
+          <w:p>
+            <w:pPr>
+              <w:spacing w:after="0" w:before="0" w:line="259" w:lineRule="auto"/>
+            </w:pPr>
+            <w:r>
+              <w:rPr>
+                <w:rFonts w:ascii="Roboto" w:hAnsi="Roboto" w:eastAsia="Roboto" w:cs="Roboto"/>
+                <w:sz w:val="20"/>
+              </w:rPr>
+              <w:t>The fearful, unbelieving and the rest named there, who have their part in it</w:t>
+            </w:r>
+          </w:p>
+        </w:tc>
+      </w:tr>
+    </w:tbl>
+    <w:p>
+      <w:pPr>
+        <w:spacing w:before="200"/>
+        <w:jc w:val="left"/>
+      </w:pPr>
+      <w:r>
+        <w:rPr>
+          <w:rFonts w:ascii="Roboto" w:hAnsi="Roboto" w:eastAsia="Roboto" w:cs="Roboto"/>
+          <w:sz w:val="20"/>
+        </w:rPr>
+        <w:t>Four things in the table are Stated. The pair “fire and brimstone” stands in 19:20, 20:10 and 21:8. The word “lake” is the name in every passage, and the Greek names it with the definite article in each of the four later places, as the one already introduced. The verb of casting is the same Greek verb in 19:20, 20:10, 20:14 and 20:15, so that the beast and the false prophet, the devil, Death and Hell, and the human dead are all said to have been cast into it in the same word. And the identification “This is the second death” in 20:14 and “which is the second death” in 21:8 is one identification made twice. That these are one lake and not different punishments with similar imagery is shown by the repetition: the book introduces no second lake, no second fire and no second name, and it never marks a change of place between one passage and the next. The unity of the lake is shown by the context and is not Stated in a single sentence.</w:t>
+      </w:r>
+    </w:p>
+    <w:p>
+      <w:pPr>
         <w:keepNext/>
         <w:spacing w:before="80" w:after="80"/>
       </w:pPr>
@@ -9468,7 +9946,1044 @@
           <w:b/>
           <w:sz w:val="20"/>
         </w:rPr>
-        <w:t>8.5 Who stands at the great white throne</w:t>
+        <w:t>Step three: the lake keeps its character when human beings are cast into it</w:t>
+      </w:r>
+    </w:p>
+    <w:p>
+      <w:pPr>
+        <w:jc w:val="left"/>
+      </w:pPr>
+      <w:r>
+        <w:rPr>
+          <w:rFonts w:ascii="Roboto" w:hAnsi="Roboto" w:eastAsia="Roboto" w:cs="Roboto"/>
+          <w:sz w:val="20"/>
+        </w:rPr>
+        <w:t>Nothing in the text says that the lake changes when human beings are cast into it, and the text says three things that point the other way. First, 21:8 comes after 20:15, and it describes the lake in the present tense as the lake “which burneth with fire and brimstone”. After the human dead have been cast in, the lake is described as it was described before. It is not described as emptied, as burned out or as ended. That is Stated. Second, 21:8 does not say that the fearful and the unbelieving are consumed by the lake. It says that they “shall have their part” in it, and a part is a share in something that is there (section 8.3). Third, the sentence of 20:15 is the execution of a judgment, and the lake is its penalty. A penalty is known by what is done in it, and the book has already said what is done in this one. That the lake does not change its character when human beings are cast in is shown by the context, since the text signals no change, and it is Inferred as the conclusion the three observations require.</w:t>
+      </w:r>
+    </w:p>
+    <w:p>
+      <w:pPr>
+        <w:jc w:val="left"/>
+      </w:pPr>
+      <w:r>
+        <w:rPr>
+          <w:rFonts w:ascii="Roboto" w:hAnsi="Roboto" w:eastAsia="Roboto" w:cs="Roboto"/>
+          <w:sz w:val="20"/>
+        </w:rPr>
+        <w:t>There is a further point. The volume reads the beast and the false prophet as persons, and Revelation says of the beast that his number “is the number of a man” (Revelation 13:18). If the beast and the false prophet are human beings, as the volume reads them, then Revelation 20:10 already puts human beings in the lake under torment day and night for ever and ever, and the step from the first occupants to the later ones is a step within one kind of person. The volume marks that reading as Inferred, and it does not rest the argument on it. The argument stands without it.</w:t>
+      </w:r>
+    </w:p>
+    <w:p>
+      <w:pPr>
+        <w:keepNext/>
+        <w:spacing w:before="80" w:after="80"/>
+      </w:pPr>
+      <w:r>
+        <w:rPr>
+          <w:rFonts w:ascii="Roboto" w:hAnsi="Roboto" w:eastAsia="Roboto" w:cs="Roboto"/>
+          <w:b/>
+          <w:sz w:val="20"/>
+        </w:rPr>
+        <w:t>Step four: the human evidence of Revelation 14:9–11</w:t>
+      </w:r>
+    </w:p>
+    <w:p>
+      <w:pPr>
+        <w:jc w:val="left"/>
+      </w:pPr>
+      <w:r>
+        <w:rPr>
+          <w:rFonts w:ascii="Roboto" w:hAnsi="Roboto" w:eastAsia="Roboto" w:cs="Roboto"/>
+          <w:sz w:val="20"/>
+        </w:rPr>
+        <w:t>Revelation 14:9–11 is the passage that speaks of human beings under this punishment in its own words. The third angel says of “any man” who worships the beast and his image and receives his mark that “he shall be tormented with fire and brimstone in the presence of the holy angels, and in the presence of the Lamb”, that “the smoke of their torment ascendeth up for ever and ever”, and that “they have no rest day nor night”. These are human beings, and what is Stated of them is torment with fire and brimstone, torment before the angels and the Lamb, a smoke of their torment that goes up for ever and ever, and no rest day nor night.</w:t>
+      </w:r>
+    </w:p>
+    <w:p>
+      <w:pPr>
+        <w:keepNext/>
+        <w:spacing w:after="200"/>
+        <w:jc w:val="left"/>
+      </w:pPr>
+      <w:r>
+        <w:rPr>
+          <w:rFonts w:ascii="Roboto" w:hAnsi="Roboto" w:eastAsia="Roboto" w:cs="Roboto"/>
+          <w:sz w:val="20"/>
+        </w:rPr>
+        <w:t>Revelation 14:9–11 and 20:10 side by side.</w:t>
+      </w:r>
+    </w:p>
+    <w:tbl>
+      <w:tblPr>
+        <w:tblLook w:firstColumn="1" w:firstRow="1" w:lastColumn="0" w:lastRow="0" w:noHBand="0" w:noVBand="1" w:val="04A0"/>
+        <w:tblCellMar>
+          <w:top w:w="60" w:type="dxa"/>
+          <w:left w:w="100" w:type="dxa"/>
+          <w:bottom w:w="60" w:type="dxa"/>
+          <w:right w:w="100" w:type="dxa"/>
+        </w:tblCellMar>
+        <w:tblW w:w="7615" w:type="dxa"/>
+        <w:tblInd w:w="100" w:type="dxa"/>
+        <w:tblLayout w:type="fixed"/>
+        <w:tblBorders>
+          <w:top w:val="single" w:sz="6" w:space="0" w:color="1B3350"/>
+          <w:left w:val="single" w:sz="6" w:space="0" w:color="1B3350"/>
+          <w:bottom w:val="single" w:sz="6" w:space="0" w:color="1B3350"/>
+          <w:right w:val="single" w:sz="6" w:space="0" w:color="1B3350"/>
+          <w:insideH w:val="single" w:sz="6" w:space="0" w:color="1B3350"/>
+          <w:insideV w:val="single" w:sz="6" w:space="0" w:color="1B3350"/>
+        </w:tblBorders>
+      </w:tblPr>
+      <w:tblGrid>
+        <w:gridCol w:w="1371"/>
+        <w:gridCol w:w="3122"/>
+        <w:gridCol w:w="3122"/>
+      </w:tblGrid>
+      <w:tr>
+        <w:trPr>
+          <w:cantSplit/>
+          <w:tblHeader/>
+        </w:trPr>
+        <w:tc>
+          <w:tcPr>
+            <w:tcW w:w="1371" w:type="dxa"/>
+            <w:shd w:val="clear" w:color="auto" w:fill="3B6E91"/>
+          </w:tcPr>
+          <w:p>
+            <w:pPr>
+              <w:keepNext/>
+              <w:spacing w:after="0" w:before="0" w:line="259" w:lineRule="auto"/>
+            </w:pPr>
+            <w:r>
+              <w:rPr>
+                <w:rFonts w:ascii="Roboto" w:hAnsi="Roboto" w:eastAsia="Roboto" w:cs="Roboto"/>
+                <w:b/>
+                <w:color w:val="FFFFFF"/>
+                <w:sz w:val="20"/>
+              </w:rPr>
+              <w:t>Element</w:t>
+            </w:r>
+          </w:p>
+        </w:tc>
+        <w:tc>
+          <w:tcPr>
+            <w:tcW w:w="3122" w:type="dxa"/>
+            <w:shd w:val="clear" w:color="auto" w:fill="3B6E91"/>
+          </w:tcPr>
+          <w:p>
+            <w:pPr>
+              <w:keepNext/>
+              <w:spacing w:after="0" w:before="0" w:line="259" w:lineRule="auto"/>
+            </w:pPr>
+            <w:r>
+              <w:rPr>
+                <w:rFonts w:ascii="Roboto" w:hAnsi="Roboto" w:eastAsia="Roboto" w:cs="Roboto"/>
+                <w:b/>
+                <w:color w:val="FFFFFF"/>
+                <w:sz w:val="20"/>
+              </w:rPr>
+              <w:t>Revelation 14:9–11 (human worshippers)</w:t>
+            </w:r>
+          </w:p>
+        </w:tc>
+        <w:tc>
+          <w:tcPr>
+            <w:tcW w:w="3122" w:type="dxa"/>
+            <w:shd w:val="clear" w:color="auto" w:fill="3B6E91"/>
+          </w:tcPr>
+          <w:p>
+            <w:pPr>
+              <w:keepNext/>
+              <w:spacing w:after="0" w:before="0" w:line="259" w:lineRule="auto"/>
+            </w:pPr>
+            <w:r>
+              <w:rPr>
+                <w:rFonts w:ascii="Roboto" w:hAnsi="Roboto" w:eastAsia="Roboto" w:cs="Roboto"/>
+                <w:b/>
+                <w:color w:val="FFFFFF"/>
+                <w:sz w:val="20"/>
+              </w:rPr>
+              <w:t>Revelation 20:10 (the devil, the beast and the false prophet)</w:t>
+            </w:r>
+          </w:p>
+        </w:tc>
+      </w:tr>
+      <w:tr>
+        <w:trPr>
+          <w:cantSplit/>
+        </w:trPr>
+        <w:tc>
+          <w:tcPr>
+            <w:tcW w:w="1371" w:type="dxa"/>
+          </w:tcPr>
+          <w:p>
+            <w:pPr>
+              <w:keepNext/>
+              <w:spacing w:after="0" w:before="0" w:line="259" w:lineRule="auto"/>
+            </w:pPr>
+            <w:r>
+              <w:rPr>
+                <w:rFonts w:ascii="Roboto" w:hAnsi="Roboto" w:eastAsia="Roboto" w:cs="Roboto"/>
+                <w:sz w:val="20"/>
+              </w:rPr>
+              <w:t>The fire</w:t>
+            </w:r>
+          </w:p>
+        </w:tc>
+        <w:tc>
+          <w:tcPr>
+            <w:tcW w:w="3122" w:type="dxa"/>
+          </w:tcPr>
+          <w:p>
+            <w:pPr>
+              <w:keepNext/>
+              <w:spacing w:after="0" w:before="0" w:line="259" w:lineRule="auto"/>
+            </w:pPr>
+            <w:r>
+              <w:rPr>
+                <w:rFonts w:ascii="Roboto" w:hAnsi="Roboto" w:eastAsia="Roboto" w:cs="Roboto"/>
+                <w:sz w:val="20"/>
+              </w:rPr>
+              <w:t>“fire and brimstone”</w:t>
+            </w:r>
+          </w:p>
+        </w:tc>
+        <w:tc>
+          <w:tcPr>
+            <w:tcW w:w="3122" w:type="dxa"/>
+          </w:tcPr>
+          <w:p>
+            <w:pPr>
+              <w:keepNext/>
+              <w:spacing w:after="0" w:before="0" w:line="259" w:lineRule="auto"/>
+            </w:pPr>
+            <w:r>
+              <w:rPr>
+                <w:rFonts w:ascii="Roboto" w:hAnsi="Roboto" w:eastAsia="Roboto" w:cs="Roboto"/>
+                <w:sz w:val="20"/>
+              </w:rPr>
+              <w:t>“the lake of fire and brimstone”</w:t>
+            </w:r>
+          </w:p>
+        </w:tc>
+      </w:tr>
+      <w:tr>
+        <w:trPr>
+          <w:cantSplit/>
+        </w:trPr>
+        <w:tc>
+          <w:tcPr>
+            <w:tcW w:w="1371" w:type="dxa"/>
+          </w:tcPr>
+          <w:p>
+            <w:pPr>
+              <w:spacing w:after="0" w:before="0" w:line="259" w:lineRule="auto"/>
+            </w:pPr>
+            <w:r>
+              <w:rPr>
+                <w:rFonts w:ascii="Roboto" w:hAnsi="Roboto" w:eastAsia="Roboto" w:cs="Roboto"/>
+                <w:sz w:val="20"/>
+              </w:rPr>
+              <w:t>The torment</w:t>
+            </w:r>
+          </w:p>
+        </w:tc>
+        <w:tc>
+          <w:tcPr>
+            <w:tcW w:w="3122" w:type="dxa"/>
+          </w:tcPr>
+          <w:p>
+            <w:pPr>
+              <w:spacing w:after="0" w:before="0" w:line="259" w:lineRule="auto"/>
+            </w:pPr>
+            <w:r>
+              <w:rPr>
+                <w:rFonts w:ascii="Roboto" w:hAnsi="Roboto" w:eastAsia="Roboto" w:cs="Roboto"/>
+                <w:sz w:val="20"/>
+              </w:rPr>
+              <w:t>“he shall be tormented”; “the smoke of their torment”</w:t>
+            </w:r>
+          </w:p>
+        </w:tc>
+        <w:tc>
+          <w:tcPr>
+            <w:tcW w:w="3122" w:type="dxa"/>
+          </w:tcPr>
+          <w:p>
+            <w:pPr>
+              <w:spacing w:after="0" w:before="0" w:line="259" w:lineRule="auto"/>
+            </w:pPr>
+            <w:r>
+              <w:rPr>
+                <w:rFonts w:ascii="Roboto" w:hAnsi="Roboto" w:eastAsia="Roboto" w:cs="Roboto"/>
+                <w:sz w:val="20"/>
+              </w:rPr>
+              <w:t>“shall be tormented”</w:t>
+            </w:r>
+          </w:p>
+        </w:tc>
+      </w:tr>
+      <w:tr>
+        <w:trPr>
+          <w:cantSplit/>
+        </w:trPr>
+        <w:tc>
+          <w:tcPr>
+            <w:tcW w:w="1371" w:type="dxa"/>
+          </w:tcPr>
+          <w:p>
+            <w:pPr>
+              <w:spacing w:after="0" w:before="0" w:line="259" w:lineRule="auto"/>
+            </w:pPr>
+            <w:r>
+              <w:rPr>
+                <w:rFonts w:ascii="Roboto" w:hAnsi="Roboto" w:eastAsia="Roboto" w:cs="Roboto"/>
+                <w:sz w:val="20"/>
+              </w:rPr>
+              <w:t>The continuance</w:t>
+            </w:r>
+          </w:p>
+        </w:tc>
+        <w:tc>
+          <w:tcPr>
+            <w:tcW w:w="3122" w:type="dxa"/>
+          </w:tcPr>
+          <w:p>
+            <w:pPr>
+              <w:spacing w:after="0" w:before="0" w:line="259" w:lineRule="auto"/>
+            </w:pPr>
+            <w:r>
+              <w:rPr>
+                <w:rFonts w:ascii="Roboto" w:hAnsi="Roboto" w:eastAsia="Roboto" w:cs="Roboto"/>
+                <w:sz w:val="20"/>
+              </w:rPr>
+              <w:t>“no rest day nor night”</w:t>
+            </w:r>
+          </w:p>
+        </w:tc>
+        <w:tc>
+          <w:tcPr>
+            <w:tcW w:w="3122" w:type="dxa"/>
+          </w:tcPr>
+          <w:p>
+            <w:pPr>
+              <w:spacing w:after="0" w:before="0" w:line="259" w:lineRule="auto"/>
+            </w:pPr>
+            <w:r>
+              <w:rPr>
+                <w:rFonts w:ascii="Roboto" w:hAnsi="Roboto" w:eastAsia="Roboto" w:cs="Roboto"/>
+                <w:sz w:val="20"/>
+              </w:rPr>
+              <w:t>“day and night”</w:t>
+            </w:r>
+          </w:p>
+        </w:tc>
+      </w:tr>
+      <w:tr>
+        <w:trPr>
+          <w:cantSplit/>
+        </w:trPr>
+        <w:tc>
+          <w:tcPr>
+            <w:tcW w:w="1371" w:type="dxa"/>
+          </w:tcPr>
+          <w:p>
+            <w:pPr>
+              <w:spacing w:after="0" w:before="0" w:line="259" w:lineRule="auto"/>
+            </w:pPr>
+            <w:r>
+              <w:rPr>
+                <w:rFonts w:ascii="Roboto" w:hAnsi="Roboto" w:eastAsia="Roboto" w:cs="Roboto"/>
+                <w:sz w:val="20"/>
+              </w:rPr>
+              <w:t>The duration</w:t>
+            </w:r>
+          </w:p>
+        </w:tc>
+        <w:tc>
+          <w:tcPr>
+            <w:tcW w:w="3122" w:type="dxa"/>
+          </w:tcPr>
+          <w:p>
+            <w:pPr>
+              <w:spacing w:after="0" w:before="0" w:line="259" w:lineRule="auto"/>
+            </w:pPr>
+            <w:r>
+              <w:rPr>
+                <w:rFonts w:ascii="Roboto" w:hAnsi="Roboto" w:eastAsia="Roboto" w:cs="Roboto"/>
+                <w:sz w:val="20"/>
+              </w:rPr>
+              <w:t>“ascendeth up for ever and ever”, said of the smoke of their torment</w:t>
+            </w:r>
+          </w:p>
+        </w:tc>
+        <w:tc>
+          <w:tcPr>
+            <w:tcW w:w="3122" w:type="dxa"/>
+          </w:tcPr>
+          <w:p>
+            <w:pPr>
+              <w:spacing w:after="0" w:before="0" w:line="259" w:lineRule="auto"/>
+            </w:pPr>
+            <w:r>
+              <w:rPr>
+                <w:rFonts w:ascii="Roboto" w:hAnsi="Roboto" w:eastAsia="Roboto" w:cs="Roboto"/>
+                <w:sz w:val="20"/>
+              </w:rPr>
+              <w:t>“for ever and ever”, said of the torment</w:t>
+            </w:r>
+          </w:p>
+        </w:tc>
+      </w:tr>
+    </w:tbl>
+    <w:p>
+      <w:pPr>
+        <w:spacing w:before="200"/>
+        <w:jc w:val="left"/>
+      </w:pPr>
+      <w:r>
+        <w:rPr>
+          <w:rFonts w:ascii="Roboto" w:hAnsi="Roboto" w:eastAsia="Roboto" w:cs="Roboto"/>
+          <w:sz w:val="20"/>
+        </w:rPr>
+        <w:t>The two passages use the same verb of torment, the same pair of fire and brimstone, the same “day” and “night” for its continuance and the same “for ever and ever” for its length. The first passage says what happens to human beings and does not name the lake. The second names the lake and says how long the torment in it lasts. That the two passages share these terms is Stated. That they describe one torment, and that the torment of the human worshippers has the length that 20:10 gives to the torment in the lake, is Inferred from the shared terms and from the absence of any second kind of torment in the book. The inference is firm, because the alternative is to hold that Revelation describes two different torments in identical words and gives no sign of the difference. The volume does not read the phrase “for ever and ever” of 14:11 as set on the no-rest clause (section 8.1). It reads it as the smoke’s, and it reads the lasting of the torment itself from 20:10.</w:t>
+      </w:r>
+    </w:p>
+    <w:p>
+      <w:pPr>
+        <w:keepNext/>
+        <w:spacing w:before="80" w:after="80"/>
+      </w:pPr>
+      <w:r>
+        <w:rPr>
+          <w:rFonts w:ascii="Roboto" w:hAnsi="Roboto" w:eastAsia="Roboto" w:cs="Roboto"/>
+          <w:b/>
+          <w:sz w:val="20"/>
+        </w:rPr>
+        <w:t>Step five: what the second death contributes</w:t>
+      </w:r>
+    </w:p>
+    <w:p>
+      <w:pPr>
+        <w:jc w:val="left"/>
+      </w:pPr>
+      <w:r>
+        <w:rPr>
+          <w:rFonts w:ascii="Roboto" w:hAnsi="Roboto" w:eastAsia="Roboto" w:cs="Roboto"/>
+          <w:sz w:val="20"/>
+        </w:rPr>
+        <w:t>The name “the second death” does not turn the lake into extinction, because the book has already said what the lake is. The name is given to a place already described. 20:14 says “This is the second death”, and 21:8 says of the lake that burneth with fire and brimstone, “which is the second death”. The clause identifies the lake as the second death, and it does not define the lake by the word death. The lake is the subject, and the book has described it, in 20:10 and in 21:8, as a place of burning and torment. The name therefore takes its meaning from the lake and not the lake from the name.</w:t>
+      </w:r>
+    </w:p>
+    <w:p>
+      <w:pPr>
+        <w:jc w:val="left"/>
+      </w:pPr>
+      <w:r>
+        <w:rPr>
+          <w:rFonts w:ascii="Roboto" w:hAnsi="Roboto" w:eastAsia="Roboto" w:cs="Roboto"/>
+          <w:sz w:val="20"/>
+        </w:rPr>
+        <w:t>What the name does contribute is stated by the book. It is a second death after the first, and it is where those not found written in the book of life are sent (Revelation 20:15). It is something that hurts and has power: “He that overcometh shall not be hurt of the second death” (Revelation 2:11), and “on such the second death hath no power” (Revelation 20:6). It is final, and it is the opposite of the life of the city, into which “there shall in no wise enter” anything that defileth (Revelation 21:27). Section 8.3 showed that in Revelation those held in the first death continue as persons who are raised and judged, so the word death does not carry cessation into the lake. The second death contributes finality, separation from life and hurt. It does not contribute ceasing. That is Stated in the clauses quoted and Inferred in the conclusion about the word.</w:t>
+      </w:r>
+    </w:p>
+    <w:p>
+      <w:pPr>
+        <w:keepNext/>
+        <w:spacing w:before="80" w:after="80"/>
+      </w:pPr>
+      <w:r>
+        <w:rPr>
+          <w:rFonts w:ascii="Roboto" w:hAnsi="Roboto" w:eastAsia="Roboto" w:cs="Roboto"/>
+          <w:b/>
+          <w:sz w:val="20"/>
+        </w:rPr>
+        <w:t>Step six: the strongest objection</w:t>
+      </w:r>
+    </w:p>
+    <w:p>
+      <w:pPr>
+        <w:jc w:val="left"/>
+      </w:pPr>
+      <w:r>
+        <w:rPr>
+          <w:rFonts w:ascii="Roboto" w:hAnsi="Roboto" w:eastAsia="Roboto" w:cs="Roboto"/>
+          <w:sz w:val="20"/>
+        </w:rPr>
+        <w:t>The objection. Revelation 20:10 says in so many words that the devil, the beast and the false prophet are tormented for ever and ever. Revelation 20:15 says only that the human dead are cast into the lake. The first sentence states a duration and a torment, and the second states neither. The character of the lake in the first cannot be carried over to human beings in the second, and a reader who does so is saying more than the verse says.</w:t>
+      </w:r>
+    </w:p>
+    <w:p>
+      <w:pPr>
+        <w:jc w:val="left"/>
+      </w:pPr>
+      <w:r>
+        <w:rPr>
+          <w:rFonts w:ascii="Roboto" w:hAnsi="Roboto" w:eastAsia="Roboto" w:cs="Roboto"/>
+          <w:sz w:val="20"/>
+        </w:rPr>
+        <w:t>The reply. The carrying over is legitimate, because the text itself does it: it names one lake, it describes it in the same terms before and after the human dead are cast in, and it states the torment of human beings in the same terms in 14:9–11 and gives the human lost their part in the burning lake in 21:8. The objection is right about what 20:15 says on its own and wrong about what the book says. The volume does not claim that 20:15 states a torment of the human dead for ever and ever in one sentence. It claims that Revelation, read as a whole, requires that conclusion.</w:t>
+      </w:r>
+    </w:p>
+    <w:p>
+      <w:pPr>
+        <w:jc w:val="left"/>
+      </w:pPr>
+      <w:r>
+        <w:rPr>
+          <w:rFonts w:ascii="Roboto" w:hAnsi="Roboto" w:eastAsia="Roboto" w:cs="Roboto"/>
+          <w:sz w:val="20"/>
+        </w:rPr>
+        <w:t>The decisive distinction is between a verse and a book. A verse that says a person is cast into a place does not need to repeat what the book has already said the place is. 20:10 has said what the lake is. 20:15 says who goes into it. A reader who accepts the first and wants the second to say it again has asked of a verse what the book has already supplied. Four considerations show that the extension is required and not merely allowed. The first is that the lake is one, and the repetition of its name, its fire and its brimstone shows it (step two). The second is that the text signals no change in the lake when the human dead enter it, and 21:8 describes it afterwards as burning (step three). The third is that human beings are said to be tormented in fire and brimstone with no rest day nor night, in the terms of 20:10 (step four). The fourth is that the alternative requires two claims that no text makes: that the same lake torments its first occupants for ever and ends its later ones, and that the casting of 20:15 is a different act from the casting of 19:20, 20:10 and 20:14, in the same word. A reading that requires two unstated claims is not the plain sense of the book.</w:t>
+      </w:r>
+    </w:p>
+    <w:p>
+      <w:pPr>
+        <w:jc w:val="left"/>
+      </w:pPr>
+      <w:r>
+        <w:rPr>
+          <w:rFonts w:ascii="Roboto" w:hAnsi="Roboto" w:eastAsia="Roboto" w:cs="Roboto"/>
+          <w:sz w:val="20"/>
+        </w:rPr>
+        <w:t>Outside Revelation the Lord’s own words go the same way, and the volume marks the point as corroboration and not as the ground. In the judgment of the nations the King sends the goats away into “everlasting fire, prepared for the devil and his angels” (Matthew 25:41), and the passage closes with the persons going into “everlasting punishment” (Matthew 25:46). The human lost are sent to the fire prepared for the devil. The volume reads that fire as the same destination that Revelation names as the lake, and marks the identification as Inferred, because Matthew 25 does not use the word lake. It is spoken to Israel in the Kingdom ministry and is used as a witness to the fate of the wicked, and not as a word to the Body.</w:t>
+      </w:r>
+    </w:p>
+    <w:p>
+      <w:pPr>
+        <w:jc w:val="left"/>
+      </w:pPr>
+      <w:r>
+        <w:rPr>
+          <w:rFonts w:ascii="Roboto" w:hAnsi="Roboto" w:eastAsia="Roboto" w:cs="Roboto"/>
+          <w:sz w:val="20"/>
+        </w:rPr>
+        <w:t>What is conceded. The devil is not a man, and the volume has said so (section 8.2); 20:10 states the torment of the devil, and of the beast and the false prophet by the plural, and does not state it of the human dead who come later. No verse says in one sentence that the human dead of 20:15 are tormented for ever and ever. That is why the conclusion is marked Inferred. Verdict: the character of the lake that 20:10 reveals governs the human lost cast into it, because the book names one lake, describes it unchanged after they enter it, and states their torment in the same terms; the objection shows that the conclusion is cumulative, and it does not show that the conclusion is unsupported.</w:t>
+      </w:r>
+    </w:p>
+    <w:p>
+      <w:pPr>
+        <w:keepNext/>
+        <w:spacing w:after="200"/>
+        <w:jc w:val="left"/>
+      </w:pPr>
+      <w:r>
+        <w:rPr>
+          <w:rFonts w:ascii="Roboto" w:hAnsi="Roboto" w:eastAsia="Roboto" w:cs="Roboto"/>
+          <w:sz w:val="20"/>
+        </w:rPr>
+        <w:t>The steps of the argument and the marks.</w:t>
+      </w:r>
+    </w:p>
+    <w:tbl>
+      <w:tblPr>
+        <w:tblLook w:firstColumn="1" w:firstRow="1" w:lastColumn="0" w:lastRow="0" w:noHBand="0" w:noVBand="1" w:val="04A0"/>
+        <w:tblCellMar>
+          <w:top w:w="60" w:type="dxa"/>
+          <w:left w:w="100" w:type="dxa"/>
+          <w:bottom w:w="60" w:type="dxa"/>
+          <w:right w:w="100" w:type="dxa"/>
+        </w:tblCellMar>
+        <w:tblW w:w="7615" w:type="dxa"/>
+        <w:tblInd w:w="100" w:type="dxa"/>
+        <w:tblLayout w:type="fixed"/>
+        <w:tblBorders>
+          <w:top w:val="single" w:sz="6" w:space="0" w:color="1B3350"/>
+          <w:left w:val="single" w:sz="6" w:space="0" w:color="1B3350"/>
+          <w:bottom w:val="single" w:sz="6" w:space="0" w:color="1B3350"/>
+          <w:right w:val="single" w:sz="6" w:space="0" w:color="1B3350"/>
+          <w:insideH w:val="single" w:sz="6" w:space="0" w:color="1B3350"/>
+          <w:insideV w:val="single" w:sz="6" w:space="0" w:color="1B3350"/>
+        </w:tblBorders>
+      </w:tblPr>
+      <w:tblGrid>
+        <w:gridCol w:w="762"/>
+        <w:gridCol w:w="3808"/>
+        <w:gridCol w:w="3045"/>
+      </w:tblGrid>
+      <w:tr>
+        <w:trPr>
+          <w:cantSplit/>
+          <w:tblHeader/>
+        </w:trPr>
+        <w:tc>
+          <w:tcPr>
+            <w:tcW w:w="762" w:type="dxa"/>
+            <w:shd w:val="clear" w:color="auto" w:fill="3B6E91"/>
+          </w:tcPr>
+          <w:p>
+            <w:pPr>
+              <w:keepNext/>
+              <w:spacing w:after="0" w:before="0" w:line="259" w:lineRule="auto"/>
+            </w:pPr>
+            <w:r>
+              <w:rPr>
+                <w:rFonts w:ascii="Roboto" w:hAnsi="Roboto" w:eastAsia="Roboto" w:cs="Roboto"/>
+                <w:b/>
+                <w:color w:val="FFFFFF"/>
+                <w:sz w:val="20"/>
+              </w:rPr>
+              <w:t>Step</w:t>
+            </w:r>
+          </w:p>
+        </w:tc>
+        <w:tc>
+          <w:tcPr>
+            <w:tcW w:w="3808" w:type="dxa"/>
+            <w:shd w:val="clear" w:color="auto" w:fill="3B6E91"/>
+          </w:tcPr>
+          <w:p>
+            <w:pPr>
+              <w:keepNext/>
+              <w:spacing w:after="0" w:before="0" w:line="259" w:lineRule="auto"/>
+            </w:pPr>
+            <w:r>
+              <w:rPr>
+                <w:rFonts w:ascii="Roboto" w:hAnsi="Roboto" w:eastAsia="Roboto" w:cs="Roboto"/>
+                <w:b/>
+                <w:color w:val="FFFFFF"/>
+                <w:sz w:val="20"/>
+              </w:rPr>
+              <w:t>What is held</w:t>
+            </w:r>
+          </w:p>
+        </w:tc>
+        <w:tc>
+          <w:tcPr>
+            <w:tcW w:w="3045" w:type="dxa"/>
+            <w:shd w:val="clear" w:color="auto" w:fill="3B6E91"/>
+          </w:tcPr>
+          <w:p>
+            <w:pPr>
+              <w:keepNext/>
+              <w:spacing w:after="0" w:before="0" w:line="259" w:lineRule="auto"/>
+            </w:pPr>
+            <w:r>
+              <w:rPr>
+                <w:rFonts w:ascii="Roboto" w:hAnsi="Roboto" w:eastAsia="Roboto" w:cs="Roboto"/>
+                <w:b/>
+                <w:color w:val="FFFFFF"/>
+                <w:sz w:val="20"/>
+              </w:rPr>
+              <w:t>The mark</w:t>
+            </w:r>
+          </w:p>
+        </w:tc>
+      </w:tr>
+      <w:tr>
+        <w:trPr>
+          <w:cantSplit/>
+        </w:trPr>
+        <w:tc>
+          <w:tcPr>
+            <w:tcW w:w="762" w:type="dxa"/>
+          </w:tcPr>
+          <w:p>
+            <w:pPr>
+              <w:keepNext/>
+              <w:spacing w:after="0" w:before="0" w:line="259" w:lineRule="auto"/>
+            </w:pPr>
+            <w:r>
+              <w:rPr>
+                <w:rFonts w:ascii="Roboto" w:hAnsi="Roboto" w:eastAsia="Roboto" w:cs="Roboto"/>
+                <w:sz w:val="20"/>
+              </w:rPr>
+              <w:t>1</w:t>
+            </w:r>
+          </w:p>
+        </w:tc>
+        <w:tc>
+          <w:tcPr>
+            <w:tcW w:w="3808" w:type="dxa"/>
+          </w:tcPr>
+          <w:p>
+            <w:pPr>
+              <w:keepNext/>
+              <w:spacing w:after="0" w:before="0" w:line="259" w:lineRule="auto"/>
+            </w:pPr>
+            <w:r>
+              <w:rPr>
+                <w:rFonts w:ascii="Roboto" w:hAnsi="Roboto" w:eastAsia="Roboto" w:cs="Roboto"/>
+                <w:sz w:val="20"/>
+              </w:rPr>
+              <w:t>The lake is a place of torment day and night for ever and ever</w:t>
+            </w:r>
+          </w:p>
+        </w:tc>
+        <w:tc>
+          <w:tcPr>
+            <w:tcW w:w="3045" w:type="dxa"/>
+          </w:tcPr>
+          <w:p>
+            <w:pPr>
+              <w:keepNext/>
+              <w:spacing w:after="0" w:before="0" w:line="259" w:lineRule="auto"/>
+            </w:pPr>
+            <w:r>
+              <w:rPr>
+                <w:rFonts w:ascii="Roboto" w:hAnsi="Roboto" w:eastAsia="Roboto" w:cs="Roboto"/>
+                <w:sz w:val="20"/>
+              </w:rPr>
+              <w:t>Stated of the devil (20:10); the beast and the false prophet included, shown by the grammar and the context</w:t>
+            </w:r>
+          </w:p>
+        </w:tc>
+      </w:tr>
+      <w:tr>
+        <w:trPr>
+          <w:cantSplit/>
+        </w:trPr>
+        <w:tc>
+          <w:tcPr>
+            <w:tcW w:w="762" w:type="dxa"/>
+          </w:tcPr>
+          <w:p>
+            <w:pPr>
+              <w:spacing w:after="0" w:before="0" w:line="259" w:lineRule="auto"/>
+            </w:pPr>
+            <w:r>
+              <w:rPr>
+                <w:rFonts w:ascii="Roboto" w:hAnsi="Roboto" w:eastAsia="Roboto" w:cs="Roboto"/>
+                <w:sz w:val="20"/>
+              </w:rPr>
+              <w:t>2</w:t>
+            </w:r>
+          </w:p>
+        </w:tc>
+        <w:tc>
+          <w:tcPr>
+            <w:tcW w:w="3808" w:type="dxa"/>
+          </w:tcPr>
+          <w:p>
+            <w:pPr>
+              <w:spacing w:after="0" w:before="0" w:line="259" w:lineRule="auto"/>
+            </w:pPr>
+            <w:r>
+              <w:rPr>
+                <w:rFonts w:ascii="Roboto" w:hAnsi="Roboto" w:eastAsia="Roboto" w:cs="Roboto"/>
+                <w:sz w:val="20"/>
+              </w:rPr>
+              <w:t>The lake of 19:20, 20:10, 20:14, 20:15 and 21:8 is one lake</w:t>
+            </w:r>
+          </w:p>
+        </w:tc>
+        <w:tc>
+          <w:tcPr>
+            <w:tcW w:w="3045" w:type="dxa"/>
+          </w:tcPr>
+          <w:p>
+            <w:pPr>
+              <w:spacing w:after="0" w:before="0" w:line="259" w:lineRule="auto"/>
+            </w:pPr>
+            <w:r>
+              <w:rPr>
+                <w:rFonts w:ascii="Roboto" w:hAnsi="Roboto" w:eastAsia="Roboto" w:cs="Roboto"/>
+                <w:sz w:val="20"/>
+              </w:rPr>
+              <w:t>Names and verb Stated; unity shown by the context</w:t>
+            </w:r>
+          </w:p>
+        </w:tc>
+      </w:tr>
+      <w:tr>
+        <w:trPr>
+          <w:cantSplit/>
+        </w:trPr>
+        <w:tc>
+          <w:tcPr>
+            <w:tcW w:w="762" w:type="dxa"/>
+          </w:tcPr>
+          <w:p>
+            <w:pPr>
+              <w:spacing w:after="0" w:before="0" w:line="259" w:lineRule="auto"/>
+            </w:pPr>
+            <w:r>
+              <w:rPr>
+                <w:rFonts w:ascii="Roboto" w:hAnsi="Roboto" w:eastAsia="Roboto" w:cs="Roboto"/>
+                <w:sz w:val="20"/>
+              </w:rPr>
+              <w:t>3</w:t>
+            </w:r>
+          </w:p>
+        </w:tc>
+        <w:tc>
+          <w:tcPr>
+            <w:tcW w:w="3808" w:type="dxa"/>
+          </w:tcPr>
+          <w:p>
+            <w:pPr>
+              <w:spacing w:after="0" w:before="0" w:line="259" w:lineRule="auto"/>
+            </w:pPr>
+            <w:r>
+              <w:rPr>
+                <w:rFonts w:ascii="Roboto" w:hAnsi="Roboto" w:eastAsia="Roboto" w:cs="Roboto"/>
+                <w:sz w:val="20"/>
+              </w:rPr>
+              <w:t>The lake keeps its character when human beings are cast into it</w:t>
+            </w:r>
+          </w:p>
+        </w:tc>
+        <w:tc>
+          <w:tcPr>
+            <w:tcW w:w="3045" w:type="dxa"/>
+          </w:tcPr>
+          <w:p>
+            <w:pPr>
+              <w:spacing w:after="0" w:before="0" w:line="259" w:lineRule="auto"/>
+            </w:pPr>
+            <w:r>
+              <w:rPr>
+                <w:rFonts w:ascii="Roboto" w:hAnsi="Roboto" w:eastAsia="Roboto" w:cs="Roboto"/>
+                <w:sz w:val="20"/>
+              </w:rPr>
+              <w:t>21:8 describes it as burning, Stated; no signal of change, shown by the context; the conclusion Inferred</w:t>
+            </w:r>
+          </w:p>
+        </w:tc>
+      </w:tr>
+      <w:tr>
+        <w:trPr>
+          <w:cantSplit/>
+        </w:trPr>
+        <w:tc>
+          <w:tcPr>
+            <w:tcW w:w="762" w:type="dxa"/>
+          </w:tcPr>
+          <w:p>
+            <w:pPr>
+              <w:spacing w:after="0" w:before="0" w:line="259" w:lineRule="auto"/>
+            </w:pPr>
+            <w:r>
+              <w:rPr>
+                <w:rFonts w:ascii="Roboto" w:hAnsi="Roboto" w:eastAsia="Roboto" w:cs="Roboto"/>
+                <w:sz w:val="20"/>
+              </w:rPr>
+              <w:t>4</w:t>
+            </w:r>
+          </w:p>
+        </w:tc>
+        <w:tc>
+          <w:tcPr>
+            <w:tcW w:w="3808" w:type="dxa"/>
+          </w:tcPr>
+          <w:p>
+            <w:pPr>
+              <w:spacing w:after="0" w:before="0" w:line="259" w:lineRule="auto"/>
+            </w:pPr>
+            <w:r>
+              <w:rPr>
+                <w:rFonts w:ascii="Roboto" w:hAnsi="Roboto" w:eastAsia="Roboto" w:cs="Roboto"/>
+                <w:sz w:val="20"/>
+              </w:rPr>
+              <w:t>Human worshippers of the beast are tormented with fire and brimstone and have no rest day nor night</w:t>
+            </w:r>
+          </w:p>
+        </w:tc>
+        <w:tc>
+          <w:tcPr>
+            <w:tcW w:w="3045" w:type="dxa"/>
+          </w:tcPr>
+          <w:p>
+            <w:pPr>
+              <w:spacing w:after="0" w:before="0" w:line="259" w:lineRule="auto"/>
+            </w:pPr>
+            <w:r>
+              <w:rPr>
+                <w:rFonts w:ascii="Roboto" w:hAnsi="Roboto" w:eastAsia="Roboto" w:cs="Roboto"/>
+                <w:sz w:val="20"/>
+              </w:rPr>
+              <w:t>Stated (14:9–11); the shared terms with 20:10 Stated; one torment, Inferred</w:t>
+            </w:r>
+          </w:p>
+        </w:tc>
+      </w:tr>
+      <w:tr>
+        <w:trPr>
+          <w:cantSplit/>
+        </w:trPr>
+        <w:tc>
+          <w:tcPr>
+            <w:tcW w:w="762" w:type="dxa"/>
+          </w:tcPr>
+          <w:p>
+            <w:pPr>
+              <w:spacing w:after="0" w:before="0" w:line="259" w:lineRule="auto"/>
+            </w:pPr>
+            <w:r>
+              <w:rPr>
+                <w:rFonts w:ascii="Roboto" w:hAnsi="Roboto" w:eastAsia="Roboto" w:cs="Roboto"/>
+                <w:sz w:val="20"/>
+              </w:rPr>
+              <w:t>5</w:t>
+            </w:r>
+          </w:p>
+        </w:tc>
+        <w:tc>
+          <w:tcPr>
+            <w:tcW w:w="3808" w:type="dxa"/>
+          </w:tcPr>
+          <w:p>
+            <w:pPr>
+              <w:spacing w:after="0" w:before="0" w:line="259" w:lineRule="auto"/>
+            </w:pPr>
+            <w:r>
+              <w:rPr>
+                <w:rFonts w:ascii="Roboto" w:hAnsi="Roboto" w:eastAsia="Roboto" w:cs="Roboto"/>
+                <w:sz w:val="20"/>
+              </w:rPr>
+              <w:t>The second death names the lake and does not define it as extinction</w:t>
+            </w:r>
+          </w:p>
+        </w:tc>
+        <w:tc>
+          <w:tcPr>
+            <w:tcW w:w="3045" w:type="dxa"/>
+          </w:tcPr>
+          <w:p>
+            <w:pPr>
+              <w:spacing w:after="0" w:before="0" w:line="259" w:lineRule="auto"/>
+            </w:pPr>
+            <w:r>
+              <w:rPr>
+                <w:rFonts w:ascii="Roboto" w:hAnsi="Roboto" w:eastAsia="Roboto" w:cs="Roboto"/>
+                <w:sz w:val="20"/>
+              </w:rPr>
+              <w:t>The identification Stated (20:14; 21:8); the conclusion about the word Inferred</w:t>
+            </w:r>
+          </w:p>
+        </w:tc>
+      </w:tr>
+      <w:tr>
+        <w:trPr>
+          <w:cantSplit/>
+        </w:trPr>
+        <w:tc>
+          <w:tcPr>
+            <w:tcW w:w="762" w:type="dxa"/>
+          </w:tcPr>
+          <w:p>
+            <w:pPr>
+              <w:spacing w:after="0" w:before="0" w:line="259" w:lineRule="auto"/>
+            </w:pPr>
+            <w:r>
+              <w:rPr>
+                <w:rFonts w:ascii="Roboto" w:hAnsi="Roboto" w:eastAsia="Roboto" w:cs="Roboto"/>
+                <w:sz w:val="20"/>
+              </w:rPr>
+              <w:t>6</w:t>
+            </w:r>
+          </w:p>
+        </w:tc>
+        <w:tc>
+          <w:tcPr>
+            <w:tcW w:w="3808" w:type="dxa"/>
+          </w:tcPr>
+          <w:p>
+            <w:pPr>
+              <w:spacing w:after="0" w:before="0" w:line="259" w:lineRule="auto"/>
+            </w:pPr>
+            <w:r>
+              <w:rPr>
+                <w:rFonts w:ascii="Roboto" w:hAnsi="Roboto" w:eastAsia="Roboto" w:cs="Roboto"/>
+                <w:sz w:val="20"/>
+              </w:rPr>
+              <w:t>The human lost cast into the lake remain under its punishment for ever and do not cease to exist</w:t>
+            </w:r>
+          </w:p>
+        </w:tc>
+        <w:tc>
+          <w:tcPr>
+            <w:tcW w:w="3045" w:type="dxa"/>
+          </w:tcPr>
+          <w:p>
+            <w:pPr>
+              <w:spacing w:after="0" w:before="0" w:line="259" w:lineRule="auto"/>
+            </w:pPr>
+            <w:r>
+              <w:rPr>
+                <w:rFonts w:ascii="Roboto" w:hAnsi="Roboto" w:eastAsia="Roboto" w:cs="Roboto"/>
+                <w:sz w:val="20"/>
+              </w:rPr>
+              <w:t>Inferred, firmly, from steps 1 to 5</w:t>
+            </w:r>
+          </w:p>
+        </w:tc>
+      </w:tr>
+    </w:tbl>
+    <w:p>
+      <w:pPr>
+        <w:keepNext/>
+        <w:spacing w:before="200" w:after="80"/>
+      </w:pPr>
+      <w:r>
+        <w:rPr>
+          <w:rFonts w:ascii="Roboto" w:hAnsi="Roboto" w:eastAsia="Roboto" w:cs="Roboto"/>
+          <w:b/>
+          <w:sz w:val="20"/>
+        </w:rPr>
+        <w:t>8.5 Revelation 20:11–15 read for what it establishes of final punishment</w:t>
+      </w:r>
+    </w:p>
+    <w:p>
+      <w:pPr>
+        <w:jc w:val="left"/>
+      </w:pPr>
+      <w:r>
+        <w:rPr>
+          <w:rFonts w:ascii="Roboto" w:hAnsi="Roboto" w:eastAsia="Roboto" w:cs="Roboto"/>
+          <w:sz w:val="20"/>
+        </w:rPr>
+        <w:t>The throne scene is read here for one thing: what it says about the punishment that follows. The seer writes, “And I saw a great white throne, and him that sat on it, from whose face the earth and the heaven fled away; and there was found no place for them” (Revelation 20:11). The dead “small and great” stand before God, books are opened, and “the dead were judged out of those things which were written in the books, according to their works” (Revelation 20:12). The sea, Death and Hades give up their dead, and “they were judged every man according to their works” (Revelation 20:13). Then the sentence is carried out: “And death and hell were cast into the lake of fire. This is the second death. And whosoever was not found written in the book of life was cast into the lake of fire” (Revelation 20:14, 15).</w:t>
+      </w:r>
+    </w:p>
+    <w:p>
+      <w:pPr>
+        <w:jc w:val="left"/>
+      </w:pPr>
+      <w:r>
+        <w:rPr>
+          <w:rFonts w:ascii="Roboto" w:hAnsi="Roboto" w:eastAsia="Roboto" w:cs="Roboto"/>
+          <w:sz w:val="20"/>
+        </w:rPr>
+        <w:t>Three things follow from the text, and they are the volume’s only claims from it. The first is that the judgment is individual and according to works: each is judged “every man according to their works” (Revelation 20:13). The second is that the sentence is a casting into the lake, which is an act done to persons. The third is that the passage does not say that the lake is emptied or that those cast into it cease. It says that they are cast in, and the preceding section has shown what the book says of the lake.</w:t>
+      </w:r>
+    </w:p>
+    <w:p>
+      <w:pPr>
+        <w:jc w:val="left"/>
+      </w:pPr>
+      <w:r>
+        <w:rPr>
+          <w:rFonts w:ascii="Roboto" w:hAnsi="Roboto" w:eastAsia="Roboto" w:cs="Roboto"/>
+          <w:sz w:val="20"/>
+        </w:rPr>
+        <w:t>A judgment that is according to works is a judgment in which the persons are not all treated alike. The Lord said as much in the days of His ministry to Israel. Of Tyre and Sidon He said that it would be “more tolerable” for them “at the day of judgment” than for the cities that saw His works (Matthew 11:22), and of Sodom the same (Matthew 11:24). Of the servant who knew his lord’s will and did it not He said that he “shall be beaten with many stripes”, and of him who knew not, “few stripes” (Luke 12:47, 48). Of the scribes and Pharisees He said, “ye shall receive the greater damnation” (Matthew 23:14), and the letter to the Hebrews speaks of “sorer punishment” for him who has trodden under foot the Son of God (Hebrews 10:29). These words were spoken to Israel and to the Hebrew readers, and they are witnesses of what Scripture reveals of the day of judgment and not words to the Body. They state that the punishment is graded.</w:t>
+      </w:r>
+    </w:p>
+    <w:p>
+      <w:pPr>
+        <w:jc w:val="left"/>
+      </w:pPr>
+      <w:r>
+        <w:rPr>
+          <w:rFonts w:ascii="Roboto" w:hAnsi="Roboto" w:eastAsia="Roboto" w:cs="Roboto"/>
+          <w:sz w:val="20"/>
+        </w:rPr>
+        <w:t>The grading of the judgment shows that the punishment is described as an infliction with a content and a measure, and not as a ceasing. A punishment which can be more tolerable or less, which is a measure of stripes, and which is said to be “greater” and “sorer”, is described as something the persons have. That is shown by the context. The writer who holds that the lost cease to exist grants the grading and says that it is the measure of suffering before the end. The volume grants that this reading is possible and that degrees alone do not decide the question; the passage does not say that the content is never completed, and the descriptions the Scripture uses are the descriptions of an infliction.</w:t>
+      </w:r>
+    </w:p>
+    <w:p>
+      <w:pPr>
+        <w:keepNext/>
+        <w:spacing w:before="80" w:after="80"/>
+      </w:pPr>
+      <w:r>
+        <w:rPr>
+          <w:rFonts w:ascii="Roboto" w:hAnsi="Roboto" w:eastAsia="Roboto" w:cs="Roboto"/>
+          <w:b/>
+          <w:sz w:val="20"/>
+        </w:rPr>
+        <w:t>8.6 Who stands at the great white throne</w:t>
       </w:r>
     </w:p>
     <w:p>
@@ -10229,7 +11744,7 @@
           <w:rFonts w:ascii="Roboto" w:hAnsi="Roboto" w:eastAsia="Roboto" w:cs="Roboto"/>
           <w:sz w:val="20"/>
         </w:rPr>
-        <w:t>The lake is called the second death; in the book’s own portrayal the dead exist, stand and are judged, so death does not inherently mean the person’s ceasing.</w:t>
+        <w:t>The lake is one lake, named the same way in 19:20, 20:10, 20:14, 20:15 and 21:8; it is described as burning after the human dead are cast in, and the torment of human worshippers in 14:9–11 is stated in the terms of 20:10; the human lost cast into it therefore remain under its punishment for ever, which is Inferred, firmly, from the steps of section 8.4.</w:t>
       </w:r>
     </w:p>
     <w:p>
@@ -10253,7 +11768,7 @@
           <w:rFonts w:ascii="Roboto" w:hAnsi="Roboto" w:eastAsia="Roboto" w:cs="Roboto"/>
           <w:sz w:val="20"/>
         </w:rPr>
-        <w:t>The judgment is according to works and is graded; the passage does not say the lake is emptied or ended.</w:t>
+        <w:t>The lake is called the second death; in the book’s own portrayal the dead exist, stand and are judged, so death does not inherently mean the person’s ceasing.</w:t>
       </w:r>
     </w:p>
     <w:p>
@@ -10277,6 +11792,30 @@
           <w:rFonts w:ascii="Roboto" w:hAnsi="Roboto" w:eastAsia="Roboto" w:cs="Roboto"/>
           <w:sz w:val="20"/>
         </w:rPr>
+        <w:t>The judgment is according to works and is graded; the passage does not say the lake is emptied or ended.</w:t>
+      </w:r>
+    </w:p>
+    <w:p>
+      <w:pPr>
+        <w:tabs>
+          <w:tab w:pos="360" w:val="left"/>
+        </w:tabs>
+        <w:spacing w:after="0"/>
+        <w:ind w:left="360" w:hanging="260"/>
+      </w:pPr>
+      <w:r>
+        <w:rPr>
+          <w:rFonts w:ascii="Roboto" w:hAnsi="Roboto" w:eastAsia="Roboto" w:cs="Roboto"/>
+          <w:sz w:val="20"/>
+        </w:rPr>
+        <w:t>•</w:t>
+        <w:tab/>
+      </w:r>
+      <w:r>
+        <w:rPr>
+          <w:rFonts w:ascii="Roboto" w:hAnsi="Roboto" w:eastAsia="Roboto" w:cs="Roboto"/>
+          <w:sz w:val="20"/>
+        </w:rPr>
         <w:t>The great white throne company is identified with the rest of the dead from the sequence of the chapter, marked as Inferred; the first-resurrection company is distinguished from it by Revelation 20:6, and the Body’s absence is a conclusion from the book’s audience and setting.</w:t>
       </w:r>
     </w:p>
@@ -10588,7 +12127,7 @@
           <w:b/>
           <w:sz w:val="20"/>
         </w:rPr>
-        <w:t>9.6 The objection from justice</w:t>
+        <w:t>9.6 The objection from the human dead of Revelation 20:15</w:t>
       </w:r>
     </w:p>
     <w:p>
@@ -10600,7 +12139,7 @@
           <w:rFonts w:ascii="Roboto" w:hAnsi="Roboto" w:eastAsia="Roboto" w:cs="Roboto"/>
           <w:sz w:val="20"/>
         </w:rPr>
-        <w:t>The objection. Endless punishment for sins done in a finite life is out of proportion, and a loving God would not inflict it. Stott, in his dialogue with Edwards, said that he found the idea hard to reconcile with the justice of God, and Wenham and Pinnock argued in the same way, as Saville reports their arguments. Pinnock and Stott also made the argument from dualism, that endless torment leaves a part of creation in rebellion for ever.</w:t>
+        <w:t>The objection. Revelation 20:10 states the torment for ever and ever of the devil, the beast and the false prophet. Revelation 20:15 says only that the human dead are cast into the lake. A verse that states a duration for the first company cannot be carried over to a second company of whom it says nothing, and the name of the lake, the second death, points to an ending.</w:t>
       </w:r>
     </w:p>
     <w:p>
@@ -10612,7 +12151,7 @@
           <w:rFonts w:ascii="Roboto" w:hAnsi="Roboto" w:eastAsia="Roboto" w:cs="Roboto"/>
           <w:sz w:val="20"/>
         </w:rPr>
-        <w:t>The reply. The objection from justice is an argument from what the reader thinks God would do, and it does not decide what the text says He will do. Its mistake is to turn a question of proportion that Scripture does not state into an exegetical rule. The volume does not meet it with a rule of proportion either: the argument that sin against an infinite God deserves infinite punishment is used by Woodier and by older traditionalists, and the volume does not use it, because no verse states it. It answers from what Scripture does say. The Judge of all the earth does right (Genesis 18:25). His judgments are “true and righteous” (Revelation 16:7; 19:2), and Paul’s answer to the question whether God is unrighteous who taketh vengeance is, “God forbid: for then how shall God judge the world?” (Romans 3:5, 6). The judgment is graded (chapter 8), it is of persons by their works, and it is the Lord’s own judgment, spoken by the Lord Himself in the passages the volume has read. Saville, who rejects annihilationism, argues in his article that “extinction cannot be an infinite punishment”, because a punishment that is retributive must be experienced, and he concludes against several traditionalists that extinction is a punishment. The volume notes that his argument is a doctrinal one and does not use it as exegesis.</w:t>
+        <w:t>The reply. The carrying over is legitimate, because the text makes it. Revelation names one lake, describes it in the same terms before and after the human dead are cast in, states the torment of human beings in the same terms in 14:9–11, and gives the human lost their part in the burning lake in 21:8. The objection treats a verse as if it were the whole book. A verse that says a person is cast into a place does not need to repeat what the book has already said the place is, and 20:10 has said what the lake is. The name “the second death” does not change this: it is given to a lake the book has already described as a place of torment, it does not define the lake as extinction, and in Revelation the word death does not inherently mean the person’s ceasing (section 8.3). The six steps are set out in section 8.4.</w:t>
       </w:r>
     </w:p>
     <w:p>
@@ -10624,7 +12163,7 @@
           <w:rFonts w:ascii="Roboto" w:hAnsi="Roboto" w:eastAsia="Roboto" w:cs="Roboto"/>
           <w:sz w:val="20"/>
         </w:rPr>
-        <w:t>What is conceded. The objection is made in earnest and by writers who love the Scripture, and the volume agrees with Stott that the question must be examined and not ruled out of order. Verdict: the objection raises a genuine moral question but supplies no exegetical evidence for annihilation. Scripture declares God’s judgments righteous and provides no proportionality rule by which its own testimony may be set aside.</w:t>
+        <w:t>What is conceded. No verse says in one sentence that the human dead of 20:15 are tormented for ever and ever, and the devil is not a man. That is why the conclusion is marked Inferred. Death and Hell are also cast into the lake (20:14), and 21:4 says that there shall be no more death; the text says that they were cast in and does not say that they cease in it, and they are not persons. Verdict: the objection shows that the conclusion is cumulative, and it does not show that it is unsupported, because the book itself names one lake and describes it the same way before and after the human dead are cast in.</w:t>
       </w:r>
     </w:p>
     <w:p>
@@ -10638,7 +12177,7 @@
           <w:b/>
           <w:sz w:val="20"/>
         </w:rPr>
-        <w:t>9.7 The objection from the immortality of the soul</w:t>
+        <w:t>9.7 The objection from justice</w:t>
       </w:r>
     </w:p>
     <w:p>
@@ -10650,7 +12189,7 @@
           <w:rFonts w:ascii="Roboto" w:hAnsi="Roboto" w:eastAsia="Roboto" w:cs="Roboto"/>
           <w:sz w:val="20"/>
         </w:rPr>
-        <w:t>The objection. The idea that the soul is by nature immortal came into the church from Greek philosophy, and it distorted the reading of the passages on the end of the lost. Saville names Travis, Pinnock, Froom and White among those who made the point. Once the idea is set aside, the passages on destruction say what they appear to say.</w:t>
+        <w:t>The objection. Endless punishment for sins done in a finite life is out of proportion, and a loving God would not inflict it. Stott, in his dialogue with Edwards, said that he found the idea hard to reconcile with the justice of God, and Wenham and Pinnock argued in the same way, as Saville reports their arguments. Pinnock and Stott also made the argument from dualism, that endless torment leaves a part of creation in rebellion for ever.</w:t>
       </w:r>
     </w:p>
     <w:p>
@@ -10662,7 +12201,7 @@
           <w:rFonts w:ascii="Roboto" w:hAnsi="Roboto" w:eastAsia="Roboto" w:cs="Roboto"/>
           <w:sz w:val="20"/>
         </w:rPr>
-        <w:t>The reply. The volume’s case does not depend on the soul’s natural immortality, so the objection does not touch it. A person may hold that only God has immortality in the sense of life in himself, and that the lost are kept in being by God’s will, and still hold that the passages on the lake describe a continuing experience. The persons are in the lake because the text puts them there and says they are tormented. That is a statement about what God does with them, and it does not require a doctrine of what they are. Saville’s own judgment is that the argument is not decisive.</w:t>
+        <w:t>The reply. The objection from justice is an argument from what the reader thinks God would do, and it does not decide what the text says He will do. Its mistake is to turn a question of proportion that Scripture does not state into an exegetical rule. The volume does not meet it with a rule of proportion either: the argument that sin against an infinite God deserves infinite punishment is used by Woodier and by older traditionalists, and the volume does not use it, because no verse states it. It answers from what Scripture does say. The Judge of all the earth does right (Genesis 18:25). His judgments are “true and righteous” (Revelation 16:7; 19:2), and Paul’s answer to the question whether God is unrighteous who taketh vengeance is, “God forbid: for then how shall God judge the world?” (Romans 3:5, 6). The judgment is graded (chapter 8), it is of persons by their works, and it is the Lord’s own judgment, spoken by the Lord Himself in the passages the volume has read. Saville, who rejects annihilationism, argues in his article that “extinction cannot be an infinite punishment”, because a punishment that is retributive must be experienced, and he concludes against several traditionalists that extinction is a punishment. The volume notes that his argument is a doctrinal one and does not use it as exegesis.</w:t>
       </w:r>
     </w:p>
     <w:p>
@@ -10674,7 +12213,7 @@
           <w:rFonts w:ascii="Roboto" w:hAnsi="Roboto" w:eastAsia="Roboto" w:cs="Roboto"/>
           <w:sz w:val="20"/>
         </w:rPr>
-        <w:t>What is conceded. The doctrine of the soul’s natural immortality is not stated in Scripture in so many words, and Matthew 10:28 says that God is able to destroy the soul. Verdict: the objection may be right about the origin of the doctrine, and it does not overturn the thesis, because the thesis rests on what the passages say God does with the persons and not on what the soul is by nature.</w:t>
+        <w:t>What is conceded. The objection is made in earnest and by writers who love the Scripture, and the volume agrees with Stott that the question must be examined and not ruled out of order. Verdict: the objection raises a genuine moral question but supplies no exegetical evidence for annihilation. Scripture declares God’s judgments righteous and provides no proportionality rule by which its own testimony may be set aside.</w:t>
       </w:r>
     </w:p>
     <w:p>
@@ -10688,7 +12227,57 @@
           <w:b/>
           <w:sz w:val="20"/>
         </w:rPr>
-        <w:t>9.8 The objection from the earthly judgments of the wicked</w:t>
+        <w:t>9.8 The objection from the immortality of the soul</w:t>
+      </w:r>
+    </w:p>
+    <w:p>
+      <w:pPr>
+        <w:jc w:val="left"/>
+      </w:pPr>
+      <w:r>
+        <w:rPr>
+          <w:rFonts w:ascii="Roboto" w:hAnsi="Roboto" w:eastAsia="Roboto" w:cs="Roboto"/>
+          <w:sz w:val="20"/>
+        </w:rPr>
+        <w:t>The objection. The idea that the soul is by nature immortal came into the church from Greek philosophy, and it distorted the reading of the passages on the end of the lost. Saville names Travis, Pinnock, Froom and White among those who made the point. Once the idea is set aside, the passages on destruction say what they appear to say.</w:t>
+      </w:r>
+    </w:p>
+    <w:p>
+      <w:pPr>
+        <w:jc w:val="left"/>
+      </w:pPr>
+      <w:r>
+        <w:rPr>
+          <w:rFonts w:ascii="Roboto" w:hAnsi="Roboto" w:eastAsia="Roboto" w:cs="Roboto"/>
+          <w:sz w:val="20"/>
+        </w:rPr>
+        <w:t>The reply. The volume’s case does not depend on the soul’s natural immortality, so the objection does not touch it. A person may hold that only God has immortality in the sense of life in himself, and that the lost are kept in being by God’s will, and still hold that the passages on the lake describe a continuing experience. The persons are in the lake because the text puts them there and says they are tormented. That is a statement about what God does with them, and it does not require a doctrine of what they are. Saville’s own judgment is that the argument is not decisive.</w:t>
+      </w:r>
+    </w:p>
+    <w:p>
+      <w:pPr>
+        <w:jc w:val="left"/>
+      </w:pPr>
+      <w:r>
+        <w:rPr>
+          <w:rFonts w:ascii="Roboto" w:hAnsi="Roboto" w:eastAsia="Roboto" w:cs="Roboto"/>
+          <w:sz w:val="20"/>
+        </w:rPr>
+        <w:t>What is conceded. The doctrine of the soul’s natural immortality is not stated in Scripture in so many words, and Matthew 10:28 says that God is able to destroy the soul. Verdict: the objection may be right about the origin of the doctrine, and it does not overturn the thesis, because the thesis rests on what the passages say God does with the persons and not on what the soul is by nature.</w:t>
+      </w:r>
+    </w:p>
+    <w:p>
+      <w:pPr>
+        <w:keepNext/>
+        <w:spacing w:before="80" w:after="80"/>
+      </w:pPr>
+      <w:r>
+        <w:rPr>
+          <w:rFonts w:ascii="Roboto" w:hAnsi="Roboto" w:eastAsia="Roboto" w:cs="Roboto"/>
+          <w:b/>
+          <w:sz w:val="20"/>
+        </w:rPr>
+        <w:t>9.9 The objection from the earthly judgments of the wicked</w:t>
       </w:r>
     </w:p>
     <w:p>
@@ -11171,7 +12760,7 @@
                 <w:rFonts w:ascii="Roboto" w:hAnsi="Roboto" w:eastAsia="Roboto" w:cs="Roboto"/>
                 <w:sz w:val="20"/>
               </w:rPr>
-              <w:t>Endless punishment is unjust</w:t>
+              <w:t>The lake’s character cannot be extended to the human dead</w:t>
             </w:r>
           </w:p>
         </w:tc>
@@ -11188,7 +12777,7 @@
                 <w:rFonts w:ascii="Roboto" w:hAnsi="Roboto" w:eastAsia="Roboto" w:cs="Roboto"/>
                 <w:sz w:val="20"/>
               </w:rPr>
-              <w:t>Stott; Pinnock; Wenham</w:t>
+              <w:t>Readings that limit 20:10 to its named occupants</w:t>
             </w:r>
           </w:p>
         </w:tc>
@@ -11205,7 +12794,7 @@
                 <w:rFonts w:ascii="Roboto" w:hAnsi="Roboto" w:eastAsia="Roboto" w:cs="Roboto"/>
                 <w:sz w:val="20"/>
               </w:rPr>
-              <w:t>The question is earnest</w:t>
+              <w:t>No verse states it of them in one sentence; the second death is a name</w:t>
             </w:r>
           </w:p>
         </w:tc>
@@ -11222,7 +12811,7 @@
                 <w:rFonts w:ascii="Roboto" w:hAnsi="Roboto" w:eastAsia="Roboto" w:cs="Roboto"/>
                 <w:sz w:val="20"/>
               </w:rPr>
-              <w:t>No verse states the proportion; the Judge does right and the punishment is graded</w:t>
+              <w:t>One lake, unchanged after they enter it, and their torment stated in the same terms (section 8.4)</w:t>
             </w:r>
           </w:p>
         </w:tc>
@@ -11244,7 +12833,7 @@
                 <w:rFonts w:ascii="Roboto" w:hAnsi="Roboto" w:eastAsia="Roboto" w:cs="Roboto"/>
                 <w:sz w:val="20"/>
               </w:rPr>
-              <w:t>The soul’s immortality is Greek</w:t>
+              <w:t>Endless punishment is unjust</w:t>
             </w:r>
           </w:p>
         </w:tc>
@@ -11261,7 +12850,7 @@
                 <w:rFonts w:ascii="Roboto" w:hAnsi="Roboto" w:eastAsia="Roboto" w:cs="Roboto"/>
                 <w:sz w:val="20"/>
               </w:rPr>
-              <w:t>Pinnock; others, per Saville</w:t>
+              <w:t>Stott; Pinnock; Wenham</w:t>
             </w:r>
           </w:p>
         </w:tc>
@@ -11278,7 +12867,7 @@
                 <w:rFonts w:ascii="Roboto" w:hAnsi="Roboto" w:eastAsia="Roboto" w:cs="Roboto"/>
                 <w:sz w:val="20"/>
               </w:rPr>
-              <w:t>The doctrine is not stated in Scripture</w:t>
+              <w:t>The question is earnest</w:t>
             </w:r>
           </w:p>
         </w:tc>
@@ -11295,7 +12884,7 @@
                 <w:rFonts w:ascii="Roboto" w:hAnsi="Roboto" w:eastAsia="Roboto" w:cs="Roboto"/>
                 <w:sz w:val="20"/>
               </w:rPr>
-              <w:t>The case does not depend on it</w:t>
+              <w:t>No verse states the proportion; the Judge does right and the punishment is graded</w:t>
             </w:r>
           </w:p>
         </w:tc>
@@ -11317,6 +12906,79 @@
                 <w:rFonts w:ascii="Roboto" w:hAnsi="Roboto" w:eastAsia="Roboto" w:cs="Roboto"/>
                 <w:sz w:val="20"/>
               </w:rPr>
+              <w:t>The soul’s immortality is Greek</w:t>
+            </w:r>
+          </w:p>
+        </w:tc>
+        <w:tc>
+          <w:tcPr>
+            <w:tcW w:w="1295" w:type="dxa"/>
+          </w:tcPr>
+          <w:p>
+            <w:pPr>
+              <w:spacing w:after="0" w:before="0" w:line="259" w:lineRule="auto"/>
+            </w:pPr>
+            <w:r>
+              <w:rPr>
+                <w:rFonts w:ascii="Roboto" w:hAnsi="Roboto" w:eastAsia="Roboto" w:cs="Roboto"/>
+                <w:sz w:val="20"/>
+              </w:rPr>
+              <w:t>Pinnock; others, per Saville</w:t>
+            </w:r>
+          </w:p>
+        </w:tc>
+        <w:tc>
+          <w:tcPr>
+            <w:tcW w:w="1904" w:type="dxa"/>
+          </w:tcPr>
+          <w:p>
+            <w:pPr>
+              <w:spacing w:after="0" w:before="0" w:line="259" w:lineRule="auto"/>
+            </w:pPr>
+            <w:r>
+              <w:rPr>
+                <w:rFonts w:ascii="Roboto" w:hAnsi="Roboto" w:eastAsia="Roboto" w:cs="Roboto"/>
+                <w:sz w:val="20"/>
+              </w:rPr>
+              <w:t>The doctrine is not stated in Scripture</w:t>
+            </w:r>
+          </w:p>
+        </w:tc>
+        <w:tc>
+          <w:tcPr>
+            <w:tcW w:w="2512" w:type="dxa"/>
+          </w:tcPr>
+          <w:p>
+            <w:pPr>
+              <w:spacing w:after="0" w:before="0" w:line="259" w:lineRule="auto"/>
+            </w:pPr>
+            <w:r>
+              <w:rPr>
+                <w:rFonts w:ascii="Roboto" w:hAnsi="Roboto" w:eastAsia="Roboto" w:cs="Roboto"/>
+                <w:sz w:val="20"/>
+              </w:rPr>
+              <w:t>The case does not depend on it</w:t>
+            </w:r>
+          </w:p>
+        </w:tc>
+      </w:tr>
+      <w:tr>
+        <w:trPr>
+          <w:cantSplit/>
+        </w:trPr>
+        <w:tc>
+          <w:tcPr>
+            <w:tcW w:w="1904" w:type="dxa"/>
+          </w:tcPr>
+          <w:p>
+            <w:pPr>
+              <w:spacing w:after="0" w:before="0" w:line="259" w:lineRule="auto"/>
+            </w:pPr>
+            <w:r>
+              <w:rPr>
+                <w:rFonts w:ascii="Roboto" w:hAnsi="Roboto" w:eastAsia="Roboto" w:cs="Roboto"/>
+                <w:sz w:val="20"/>
+              </w:rPr>
               <w:t>The wicked shall be no more</w:t>
             </w:r>
           </w:p>
@@ -11385,7 +13047,7 @@
           <w:b/>
           <w:sz w:val="20"/>
         </w:rPr>
-        <w:t>9.9 What the objections leave</w:t>
+        <w:t>9.10 What the objections leave</w:t>
       </w:r>
     </w:p>
     <w:p>
@@ -11397,7 +13059,7 @@
           <w:rFonts w:ascii="Roboto" w:hAnsi="Roboto" w:eastAsia="Roboto" w:cs="Roboto"/>
           <w:sz w:val="20"/>
         </w:rPr>
-        <w:t>The objections do not overturn the thesis. Words of destruction can name an ending, and they also name the ruin of persons who go on existing, so they do not decide the question. The adjective of duration establishes permanence, and the passages about the persons say what the permanence is. The picture of the fire and the worm is a picture of corpses in Isaiah and of a casting of the living in the Gospels. The smoke may be a monument, and the persons beside it are tormented and have no rest day nor night. What remains when every concession is made is the statement of Revelation about persons who are tormented, who have no rest day nor night, and whose plural statement of torment at Revelation 20:10 takes in the beast and the false prophet cast in a thousand years before. That remains because it is in the text, and nothing in the objections has removed it.</w:t>
+        <w:t>The objections do not overturn the thesis. Words of destruction can name an ending, and they also name the ruin of persons who go on existing, so they do not decide the question. The adjective of duration establishes permanence, and the passages about the persons say what the permanence is. The picture of the fire and the worm is a picture of corpses in Isaiah and of a casting of the living in the Gospels. The smoke may be a monument, and the persons beside it are tormented and have no rest day nor night. What remains when every concession is made is the statement of Revelation about persons who are tormented, who have no rest day nor night, and whose torment day and night for ever and ever is set in a lake that the book names as one lake before and after the human dead are cast into it. The human lost remain under its punishment for ever and do not cease to exist. That remains because it is in the text, and nothing in the objections has removed it.</w:t>
       </w:r>
     </w:p>
     <w:p>
@@ -11531,6 +13193,30 @@
           <w:rFonts w:ascii="Roboto" w:hAnsi="Roboto" w:eastAsia="Roboto" w:cs="Roboto"/>
           <w:sz w:val="20"/>
         </w:rPr>
+        <w:t>The objection that the lake’s character cannot be carried to the human dead is answered from the book: one lake, unchanged after they enter it, with their torment stated in the same terms.</w:t>
+      </w:r>
+    </w:p>
+    <w:p>
+      <w:pPr>
+        <w:tabs>
+          <w:tab w:pos="360" w:val="left"/>
+        </w:tabs>
+        <w:spacing w:after="0"/>
+        <w:ind w:left="360" w:hanging="260"/>
+      </w:pPr>
+      <w:r>
+        <w:rPr>
+          <w:rFonts w:ascii="Roboto" w:hAnsi="Roboto" w:eastAsia="Roboto" w:cs="Roboto"/>
+          <w:sz w:val="20"/>
+        </w:rPr>
+        <w:t>•</w:t>
+        <w:tab/>
+      </w:r>
+      <w:r>
+        <w:rPr>
+          <w:rFonts w:ascii="Roboto" w:hAnsi="Roboto" w:eastAsia="Roboto" w:cs="Roboto"/>
+          <w:sz w:val="20"/>
+        </w:rPr>
         <w:t>The objection from justice is answered from what Scripture says of the Judge and of the grading of judgment, and not from a rule of proportion that Scripture does not state.</w:t>
       </w:r>
     </w:p>
@@ -11578,7 +13264,7 @@
           <w:rFonts w:ascii="Roboto" w:hAnsi="Roboto" w:eastAsia="Roboto" w:cs="Roboto"/>
           <w:sz w:val="20"/>
         </w:rPr>
-        <w:t>Scripture uses the words of death and destruction both of an ending and of a ruin that remains, and no one of them settles what becomes of the lost. The Lord tells the Twelve that God is able to destroy soul and body in hell, and Paul calls the end of the enemies of the cross destruction. Paul says that those who know not God shall be punished with everlasting destruction from the presence of the Lord, an irreversible penalty set against the rest and glory of the saints, whether the preposition names exclusion or source. The Lord sets one adjective on the punishment and on the life, speaks of a fire that is not quenched and a worm that dieth not, and places wailing and gnashing of teeth at the furnace into which the wicked are cast. Revelation says that the worshippers of the beast are tormented in the presence of the Lamb and have no rest day nor night, that the beast and the false prophet were cast alive into the lake of fire, that the devil is cast in a thousand years later, and that the plural statement of torment, day and night for ever and ever, takes in all three. It calls the lake the second death, and in the same book the dead exist, stand and are judged. The passages that say the wicked shall be no more speak of the earth and of the living. Taken together, each in its own setting, the passages on final judgment describe a punishment that is irreversible and enduring and that persons undergo, and none of them states that the persons cease to exist. Any reading that adds a ceasing, or an endless awareness where no verse says it, goes beyond what the text states.</w:t>
+        <w:t>Every person finally cast into the lake of fire remains under its punishment for ever and does not cease to exist. The lake is not annihilation. Scripture’s words of death and destruction name both an ending and a ruin that remains, so no one of them decides what becomes of the lost, and the passages that say the wicked shall be no more speak of the earth and of the living. What decides it is Revelation’s own description of the lake. The lake of fire is one place: the book names it the same way in 19:20, 20:10, 20:14, 20:15 and 21:8, calls it the second death, and says that the devil, the beast and the false prophet are tormented in it day and night for ever and ever. The human worshippers of the beast are tormented with fire and brimstone in the presence of the holy angels and of the Lamb and have no rest day nor night, and those not found written in the book of life are cast into the same lake and have their part in what burneth with fire and brimstone. The Lord sets one adjective on the punishment and on the life, and the persons go into each. The conclusion is not the statement of any single verse. It is what Revelation’s descriptions require when they are read together, and it is firmly established: the torment, the absence of rest, the second death and the everlasting punishment of the lake together describe a continuing conscious experience of final judgment.</w:t>
       </w:r>
     </w:p>
     <w:p>
@@ -12007,7 +13693,7 @@
                 <w:rFonts w:ascii="Roboto" w:hAnsi="Roboto" w:eastAsia="Roboto" w:cs="Roboto"/>
                 <w:sz w:val="20"/>
               </w:rPr>
-              <w:t>They are tormented and have no rest day nor night; the plural statement of torment at 20:10 takes in the beast and the false prophet cast in a thousand years before</w:t>
+              <w:t>Human worshippers of the beast are tormented with fire and brimstone and have no rest day nor night; the lake is the place of torment day and night for ever and ever</w:t>
             </w:r>
           </w:p>
         </w:tc>
@@ -12063,7 +13749,7 @@
                 <w:rFonts w:ascii="Roboto" w:hAnsi="Roboto" w:eastAsia="Roboto" w:cs="Roboto"/>
                 <w:sz w:val="20"/>
               </w:rPr>
-              <w:t>The lake of fire; in the book the dead exist, stand and are judged</w:t>
+              <w:t>The name of the lake of fire, which is one lake; in the book the dead exist, stand and are judged, so the name does not mean extinction</w:t>
             </w:r>
           </w:p>
         </w:tc>
@@ -12081,6 +13767,62 @@
                 <w:sz w:val="20"/>
               </w:rPr>
               <w:t>Rev 20:12–15; 21:8</w:t>
+            </w:r>
+          </w:p>
+        </w:tc>
+      </w:tr>
+      <w:tr>
+        <w:trPr>
+          <w:cantSplit/>
+        </w:trPr>
+        <w:tc>
+          <w:tcPr>
+            <w:tcW w:w="2437" w:type="dxa"/>
+          </w:tcPr>
+          <w:p>
+            <w:pPr>
+              <w:spacing w:after="0" w:before="0" w:line="259" w:lineRule="auto"/>
+            </w:pPr>
+            <w:r>
+              <w:rPr>
+                <w:rFonts w:ascii="Roboto" w:hAnsi="Roboto" w:eastAsia="Roboto" w:cs="Roboto"/>
+                <w:sz w:val="20"/>
+              </w:rPr>
+              <w:t>What becomes of the human lost cast into the lake?</w:t>
+            </w:r>
+          </w:p>
+        </w:tc>
+        <w:tc>
+          <w:tcPr>
+            <w:tcW w:w="3046" w:type="dxa"/>
+          </w:tcPr>
+          <w:p>
+            <w:pPr>
+              <w:spacing w:after="0" w:before="0" w:line="259" w:lineRule="auto"/>
+            </w:pPr>
+            <w:r>
+              <w:rPr>
+                <w:rFonts w:ascii="Roboto" w:hAnsi="Roboto" w:eastAsia="Roboto" w:cs="Roboto"/>
+                <w:sz w:val="20"/>
+              </w:rPr>
+              <w:t>They remain under its punishment for ever and do not cease to exist; inferred firmly from one lake, unchanged after they enter it, with their torment stated in the same terms</w:t>
+            </w:r>
+          </w:p>
+        </w:tc>
+        <w:tc>
+          <w:tcPr>
+            <w:tcW w:w="2132" w:type="dxa"/>
+          </w:tcPr>
+          <w:p>
+            <w:pPr>
+              <w:spacing w:after="0" w:before="0" w:line="259" w:lineRule="auto"/>
+            </w:pPr>
+            <w:r>
+              <w:rPr>
+                <w:rFonts w:ascii="Roboto" w:hAnsi="Roboto" w:eastAsia="Roboto" w:cs="Roboto"/>
+                <w:sz w:val="20"/>
+              </w:rPr>
+              <w:t>Rev 14:9–11; 20:10, 14, 15; 21:8</w:t>
             </w:r>
           </w:p>
         </w:tc>
@@ -12934,7 +14676,7 @@
                 <w:rFonts w:ascii="Roboto" w:hAnsi="Roboto" w:eastAsia="Roboto" w:cs="Roboto"/>
                 <w:sz w:val="20"/>
               </w:rPr>
-              <w:t>Judged by works; the book of life; the lake is the second death</w:t>
+              <w:t>Judged by works; the book of life; the lake, which burneth with fire and brimstone, is the second death; those not found written have their part in it</w:t>
             </w:r>
           </w:p>
         </w:tc>
@@ -15136,7 +16878,7 @@
                 <w:rFonts w:ascii="Roboto" w:hAnsi="Roboto" w:eastAsia="Roboto" w:cs="Roboto"/>
                 <w:sz w:val="20"/>
               </w:rPr>
-              <w:t>ch. 2, p. 4; ch. 3, pp. 9, 10; ch. 9, p. 39</w:t>
+              <w:t>ch. 2, p. 5; ch. 3, pp. 9, 10; ch. 9, p. 43</w:t>
             </w:r>
           </w:p>
         </w:tc>
@@ -15186,7 +16928,7 @@
                 <w:rFonts w:ascii="Roboto" w:hAnsi="Roboto" w:eastAsia="Roboto" w:cs="Roboto"/>
                 <w:sz w:val="20"/>
               </w:rPr>
-              <w:t>ch. 9, p. 39</w:t>
+              <w:t>ch. 9, p. 43</w:t>
             </w:r>
           </w:p>
         </w:tc>
@@ -15235,7 +16977,7 @@
                 <w:rFonts w:ascii="Roboto" w:hAnsi="Roboto" w:eastAsia="Roboto" w:cs="Roboto"/>
                 <w:sz w:val="20"/>
               </w:rPr>
-              <w:t>ch. 3, pp. 6, 10</w:t>
+              <w:t>ch. 3, pp. 7, 10</w:t>
             </w:r>
           </w:p>
         </w:tc>
@@ -15333,7 +17075,7 @@
                 <w:rFonts w:ascii="Roboto" w:hAnsi="Roboto" w:eastAsia="Roboto" w:cs="Roboto"/>
                 <w:sz w:val="20"/>
               </w:rPr>
-              <w:t>ch. 3, pp. 7, 10; Conclusion, p. 45</w:t>
+              <w:t>ch. 3, pp. 7, 10; Conclusion, p. 50</w:t>
             </w:r>
           </w:p>
         </w:tc>
@@ -15382,7 +17124,7 @@
                 <w:rFonts w:ascii="Roboto" w:hAnsi="Roboto" w:eastAsia="Roboto" w:cs="Roboto"/>
                 <w:sz w:val="20"/>
               </w:rPr>
-              <w:t>ch. 9, p. 41</w:t>
+              <w:t>ch. 9, p. 46</w:t>
             </w:r>
           </w:p>
         </w:tc>
@@ -15431,7 +17173,7 @@
                 <w:rFonts w:ascii="Roboto" w:hAnsi="Roboto" w:eastAsia="Roboto" w:cs="Roboto"/>
                 <w:sz w:val="20"/>
               </w:rPr>
-              <w:t>ch. 3, pp. 8, 9, 10</w:t>
+              <w:t>ch. 3, pp. 9, 10</w:t>
             </w:r>
           </w:p>
         </w:tc>
@@ -15480,7 +17222,7 @@
                 <w:rFonts w:ascii="Roboto" w:hAnsi="Roboto" w:eastAsia="Roboto" w:cs="Roboto"/>
                 <w:sz w:val="20"/>
               </w:rPr>
-              <w:t>ch. 3, pp. 7, 10</w:t>
+              <w:t>ch. 3, pp. 7, 8, 10</w:t>
             </w:r>
           </w:p>
         </w:tc>
@@ -15529,7 +17271,7 @@
                 <w:rFonts w:ascii="Roboto" w:hAnsi="Roboto" w:eastAsia="Roboto" w:cs="Roboto"/>
                 <w:sz w:val="20"/>
               </w:rPr>
-              <w:t>ch. 9, p. 42</w:t>
+              <w:t>ch. 9, p. 47</w:t>
             </w:r>
           </w:p>
         </w:tc>
@@ -15578,7 +17320,7 @@
                 <w:rFonts w:ascii="Roboto" w:hAnsi="Roboto" w:eastAsia="Roboto" w:cs="Roboto"/>
                 <w:sz w:val="20"/>
               </w:rPr>
-              <w:t>Conclusion, p. 45</w:t>
+              <w:t>Conclusion, p. 51</w:t>
             </w:r>
           </w:p>
         </w:tc>
@@ -15627,7 +17369,7 @@
                 <w:rFonts w:ascii="Roboto" w:hAnsi="Roboto" w:eastAsia="Roboto" w:cs="Roboto"/>
                 <w:sz w:val="20"/>
               </w:rPr>
-              <w:t>ch. 9, p. 42</w:t>
+              <w:t>ch. 9, p. 47</w:t>
             </w:r>
           </w:p>
         </w:tc>
@@ -15676,7 +17418,7 @@
                 <w:rFonts w:ascii="Roboto" w:hAnsi="Roboto" w:eastAsia="Roboto" w:cs="Roboto"/>
                 <w:sz w:val="20"/>
               </w:rPr>
-              <w:t>ch. 9, p. 42</w:t>
+              <w:t>ch. 9, p. 47</w:t>
             </w:r>
           </w:p>
         </w:tc>
@@ -15774,7 +17516,7 @@
                 <w:rFonts w:ascii="Roboto" w:hAnsi="Roboto" w:eastAsia="Roboto" w:cs="Roboto"/>
                 <w:sz w:val="20"/>
               </w:rPr>
-              <w:t>ch. 5, p. 17</w:t>
+              <w:t>ch. 5, p. 18</w:t>
             </w:r>
           </w:p>
         </w:tc>
@@ -15872,7 +17614,7 @@
                 <w:rFonts w:ascii="Roboto" w:hAnsi="Roboto" w:eastAsia="Roboto" w:cs="Roboto"/>
                 <w:sz w:val="20"/>
               </w:rPr>
-              <w:t>ch. 7, pp. 26, 28</w:t>
+              <w:t>ch. 7, pp. 27, 28</w:t>
             </w:r>
           </w:p>
         </w:tc>
@@ -15921,7 +17663,7 @@
                 <w:rFonts w:ascii="Roboto" w:hAnsi="Roboto" w:eastAsia="Roboto" w:cs="Roboto"/>
                 <w:sz w:val="20"/>
               </w:rPr>
-              <w:t>ch. 9, p. 40</w:t>
+              <w:t>ch. 9, p. 45</w:t>
             </w:r>
           </w:p>
         </w:tc>
@@ -15970,7 +17712,7 @@
                 <w:rFonts w:ascii="Roboto" w:hAnsi="Roboto" w:eastAsia="Roboto" w:cs="Roboto"/>
                 <w:sz w:val="20"/>
               </w:rPr>
-              <w:t>ch. 8, p. 36</w:t>
+              <w:t>ch. 8, p. 41</w:t>
             </w:r>
           </w:p>
         </w:tc>
@@ -16180,7 +17922,7 @@
                 <w:rFonts w:ascii="Roboto" w:hAnsi="Roboto" w:eastAsia="Roboto" w:cs="Roboto"/>
                 <w:sz w:val="20"/>
               </w:rPr>
-              <w:t>ch. 6, p. 21; ch. 7, pp. 24, 25, 27, 28; ch. 9, pp. 40, 43; Conclusion, p. 45</w:t>
+              <w:t>ch. 6, p. 21; ch. 7, pp. 24, 25, 27, 28; ch. 9, pp. 45, 48; Conclusion, p. 50</w:t>
             </w:r>
           </w:p>
         </w:tc>
@@ -16285,7 +18027,7 @@
                 <w:rFonts w:ascii="Roboto" w:hAnsi="Roboto" w:eastAsia="Roboto" w:cs="Roboto"/>
                 <w:sz w:val="20"/>
               </w:rPr>
-              <w:t>ch. 7, pp. 24, 25, 28; ch. 9, p. 40</w:t>
+              <w:t>ch. 7, pp. 24, 25, 28; ch. 9, p. 44</w:t>
             </w:r>
           </w:p>
         </w:tc>
@@ -16334,7 +18076,7 @@
                 <w:rFonts w:ascii="Roboto" w:hAnsi="Roboto" w:eastAsia="Roboto" w:cs="Roboto"/>
                 <w:sz w:val="20"/>
               </w:rPr>
-              <w:t>ch. 3, pp. 8, 9, 10</w:t>
+              <w:t>ch. 3, pp. 9, 10</w:t>
             </w:r>
           </w:p>
         </w:tc>
@@ -16383,7 +18125,7 @@
                 <w:rFonts w:ascii="Roboto" w:hAnsi="Roboto" w:eastAsia="Roboto" w:cs="Roboto"/>
                 <w:sz w:val="20"/>
               </w:rPr>
-              <w:t>ch. 3, p. 8</w:t>
+              <w:t>ch. 3, p. 9</w:t>
             </w:r>
           </w:p>
         </w:tc>
@@ -16432,7 +18174,7 @@
                 <w:rFonts w:ascii="Roboto" w:hAnsi="Roboto" w:eastAsia="Roboto" w:cs="Roboto"/>
                 <w:sz w:val="20"/>
               </w:rPr>
-              <w:t>ch. 9, p. 42</w:t>
+              <w:t>ch. 9, p. 47</w:t>
             </w:r>
           </w:p>
         </w:tc>
@@ -16481,7 +18223,7 @@
                 <w:rFonts w:ascii="Roboto" w:hAnsi="Roboto" w:eastAsia="Roboto" w:cs="Roboto"/>
                 <w:sz w:val="20"/>
               </w:rPr>
-              <w:t>ch. 2, p. 4; ch. 3, p. 9; ch. 9, p. 42; Conclusion, p. 45</w:t>
+              <w:t>ch. 2, p. 5; ch. 3, pp. 9, 10; ch. 9, p. 47; Conclusion, p. 51</w:t>
             </w:r>
           </w:p>
         </w:tc>
@@ -16530,7 +18272,7 @@
                 <w:rFonts w:ascii="Roboto" w:hAnsi="Roboto" w:eastAsia="Roboto" w:cs="Roboto"/>
                 <w:sz w:val="20"/>
               </w:rPr>
-              <w:t>ch. 7, pp. 24, 25, 28; ch. 9, p. 40</w:t>
+              <w:t>ch. 7, pp. 24, 25, 28; ch. 9, p. 44</w:t>
             </w:r>
           </w:p>
         </w:tc>
@@ -16677,7 +18419,7 @@
                 <w:rFonts w:ascii="Roboto" w:hAnsi="Roboto" w:eastAsia="Roboto" w:cs="Roboto"/>
                 <w:sz w:val="20"/>
               </w:rPr>
-              <w:t>ch. 6, p. 20</w:t>
+              <w:t>ch. 6, p. 21</w:t>
             </w:r>
           </w:p>
         </w:tc>
@@ -16733,7 +18475,7 @@
                 <w:rFonts w:ascii="Roboto" w:hAnsi="Roboto" w:eastAsia="Roboto" w:cs="Roboto"/>
                 <w:sz w:val="20"/>
               </w:rPr>
-              <w:t>ch. 6, pp. 18, 20, 21, 22; Conclusion, p. 45</w:t>
+              <w:t>ch. 6, pp. 19, 21, 22, 23; Conclusion, p. 50</w:t>
             </w:r>
           </w:p>
         </w:tc>
@@ -16789,7 +18531,7 @@
                 <w:rFonts w:ascii="Roboto" w:hAnsi="Roboto" w:eastAsia="Roboto" w:cs="Roboto"/>
                 <w:sz w:val="20"/>
               </w:rPr>
-              <w:t>ch. 3, p. 8</w:t>
+              <w:t>ch. 3, p. 9</w:t>
             </w:r>
           </w:p>
         </w:tc>
@@ -16838,7 +18580,7 @@
                 <w:rFonts w:ascii="Roboto" w:hAnsi="Roboto" w:eastAsia="Roboto" w:cs="Roboto"/>
                 <w:sz w:val="20"/>
               </w:rPr>
-              <w:t>ch. 8, p. 36</w:t>
+              <w:t>ch. 8, p. 41</w:t>
             </w:r>
           </w:p>
         </w:tc>
@@ -16887,7 +18629,7 @@
                 <w:rFonts w:ascii="Roboto" w:hAnsi="Roboto" w:eastAsia="Roboto" w:cs="Roboto"/>
                 <w:sz w:val="20"/>
               </w:rPr>
-              <w:t>ch. 9, p. 42</w:t>
+              <w:t>ch. 9, p. 47</w:t>
             </w:r>
           </w:p>
         </w:tc>
@@ -16936,7 +18678,7 @@
                 <w:rFonts w:ascii="Roboto" w:hAnsi="Roboto" w:eastAsia="Roboto" w:cs="Roboto"/>
                 <w:sz w:val="20"/>
               </w:rPr>
-              <w:t>Conclusion, p. 45</w:t>
+              <w:t>Conclusion, p. 51</w:t>
             </w:r>
           </w:p>
         </w:tc>
@@ -17083,7 +18825,7 @@
                 <w:rFonts w:ascii="Roboto" w:hAnsi="Roboto" w:eastAsia="Roboto" w:cs="Roboto"/>
                 <w:sz w:val="20"/>
               </w:rPr>
-              <w:t>ch. 7, pp. 26, 27</w:t>
+              <w:t>ch. 7, pp. 26, 28</w:t>
             </w:r>
           </w:p>
         </w:tc>
@@ -17335,7 +19077,7 @@
                 <w:rFonts w:ascii="Roboto" w:hAnsi="Roboto" w:eastAsia="Roboto" w:cs="Roboto"/>
                 <w:sz w:val="20"/>
               </w:rPr>
-              <w:t>ch. 3, pp. 7, 9, 10</w:t>
+              <w:t>ch. 3, pp. 8, 9, 10</w:t>
             </w:r>
           </w:p>
         </w:tc>
@@ -17720,7 +19462,7 @@
                 <w:rFonts w:ascii="Roboto" w:hAnsi="Roboto" w:eastAsia="Roboto" w:cs="Roboto"/>
                 <w:sz w:val="20"/>
               </w:rPr>
-              <w:t>ch. 2, p. 4; ch. 4, pp. 11, 12, 13, 14; ch. 5, p. 16; ch. 7, p. 26; ch. 9, pp. 39, 42; Conclusion, p. 45</w:t>
+              <w:t>ch. 2, p. 5; ch. 4, pp. 11, 12, 13, 14, 15; ch. 5, p. 16; ch. 7, p. 26; ch. 9, pp. 43, 47; Conclusion, p. 50</w:t>
             </w:r>
           </w:p>
         </w:tc>
@@ -17776,7 +19518,7 @@
                 <w:rFonts w:ascii="Roboto" w:hAnsi="Roboto" w:eastAsia="Roboto" w:cs="Roboto"/>
                 <w:sz w:val="20"/>
               </w:rPr>
-              <w:t>ch. 8, p. 34</w:t>
+              <w:t>ch. 8, p. 39</w:t>
             </w:r>
           </w:p>
         </w:tc>
@@ -17825,7 +19567,7 @@
                 <w:rFonts w:ascii="Roboto" w:hAnsi="Roboto" w:eastAsia="Roboto" w:cs="Roboto"/>
                 <w:sz w:val="20"/>
               </w:rPr>
-              <w:t>ch. 8, p. 34</w:t>
+              <w:t>ch. 8, p. 39</w:t>
             </w:r>
           </w:p>
         </w:tc>
@@ -18168,7 +19910,7 @@
                 <w:rFonts w:ascii="Roboto" w:hAnsi="Roboto" w:eastAsia="Roboto" w:cs="Roboto"/>
                 <w:sz w:val="20"/>
               </w:rPr>
-              <w:t>ch. 8, p. 34</w:t>
+              <w:t>ch. 8, p. 39</w:t>
             </w:r>
           </w:p>
         </w:tc>
@@ -18679,7 +20421,7 @@
                 <w:rFonts w:ascii="Roboto" w:hAnsi="Roboto" w:eastAsia="Roboto" w:cs="Roboto"/>
                 <w:sz w:val="20"/>
               </w:rPr>
-              <w:t>ch. 6, p. 20</w:t>
+              <w:t>ch. 6, p. 20; ch. 8, p. 37</w:t>
             </w:r>
           </w:p>
         </w:tc>
@@ -18735,7 +20477,7 @@
                 <w:rFonts w:ascii="Roboto" w:hAnsi="Roboto" w:eastAsia="Roboto" w:cs="Roboto"/>
                 <w:sz w:val="20"/>
               </w:rPr>
-              <w:t>ch. 2, p. 4; ch. 6, pp. 19, 20, 22; ch. 9, pp. 39, 40; Conclusion, p. 45</w:t>
+              <w:t>ch. 2, p. 5; ch. 6, pp. 19, 20, 22, 23; ch. 8, p. 37; ch. 9, p. 44; Conclusion, p. 50</w:t>
             </w:r>
           </w:p>
         </w:tc>
@@ -18977,7 +20719,7 @@
                 <w:rFonts w:ascii="Roboto" w:hAnsi="Roboto" w:eastAsia="Roboto" w:cs="Roboto"/>
                 <w:sz w:val="20"/>
               </w:rPr>
-              <w:t>Mark 9:43, 44</w:t>
+              <w:t>Mark 9:43</w:t>
             </w:r>
           </w:p>
         </w:tc>
@@ -18994,7 +20736,7 @@
                 <w:rFonts w:ascii="Roboto" w:hAnsi="Roboto" w:eastAsia="Roboto" w:cs="Roboto"/>
                 <w:sz w:val="20"/>
               </w:rPr>
-              <w:t>ch. 7, p. 23</w:t>
+              <w:t>ch. 9, p. 44</w:t>
             </w:r>
           </w:p>
         </w:tc>
@@ -19033,7 +20775,7 @@
                 <w:rFonts w:ascii="Roboto" w:hAnsi="Roboto" w:eastAsia="Roboto" w:cs="Roboto"/>
                 <w:sz w:val="20"/>
               </w:rPr>
-              <w:t>Mark 9:43, 48</w:t>
+              <w:t>Mark 9:43, 44</w:t>
             </w:r>
           </w:p>
         </w:tc>
@@ -19050,7 +20792,7 @@
                 <w:rFonts w:ascii="Roboto" w:hAnsi="Roboto" w:eastAsia="Roboto" w:cs="Roboto"/>
                 <w:sz w:val="20"/>
               </w:rPr>
-              <w:t>ch. 9, p. 40</w:t>
+              <w:t>ch. 7, p. 23</w:t>
             </w:r>
           </w:p>
         </w:tc>
@@ -19089,7 +20831,7 @@
                 <w:rFonts w:ascii="Roboto" w:hAnsi="Roboto" w:eastAsia="Roboto" w:cs="Roboto"/>
                 <w:sz w:val="20"/>
               </w:rPr>
-              <w:t>Mark 9:43–48</w:t>
+              <w:t>Mark 9:43, 48</w:t>
             </w:r>
           </w:p>
         </w:tc>
@@ -19106,7 +20848,7 @@
                 <w:rFonts w:ascii="Roboto" w:hAnsi="Roboto" w:eastAsia="Roboto" w:cs="Roboto"/>
                 <w:sz w:val="20"/>
               </w:rPr>
-              <w:t>ch. 7, pp. 27, 28; Conclusion, p. 45</w:t>
+              <w:t>ch. 9, p. 44</w:t>
             </w:r>
           </w:p>
         </w:tc>
@@ -19145,7 +20887,7 @@
                 <w:rFonts w:ascii="Roboto" w:hAnsi="Roboto" w:eastAsia="Roboto" w:cs="Roboto"/>
                 <w:sz w:val="20"/>
               </w:rPr>
-              <w:t>Mark 9:48</w:t>
+              <w:t>Mark 9:43–48</w:t>
             </w:r>
           </w:p>
         </w:tc>
@@ -19162,7 +20904,7 @@
                 <w:rFonts w:ascii="Roboto" w:hAnsi="Roboto" w:eastAsia="Roboto" w:cs="Roboto"/>
                 <w:sz w:val="20"/>
               </w:rPr>
-              <w:t>ch. 7, pp. 23, 25; ch. 9, p. 40</w:t>
+              <w:t>ch. 7, pp. 27, 28; Conclusion, p. 50</w:t>
             </w:r>
           </w:p>
         </w:tc>
@@ -19201,7 +20943,7 @@
                 <w:rFonts w:ascii="Roboto" w:hAnsi="Roboto" w:eastAsia="Roboto" w:cs="Roboto"/>
                 <w:sz w:val="20"/>
               </w:rPr>
-              <w:t>Mark 9:49</w:t>
+              <w:t>Mark 9:48</w:t>
             </w:r>
           </w:p>
         </w:tc>
@@ -19218,7 +20960,7 @@
                 <w:rFonts w:ascii="Roboto" w:hAnsi="Roboto" w:eastAsia="Roboto" w:cs="Roboto"/>
                 <w:sz w:val="20"/>
               </w:rPr>
-              <w:t>ch. 9, p. 40</w:t>
+              <w:t>ch. 7, pp. 24, 25; ch. 9, p. 44</w:t>
             </w:r>
           </w:p>
         </w:tc>
@@ -19257,7 +20999,7 @@
                 <w:rFonts w:ascii="Roboto" w:hAnsi="Roboto" w:eastAsia="Roboto" w:cs="Roboto"/>
                 <w:sz w:val="20"/>
               </w:rPr>
-              <w:t>Mark 14:4</w:t>
+              <w:t>Mark 9:49</w:t>
             </w:r>
           </w:p>
         </w:tc>
@@ -19274,7 +21016,7 @@
                 <w:rFonts w:ascii="Roboto" w:hAnsi="Roboto" w:eastAsia="Roboto" w:cs="Roboto"/>
                 <w:sz w:val="20"/>
               </w:rPr>
-              <w:t>ch. 3, p. 8; ch. 4, p. 13</w:t>
+              <w:t>ch. 9, p. 44</w:t>
             </w:r>
           </w:p>
         </w:tc>
@@ -19286,6 +21028,13 @@
             <w:pPr>
               <w:spacing w:after="0" w:before="0" w:line="259" w:lineRule="auto"/>
             </w:pPr>
+            <w:r>
+              <w:rPr>
+                <w:rFonts w:ascii="Roboto" w:hAnsi="Roboto" w:eastAsia="Roboto" w:cs="Roboto"/>
+                <w:sz w:val="20"/>
+              </w:rPr>
+              <w:t>In full, Appendix B</w:t>
+            </w:r>
           </w:p>
         </w:tc>
       </w:tr>
@@ -19306,7 +21055,7 @@
                 <w:rFonts w:ascii="Roboto" w:hAnsi="Roboto" w:eastAsia="Roboto" w:cs="Roboto"/>
                 <w:sz w:val="20"/>
               </w:rPr>
-              <w:t>Luke 12:1</w:t>
+              <w:t>Mark 14:4</w:t>
             </w:r>
           </w:p>
         </w:tc>
@@ -19323,7 +21072,7 @@
                 <w:rFonts w:ascii="Roboto" w:hAnsi="Roboto" w:eastAsia="Roboto" w:cs="Roboto"/>
                 <w:sz w:val="20"/>
               </w:rPr>
-              <w:t>ch. 4, p. 12</w:t>
+              <w:t>ch. 3, p. 8; ch. 4, p. 13</w:t>
             </w:r>
           </w:p>
         </w:tc>
@@ -19335,13 +21084,6 @@
             <w:pPr>
               <w:spacing w:after="0" w:before="0" w:line="259" w:lineRule="auto"/>
             </w:pPr>
-            <w:r>
-              <w:rPr>
-                <w:rFonts w:ascii="Roboto" w:hAnsi="Roboto" w:eastAsia="Roboto" w:cs="Roboto"/>
-                <w:sz w:val="20"/>
-              </w:rPr>
-              <w:t>In full, Appendix B</w:t>
-            </w:r>
           </w:p>
         </w:tc>
       </w:tr>
@@ -19362,7 +21104,7 @@
                 <w:rFonts w:ascii="Roboto" w:hAnsi="Roboto" w:eastAsia="Roboto" w:cs="Roboto"/>
                 <w:sz w:val="20"/>
               </w:rPr>
-              <w:t>Luke 12:2</w:t>
+              <w:t>Luke 12:1</w:t>
             </w:r>
           </w:p>
         </w:tc>
@@ -19418,7 +21160,7 @@
                 <w:rFonts w:ascii="Roboto" w:hAnsi="Roboto" w:eastAsia="Roboto" w:cs="Roboto"/>
                 <w:sz w:val="20"/>
               </w:rPr>
-              <w:t>Luke 12:4</w:t>
+              <w:t>Luke 12:2</w:t>
             </w:r>
           </w:p>
         </w:tc>
@@ -19435,7 +21177,7 @@
                 <w:rFonts w:ascii="Roboto" w:hAnsi="Roboto" w:eastAsia="Roboto" w:cs="Roboto"/>
                 <w:sz w:val="20"/>
               </w:rPr>
-              <w:t>ch. 4, pp. 11, 12</w:t>
+              <w:t>ch. 4, p. 12</w:t>
             </w:r>
           </w:p>
         </w:tc>
@@ -19474,7 +21216,7 @@
                 <w:rFonts w:ascii="Roboto" w:hAnsi="Roboto" w:eastAsia="Roboto" w:cs="Roboto"/>
                 <w:sz w:val="20"/>
               </w:rPr>
-              <w:t>Luke 12:5</w:t>
+              <w:t>Luke 12:4</w:t>
             </w:r>
           </w:p>
         </w:tc>
@@ -19491,7 +21233,7 @@
                 <w:rFonts w:ascii="Roboto" w:hAnsi="Roboto" w:eastAsia="Roboto" w:cs="Roboto"/>
                 <w:sz w:val="20"/>
               </w:rPr>
-              <w:t>ch. 4, pp. 11, 12, 14; Conclusion, p. 45</w:t>
+              <w:t>ch. 4, p. 12</w:t>
             </w:r>
           </w:p>
         </w:tc>
@@ -19530,7 +21272,7 @@
                 <w:rFonts w:ascii="Roboto" w:hAnsi="Roboto" w:eastAsia="Roboto" w:cs="Roboto"/>
                 <w:sz w:val="20"/>
               </w:rPr>
-              <w:t>Luke 12:47, 48</w:t>
+              <w:t>Luke 12:5</w:t>
             </w:r>
           </w:p>
         </w:tc>
@@ -19547,7 +21289,7 @@
                 <w:rFonts w:ascii="Roboto" w:hAnsi="Roboto" w:eastAsia="Roboto" w:cs="Roboto"/>
                 <w:sz w:val="20"/>
               </w:rPr>
-              <w:t>ch. 8, p. 34</w:t>
+              <w:t>ch. 4, pp. 12, 13, 15; Conclusion, p. 50</w:t>
             </w:r>
           </w:p>
         </w:tc>
@@ -19559,6 +21301,13 @@
             <w:pPr>
               <w:spacing w:after="0" w:before="0" w:line="259" w:lineRule="auto"/>
             </w:pPr>
+            <w:r>
+              <w:rPr>
+                <w:rFonts w:ascii="Roboto" w:hAnsi="Roboto" w:eastAsia="Roboto" w:cs="Roboto"/>
+                <w:sz w:val="20"/>
+              </w:rPr>
+              <w:t>In full, Appendix B</w:t>
+            </w:r>
           </w:p>
         </w:tc>
       </w:tr>
@@ -19579,7 +21328,7 @@
                 <w:rFonts w:ascii="Roboto" w:hAnsi="Roboto" w:eastAsia="Roboto" w:cs="Roboto"/>
                 <w:sz w:val="20"/>
               </w:rPr>
-              <w:t>Luke 13:25–28</w:t>
+              <w:t>Luke 12:47, 48</w:t>
             </w:r>
           </w:p>
         </w:tc>
@@ -19596,7 +21345,7 @@
                 <w:rFonts w:ascii="Roboto" w:hAnsi="Roboto" w:eastAsia="Roboto" w:cs="Roboto"/>
                 <w:sz w:val="20"/>
               </w:rPr>
-              <w:t>ch. 5, p. 17</w:t>
+              <w:t>ch. 8, p. 39</w:t>
             </w:r>
           </w:p>
         </w:tc>
@@ -19628,7 +21377,7 @@
                 <w:rFonts w:ascii="Roboto" w:hAnsi="Roboto" w:eastAsia="Roboto" w:cs="Roboto"/>
                 <w:sz w:val="20"/>
               </w:rPr>
-              <w:t>Luke 13:28</w:t>
+              <w:t>Luke 13:25–28</w:t>
             </w:r>
           </w:p>
         </w:tc>
@@ -19645,7 +21394,7 @@
                 <w:rFonts w:ascii="Roboto" w:hAnsi="Roboto" w:eastAsia="Roboto" w:cs="Roboto"/>
                 <w:sz w:val="20"/>
               </w:rPr>
-              <w:t>ch. 7, p. 27</w:t>
+              <w:t>ch. 5, p. 17</w:t>
             </w:r>
           </w:p>
         </w:tc>
@@ -19677,7 +21426,7 @@
                 <w:rFonts w:ascii="Roboto" w:hAnsi="Roboto" w:eastAsia="Roboto" w:cs="Roboto"/>
                 <w:sz w:val="20"/>
               </w:rPr>
-              <w:t>Luke 15:4</w:t>
+              <w:t>Luke 13:28</w:t>
             </w:r>
           </w:p>
         </w:tc>
@@ -19694,7 +21443,7 @@
                 <w:rFonts w:ascii="Roboto" w:hAnsi="Roboto" w:eastAsia="Roboto" w:cs="Roboto"/>
                 <w:sz w:val="20"/>
               </w:rPr>
-              <w:t>ch. 3, p. 7</w:t>
+              <w:t>ch. 7, p. 27</w:t>
             </w:r>
           </w:p>
         </w:tc>
@@ -19726,7 +21475,7 @@
                 <w:rFonts w:ascii="Roboto" w:hAnsi="Roboto" w:eastAsia="Roboto" w:cs="Roboto"/>
                 <w:sz w:val="20"/>
               </w:rPr>
-              <w:t>Luke 15:4, 6, 24, 32</w:t>
+              <w:t>Luke 15:4</w:t>
             </w:r>
           </w:p>
         </w:tc>
@@ -19743,7 +21492,7 @@
                 <w:rFonts w:ascii="Roboto" w:hAnsi="Roboto" w:eastAsia="Roboto" w:cs="Roboto"/>
                 <w:sz w:val="20"/>
               </w:rPr>
-              <w:t>ch. 3, p. 10</w:t>
+              <w:t>ch. 3, p. 8</w:t>
             </w:r>
           </w:p>
         </w:tc>
@@ -19775,7 +21524,7 @@
                 <w:rFonts w:ascii="Roboto" w:hAnsi="Roboto" w:eastAsia="Roboto" w:cs="Roboto"/>
                 <w:sz w:val="20"/>
               </w:rPr>
-              <w:t>Luke 15:6</w:t>
+              <w:t>Luke 15:4, 6, 24, 32</w:t>
             </w:r>
           </w:p>
         </w:tc>
@@ -19792,7 +21541,7 @@
                 <w:rFonts w:ascii="Roboto" w:hAnsi="Roboto" w:eastAsia="Roboto" w:cs="Roboto"/>
                 <w:sz w:val="20"/>
               </w:rPr>
-              <w:t>ch. 3, p. 7</w:t>
+              <w:t>ch. 3, p. 10</w:t>
             </w:r>
           </w:p>
         </w:tc>
@@ -19824,7 +21573,7 @@
                 <w:rFonts w:ascii="Roboto" w:hAnsi="Roboto" w:eastAsia="Roboto" w:cs="Roboto"/>
                 <w:sz w:val="20"/>
               </w:rPr>
-              <w:t>Luke 15:24</w:t>
+              <w:t>Luke 15:6</w:t>
             </w:r>
           </w:p>
         </w:tc>
@@ -19841,7 +21590,7 @@
                 <w:rFonts w:ascii="Roboto" w:hAnsi="Roboto" w:eastAsia="Roboto" w:cs="Roboto"/>
                 <w:sz w:val="20"/>
               </w:rPr>
-              <w:t>ch. 2, p. 4; ch. 3, pp. 8, 9, 10; ch. 9, p. 39; Conclusion, p. 45</w:t>
+              <w:t>ch. 3, p. 8</w:t>
             </w:r>
           </w:p>
         </w:tc>
@@ -19873,7 +21622,7 @@
                 <w:rFonts w:ascii="Roboto" w:hAnsi="Roboto" w:eastAsia="Roboto" w:cs="Roboto"/>
                 <w:sz w:val="20"/>
               </w:rPr>
-              <w:t>Luke 15:32</w:t>
+              <w:t>Luke 15:24</w:t>
             </w:r>
           </w:p>
         </w:tc>
@@ -19890,7 +21639,7 @@
                 <w:rFonts w:ascii="Roboto" w:hAnsi="Roboto" w:eastAsia="Roboto" w:cs="Roboto"/>
                 <w:sz w:val="20"/>
               </w:rPr>
-              <w:t>ch. 3, p. 8</w:t>
+              <w:t>ch. 2, p. 5; ch. 3, pp. 8, 9, 10; ch. 9, p. 43; Conclusion, p. 50</w:t>
             </w:r>
           </w:p>
         </w:tc>
@@ -19922,7 +21671,7 @@
                 <w:rFonts w:ascii="Roboto" w:hAnsi="Roboto" w:eastAsia="Roboto" w:cs="Roboto"/>
                 <w:sz w:val="20"/>
               </w:rPr>
-              <w:t>Luke 19:10</w:t>
+              <w:t>Luke 15:32</w:t>
             </w:r>
           </w:p>
         </w:tc>
@@ -19939,7 +21688,7 @@
                 <w:rFonts w:ascii="Roboto" w:hAnsi="Roboto" w:eastAsia="Roboto" w:cs="Roboto"/>
                 <w:sz w:val="20"/>
               </w:rPr>
-              <w:t>ch. 3, pp. 8, 10</w:t>
+              <w:t>ch. 3, p. 8</w:t>
             </w:r>
           </w:p>
         </w:tc>
@@ -19971,7 +21720,7 @@
                 <w:rFonts w:ascii="Roboto" w:hAnsi="Roboto" w:eastAsia="Roboto" w:cs="Roboto"/>
                 <w:sz w:val="20"/>
               </w:rPr>
-              <w:t>John 3:36</w:t>
+              <w:t>Luke 19:10</w:t>
             </w:r>
           </w:p>
         </w:tc>
@@ -19988,7 +21737,7 @@
                 <w:rFonts w:ascii="Roboto" w:hAnsi="Roboto" w:eastAsia="Roboto" w:cs="Roboto"/>
                 <w:sz w:val="20"/>
               </w:rPr>
-              <w:t>ch. 6, p. 22</w:t>
+              <w:t>ch. 3, pp. 8, 10</w:t>
             </w:r>
           </w:p>
         </w:tc>
@@ -20020,7 +21769,7 @@
                 <w:rFonts w:ascii="Roboto" w:hAnsi="Roboto" w:eastAsia="Roboto" w:cs="Roboto"/>
                 <w:sz w:val="20"/>
               </w:rPr>
-              <w:t>John 17:12</w:t>
+              <w:t>John 3:36</w:t>
             </w:r>
           </w:p>
         </w:tc>
@@ -20037,7 +21786,7 @@
                 <w:rFonts w:ascii="Roboto" w:hAnsi="Roboto" w:eastAsia="Roboto" w:cs="Roboto"/>
                 <w:sz w:val="20"/>
               </w:rPr>
-              <w:t>ch. 4, p. 13</w:t>
+              <w:t>ch. 6, p. 22</w:t>
             </w:r>
           </w:p>
         </w:tc>
@@ -20069,7 +21818,7 @@
                 <w:rFonts w:ascii="Roboto" w:hAnsi="Roboto" w:eastAsia="Roboto" w:cs="Roboto"/>
                 <w:sz w:val="20"/>
               </w:rPr>
-              <w:t>Acts 8:20</w:t>
+              <w:t>John 17:12</w:t>
             </w:r>
           </w:p>
         </w:tc>
@@ -20118,7 +21867,7 @@
                 <w:rFonts w:ascii="Roboto" w:hAnsi="Roboto" w:eastAsia="Roboto" w:cs="Roboto"/>
                 <w:sz w:val="20"/>
               </w:rPr>
-              <w:t>Romans 3:5, 6</w:t>
+              <w:t>Acts 8:20</w:t>
             </w:r>
           </w:p>
         </w:tc>
@@ -20135,7 +21884,7 @@
                 <w:rFonts w:ascii="Roboto" w:hAnsi="Roboto" w:eastAsia="Roboto" w:cs="Roboto"/>
                 <w:sz w:val="20"/>
               </w:rPr>
-              <w:t>ch. 9, p. 41</w:t>
+              <w:t>ch. 4, p. 13</w:t>
             </w:r>
           </w:p>
         </w:tc>
@@ -20167,7 +21916,7 @@
                 <w:rFonts w:ascii="Roboto" w:hAnsi="Roboto" w:eastAsia="Roboto" w:cs="Roboto"/>
                 <w:sz w:val="20"/>
               </w:rPr>
-              <w:t>Romans 9:22</w:t>
+              <w:t>Romans 3:5, 6</w:t>
             </w:r>
           </w:p>
         </w:tc>
@@ -20184,7 +21933,7 @@
                 <w:rFonts w:ascii="Roboto" w:hAnsi="Roboto" w:eastAsia="Roboto" w:cs="Roboto"/>
                 <w:sz w:val="20"/>
               </w:rPr>
-              <w:t>ch. 4, p. 13</w:t>
+              <w:t>ch. 9, p. 46</w:t>
             </w:r>
           </w:p>
         </w:tc>
@@ -20216,7 +21965,7 @@
                 <w:rFonts w:ascii="Roboto" w:hAnsi="Roboto" w:eastAsia="Roboto" w:cs="Roboto"/>
                 <w:sz w:val="20"/>
               </w:rPr>
-              <w:t>Romans 14:10</w:t>
+              <w:t>Romans 9:22</w:t>
             </w:r>
           </w:p>
         </w:tc>
@@ -20233,7 +21982,7 @@
                 <w:rFonts w:ascii="Roboto" w:hAnsi="Roboto" w:eastAsia="Roboto" w:cs="Roboto"/>
                 <w:sz w:val="20"/>
               </w:rPr>
-              <w:t>ch. 8, pp. 35, 37</w:t>
+              <w:t>ch. 4, p. 13</w:t>
             </w:r>
           </w:p>
         </w:tc>
@@ -20265,7 +22014,7 @@
                 <w:rFonts w:ascii="Roboto" w:hAnsi="Roboto" w:eastAsia="Roboto" w:cs="Roboto"/>
                 <w:sz w:val="20"/>
               </w:rPr>
-              <w:t>1 Corinthians 5:5</w:t>
+              <w:t>Romans 14:10</w:t>
             </w:r>
           </w:p>
         </w:tc>
@@ -20282,7 +22031,7 @@
                 <w:rFonts w:ascii="Roboto" w:hAnsi="Roboto" w:eastAsia="Roboto" w:cs="Roboto"/>
                 <w:sz w:val="20"/>
               </w:rPr>
-              <w:t>ch. 3, pp. 8, 9, 10; ch. 5, p. 16; ch. 9, p. 39; Conclusion, p. 45</w:t>
+              <w:t>ch. 8, pp. 40, 41</w:t>
             </w:r>
           </w:p>
         </w:tc>
@@ -20314,7 +22063,7 @@
                 <w:rFonts w:ascii="Roboto" w:hAnsi="Roboto" w:eastAsia="Roboto" w:cs="Roboto"/>
                 <w:sz w:val="20"/>
               </w:rPr>
-              <w:t>1 Corinthians 15:26</w:t>
+              <w:t>1 Corinthians 5:5</w:t>
             </w:r>
           </w:p>
         </w:tc>
@@ -20331,7 +22080,7 @@
                 <w:rFonts w:ascii="Roboto" w:hAnsi="Roboto" w:eastAsia="Roboto" w:cs="Roboto"/>
                 <w:sz w:val="20"/>
               </w:rPr>
-              <w:t>ch. 8, p. 33</w:t>
+              <w:t>ch. 3, pp. 9, 10; ch. 5, p. 16; ch. 9, p. 43; Conclusion, p. 50</w:t>
             </w:r>
           </w:p>
         </w:tc>
@@ -20363,7 +22112,7 @@
                 <w:rFonts w:ascii="Roboto" w:hAnsi="Roboto" w:eastAsia="Roboto" w:cs="Roboto"/>
                 <w:sz w:val="20"/>
               </w:rPr>
-              <w:t>2 Corinthians 5:10</w:t>
+              <w:t>1 Corinthians 15:26</w:t>
             </w:r>
           </w:p>
         </w:tc>
@@ -20380,7 +22129,7 @@
                 <w:rFonts w:ascii="Roboto" w:hAnsi="Roboto" w:eastAsia="Roboto" w:cs="Roboto"/>
                 <w:sz w:val="20"/>
               </w:rPr>
-              <w:t>ch. 8, pp. 35, 37</w:t>
+              <w:t>ch. 8, p. 33</w:t>
             </w:r>
           </w:p>
         </w:tc>
@@ -20412,7 +22161,7 @@
                 <w:rFonts w:ascii="Roboto" w:hAnsi="Roboto" w:eastAsia="Roboto" w:cs="Roboto"/>
                 <w:sz w:val="20"/>
               </w:rPr>
-              <w:t>Ephesians 2:1</w:t>
+              <w:t>2 Corinthians 5:10</w:t>
             </w:r>
           </w:p>
         </w:tc>
@@ -20429,7 +22178,7 @@
                 <w:rFonts w:ascii="Roboto" w:hAnsi="Roboto" w:eastAsia="Roboto" w:cs="Roboto"/>
                 <w:sz w:val="20"/>
               </w:rPr>
-              <w:t>ch. 2, p. 4; ch. 3, pp. 9, 10; ch. 9, p. 39</w:t>
+              <w:t>ch. 8, pp. 40, 41</w:t>
             </w:r>
           </w:p>
         </w:tc>
@@ -20461,7 +22210,7 @@
                 <w:rFonts w:ascii="Roboto" w:hAnsi="Roboto" w:eastAsia="Roboto" w:cs="Roboto"/>
                 <w:sz w:val="20"/>
               </w:rPr>
-              <w:t>Philippians 1:28</w:t>
+              <w:t>Ephesians 2:1</w:t>
             </w:r>
           </w:p>
         </w:tc>
@@ -20478,7 +22227,7 @@
                 <w:rFonts w:ascii="Roboto" w:hAnsi="Roboto" w:eastAsia="Roboto" w:cs="Roboto"/>
                 <w:sz w:val="20"/>
               </w:rPr>
-              <w:t>ch. 4, p. 13</w:t>
+              <w:t>ch. 2, p. 5; ch. 3, p. 10; ch. 9, p. 43</w:t>
             </w:r>
           </w:p>
         </w:tc>
@@ -20510,7 +22259,7 @@
                 <w:rFonts w:ascii="Roboto" w:hAnsi="Roboto" w:eastAsia="Roboto" w:cs="Roboto"/>
                 <w:sz w:val="20"/>
               </w:rPr>
-              <w:t>Philippians 3:17</w:t>
+              <w:t>Philippians 1:28</w:t>
             </w:r>
           </w:p>
         </w:tc>
@@ -20527,7 +22276,7 @@
                 <w:rFonts w:ascii="Roboto" w:hAnsi="Roboto" w:eastAsia="Roboto" w:cs="Roboto"/>
                 <w:sz w:val="20"/>
               </w:rPr>
-              <w:t>ch. 4, p. 13</w:t>
+              <w:t>ch. 4, p. 14</w:t>
             </w:r>
           </w:p>
         </w:tc>
@@ -20539,13 +22288,6 @@
             <w:pPr>
               <w:spacing w:after="0" w:before="0" w:line="259" w:lineRule="auto"/>
             </w:pPr>
-            <w:r>
-              <w:rPr>
-                <w:rFonts w:ascii="Roboto" w:hAnsi="Roboto" w:eastAsia="Roboto" w:cs="Roboto"/>
-                <w:sz w:val="20"/>
-              </w:rPr>
-              <w:t>In full, Appendix B</w:t>
-            </w:r>
           </w:p>
         </w:tc>
       </w:tr>
@@ -20566,7 +22308,7 @@
                 <w:rFonts w:ascii="Roboto" w:hAnsi="Roboto" w:eastAsia="Roboto" w:cs="Roboto"/>
                 <w:sz w:val="20"/>
               </w:rPr>
-              <w:t>Philippians 3:18, 19</w:t>
+              <w:t>Philippians 3:17</w:t>
             </w:r>
           </w:p>
         </w:tc>
@@ -20622,7 +22364,7 @@
                 <w:rFonts w:ascii="Roboto" w:hAnsi="Roboto" w:eastAsia="Roboto" w:cs="Roboto"/>
                 <w:sz w:val="20"/>
               </w:rPr>
-              <w:t>Philippians 3:19</w:t>
+              <w:t>Philippians 3:18, 19</w:t>
             </w:r>
           </w:p>
         </w:tc>
@@ -20639,7 +22381,7 @@
                 <w:rFonts w:ascii="Roboto" w:hAnsi="Roboto" w:eastAsia="Roboto" w:cs="Roboto"/>
                 <w:sz w:val="20"/>
               </w:rPr>
-              <w:t>ch. 2, p. 4; ch. 4, pp. 13, 14; ch. 5, p. 16</w:t>
+              <w:t>ch. 4, p. 13</w:t>
             </w:r>
           </w:p>
         </w:tc>
@@ -20678,7 +22420,7 @@
                 <w:rFonts w:ascii="Roboto" w:hAnsi="Roboto" w:eastAsia="Roboto" w:cs="Roboto"/>
                 <w:sz w:val="20"/>
               </w:rPr>
-              <w:t>Philippians 3:20, 21</w:t>
+              <w:t>Philippians 3:19</w:t>
             </w:r>
           </w:p>
         </w:tc>
@@ -20695,7 +22437,7 @@
                 <w:rFonts w:ascii="Roboto" w:hAnsi="Roboto" w:eastAsia="Roboto" w:cs="Roboto"/>
                 <w:sz w:val="20"/>
               </w:rPr>
-              <w:t>ch. 4, p. 13</w:t>
+              <w:t>ch. 2, p. 5; ch. 4, pp. 13, 14, 15; ch. 5, p. 16</w:t>
             </w:r>
           </w:p>
         </w:tc>
@@ -20734,7 +22476,7 @@
                 <w:rFonts w:ascii="Roboto" w:hAnsi="Roboto" w:eastAsia="Roboto" w:cs="Roboto"/>
                 <w:sz w:val="20"/>
               </w:rPr>
-              <w:t>1 Thessalonians 5:3</w:t>
+              <w:t>Philippians 3:20, 21</w:t>
             </w:r>
           </w:p>
         </w:tc>
@@ -20751,7 +22493,7 @@
                 <w:rFonts w:ascii="Roboto" w:hAnsi="Roboto" w:eastAsia="Roboto" w:cs="Roboto"/>
                 <w:sz w:val="20"/>
               </w:rPr>
-              <w:t>ch. 5, p. 16</w:t>
+              <w:t>ch. 4, p. 13</w:t>
             </w:r>
           </w:p>
         </w:tc>
@@ -20763,6 +22505,13 @@
             <w:pPr>
               <w:spacing w:after="0" w:before="0" w:line="259" w:lineRule="auto"/>
             </w:pPr>
+            <w:r>
+              <w:rPr>
+                <w:rFonts w:ascii="Roboto" w:hAnsi="Roboto" w:eastAsia="Roboto" w:cs="Roboto"/>
+                <w:sz w:val="20"/>
+              </w:rPr>
+              <w:t>In full, Appendix B</w:t>
+            </w:r>
           </w:p>
         </w:tc>
       </w:tr>
@@ -20783,7 +22532,7 @@
                 <w:rFonts w:ascii="Roboto" w:hAnsi="Roboto" w:eastAsia="Roboto" w:cs="Roboto"/>
                 <w:sz w:val="20"/>
               </w:rPr>
-              <w:t>2 Thessalonians 1:1</w:t>
+              <w:t>1 Thessalonians 5:3</w:t>
             </w:r>
           </w:p>
         </w:tc>
@@ -20800,7 +22549,7 @@
                 <w:rFonts w:ascii="Roboto" w:hAnsi="Roboto" w:eastAsia="Roboto" w:cs="Roboto"/>
                 <w:sz w:val="20"/>
               </w:rPr>
-              <w:t>ch. 5, p. 15</w:t>
+              <w:t>ch. 5, p. 16</w:t>
             </w:r>
           </w:p>
         </w:tc>
@@ -20832,7 +22581,7 @@
                 <w:rFonts w:ascii="Roboto" w:hAnsi="Roboto" w:eastAsia="Roboto" w:cs="Roboto"/>
                 <w:sz w:val="20"/>
               </w:rPr>
-              <w:t>2 Thessalonians 1:4</w:t>
+              <w:t>2 Thessalonians 1:1</w:t>
             </w:r>
           </w:p>
         </w:tc>
@@ -20861,13 +22610,6 @@
             <w:pPr>
               <w:spacing w:after="0" w:before="0" w:line="259" w:lineRule="auto"/>
             </w:pPr>
-            <w:r>
-              <w:rPr>
-                <w:rFonts w:ascii="Roboto" w:hAnsi="Roboto" w:eastAsia="Roboto" w:cs="Roboto"/>
-                <w:sz w:val="20"/>
-              </w:rPr>
-              <w:t>In full, Appendix B</w:t>
-            </w:r>
           </w:p>
         </w:tc>
       </w:tr>
@@ -20888,7 +22630,7 @@
                 <w:rFonts w:ascii="Roboto" w:hAnsi="Roboto" w:eastAsia="Roboto" w:cs="Roboto"/>
                 <w:sz w:val="20"/>
               </w:rPr>
-              <w:t>2 Thessalonians 1:5</w:t>
+              <w:t>2 Thessalonians 1:4</w:t>
             </w:r>
           </w:p>
         </w:tc>
@@ -20944,7 +22686,7 @@
                 <w:rFonts w:ascii="Roboto" w:hAnsi="Roboto" w:eastAsia="Roboto" w:cs="Roboto"/>
                 <w:sz w:val="20"/>
               </w:rPr>
-              <w:t>2 Thessalonians 1:6</w:t>
+              <w:t>2 Thessalonians 1:5</w:t>
             </w:r>
           </w:p>
         </w:tc>
@@ -21000,7 +22742,7 @@
                 <w:rFonts w:ascii="Roboto" w:hAnsi="Roboto" w:eastAsia="Roboto" w:cs="Roboto"/>
                 <w:sz w:val="20"/>
               </w:rPr>
-              <w:t>2 Thessalonians 1:6–10</w:t>
+              <w:t>2 Thessalonians 1:6</w:t>
             </w:r>
           </w:p>
         </w:tc>
@@ -21017,7 +22759,7 @@
                 <w:rFonts w:ascii="Roboto" w:hAnsi="Roboto" w:eastAsia="Roboto" w:cs="Roboto"/>
                 <w:sz w:val="20"/>
               </w:rPr>
-              <w:t>ch. 5, p. 15; Conclusion, p. 45</w:t>
+              <w:t>ch. 5, p. 16</w:t>
             </w:r>
           </w:p>
         </w:tc>
@@ -21056,7 +22798,7 @@
                 <w:rFonts w:ascii="Roboto" w:hAnsi="Roboto" w:eastAsia="Roboto" w:cs="Roboto"/>
                 <w:sz w:val="20"/>
               </w:rPr>
-              <w:t>2 Thessalonians 1:7</w:t>
+              <w:t>2 Thessalonians 1:6–10</w:t>
             </w:r>
           </w:p>
         </w:tc>
@@ -21073,7 +22815,7 @@
                 <w:rFonts w:ascii="Roboto" w:hAnsi="Roboto" w:eastAsia="Roboto" w:cs="Roboto"/>
                 <w:sz w:val="20"/>
               </w:rPr>
-              <w:t>ch. 5, p. 15</w:t>
+              <w:t>ch. 5, p. 16; Conclusion, p. 50</w:t>
             </w:r>
           </w:p>
         </w:tc>
@@ -21112,7 +22854,7 @@
                 <w:rFonts w:ascii="Roboto" w:hAnsi="Roboto" w:eastAsia="Roboto" w:cs="Roboto"/>
                 <w:sz w:val="20"/>
               </w:rPr>
-              <w:t>2 Thessalonians 1:8</w:t>
+              <w:t>2 Thessalonians 1:7</w:t>
             </w:r>
           </w:p>
         </w:tc>
@@ -21129,7 +22871,7 @@
                 <w:rFonts w:ascii="Roboto" w:hAnsi="Roboto" w:eastAsia="Roboto" w:cs="Roboto"/>
                 <w:sz w:val="20"/>
               </w:rPr>
-              <w:t>ch. 5, pp. 15, 17</w:t>
+              <w:t>ch. 5, p. 16</w:t>
             </w:r>
           </w:p>
         </w:tc>
@@ -21168,7 +22910,7 @@
                 <w:rFonts w:ascii="Roboto" w:hAnsi="Roboto" w:eastAsia="Roboto" w:cs="Roboto"/>
                 <w:sz w:val="20"/>
               </w:rPr>
-              <w:t>2 Thessalonians 1:9</w:t>
+              <w:t>2 Thessalonians 1:8</w:t>
             </w:r>
           </w:p>
         </w:tc>
@@ -21185,7 +22927,7 @@
                 <w:rFonts w:ascii="Roboto" w:hAnsi="Roboto" w:eastAsia="Roboto" w:cs="Roboto"/>
                 <w:sz w:val="20"/>
               </w:rPr>
-              <w:t>ch. 2, pp. 4, 5; ch. 5, p. 16; ch. 9, p. 39</w:t>
+              <w:t>ch. 5, pp. 16, 18</w:t>
             </w:r>
           </w:p>
         </w:tc>
@@ -21224,7 +22966,7 @@
                 <w:rFonts w:ascii="Roboto" w:hAnsi="Roboto" w:eastAsia="Roboto" w:cs="Roboto"/>
                 <w:sz w:val="20"/>
               </w:rPr>
-              <w:t>2 Thessalonians 1:10</w:t>
+              <w:t>2 Thessalonians 1:9</w:t>
             </w:r>
           </w:p>
         </w:tc>
@@ -21241,7 +22983,7 @@
                 <w:rFonts w:ascii="Roboto" w:hAnsi="Roboto" w:eastAsia="Roboto" w:cs="Roboto"/>
                 <w:sz w:val="20"/>
               </w:rPr>
-              <w:t>ch. 5, p. 16</w:t>
+              <w:t>ch. 2, p. 5; ch. 5, pp. 16, 17; ch. 9, p. 43</w:t>
             </w:r>
           </w:p>
         </w:tc>
@@ -21280,7 +23022,7 @@
                 <w:rFonts w:ascii="Roboto" w:hAnsi="Roboto" w:eastAsia="Roboto" w:cs="Roboto"/>
                 <w:sz w:val="20"/>
               </w:rPr>
-              <w:t>1 Timothy 6:9</w:t>
+              <w:t>2 Thessalonians 1:10</w:t>
             </w:r>
           </w:p>
         </w:tc>
@@ -21309,6 +23051,13 @@
             <w:pPr>
               <w:spacing w:after="0" w:before="0" w:line="259" w:lineRule="auto"/>
             </w:pPr>
+            <w:r>
+              <w:rPr>
+                <w:rFonts w:ascii="Roboto" w:hAnsi="Roboto" w:eastAsia="Roboto" w:cs="Roboto"/>
+                <w:sz w:val="20"/>
+              </w:rPr>
+              <w:t>In full, Appendix B</w:t>
+            </w:r>
           </w:p>
         </w:tc>
       </w:tr>
@@ -21329,7 +23078,7 @@
                 <w:rFonts w:ascii="Roboto" w:hAnsi="Roboto" w:eastAsia="Roboto" w:cs="Roboto"/>
                 <w:sz w:val="20"/>
               </w:rPr>
-              <w:t>Hebrews 5:9</w:t>
+              <w:t>1 Timothy 6:9</w:t>
             </w:r>
           </w:p>
         </w:tc>
@@ -21346,7 +23095,7 @@
                 <w:rFonts w:ascii="Roboto" w:hAnsi="Roboto" w:eastAsia="Roboto" w:cs="Roboto"/>
                 <w:sz w:val="20"/>
               </w:rPr>
-              <w:t>ch. 6, p. 19; ch. 9, pp. 40, 43</w:t>
+              <w:t>ch. 5, p. 16</w:t>
             </w:r>
           </w:p>
         </w:tc>
@@ -21378,7 +23127,7 @@
                 <w:rFonts w:ascii="Roboto" w:hAnsi="Roboto" w:eastAsia="Roboto" w:cs="Roboto"/>
                 <w:sz w:val="20"/>
               </w:rPr>
-              <w:t>Hebrews 6:2</w:t>
+              <w:t>Hebrews 5:9</w:t>
             </w:r>
           </w:p>
         </w:tc>
@@ -21395,7 +23144,7 @@
                 <w:rFonts w:ascii="Roboto" w:hAnsi="Roboto" w:eastAsia="Roboto" w:cs="Roboto"/>
                 <w:sz w:val="20"/>
               </w:rPr>
-              <w:t>ch. 2, p. 5; ch. 6, pp. 19, 20; ch. 9, pp. 40, 43</w:t>
+              <w:t>ch. 6, pp. 19, 20; ch. 9, pp. 44, 48</w:t>
             </w:r>
           </w:p>
         </w:tc>
@@ -21427,7 +23176,7 @@
                 <w:rFonts w:ascii="Roboto" w:hAnsi="Roboto" w:eastAsia="Roboto" w:cs="Roboto"/>
                 <w:sz w:val="20"/>
               </w:rPr>
-              <w:t>Hebrews 9:12</w:t>
+              <w:t>Hebrews 6:2</w:t>
             </w:r>
           </w:p>
         </w:tc>
@@ -21444,7 +23193,7 @@
                 <w:rFonts w:ascii="Roboto" w:hAnsi="Roboto" w:eastAsia="Roboto" w:cs="Roboto"/>
                 <w:sz w:val="20"/>
               </w:rPr>
-              <w:t>ch. 6, p. 19; ch. 9, pp. 40, 43</w:t>
+              <w:t>ch. 2, p. 5; ch. 6, pp. 19, 20; ch. 9, pp. 44, 48</w:t>
             </w:r>
           </w:p>
         </w:tc>
@@ -21476,7 +23225,7 @@
                 <w:rFonts w:ascii="Roboto" w:hAnsi="Roboto" w:eastAsia="Roboto" w:cs="Roboto"/>
                 <w:sz w:val="20"/>
               </w:rPr>
-              <w:t>Hebrews 10:29</w:t>
+              <w:t>Hebrews 9:12</w:t>
             </w:r>
           </w:p>
         </w:tc>
@@ -21493,7 +23242,7 @@
                 <w:rFonts w:ascii="Roboto" w:hAnsi="Roboto" w:eastAsia="Roboto" w:cs="Roboto"/>
                 <w:sz w:val="20"/>
               </w:rPr>
-              <w:t>ch. 8, p. 34</w:t>
+              <w:t>ch. 6, pp. 19, 20; ch. 9, pp. 44, 48</w:t>
             </w:r>
           </w:p>
         </w:tc>
@@ -21525,7 +23274,7 @@
                 <w:rFonts w:ascii="Roboto" w:hAnsi="Roboto" w:eastAsia="Roboto" w:cs="Roboto"/>
                 <w:sz w:val="20"/>
               </w:rPr>
-              <w:t>2 Peter 2:6</w:t>
+              <w:t>Hebrews 10:29</w:t>
             </w:r>
           </w:p>
         </w:tc>
@@ -21542,7 +23291,7 @@
                 <w:rFonts w:ascii="Roboto" w:hAnsi="Roboto" w:eastAsia="Roboto" w:cs="Roboto"/>
                 <w:sz w:val="20"/>
               </w:rPr>
-              <w:t>ch. 6, p. 21</w:t>
+              <w:t>ch. 8, p. 39</w:t>
             </w:r>
           </w:p>
         </w:tc>
@@ -21574,7 +23323,7 @@
                 <w:rFonts w:ascii="Roboto" w:hAnsi="Roboto" w:eastAsia="Roboto" w:cs="Roboto"/>
                 <w:sz w:val="20"/>
               </w:rPr>
-              <w:t>2 Peter 3:5</w:t>
+              <w:t>2 Peter 2:6</w:t>
             </w:r>
           </w:p>
         </w:tc>
@@ -21591,7 +23340,7 @@
                 <w:rFonts w:ascii="Roboto" w:hAnsi="Roboto" w:eastAsia="Roboto" w:cs="Roboto"/>
                 <w:sz w:val="20"/>
               </w:rPr>
-              <w:t>ch. 3, p. 8</w:t>
+              <w:t>ch. 6, p. 21</w:t>
             </w:r>
           </w:p>
         </w:tc>
@@ -21623,7 +23372,7 @@
                 <w:rFonts w:ascii="Roboto" w:hAnsi="Roboto" w:eastAsia="Roboto" w:cs="Roboto"/>
                 <w:sz w:val="20"/>
               </w:rPr>
-              <w:t>2 Peter 3:6</w:t>
+              <w:t>2 Peter 3:5</w:t>
             </w:r>
           </w:p>
         </w:tc>
@@ -21640,7 +23389,7 @@
                 <w:rFonts w:ascii="Roboto" w:hAnsi="Roboto" w:eastAsia="Roboto" w:cs="Roboto"/>
                 <w:sz w:val="20"/>
               </w:rPr>
-              <w:t>ch. 3, pp. 8, 10</w:t>
+              <w:t>ch. 3, p. 8</w:t>
             </w:r>
           </w:p>
         </w:tc>
@@ -21672,7 +23421,7 @@
                 <w:rFonts w:ascii="Roboto" w:hAnsi="Roboto" w:eastAsia="Roboto" w:cs="Roboto"/>
                 <w:sz w:val="20"/>
               </w:rPr>
-              <w:t>2 Peter 3:7</w:t>
+              <w:t>2 Peter 3:6</w:t>
             </w:r>
           </w:p>
         </w:tc>
@@ -21689,7 +23438,7 @@
                 <w:rFonts w:ascii="Roboto" w:hAnsi="Roboto" w:eastAsia="Roboto" w:cs="Roboto"/>
                 <w:sz w:val="20"/>
               </w:rPr>
-              <w:t>ch. 3, p. 8</w:t>
+              <w:t>ch. 3, pp. 8, 10</w:t>
             </w:r>
           </w:p>
         </w:tc>
@@ -21721,7 +23470,7 @@
                 <w:rFonts w:ascii="Roboto" w:hAnsi="Roboto" w:eastAsia="Roboto" w:cs="Roboto"/>
                 <w:sz w:val="20"/>
               </w:rPr>
-              <w:t>1 John 4:18</w:t>
+              <w:t>2 Peter 3:7</w:t>
             </w:r>
           </w:p>
         </w:tc>
@@ -21738,7 +23487,7 @@
                 <w:rFonts w:ascii="Roboto" w:hAnsi="Roboto" w:eastAsia="Roboto" w:cs="Roboto"/>
                 <w:sz w:val="20"/>
               </w:rPr>
-              <w:t>ch. 6, p. 19</w:t>
+              <w:t>ch. 3, p. 8</w:t>
             </w:r>
           </w:p>
         </w:tc>
@@ -21770,7 +23519,7 @@
                 <w:rFonts w:ascii="Roboto" w:hAnsi="Roboto" w:eastAsia="Roboto" w:cs="Roboto"/>
                 <w:sz w:val="20"/>
               </w:rPr>
-              <w:t>Jude 1:1</w:t>
+              <w:t>1 John 4:18</w:t>
             </w:r>
           </w:p>
         </w:tc>
@@ -21787,7 +23536,7 @@
                 <w:rFonts w:ascii="Roboto" w:hAnsi="Roboto" w:eastAsia="Roboto" w:cs="Roboto"/>
                 <w:sz w:val="20"/>
               </w:rPr>
-              <w:t>ch. 6, p. 21</w:t>
+              <w:t>ch. 6, p. 19</w:t>
             </w:r>
           </w:p>
         </w:tc>
@@ -21819,7 +23568,7 @@
                 <w:rFonts w:ascii="Roboto" w:hAnsi="Roboto" w:eastAsia="Roboto" w:cs="Roboto"/>
                 <w:sz w:val="20"/>
               </w:rPr>
-              <w:t>Jude 1:4</w:t>
+              <w:t>Jude 1:1</w:t>
             </w:r>
           </w:p>
         </w:tc>
@@ -21868,7 +23617,7 @@
                 <w:rFonts w:ascii="Roboto" w:hAnsi="Roboto" w:eastAsia="Roboto" w:cs="Roboto"/>
                 <w:sz w:val="20"/>
               </w:rPr>
-              <w:t>Jude 1:5</w:t>
+              <w:t>Jude 1:4</w:t>
             </w:r>
           </w:p>
         </w:tc>
@@ -21897,13 +23646,6 @@
             <w:pPr>
               <w:spacing w:after="0" w:before="0" w:line="259" w:lineRule="auto"/>
             </w:pPr>
-            <w:r>
-              <w:rPr>
-                <w:rFonts w:ascii="Roboto" w:hAnsi="Roboto" w:eastAsia="Roboto" w:cs="Roboto"/>
-                <w:sz w:val="20"/>
-              </w:rPr>
-              <w:t>In full, Appendix B</w:t>
-            </w:r>
           </w:p>
         </w:tc>
       </w:tr>
@@ -21924,7 +23666,7 @@
                 <w:rFonts w:ascii="Roboto" w:hAnsi="Roboto" w:eastAsia="Roboto" w:cs="Roboto"/>
                 <w:sz w:val="20"/>
               </w:rPr>
-              <w:t>Jude 1:6</w:t>
+              <w:t>Jude 1:5</w:t>
             </w:r>
           </w:p>
         </w:tc>
@@ -21980,7 +23722,7 @@
                 <w:rFonts w:ascii="Roboto" w:hAnsi="Roboto" w:eastAsia="Roboto" w:cs="Roboto"/>
                 <w:sz w:val="20"/>
               </w:rPr>
-              <w:t>Jude 1:7</w:t>
+              <w:t>Jude 1:6</w:t>
             </w:r>
           </w:p>
         </w:tc>
@@ -21997,7 +23739,7 @@
                 <w:rFonts w:ascii="Roboto" w:hAnsi="Roboto" w:eastAsia="Roboto" w:cs="Roboto"/>
                 <w:sz w:val="20"/>
               </w:rPr>
-              <w:t>ch. 6, pp. 18, 21, 22, 23; Conclusion, p. 45</w:t>
+              <w:t>ch. 6, p. 21</w:t>
             </w:r>
           </w:p>
         </w:tc>
@@ -22036,7 +23778,7 @@
                 <w:rFonts w:ascii="Roboto" w:hAnsi="Roboto" w:eastAsia="Roboto" w:cs="Roboto"/>
                 <w:sz w:val="20"/>
               </w:rPr>
-              <w:t>Jude 1:13</w:t>
+              <w:t>Jude 1:7</w:t>
             </w:r>
           </w:p>
         </w:tc>
@@ -22053,7 +23795,7 @@
                 <w:rFonts w:ascii="Roboto" w:hAnsi="Roboto" w:eastAsia="Roboto" w:cs="Roboto"/>
                 <w:sz w:val="20"/>
               </w:rPr>
-              <w:t>ch. 6, p. 21</w:t>
+              <w:t>ch. 6, pp. 19, 21, 22, 23; Conclusion, p. 50</w:t>
             </w:r>
           </w:p>
         </w:tc>
@@ -22092,7 +23834,7 @@
                 <w:rFonts w:ascii="Roboto" w:hAnsi="Roboto" w:eastAsia="Roboto" w:cs="Roboto"/>
                 <w:sz w:val="20"/>
               </w:rPr>
-              <w:t>Revelation 1:1</w:t>
+              <w:t>Jude 1:13</w:t>
             </w:r>
           </w:p>
         </w:tc>
@@ -22109,7 +23851,7 @@
                 <w:rFonts w:ascii="Roboto" w:hAnsi="Roboto" w:eastAsia="Roboto" w:cs="Roboto"/>
                 <w:sz w:val="20"/>
               </w:rPr>
-              <w:t>ch. 8, p. 28</w:t>
+              <w:t>ch. 6, p. 22</w:t>
             </w:r>
           </w:p>
         </w:tc>
@@ -22121,6 +23863,13 @@
             <w:pPr>
               <w:spacing w:after="0" w:before="0" w:line="259" w:lineRule="auto"/>
             </w:pPr>
+            <w:r>
+              <w:rPr>
+                <w:rFonts w:ascii="Roboto" w:hAnsi="Roboto" w:eastAsia="Roboto" w:cs="Roboto"/>
+                <w:sz w:val="20"/>
+              </w:rPr>
+              <w:t>In full, Appendix B</w:t>
+            </w:r>
           </w:p>
         </w:tc>
       </w:tr>
@@ -22141,7 +23890,7 @@
                 <w:rFonts w:ascii="Roboto" w:hAnsi="Roboto" w:eastAsia="Roboto" w:cs="Roboto"/>
                 <w:sz w:val="20"/>
               </w:rPr>
-              <w:t>Revelation 1:4</w:t>
+              <w:t>Revelation 1:1</w:t>
             </w:r>
           </w:p>
         </w:tc>
@@ -22190,7 +23939,7 @@
                 <w:rFonts w:ascii="Roboto" w:hAnsi="Roboto" w:eastAsia="Roboto" w:cs="Roboto"/>
                 <w:sz w:val="20"/>
               </w:rPr>
-              <w:t>Revelation 2:11</w:t>
+              <w:t>Revelation 1:4</w:t>
             </w:r>
           </w:p>
         </w:tc>
@@ -22207,7 +23956,7 @@
                 <w:rFonts w:ascii="Roboto" w:hAnsi="Roboto" w:eastAsia="Roboto" w:cs="Roboto"/>
                 <w:sz w:val="20"/>
               </w:rPr>
-              <w:t>ch. 8, p. 32</w:t>
+              <w:t>ch. 8, p. 28</w:t>
             </w:r>
           </w:p>
         </w:tc>
@@ -22239,7 +23988,7 @@
                 <w:rFonts w:ascii="Roboto" w:hAnsi="Roboto" w:eastAsia="Roboto" w:cs="Roboto"/>
                 <w:sz w:val="20"/>
               </w:rPr>
-              <w:t>Revelation 3:5</w:t>
+              <w:t>Revelation 2:11</w:t>
             </w:r>
           </w:p>
         </w:tc>
@@ -22256,7 +24005,7 @@
                 <w:rFonts w:ascii="Roboto" w:hAnsi="Roboto" w:eastAsia="Roboto" w:cs="Roboto"/>
                 <w:sz w:val="20"/>
               </w:rPr>
-              <w:t>ch. 8, p. 36</w:t>
+              <w:t>ch. 8, pp. 32, 36</w:t>
             </w:r>
           </w:p>
         </w:tc>
@@ -22288,7 +24037,7 @@
                 <w:rFonts w:ascii="Roboto" w:hAnsi="Roboto" w:eastAsia="Roboto" w:cs="Roboto"/>
                 <w:sz w:val="20"/>
               </w:rPr>
-              <w:t>Revelation 4:9, 10</w:t>
+              <w:t>Revelation 3:5</w:t>
             </w:r>
           </w:p>
         </w:tc>
@@ -22305,7 +24054,7 @@
                 <w:rFonts w:ascii="Roboto" w:hAnsi="Roboto" w:eastAsia="Roboto" w:cs="Roboto"/>
                 <w:sz w:val="20"/>
               </w:rPr>
-              <w:t>ch. 8, p. 31</w:t>
+              <w:t>ch. 8, p. 40</w:t>
             </w:r>
           </w:p>
         </w:tc>
@@ -22337,7 +24086,7 @@
                 <w:rFonts w:ascii="Roboto" w:hAnsi="Roboto" w:eastAsia="Roboto" w:cs="Roboto"/>
                 <w:sz w:val="20"/>
               </w:rPr>
-              <w:t>Revelation 6:8</w:t>
+              <w:t>Revelation 4:9, 10</w:t>
             </w:r>
           </w:p>
         </w:tc>
@@ -22354,7 +24103,7 @@
                 <w:rFonts w:ascii="Roboto" w:hAnsi="Roboto" w:eastAsia="Roboto" w:cs="Roboto"/>
                 <w:sz w:val="20"/>
               </w:rPr>
-              <w:t>ch. 8, pp. 32, 34</w:t>
+              <w:t>ch. 8, p. 31</w:t>
             </w:r>
           </w:p>
         </w:tc>
@@ -22386,7 +24135,7 @@
                 <w:rFonts w:ascii="Roboto" w:hAnsi="Roboto" w:eastAsia="Roboto" w:cs="Roboto"/>
                 <w:sz w:val="20"/>
               </w:rPr>
-              <w:t>Revelation 9:5</w:t>
+              <w:t>Revelation 6:8</w:t>
             </w:r>
           </w:p>
         </w:tc>
@@ -22403,7 +24152,7 @@
                 <w:rFonts w:ascii="Roboto" w:hAnsi="Roboto" w:eastAsia="Roboto" w:cs="Roboto"/>
                 <w:sz w:val="20"/>
               </w:rPr>
-              <w:t>ch. 8, p. 29</w:t>
+              <w:t>ch. 8, pp. 32, 34</w:t>
             </w:r>
           </w:p>
         </w:tc>
@@ -22435,7 +24184,7 @@
                 <w:rFonts w:ascii="Roboto" w:hAnsi="Roboto" w:eastAsia="Roboto" w:cs="Roboto"/>
                 <w:sz w:val="20"/>
               </w:rPr>
-              <w:t>Revelation 9:5, 6</w:t>
+              <w:t>Revelation 9:5</w:t>
             </w:r>
           </w:p>
         </w:tc>
@@ -22452,7 +24201,7 @@
                 <w:rFonts w:ascii="Roboto" w:hAnsi="Roboto" w:eastAsia="Roboto" w:cs="Roboto"/>
                 <w:sz w:val="20"/>
               </w:rPr>
-              <w:t>ch. 8, p. 30</w:t>
+              <w:t>ch. 8, p. 29</w:t>
             </w:r>
           </w:p>
         </w:tc>
@@ -22484,7 +24233,7 @@
                 <w:rFonts w:ascii="Roboto" w:hAnsi="Roboto" w:eastAsia="Roboto" w:cs="Roboto"/>
                 <w:sz w:val="20"/>
               </w:rPr>
-              <w:t>Revelation 9:6</w:t>
+              <w:t>Revelation 9:5, 6</w:t>
             </w:r>
           </w:p>
         </w:tc>
@@ -22501,7 +24250,7 @@
                 <w:rFonts w:ascii="Roboto" w:hAnsi="Roboto" w:eastAsia="Roboto" w:cs="Roboto"/>
                 <w:sz w:val="20"/>
               </w:rPr>
-              <w:t>ch. 8, p. 29</w:t>
+              <w:t>ch. 8, p. 30</w:t>
             </w:r>
           </w:p>
         </w:tc>
@@ -22533,7 +24282,7 @@
                 <w:rFonts w:ascii="Roboto" w:hAnsi="Roboto" w:eastAsia="Roboto" w:cs="Roboto"/>
                 <w:sz w:val="20"/>
               </w:rPr>
-              <w:t>Revelation 10:6</w:t>
+              <w:t>Revelation 9:6</w:t>
             </w:r>
           </w:p>
         </w:tc>
@@ -22550,7 +24299,7 @@
                 <w:rFonts w:ascii="Roboto" w:hAnsi="Roboto" w:eastAsia="Roboto" w:cs="Roboto"/>
                 <w:sz w:val="20"/>
               </w:rPr>
-              <w:t>ch. 8, p. 31</w:t>
+              <w:t>ch. 8, p. 29</w:t>
             </w:r>
           </w:p>
         </w:tc>
@@ -22582,7 +24331,7 @@
                 <w:rFonts w:ascii="Roboto" w:hAnsi="Roboto" w:eastAsia="Roboto" w:cs="Roboto"/>
                 <w:sz w:val="20"/>
               </w:rPr>
-              <w:t>Revelation 11:10</w:t>
+              <w:t>Revelation 10:6</w:t>
             </w:r>
           </w:p>
         </w:tc>
@@ -22599,7 +24348,7 @@
                 <w:rFonts w:ascii="Roboto" w:hAnsi="Roboto" w:eastAsia="Roboto" w:cs="Roboto"/>
                 <w:sz w:val="20"/>
               </w:rPr>
-              <w:t>ch. 8, pp. 29, 30</w:t>
+              <w:t>ch. 8, p. 31</w:t>
             </w:r>
           </w:p>
         </w:tc>
@@ -22631,7 +24380,7 @@
                 <w:rFonts w:ascii="Roboto" w:hAnsi="Roboto" w:eastAsia="Roboto" w:cs="Roboto"/>
                 <w:sz w:val="20"/>
               </w:rPr>
-              <w:t>Revelation 11:15</w:t>
+              <w:t>Revelation 11:10</w:t>
             </w:r>
           </w:p>
         </w:tc>
@@ -22648,7 +24397,7 @@
                 <w:rFonts w:ascii="Roboto" w:hAnsi="Roboto" w:eastAsia="Roboto" w:cs="Roboto"/>
                 <w:sz w:val="20"/>
               </w:rPr>
-              <w:t>ch. 8, p. 32</w:t>
+              <w:t>ch. 8, pp. 29, 30</w:t>
             </w:r>
           </w:p>
         </w:tc>
@@ -22680,7 +24429,7 @@
                 <w:rFonts w:ascii="Roboto" w:hAnsi="Roboto" w:eastAsia="Roboto" w:cs="Roboto"/>
                 <w:sz w:val="20"/>
               </w:rPr>
-              <w:t>Revelation 14:1</w:t>
+              <w:t>Revelation 11:15</w:t>
             </w:r>
           </w:p>
         </w:tc>
@@ -22697,7 +24446,7 @@
                 <w:rFonts w:ascii="Roboto" w:hAnsi="Roboto" w:eastAsia="Roboto" w:cs="Roboto"/>
                 <w:sz w:val="20"/>
               </w:rPr>
-              <w:t>ch. 8, p. 28</w:t>
+              <w:t>ch. 8, p. 32</w:t>
             </w:r>
           </w:p>
         </w:tc>
@@ -22729,7 +24478,7 @@
                 <w:rFonts w:ascii="Roboto" w:hAnsi="Roboto" w:eastAsia="Roboto" w:cs="Roboto"/>
                 <w:sz w:val="20"/>
               </w:rPr>
-              <w:t>Revelation 14:6</w:t>
+              <w:t>Revelation 13:18</w:t>
             </w:r>
           </w:p>
         </w:tc>
@@ -22746,7 +24495,7 @@
                 <w:rFonts w:ascii="Roboto" w:hAnsi="Roboto" w:eastAsia="Roboto" w:cs="Roboto"/>
                 <w:sz w:val="20"/>
               </w:rPr>
-              <w:t>ch. 8, p. 28</w:t>
+              <w:t>ch. 8, p. 35</w:t>
             </w:r>
           </w:p>
         </w:tc>
@@ -22758,13 +24507,6 @@
             <w:pPr>
               <w:spacing w:after="0" w:before="0" w:line="259" w:lineRule="auto"/>
             </w:pPr>
-            <w:r>
-              <w:rPr>
-                <w:rFonts w:ascii="Roboto" w:hAnsi="Roboto" w:eastAsia="Roboto" w:cs="Roboto"/>
-                <w:sz w:val="20"/>
-              </w:rPr>
-              <w:t>In full, Appendix B</w:t>
-            </w:r>
           </w:p>
         </w:tc>
       </w:tr>
@@ -22785,7 +24527,7 @@
                 <w:rFonts w:ascii="Roboto" w:hAnsi="Roboto" w:eastAsia="Roboto" w:cs="Roboto"/>
                 <w:sz w:val="20"/>
               </w:rPr>
-              <w:t>Revelation 14:9–11</w:t>
+              <w:t>Revelation 14:1</w:t>
             </w:r>
           </w:p>
         </w:tc>
@@ -22802,7 +24544,7 @@
                 <w:rFonts w:ascii="Roboto" w:hAnsi="Roboto" w:eastAsia="Roboto" w:cs="Roboto"/>
                 <w:sz w:val="20"/>
               </w:rPr>
-              <w:t>ch. 8, pp. 28, 29, 37</w:t>
+              <w:t>ch. 8, p. 28</w:t>
             </w:r>
           </w:p>
         </w:tc>
@@ -22814,13 +24556,6 @@
             <w:pPr>
               <w:spacing w:after="0" w:before="0" w:line="259" w:lineRule="auto"/>
             </w:pPr>
-            <w:r>
-              <w:rPr>
-                <w:rFonts w:ascii="Roboto" w:hAnsi="Roboto" w:eastAsia="Roboto" w:cs="Roboto"/>
-                <w:sz w:val="20"/>
-              </w:rPr>
-              <w:t>In full, Appendix B</w:t>
-            </w:r>
           </w:p>
         </w:tc>
       </w:tr>
@@ -22841,7 +24576,7 @@
                 <w:rFonts w:ascii="Roboto" w:hAnsi="Roboto" w:eastAsia="Roboto" w:cs="Roboto"/>
                 <w:sz w:val="20"/>
               </w:rPr>
-              <w:t>Revelation 14:10, 11</w:t>
+              <w:t>Revelation 14:6</w:t>
             </w:r>
           </w:p>
         </w:tc>
@@ -22858,7 +24593,7 @@
                 <w:rFonts w:ascii="Roboto" w:hAnsi="Roboto" w:eastAsia="Roboto" w:cs="Roboto"/>
                 <w:sz w:val="20"/>
               </w:rPr>
-              <w:t>ch. 2, p. 5; ch. 8, p. 30; ch. 9, p. 39</w:t>
+              <w:t>ch. 8, p. 29</w:t>
             </w:r>
           </w:p>
         </w:tc>
@@ -22897,7 +24632,7 @@
                 <w:rFonts w:ascii="Roboto" w:hAnsi="Roboto" w:eastAsia="Roboto" w:cs="Roboto"/>
                 <w:sz w:val="20"/>
               </w:rPr>
-              <w:t>Revelation 14:11</w:t>
+              <w:t>Revelation 14:9–11</w:t>
             </w:r>
           </w:p>
         </w:tc>
@@ -22914,7 +24649,7 @@
                 <w:rFonts w:ascii="Roboto" w:hAnsi="Roboto" w:eastAsia="Roboto" w:cs="Roboto"/>
                 <w:sz w:val="20"/>
               </w:rPr>
-              <w:t>ch. 8, p. 31; ch. 9, p. 40</w:t>
+              <w:t>ch. 8, pp. 28, 29, 35, 36, 42</w:t>
             </w:r>
           </w:p>
         </w:tc>
@@ -22953,7 +24688,7 @@
                 <w:rFonts w:ascii="Roboto" w:hAnsi="Roboto" w:eastAsia="Roboto" w:cs="Roboto"/>
                 <w:sz w:val="20"/>
               </w:rPr>
-              <w:t>Revelation 14:13</w:t>
+              <w:t>Revelation 14:10, 11</w:t>
             </w:r>
           </w:p>
         </w:tc>
@@ -22970,7 +24705,7 @@
                 <w:rFonts w:ascii="Roboto" w:hAnsi="Roboto" w:eastAsia="Roboto" w:cs="Roboto"/>
                 <w:sz w:val="20"/>
               </w:rPr>
-              <w:t>ch. 8, p. 29</w:t>
+              <w:t>ch. 2, p. 5; ch. 8, p. 30; ch. 9, p. 44</w:t>
             </w:r>
           </w:p>
         </w:tc>
@@ -23009,7 +24744,7 @@
                 <w:rFonts w:ascii="Roboto" w:hAnsi="Roboto" w:eastAsia="Roboto" w:cs="Roboto"/>
                 <w:sz w:val="20"/>
               </w:rPr>
-              <w:t>Revelation 16:7</w:t>
+              <w:t>Revelation 14:11</w:t>
             </w:r>
           </w:p>
         </w:tc>
@@ -23026,7 +24761,7 @@
                 <w:rFonts w:ascii="Roboto" w:hAnsi="Roboto" w:eastAsia="Roboto" w:cs="Roboto"/>
                 <w:sz w:val="20"/>
               </w:rPr>
-              <w:t>ch. 9, p. 41</w:t>
+              <w:t>ch. 8, p. 31; ch. 9, p. 45</w:t>
             </w:r>
           </w:p>
         </w:tc>
@@ -23038,6 +24773,13 @@
             <w:pPr>
               <w:spacing w:after="0" w:before="0" w:line="259" w:lineRule="auto"/>
             </w:pPr>
+            <w:r>
+              <w:rPr>
+                <w:rFonts w:ascii="Roboto" w:hAnsi="Roboto" w:eastAsia="Roboto" w:cs="Roboto"/>
+                <w:sz w:val="20"/>
+              </w:rPr>
+              <w:t>In full, Appendix B</w:t>
+            </w:r>
           </w:p>
         </w:tc>
       </w:tr>
@@ -23058,7 +24800,7 @@
                 <w:rFonts w:ascii="Roboto" w:hAnsi="Roboto" w:eastAsia="Roboto" w:cs="Roboto"/>
                 <w:sz w:val="20"/>
               </w:rPr>
-              <w:t>Revelation 16:10, 11</w:t>
+              <w:t>Revelation 14:13</w:t>
             </w:r>
           </w:p>
         </w:tc>
@@ -23075,7 +24817,7 @@
                 <w:rFonts w:ascii="Roboto" w:hAnsi="Roboto" w:eastAsia="Roboto" w:cs="Roboto"/>
                 <w:sz w:val="20"/>
               </w:rPr>
-              <w:t>ch. 8, pp. 29, 31</w:t>
+              <w:t>ch. 8, p. 29</w:t>
             </w:r>
           </w:p>
         </w:tc>
@@ -23087,6 +24829,13 @@
             <w:pPr>
               <w:spacing w:after="0" w:before="0" w:line="259" w:lineRule="auto"/>
             </w:pPr>
+            <w:r>
+              <w:rPr>
+                <w:rFonts w:ascii="Roboto" w:hAnsi="Roboto" w:eastAsia="Roboto" w:cs="Roboto"/>
+                <w:sz w:val="20"/>
+              </w:rPr>
+              <w:t>In full, Appendix B</w:t>
+            </w:r>
           </w:p>
         </w:tc>
       </w:tr>
@@ -23107,7 +24856,7 @@
                 <w:rFonts w:ascii="Roboto" w:hAnsi="Roboto" w:eastAsia="Roboto" w:cs="Roboto"/>
                 <w:sz w:val="20"/>
               </w:rPr>
-              <w:t>Revelation 19:2</w:t>
+              <w:t>Revelation 16:7</w:t>
             </w:r>
           </w:p>
         </w:tc>
@@ -23124,7 +24873,7 @@
                 <w:rFonts w:ascii="Roboto" w:hAnsi="Roboto" w:eastAsia="Roboto" w:cs="Roboto"/>
                 <w:sz w:val="20"/>
               </w:rPr>
-              <w:t>ch. 9, p. 41</w:t>
+              <w:t>ch. 9, p. 46</w:t>
             </w:r>
           </w:p>
         </w:tc>
@@ -23156,7 +24905,7 @@
                 <w:rFonts w:ascii="Roboto" w:hAnsi="Roboto" w:eastAsia="Roboto" w:cs="Roboto"/>
                 <w:sz w:val="20"/>
               </w:rPr>
-              <w:t>Revelation 19:3</w:t>
+              <w:t>Revelation 16:10, 11</w:t>
             </w:r>
           </w:p>
         </w:tc>
@@ -23173,7 +24922,7 @@
                 <w:rFonts w:ascii="Roboto" w:hAnsi="Roboto" w:eastAsia="Roboto" w:cs="Roboto"/>
                 <w:sz w:val="20"/>
               </w:rPr>
-              <w:t>ch. 8, p. 29; ch. 9, pp. 40, 41, 43</w:t>
+              <w:t>ch. 8, pp. 29, 31</w:t>
             </w:r>
           </w:p>
         </w:tc>
@@ -23205,7 +24954,7 @@
                 <w:rFonts w:ascii="Roboto" w:hAnsi="Roboto" w:eastAsia="Roboto" w:cs="Roboto"/>
                 <w:sz w:val="20"/>
               </w:rPr>
-              <w:t>Revelation 19:20</w:t>
+              <w:t>Revelation 19:2</w:t>
             </w:r>
           </w:p>
         </w:tc>
@@ -23222,7 +24971,7 @@
                 <w:rFonts w:ascii="Roboto" w:hAnsi="Roboto" w:eastAsia="Roboto" w:cs="Roboto"/>
                 <w:sz w:val="20"/>
               </w:rPr>
-              <w:t>ch. 8, pp. 31, 32, 33</w:t>
+              <w:t>ch. 9, p. 46</w:t>
             </w:r>
           </w:p>
         </w:tc>
@@ -23234,13 +24983,6 @@
             <w:pPr>
               <w:spacing w:after="0" w:before="0" w:line="259" w:lineRule="auto"/>
             </w:pPr>
-            <w:r>
-              <w:rPr>
-                <w:rFonts w:ascii="Roboto" w:hAnsi="Roboto" w:eastAsia="Roboto" w:cs="Roboto"/>
-                <w:sz w:val="20"/>
-              </w:rPr>
-              <w:t>In full, Appendix B</w:t>
-            </w:r>
           </w:p>
         </w:tc>
       </w:tr>
@@ -23261,7 +25003,7 @@
                 <w:rFonts w:ascii="Roboto" w:hAnsi="Roboto" w:eastAsia="Roboto" w:cs="Roboto"/>
                 <w:sz w:val="20"/>
               </w:rPr>
-              <w:t>Revelation 19:21</w:t>
+              <w:t>Revelation 19:3</w:t>
             </w:r>
           </w:p>
         </w:tc>
@@ -23278,7 +25020,7 @@
                 <w:rFonts w:ascii="Roboto" w:hAnsi="Roboto" w:eastAsia="Roboto" w:cs="Roboto"/>
                 <w:sz w:val="20"/>
               </w:rPr>
-              <w:t>ch. 8, p. 31</w:t>
+              <w:t>ch. 8, p. 29; ch. 9, pp. 45, 48</w:t>
             </w:r>
           </w:p>
         </w:tc>
@@ -23290,13 +25032,6 @@
             <w:pPr>
               <w:spacing w:after="0" w:before="0" w:line="259" w:lineRule="auto"/>
             </w:pPr>
-            <w:r>
-              <w:rPr>
-                <w:rFonts w:ascii="Roboto" w:hAnsi="Roboto" w:eastAsia="Roboto" w:cs="Roboto"/>
-                <w:sz w:val="20"/>
-              </w:rPr>
-              <w:t>In full, Appendix B</w:t>
-            </w:r>
           </w:p>
         </w:tc>
       </w:tr>
@@ -23317,7 +25052,7 @@
                 <w:rFonts w:ascii="Roboto" w:hAnsi="Roboto" w:eastAsia="Roboto" w:cs="Roboto"/>
                 <w:sz w:val="20"/>
               </w:rPr>
-              <w:t>Revelation 20:1–3</w:t>
+              <w:t>Revelation 19:20</w:t>
             </w:r>
           </w:p>
         </w:tc>
@@ -23334,7 +25069,7 @@
                 <w:rFonts w:ascii="Roboto" w:hAnsi="Roboto" w:eastAsia="Roboto" w:cs="Roboto"/>
                 <w:sz w:val="20"/>
               </w:rPr>
-              <w:t>ch. 8, p. 31</w:t>
+              <w:t>ch. 8, pp. 31, 32, 33, 34</w:t>
             </w:r>
           </w:p>
         </w:tc>
@@ -23373,7 +25108,7 @@
                 <w:rFonts w:ascii="Roboto" w:hAnsi="Roboto" w:eastAsia="Roboto" w:cs="Roboto"/>
                 <w:sz w:val="20"/>
               </w:rPr>
-              <w:t>Revelation 20:6</w:t>
+              <w:t>Revelation 19:21</w:t>
             </w:r>
           </w:p>
         </w:tc>
@@ -23390,7 +25125,7 @@
                 <w:rFonts w:ascii="Roboto" w:hAnsi="Roboto" w:eastAsia="Roboto" w:cs="Roboto"/>
                 <w:sz w:val="20"/>
               </w:rPr>
-              <w:t>ch. 8, pp. 32, 35, 37</w:t>
+              <w:t>ch. 8, p. 31</w:t>
             </w:r>
           </w:p>
         </w:tc>
@@ -23429,7 +25164,7 @@
                 <w:rFonts w:ascii="Roboto" w:hAnsi="Roboto" w:eastAsia="Roboto" w:cs="Roboto"/>
                 <w:sz w:val="20"/>
               </w:rPr>
-              <w:t>Revelation 20:7–9</w:t>
+              <w:t>Revelation 20:1–3</w:t>
             </w:r>
           </w:p>
         </w:tc>
@@ -23485,7 +25220,7 @@
                 <w:rFonts w:ascii="Roboto" w:hAnsi="Roboto" w:eastAsia="Roboto" w:cs="Roboto"/>
                 <w:sz w:val="20"/>
               </w:rPr>
-              <w:t>Revelation 20:8, 9</w:t>
+              <w:t>Revelation 20:6</w:t>
             </w:r>
           </w:p>
         </w:tc>
@@ -23502,7 +25237,7 @@
                 <w:rFonts w:ascii="Roboto" w:hAnsi="Roboto" w:eastAsia="Roboto" w:cs="Roboto"/>
                 <w:sz w:val="20"/>
               </w:rPr>
-              <w:t>ch. 8, p. 36</w:t>
+              <w:t>ch. 8, pp. 32, 36, 40, 42</w:t>
             </w:r>
           </w:p>
         </w:tc>
@@ -23541,7 +25276,7 @@
                 <w:rFonts w:ascii="Roboto" w:hAnsi="Roboto" w:eastAsia="Roboto" w:cs="Roboto"/>
                 <w:sz w:val="20"/>
               </w:rPr>
-              <w:t>Revelation 20:9</w:t>
+              <w:t>Revelation 20:7–9</w:t>
             </w:r>
           </w:p>
         </w:tc>
@@ -23558,7 +25293,7 @@
                 <w:rFonts w:ascii="Roboto" w:hAnsi="Roboto" w:eastAsia="Roboto" w:cs="Roboto"/>
                 <w:sz w:val="20"/>
               </w:rPr>
-              <w:t>ch. 9, p. 42</w:t>
+              <w:t>ch. 8, p. 31</w:t>
             </w:r>
           </w:p>
         </w:tc>
@@ -23597,7 +25332,7 @@
                 <w:rFonts w:ascii="Roboto" w:hAnsi="Roboto" w:eastAsia="Roboto" w:cs="Roboto"/>
                 <w:sz w:val="20"/>
               </w:rPr>
-              <w:t>Revelation 20:10</w:t>
+              <w:t>Revelation 20:8, 9</w:t>
             </w:r>
           </w:p>
         </w:tc>
@@ -23614,7 +25349,7 @@
                 <w:rFonts w:ascii="Roboto" w:hAnsi="Roboto" w:eastAsia="Roboto" w:cs="Roboto"/>
                 <w:sz w:val="20"/>
               </w:rPr>
-              <w:t>ch. 2, p. 5; ch. 6, p. 20; ch. 8, pp. 29, 30, 31, 32, 33, 37; ch. 9, pp. 39, 40, 41, 43</w:t>
+              <w:t>ch. 8, p. 40</w:t>
             </w:r>
           </w:p>
         </w:tc>
@@ -23653,7 +25388,7 @@
                 <w:rFonts w:ascii="Roboto" w:hAnsi="Roboto" w:eastAsia="Roboto" w:cs="Roboto"/>
                 <w:sz w:val="20"/>
               </w:rPr>
-              <w:t>Revelation 20:10, 14</w:t>
+              <w:t>Revelation 20:9</w:t>
             </w:r>
           </w:p>
         </w:tc>
@@ -23670,7 +25405,7 @@
                 <w:rFonts w:ascii="Roboto" w:hAnsi="Roboto" w:eastAsia="Roboto" w:cs="Roboto"/>
                 <w:sz w:val="20"/>
               </w:rPr>
-              <w:t>ch. 8, p. 34</w:t>
+              <w:t>ch. 9, p. 47</w:t>
             </w:r>
           </w:p>
         </w:tc>
@@ -23709,7 +25444,7 @@
                 <w:rFonts w:ascii="Roboto" w:hAnsi="Roboto" w:eastAsia="Roboto" w:cs="Roboto"/>
                 <w:sz w:val="20"/>
               </w:rPr>
-              <w:t>Revelation 20:11</w:t>
+              <w:t>Revelation 20:10</w:t>
             </w:r>
           </w:p>
         </w:tc>
@@ -23726,7 +25461,7 @@
                 <w:rFonts w:ascii="Roboto" w:hAnsi="Roboto" w:eastAsia="Roboto" w:cs="Roboto"/>
                 <w:sz w:val="20"/>
               </w:rPr>
-              <w:t>ch. 5, p. 17; ch. 8, p. 34</w:t>
+              <w:t>ch. 2, p. 5; ch. 6, p. 21; ch. 8, pp. 29, 30, 31, 32, 33, 34, 35, 36, 37, 42; ch. 9, pp. 44, 45</w:t>
             </w:r>
           </w:p>
         </w:tc>
@@ -23765,7 +25500,7 @@
                 <w:rFonts w:ascii="Roboto" w:hAnsi="Roboto" w:eastAsia="Roboto" w:cs="Roboto"/>
                 <w:sz w:val="20"/>
               </w:rPr>
-              <w:t>Revelation 20:11–15</w:t>
+              <w:t>Revelation 20:10, 14</w:t>
             </w:r>
           </w:p>
         </w:tc>
@@ -23782,7 +25517,7 @@
                 <w:rFonts w:ascii="Roboto" w:hAnsi="Roboto" w:eastAsia="Roboto" w:cs="Roboto"/>
                 <w:sz w:val="20"/>
               </w:rPr>
-              <w:t>ch. 2, p. 5; ch. 8, p. 34</w:t>
+              <w:t>ch. 8, p. 34</w:t>
             </w:r>
           </w:p>
         </w:tc>
@@ -23821,7 +25556,7 @@
                 <w:rFonts w:ascii="Roboto" w:hAnsi="Roboto" w:eastAsia="Roboto" w:cs="Roboto"/>
                 <w:sz w:val="20"/>
               </w:rPr>
-              <w:t>Revelation 20:12</w:t>
+              <w:t>Revelation 20:11</w:t>
             </w:r>
           </w:p>
         </w:tc>
@@ -23838,7 +25573,7 @@
                 <w:rFonts w:ascii="Roboto" w:hAnsi="Roboto" w:eastAsia="Roboto" w:cs="Roboto"/>
                 <w:sz w:val="20"/>
               </w:rPr>
-              <w:t>ch. 8, pp. 33, 34, 35, 36</w:t>
+              <w:t>ch. 5, p. 17; ch. 8, p. 38</w:t>
             </w:r>
           </w:p>
         </w:tc>
@@ -23877,7 +25612,7 @@
                 <w:rFonts w:ascii="Roboto" w:hAnsi="Roboto" w:eastAsia="Roboto" w:cs="Roboto"/>
                 <w:sz w:val="20"/>
               </w:rPr>
-              <w:t>Revelation 20:12, 13</w:t>
+              <w:t>Revelation 20:11–15</w:t>
             </w:r>
           </w:p>
         </w:tc>
@@ -23894,7 +25629,7 @@
                 <w:rFonts w:ascii="Roboto" w:hAnsi="Roboto" w:eastAsia="Roboto" w:cs="Roboto"/>
                 <w:sz w:val="20"/>
               </w:rPr>
-              <w:t>ch. 8, p. 34</w:t>
+              <w:t>ch. 2, p. 5; ch. 8, p. 38</w:t>
             </w:r>
           </w:p>
         </w:tc>
@@ -23933,7 +25668,7 @@
                 <w:rFonts w:ascii="Roboto" w:hAnsi="Roboto" w:eastAsia="Roboto" w:cs="Roboto"/>
                 <w:sz w:val="20"/>
               </w:rPr>
-              <w:t>Revelation 20:12–14</w:t>
+              <w:t>Revelation 20:12</w:t>
             </w:r>
           </w:p>
         </w:tc>
@@ -23950,7 +25685,7 @@
                 <w:rFonts w:ascii="Roboto" w:hAnsi="Roboto" w:eastAsia="Roboto" w:cs="Roboto"/>
                 <w:sz w:val="20"/>
               </w:rPr>
-              <w:t>ch. 8, p. 34</w:t>
+              <w:t>ch. 8, pp. 33, 38, 39, 40</w:t>
             </w:r>
           </w:p>
         </w:tc>
@@ -23989,7 +25724,7 @@
                 <w:rFonts w:ascii="Roboto" w:hAnsi="Roboto" w:eastAsia="Roboto" w:cs="Roboto"/>
                 <w:sz w:val="20"/>
               </w:rPr>
-              <w:t>Revelation 20:13</w:t>
+              <w:t>Revelation 20:12, 13</w:t>
             </w:r>
           </w:p>
         </w:tc>
@@ -24006,7 +25741,7 @@
                 <w:rFonts w:ascii="Roboto" w:hAnsi="Roboto" w:eastAsia="Roboto" w:cs="Roboto"/>
                 <w:sz w:val="20"/>
               </w:rPr>
-              <w:t>ch. 8, pp. 33, 34</w:t>
+              <w:t>ch. 8, p. 34</w:t>
             </w:r>
           </w:p>
         </w:tc>
@@ -24045,7 +25780,7 @@
                 <w:rFonts w:ascii="Roboto" w:hAnsi="Roboto" w:eastAsia="Roboto" w:cs="Roboto"/>
                 <w:sz w:val="20"/>
               </w:rPr>
-              <w:t>Revelation 20:14</w:t>
+              <w:t>Revelation 20:12–14</w:t>
             </w:r>
           </w:p>
         </w:tc>
@@ -24062,7 +25797,7 @@
                 <w:rFonts w:ascii="Roboto" w:hAnsi="Roboto" w:eastAsia="Roboto" w:cs="Roboto"/>
                 <w:sz w:val="20"/>
               </w:rPr>
-              <w:t>ch. 2, p. 5; ch. 8, pp. 32, 33, 35</w:t>
+              <w:t>ch. 8, p. 34</w:t>
             </w:r>
           </w:p>
         </w:tc>
@@ -24101,7 +25836,7 @@
                 <w:rFonts w:ascii="Roboto" w:hAnsi="Roboto" w:eastAsia="Roboto" w:cs="Roboto"/>
                 <w:sz w:val="20"/>
               </w:rPr>
-              <w:t>Revelation 20:14, 15</w:t>
+              <w:t>Revelation 20:13</w:t>
             </w:r>
           </w:p>
         </w:tc>
@@ -24118,7 +25853,7 @@
                 <w:rFonts w:ascii="Roboto" w:hAnsi="Roboto" w:eastAsia="Roboto" w:cs="Roboto"/>
                 <w:sz w:val="20"/>
               </w:rPr>
-              <w:t>ch. 8, p. 34</w:t>
+              <w:t>ch. 8, pp. 33, 38</w:t>
             </w:r>
           </w:p>
         </w:tc>
@@ -24157,7 +25892,7 @@
                 <w:rFonts w:ascii="Roboto" w:hAnsi="Roboto" w:eastAsia="Roboto" w:cs="Roboto"/>
                 <w:sz w:val="20"/>
               </w:rPr>
-              <w:t>Revelation 20:15</w:t>
+              <w:t>Revelation 20:14</w:t>
             </w:r>
           </w:p>
         </w:tc>
@@ -24174,7 +25909,7 @@
                 <w:rFonts w:ascii="Roboto" w:hAnsi="Roboto" w:eastAsia="Roboto" w:cs="Roboto"/>
                 <w:sz w:val="20"/>
               </w:rPr>
-              <w:t>ch. 8, pp. 32, 36</w:t>
+              <w:t>ch. 2, p. 5; ch. 8, pp. 32, 33, 34, 40</w:t>
             </w:r>
           </w:p>
         </w:tc>
@@ -24213,7 +25948,7 @@
                 <w:rFonts w:ascii="Roboto" w:hAnsi="Roboto" w:eastAsia="Roboto" w:cs="Roboto"/>
                 <w:sz w:val="20"/>
               </w:rPr>
-              <w:t>Revelation 21:4</w:t>
+              <w:t>Revelation 20:14, 15</w:t>
             </w:r>
           </w:p>
         </w:tc>
@@ -24230,7 +25965,7 @@
                 <w:rFonts w:ascii="Roboto" w:hAnsi="Roboto" w:eastAsia="Roboto" w:cs="Roboto"/>
                 <w:sz w:val="20"/>
               </w:rPr>
-              <w:t>ch. 8, p. 33</w:t>
+              <w:t>ch. 8, p. 38</w:t>
             </w:r>
           </w:p>
         </w:tc>
@@ -24269,7 +26004,7 @@
                 <w:rFonts w:ascii="Roboto" w:hAnsi="Roboto" w:eastAsia="Roboto" w:cs="Roboto"/>
                 <w:sz w:val="20"/>
               </w:rPr>
-              <w:t>Revelation 21:8</w:t>
+              <w:t>Revelation 20:15</w:t>
             </w:r>
           </w:p>
         </w:tc>
@@ -24286,7 +26021,7 @@
                 <w:rFonts w:ascii="Roboto" w:hAnsi="Roboto" w:eastAsia="Roboto" w:cs="Roboto"/>
                 <w:sz w:val="20"/>
               </w:rPr>
-              <w:t>ch. 2, p. 5; ch. 8, pp. 32, 33, 34</w:t>
+              <w:t>ch. 8, pp. 32, 35, 36, 37, 40; ch. 9, p. 45</w:t>
             </w:r>
           </w:p>
         </w:tc>
@@ -24325,7 +26060,7 @@
                 <w:rFonts w:ascii="Roboto" w:hAnsi="Roboto" w:eastAsia="Roboto" w:cs="Roboto"/>
                 <w:sz w:val="20"/>
               </w:rPr>
-              <w:t>Revelation 21:24</w:t>
+              <w:t>Revelation 21:4</w:t>
             </w:r>
           </w:p>
         </w:tc>
@@ -24342,7 +26077,7 @@
                 <w:rFonts w:ascii="Roboto" w:hAnsi="Roboto" w:eastAsia="Roboto" w:cs="Roboto"/>
                 <w:sz w:val="20"/>
               </w:rPr>
-              <w:t>ch. 8, p. 36</w:t>
+              <w:t>ch. 8, p. 33</w:t>
             </w:r>
           </w:p>
         </w:tc>
@@ -24354,6 +26089,13 @@
             <w:pPr>
               <w:spacing w:after="0" w:before="0" w:line="259" w:lineRule="auto"/>
             </w:pPr>
+            <w:r>
+              <w:rPr>
+                <w:rFonts w:ascii="Roboto" w:hAnsi="Roboto" w:eastAsia="Roboto" w:cs="Roboto"/>
+                <w:sz w:val="20"/>
+              </w:rPr>
+              <w:t>In full, Appendix B</w:t>
+            </w:r>
           </w:p>
         </w:tc>
       </w:tr>
@@ -24374,6 +26116,111 @@
                 <w:rFonts w:ascii="Roboto" w:hAnsi="Roboto" w:eastAsia="Roboto" w:cs="Roboto"/>
                 <w:sz w:val="20"/>
               </w:rPr>
+              <w:t>Revelation 21:8</w:t>
+            </w:r>
+          </w:p>
+        </w:tc>
+        <w:tc>
+          <w:tcPr>
+            <w:tcW w:w="3808" w:type="dxa"/>
+          </w:tcPr>
+          <w:p>
+            <w:pPr>
+              <w:spacing w:after="0" w:before="0" w:line="259" w:lineRule="auto"/>
+            </w:pPr>
+            <w:r>
+              <w:rPr>
+                <w:rFonts w:ascii="Roboto" w:hAnsi="Roboto" w:eastAsia="Roboto" w:cs="Roboto"/>
+                <w:sz w:val="20"/>
+              </w:rPr>
+              <w:t>ch. 2, p. 5; ch. 8, pp. 32, 33, 34, 35</w:t>
+            </w:r>
+          </w:p>
+        </w:tc>
+        <w:tc>
+          <w:tcPr>
+            <w:tcW w:w="1903" w:type="dxa"/>
+          </w:tcPr>
+          <w:p>
+            <w:pPr>
+              <w:spacing w:after="0" w:before="0" w:line="259" w:lineRule="auto"/>
+            </w:pPr>
+            <w:r>
+              <w:rPr>
+                <w:rFonts w:ascii="Roboto" w:hAnsi="Roboto" w:eastAsia="Roboto" w:cs="Roboto"/>
+                <w:sz w:val="20"/>
+              </w:rPr>
+              <w:t>In full, Appendix B</w:t>
+            </w:r>
+          </w:p>
+        </w:tc>
+      </w:tr>
+      <w:tr>
+        <w:trPr>
+          <w:cantSplit/>
+        </w:trPr>
+        <w:tc>
+          <w:tcPr>
+            <w:tcW w:w="1904" w:type="dxa"/>
+          </w:tcPr>
+          <w:p>
+            <w:pPr>
+              <w:spacing w:after="0" w:before="0" w:line="259" w:lineRule="auto"/>
+            </w:pPr>
+            <w:r>
+              <w:rPr>
+                <w:rFonts w:ascii="Roboto" w:hAnsi="Roboto" w:eastAsia="Roboto" w:cs="Roboto"/>
+                <w:sz w:val="20"/>
+              </w:rPr>
+              <w:t>Revelation 21:24</w:t>
+            </w:r>
+          </w:p>
+        </w:tc>
+        <w:tc>
+          <w:tcPr>
+            <w:tcW w:w="3808" w:type="dxa"/>
+          </w:tcPr>
+          <w:p>
+            <w:pPr>
+              <w:spacing w:after="0" w:before="0" w:line="259" w:lineRule="auto"/>
+            </w:pPr>
+            <w:r>
+              <w:rPr>
+                <w:rFonts w:ascii="Roboto" w:hAnsi="Roboto" w:eastAsia="Roboto" w:cs="Roboto"/>
+                <w:sz w:val="20"/>
+              </w:rPr>
+              <w:t>ch. 8, p. 41</w:t>
+            </w:r>
+          </w:p>
+        </w:tc>
+        <w:tc>
+          <w:tcPr>
+            <w:tcW w:w="1903" w:type="dxa"/>
+          </w:tcPr>
+          <w:p>
+            <w:pPr>
+              <w:spacing w:after="0" w:before="0" w:line="259" w:lineRule="auto"/>
+            </w:pPr>
+          </w:p>
+        </w:tc>
+      </w:tr>
+      <w:tr>
+        <w:trPr>
+          <w:cantSplit/>
+        </w:trPr>
+        <w:tc>
+          <w:tcPr>
+            <w:tcW w:w="1904" w:type="dxa"/>
+          </w:tcPr>
+          <w:p>
+            <w:pPr>
+              <w:spacing w:after="0" w:before="0" w:line="259" w:lineRule="auto"/>
+            </w:pPr>
+            <w:r>
+              <w:rPr>
+                <w:rFonts w:ascii="Roboto" w:hAnsi="Roboto" w:eastAsia="Roboto" w:cs="Roboto"/>
+                <w:sz w:val="20"/>
+              </w:rPr>
               <w:t>Revelation 21:27</w:t>
             </w:r>
           </w:p>
@@ -24391,7 +26238,7 @@
                 <w:rFonts w:ascii="Roboto" w:hAnsi="Roboto" w:eastAsia="Roboto" w:cs="Roboto"/>
                 <w:sz w:val="20"/>
               </w:rPr>
-              <w:t>ch. 8, pp. 33, 36</w:t>
+              <w:t>ch. 8, pp. 33, 36, 40</w:t>
             </w:r>
           </w:p>
         </w:tc>

</xml_diff>

<commit_message>
The End of the Lost: Greek wording refinements in 8.4, previews re-rendered; Rule 38 Objection-and-Reply Standard (Master Standard v1.177, CLAUDE.md)
Co-Authored-By: Claude Sonnet 5.5 <noreply@anthropic.com>
Claude-Session: https://claude.ai/code/session_019KSmWUdVBWY1ogjaJqRPqC
</commit_message>
<xml_diff>
--- a/build-tools/commentary/endoflost/out/volume.docx
+++ b/build-tools/commentary/endoflost/out/volume.docx
@@ -9932,7 +9932,7 @@
           <w:rFonts w:ascii="Roboto" w:hAnsi="Roboto" w:eastAsia="Roboto" w:cs="Roboto"/>
           <w:sz w:val="20"/>
         </w:rPr>
-        <w:t>Four things in the table are Stated. The pair “fire and brimstone” stands in 19:20, 20:10 and 21:8. The word “lake” is the name in every passage, and the Greek names it with the definite article in each of the four later places, as the one already introduced. The verb of casting is the same Greek verb in 19:20, 20:10, 20:14 and 20:15, so that the beast and the false prophet, the devil, Death and Hell, and the human dead are all said to have been cast into it in the same word. And the identification “This is the second death” in 20:14 and “which is the second death” in 21:8 is one identification made twice. That these are one lake and not different punishments with similar imagery is shown by the repetition: the book introduces no second lake, no second fire and no second name, and it never marks a change of place between one passage and the next. The unity of the lake is shown by the context and is not Stated in a single sentence.</w:t>
+        <w:t>Four things in the table are Stated. The pair “fire and brimstone” stands in 19:20, 20:10 and 21:8. The word “lake” is the name in every passage, and the Greek names it with the definite article in each of the four later places, as the one already introduced. The article does not by itself prove that the lake is the same; the case rests on the repeated designation and the surrounding context together. Each passage uses an inflected form of the same Greek verb for casting, βάλλω (19:20, 20:10, 20:14 and 20:15), so that the beast and the false prophet, the devil, Death and Hell, and the human dead are all said to have been cast into it by the one verb, in forms that differ only by number and tense. And the identification “This is the second death” in 20:14 and “which is the second death” in 21:8 is one identification made twice. That these are one lake and not different punishments with similar imagery is shown by the repetition: the book introduces no second lake, no second fire and no second name, and it never marks a change of place between one passage and the next. The unity of the lake is shown by the context and is not Stated in a single sentence.</w:t>
       </w:r>
     </w:p>
     <w:p>
@@ -10346,7 +10346,7 @@
           <w:rFonts w:ascii="Roboto" w:hAnsi="Roboto" w:eastAsia="Roboto" w:cs="Roboto"/>
           <w:sz w:val="20"/>
         </w:rPr>
-        <w:t>The two passages use the same verb of torment, the same pair of fire and brimstone, the same “day” and “night” for its continuance and the same “for ever and ever” for its length. The first passage says what happens to human beings and does not name the lake. The second names the lake and says how long the torment in it lasts. That the two passages share these terms is Stated. That they describe one torment, and that the torment of the human worshippers has the length that 20:10 gives to the torment in the lake, is Inferred from the shared terms and from the absence of any second kind of torment in the book. The inference is firm, because the alternative is to hold that Revelation describes two different torments in identical words and gives no sign of the difference. The volume does not read the phrase “for ever and ever” of 14:11 as set on the no-rest clause (section 8.1). It reads it as the smoke’s, and it reads the lasting of the torment itself from 20:10.</w:t>
+        <w:t>The two passages use different inflected forms of the same Greek verb of torment, βασανίζω, the same pair of fire and brimstone, the same “day” and “night” for its continuance and the same “for ever and ever” for its length. The first passage says what happens to human beings and does not name the lake. The second names the lake and says how long the torment in it lasts. That the two passages share these terms is Stated. That they describe one torment, and that the torment of the human worshippers has the length that 20:10 gives to the torment in the lake, is Inferred from the shared terms and from the absence of any second kind of torment in the book. The inference is firm, because the alternative is to hold that Revelation describes two different torments in identical words and gives no sign of the difference. The volume does not read the phrase “for ever and ever” of 14:11 as set on the no-rest clause (section 8.1). It reads it as the smoke’s, and it reads the lasting of the torment itself from 20:10.</w:t>
       </w:r>
     </w:p>
     <w:p>
@@ -20719,7 +20719,7 @@
                 <w:rFonts w:ascii="Roboto" w:hAnsi="Roboto" w:eastAsia="Roboto" w:cs="Roboto"/>
                 <w:sz w:val="20"/>
               </w:rPr>
-              <w:t>Mark 9:43</w:t>
+              <w:t>Mark 9:43, 44</w:t>
             </w:r>
           </w:p>
         </w:tc>
@@ -20736,7 +20736,7 @@
                 <w:rFonts w:ascii="Roboto" w:hAnsi="Roboto" w:eastAsia="Roboto" w:cs="Roboto"/>
                 <w:sz w:val="20"/>
               </w:rPr>
-              <w:t>ch. 9, p. 44</w:t>
+              <w:t>ch. 7, p. 23</w:t>
             </w:r>
           </w:p>
         </w:tc>
@@ -20775,7 +20775,7 @@
                 <w:rFonts w:ascii="Roboto" w:hAnsi="Roboto" w:eastAsia="Roboto" w:cs="Roboto"/>
                 <w:sz w:val="20"/>
               </w:rPr>
-              <w:t>Mark 9:43, 44</w:t>
+              <w:t>Mark 9:43, 48</w:t>
             </w:r>
           </w:p>
         </w:tc>
@@ -20792,7 +20792,7 @@
                 <w:rFonts w:ascii="Roboto" w:hAnsi="Roboto" w:eastAsia="Roboto" w:cs="Roboto"/>
                 <w:sz w:val="20"/>
               </w:rPr>
-              <w:t>ch. 7, p. 23</w:t>
+              <w:t>ch. 9, p. 45</w:t>
             </w:r>
           </w:p>
         </w:tc>
@@ -20831,7 +20831,7 @@
                 <w:rFonts w:ascii="Roboto" w:hAnsi="Roboto" w:eastAsia="Roboto" w:cs="Roboto"/>
                 <w:sz w:val="20"/>
               </w:rPr>
-              <w:t>Mark 9:43, 48</w:t>
+              <w:t>Mark 9:43–48</w:t>
             </w:r>
           </w:p>
         </w:tc>
@@ -20848,7 +20848,7 @@
                 <w:rFonts w:ascii="Roboto" w:hAnsi="Roboto" w:eastAsia="Roboto" w:cs="Roboto"/>
                 <w:sz w:val="20"/>
               </w:rPr>
-              <w:t>ch. 9, p. 44</w:t>
+              <w:t>ch. 7, pp. 27, 28; Conclusion, p. 50</w:t>
             </w:r>
           </w:p>
         </w:tc>
@@ -20887,7 +20887,7 @@
                 <w:rFonts w:ascii="Roboto" w:hAnsi="Roboto" w:eastAsia="Roboto" w:cs="Roboto"/>
                 <w:sz w:val="20"/>
               </w:rPr>
-              <w:t>Mark 9:43–48</w:t>
+              <w:t>Mark 9:48</w:t>
             </w:r>
           </w:p>
         </w:tc>
@@ -20904,7 +20904,7 @@
                 <w:rFonts w:ascii="Roboto" w:hAnsi="Roboto" w:eastAsia="Roboto" w:cs="Roboto"/>
                 <w:sz w:val="20"/>
               </w:rPr>
-              <w:t>ch. 7, pp. 27, 28; Conclusion, p. 50</w:t>
+              <w:t>ch. 7, pp. 24, 25; ch. 9, p. 44</w:t>
             </w:r>
           </w:p>
         </w:tc>
@@ -20943,7 +20943,7 @@
                 <w:rFonts w:ascii="Roboto" w:hAnsi="Roboto" w:eastAsia="Roboto" w:cs="Roboto"/>
                 <w:sz w:val="20"/>
               </w:rPr>
-              <w:t>Mark 9:48</w:t>
+              <w:t>Mark 9:49</w:t>
             </w:r>
           </w:p>
         </w:tc>
@@ -20960,7 +20960,7 @@
                 <w:rFonts w:ascii="Roboto" w:hAnsi="Roboto" w:eastAsia="Roboto" w:cs="Roboto"/>
                 <w:sz w:val="20"/>
               </w:rPr>
-              <w:t>ch. 7, pp. 24, 25; ch. 9, p. 44</w:t>
+              <w:t>ch. 9, p. 44</w:t>
             </w:r>
           </w:p>
         </w:tc>
@@ -20999,7 +20999,7 @@
                 <w:rFonts w:ascii="Roboto" w:hAnsi="Roboto" w:eastAsia="Roboto" w:cs="Roboto"/>
                 <w:sz w:val="20"/>
               </w:rPr>
-              <w:t>Mark 9:49</w:t>
+              <w:t>Mark 14:4</w:t>
             </w:r>
           </w:p>
         </w:tc>
@@ -21016,7 +21016,7 @@
                 <w:rFonts w:ascii="Roboto" w:hAnsi="Roboto" w:eastAsia="Roboto" w:cs="Roboto"/>
                 <w:sz w:val="20"/>
               </w:rPr>
-              <w:t>ch. 9, p. 44</w:t>
+              <w:t>ch. 3, p. 8; ch. 4, p. 13</w:t>
             </w:r>
           </w:p>
         </w:tc>
@@ -21028,13 +21028,6 @@
             <w:pPr>
               <w:spacing w:after="0" w:before="0" w:line="259" w:lineRule="auto"/>
             </w:pPr>
-            <w:r>
-              <w:rPr>
-                <w:rFonts w:ascii="Roboto" w:hAnsi="Roboto" w:eastAsia="Roboto" w:cs="Roboto"/>
-                <w:sz w:val="20"/>
-              </w:rPr>
-              <w:t>In full, Appendix B</w:t>
-            </w:r>
           </w:p>
         </w:tc>
       </w:tr>
@@ -21055,7 +21048,7 @@
                 <w:rFonts w:ascii="Roboto" w:hAnsi="Roboto" w:eastAsia="Roboto" w:cs="Roboto"/>
                 <w:sz w:val="20"/>
               </w:rPr>
-              <w:t>Mark 14:4</w:t>
+              <w:t>Luke 12:1</w:t>
             </w:r>
           </w:p>
         </w:tc>
@@ -21072,7 +21065,7 @@
                 <w:rFonts w:ascii="Roboto" w:hAnsi="Roboto" w:eastAsia="Roboto" w:cs="Roboto"/>
                 <w:sz w:val="20"/>
               </w:rPr>
-              <w:t>ch. 3, p. 8; ch. 4, p. 13</w:t>
+              <w:t>ch. 4, p. 12</w:t>
             </w:r>
           </w:p>
         </w:tc>
@@ -21084,6 +21077,13 @@
             <w:pPr>
               <w:spacing w:after="0" w:before="0" w:line="259" w:lineRule="auto"/>
             </w:pPr>
+            <w:r>
+              <w:rPr>
+                <w:rFonts w:ascii="Roboto" w:hAnsi="Roboto" w:eastAsia="Roboto" w:cs="Roboto"/>
+                <w:sz w:val="20"/>
+              </w:rPr>
+              <w:t>In full, Appendix B</w:t>
+            </w:r>
           </w:p>
         </w:tc>
       </w:tr>
@@ -21104,7 +21104,7 @@
                 <w:rFonts w:ascii="Roboto" w:hAnsi="Roboto" w:eastAsia="Roboto" w:cs="Roboto"/>
                 <w:sz w:val="20"/>
               </w:rPr>
-              <w:t>Luke 12:1</w:t>
+              <w:t>Luke 12:2</w:t>
             </w:r>
           </w:p>
         </w:tc>
@@ -21160,7 +21160,7 @@
                 <w:rFonts w:ascii="Roboto" w:hAnsi="Roboto" w:eastAsia="Roboto" w:cs="Roboto"/>
                 <w:sz w:val="20"/>
               </w:rPr>
-              <w:t>Luke 12:2</w:t>
+              <w:t>Luke 12:4</w:t>
             </w:r>
           </w:p>
         </w:tc>
@@ -21216,7 +21216,7 @@
                 <w:rFonts w:ascii="Roboto" w:hAnsi="Roboto" w:eastAsia="Roboto" w:cs="Roboto"/>
                 <w:sz w:val="20"/>
               </w:rPr>
-              <w:t>Luke 12:4</w:t>
+              <w:t>Luke 12:5</w:t>
             </w:r>
           </w:p>
         </w:tc>
@@ -21233,7 +21233,7 @@
                 <w:rFonts w:ascii="Roboto" w:hAnsi="Roboto" w:eastAsia="Roboto" w:cs="Roboto"/>
                 <w:sz w:val="20"/>
               </w:rPr>
-              <w:t>ch. 4, p. 12</w:t>
+              <w:t>ch. 4, pp. 12, 13, 15; Conclusion, p. 50</w:t>
             </w:r>
           </w:p>
         </w:tc>
@@ -21272,7 +21272,7 @@
                 <w:rFonts w:ascii="Roboto" w:hAnsi="Roboto" w:eastAsia="Roboto" w:cs="Roboto"/>
                 <w:sz w:val="20"/>
               </w:rPr>
-              <w:t>Luke 12:5</w:t>
+              <w:t>Luke 12:47, 48</w:t>
             </w:r>
           </w:p>
         </w:tc>
@@ -21289,7 +21289,7 @@
                 <w:rFonts w:ascii="Roboto" w:hAnsi="Roboto" w:eastAsia="Roboto" w:cs="Roboto"/>
                 <w:sz w:val="20"/>
               </w:rPr>
-              <w:t>ch. 4, pp. 12, 13, 15; Conclusion, p. 50</w:t>
+              <w:t>ch. 8, p. 39</w:t>
             </w:r>
           </w:p>
         </w:tc>
@@ -21301,13 +21301,6 @@
             <w:pPr>
               <w:spacing w:after="0" w:before="0" w:line="259" w:lineRule="auto"/>
             </w:pPr>
-            <w:r>
-              <w:rPr>
-                <w:rFonts w:ascii="Roboto" w:hAnsi="Roboto" w:eastAsia="Roboto" w:cs="Roboto"/>
-                <w:sz w:val="20"/>
-              </w:rPr>
-              <w:t>In full, Appendix B</w:t>
-            </w:r>
           </w:p>
         </w:tc>
       </w:tr>
@@ -21328,7 +21321,7 @@
                 <w:rFonts w:ascii="Roboto" w:hAnsi="Roboto" w:eastAsia="Roboto" w:cs="Roboto"/>
                 <w:sz w:val="20"/>
               </w:rPr>
-              <w:t>Luke 12:47, 48</w:t>
+              <w:t>Luke 13:25–28</w:t>
             </w:r>
           </w:p>
         </w:tc>
@@ -21345,7 +21338,7 @@
                 <w:rFonts w:ascii="Roboto" w:hAnsi="Roboto" w:eastAsia="Roboto" w:cs="Roboto"/>
                 <w:sz w:val="20"/>
               </w:rPr>
-              <w:t>ch. 8, p. 39</w:t>
+              <w:t>ch. 5, p. 17</w:t>
             </w:r>
           </w:p>
         </w:tc>
@@ -21377,7 +21370,7 @@
                 <w:rFonts w:ascii="Roboto" w:hAnsi="Roboto" w:eastAsia="Roboto" w:cs="Roboto"/>
                 <w:sz w:val="20"/>
               </w:rPr>
-              <w:t>Luke 13:25–28</w:t>
+              <w:t>Luke 13:28</w:t>
             </w:r>
           </w:p>
         </w:tc>
@@ -21394,7 +21387,7 @@
                 <w:rFonts w:ascii="Roboto" w:hAnsi="Roboto" w:eastAsia="Roboto" w:cs="Roboto"/>
                 <w:sz w:val="20"/>
               </w:rPr>
-              <w:t>ch. 5, p. 17</w:t>
+              <w:t>ch. 7, p. 27</w:t>
             </w:r>
           </w:p>
         </w:tc>
@@ -21426,7 +21419,7 @@
                 <w:rFonts w:ascii="Roboto" w:hAnsi="Roboto" w:eastAsia="Roboto" w:cs="Roboto"/>
                 <w:sz w:val="20"/>
               </w:rPr>
-              <w:t>Luke 13:28</w:t>
+              <w:t>Luke 15:4</w:t>
             </w:r>
           </w:p>
         </w:tc>
@@ -21443,7 +21436,7 @@
                 <w:rFonts w:ascii="Roboto" w:hAnsi="Roboto" w:eastAsia="Roboto" w:cs="Roboto"/>
                 <w:sz w:val="20"/>
               </w:rPr>
-              <w:t>ch. 7, p. 27</w:t>
+              <w:t>ch. 3, p. 8</w:t>
             </w:r>
           </w:p>
         </w:tc>
@@ -21475,7 +21468,7 @@
                 <w:rFonts w:ascii="Roboto" w:hAnsi="Roboto" w:eastAsia="Roboto" w:cs="Roboto"/>
                 <w:sz w:val="20"/>
               </w:rPr>
-              <w:t>Luke 15:4</w:t>
+              <w:t>Luke 15:4, 6, 24, 32</w:t>
             </w:r>
           </w:p>
         </w:tc>
@@ -21492,7 +21485,7 @@
                 <w:rFonts w:ascii="Roboto" w:hAnsi="Roboto" w:eastAsia="Roboto" w:cs="Roboto"/>
                 <w:sz w:val="20"/>
               </w:rPr>
-              <w:t>ch. 3, p. 8</w:t>
+              <w:t>ch. 3, p. 10</w:t>
             </w:r>
           </w:p>
         </w:tc>
@@ -21524,7 +21517,7 @@
                 <w:rFonts w:ascii="Roboto" w:hAnsi="Roboto" w:eastAsia="Roboto" w:cs="Roboto"/>
                 <w:sz w:val="20"/>
               </w:rPr>
-              <w:t>Luke 15:4, 6, 24, 32</w:t>
+              <w:t>Luke 15:6</w:t>
             </w:r>
           </w:p>
         </w:tc>
@@ -21541,7 +21534,7 @@
                 <w:rFonts w:ascii="Roboto" w:hAnsi="Roboto" w:eastAsia="Roboto" w:cs="Roboto"/>
                 <w:sz w:val="20"/>
               </w:rPr>
-              <w:t>ch. 3, p. 10</w:t>
+              <w:t>ch. 3, p. 8</w:t>
             </w:r>
           </w:p>
         </w:tc>
@@ -21573,7 +21566,7 @@
                 <w:rFonts w:ascii="Roboto" w:hAnsi="Roboto" w:eastAsia="Roboto" w:cs="Roboto"/>
                 <w:sz w:val="20"/>
               </w:rPr>
-              <w:t>Luke 15:6</w:t>
+              <w:t>Luke 15:24</w:t>
             </w:r>
           </w:p>
         </w:tc>
@@ -21590,7 +21583,7 @@
                 <w:rFonts w:ascii="Roboto" w:hAnsi="Roboto" w:eastAsia="Roboto" w:cs="Roboto"/>
                 <w:sz w:val="20"/>
               </w:rPr>
-              <w:t>ch. 3, p. 8</w:t>
+              <w:t>ch. 2, p. 5; ch. 3, pp. 8, 9, 10; ch. 9, p. 43; Conclusion, p. 50</w:t>
             </w:r>
           </w:p>
         </w:tc>
@@ -21622,7 +21615,7 @@
                 <w:rFonts w:ascii="Roboto" w:hAnsi="Roboto" w:eastAsia="Roboto" w:cs="Roboto"/>
                 <w:sz w:val="20"/>
               </w:rPr>
-              <w:t>Luke 15:24</w:t>
+              <w:t>Luke 15:32</w:t>
             </w:r>
           </w:p>
         </w:tc>
@@ -21639,7 +21632,7 @@
                 <w:rFonts w:ascii="Roboto" w:hAnsi="Roboto" w:eastAsia="Roboto" w:cs="Roboto"/>
                 <w:sz w:val="20"/>
               </w:rPr>
-              <w:t>ch. 2, p. 5; ch. 3, pp. 8, 9, 10; ch. 9, p. 43; Conclusion, p. 50</w:t>
+              <w:t>ch. 3, p. 8</w:t>
             </w:r>
           </w:p>
         </w:tc>
@@ -21671,7 +21664,7 @@
                 <w:rFonts w:ascii="Roboto" w:hAnsi="Roboto" w:eastAsia="Roboto" w:cs="Roboto"/>
                 <w:sz w:val="20"/>
               </w:rPr>
-              <w:t>Luke 15:32</w:t>
+              <w:t>Luke 19:10</w:t>
             </w:r>
           </w:p>
         </w:tc>
@@ -21688,7 +21681,7 @@
                 <w:rFonts w:ascii="Roboto" w:hAnsi="Roboto" w:eastAsia="Roboto" w:cs="Roboto"/>
                 <w:sz w:val="20"/>
               </w:rPr>
-              <w:t>ch. 3, p. 8</w:t>
+              <w:t>ch. 3, pp. 8, 10</w:t>
             </w:r>
           </w:p>
         </w:tc>
@@ -21720,7 +21713,7 @@
                 <w:rFonts w:ascii="Roboto" w:hAnsi="Roboto" w:eastAsia="Roboto" w:cs="Roboto"/>
                 <w:sz w:val="20"/>
               </w:rPr>
-              <w:t>Luke 19:10</w:t>
+              <w:t>John 3:36</w:t>
             </w:r>
           </w:p>
         </w:tc>
@@ -21737,7 +21730,7 @@
                 <w:rFonts w:ascii="Roboto" w:hAnsi="Roboto" w:eastAsia="Roboto" w:cs="Roboto"/>
                 <w:sz w:val="20"/>
               </w:rPr>
-              <w:t>ch. 3, pp. 8, 10</w:t>
+              <w:t>ch. 6, p. 22</w:t>
             </w:r>
           </w:p>
         </w:tc>
@@ -21769,7 +21762,7 @@
                 <w:rFonts w:ascii="Roboto" w:hAnsi="Roboto" w:eastAsia="Roboto" w:cs="Roboto"/>
                 <w:sz w:val="20"/>
               </w:rPr>
-              <w:t>John 3:36</w:t>
+              <w:t>John 17:12</w:t>
             </w:r>
           </w:p>
         </w:tc>
@@ -21786,7 +21779,7 @@
                 <w:rFonts w:ascii="Roboto" w:hAnsi="Roboto" w:eastAsia="Roboto" w:cs="Roboto"/>
                 <w:sz w:val="20"/>
               </w:rPr>
-              <w:t>ch. 6, p. 22</w:t>
+              <w:t>ch. 4, p. 13</w:t>
             </w:r>
           </w:p>
         </w:tc>
@@ -21818,7 +21811,7 @@
                 <w:rFonts w:ascii="Roboto" w:hAnsi="Roboto" w:eastAsia="Roboto" w:cs="Roboto"/>
                 <w:sz w:val="20"/>
               </w:rPr>
-              <w:t>John 17:12</w:t>
+              <w:t>Acts 8:20</w:t>
             </w:r>
           </w:p>
         </w:tc>
@@ -21867,7 +21860,7 @@
                 <w:rFonts w:ascii="Roboto" w:hAnsi="Roboto" w:eastAsia="Roboto" w:cs="Roboto"/>
                 <w:sz w:val="20"/>
               </w:rPr>
-              <w:t>Acts 8:20</w:t>
+              <w:t>Romans 3:5, 6</w:t>
             </w:r>
           </w:p>
         </w:tc>
@@ -21884,7 +21877,7 @@
                 <w:rFonts w:ascii="Roboto" w:hAnsi="Roboto" w:eastAsia="Roboto" w:cs="Roboto"/>
                 <w:sz w:val="20"/>
               </w:rPr>
-              <w:t>ch. 4, p. 13</w:t>
+              <w:t>ch. 9, p. 46</w:t>
             </w:r>
           </w:p>
         </w:tc>
@@ -21916,7 +21909,7 @@
                 <w:rFonts w:ascii="Roboto" w:hAnsi="Roboto" w:eastAsia="Roboto" w:cs="Roboto"/>
                 <w:sz w:val="20"/>
               </w:rPr>
-              <w:t>Romans 3:5, 6</w:t>
+              <w:t>Romans 9:22</w:t>
             </w:r>
           </w:p>
         </w:tc>
@@ -21933,7 +21926,7 @@
                 <w:rFonts w:ascii="Roboto" w:hAnsi="Roboto" w:eastAsia="Roboto" w:cs="Roboto"/>
                 <w:sz w:val="20"/>
               </w:rPr>
-              <w:t>ch. 9, p. 46</w:t>
+              <w:t>ch. 4, p. 13</w:t>
             </w:r>
           </w:p>
         </w:tc>
@@ -21965,7 +21958,7 @@
                 <w:rFonts w:ascii="Roboto" w:hAnsi="Roboto" w:eastAsia="Roboto" w:cs="Roboto"/>
                 <w:sz w:val="20"/>
               </w:rPr>
-              <w:t>Romans 9:22</w:t>
+              <w:t>Romans 14:10</w:t>
             </w:r>
           </w:p>
         </w:tc>
@@ -21982,7 +21975,7 @@
                 <w:rFonts w:ascii="Roboto" w:hAnsi="Roboto" w:eastAsia="Roboto" w:cs="Roboto"/>
                 <w:sz w:val="20"/>
               </w:rPr>
-              <w:t>ch. 4, p. 13</w:t>
+              <w:t>ch. 8, pp. 40, 41</w:t>
             </w:r>
           </w:p>
         </w:tc>
@@ -22014,7 +22007,7 @@
                 <w:rFonts w:ascii="Roboto" w:hAnsi="Roboto" w:eastAsia="Roboto" w:cs="Roboto"/>
                 <w:sz w:val="20"/>
               </w:rPr>
-              <w:t>Romans 14:10</w:t>
+              <w:t>1 Corinthians 5:5</w:t>
             </w:r>
           </w:p>
         </w:tc>
@@ -22031,7 +22024,7 @@
                 <w:rFonts w:ascii="Roboto" w:hAnsi="Roboto" w:eastAsia="Roboto" w:cs="Roboto"/>
                 <w:sz w:val="20"/>
               </w:rPr>
-              <w:t>ch. 8, pp. 40, 41</w:t>
+              <w:t>ch. 3, pp. 9, 10; ch. 5, p. 16; ch. 9, p. 43; Conclusion, p. 50</w:t>
             </w:r>
           </w:p>
         </w:tc>
@@ -22063,7 +22056,7 @@
                 <w:rFonts w:ascii="Roboto" w:hAnsi="Roboto" w:eastAsia="Roboto" w:cs="Roboto"/>
                 <w:sz w:val="20"/>
               </w:rPr>
-              <w:t>1 Corinthians 5:5</w:t>
+              <w:t>1 Corinthians 15:26</w:t>
             </w:r>
           </w:p>
         </w:tc>
@@ -22080,7 +22073,7 @@
                 <w:rFonts w:ascii="Roboto" w:hAnsi="Roboto" w:eastAsia="Roboto" w:cs="Roboto"/>
                 <w:sz w:val="20"/>
               </w:rPr>
-              <w:t>ch. 3, pp. 9, 10; ch. 5, p. 16; ch. 9, p. 43; Conclusion, p. 50</w:t>
+              <w:t>ch. 8, p. 33</w:t>
             </w:r>
           </w:p>
         </w:tc>
@@ -22112,7 +22105,7 @@
                 <w:rFonts w:ascii="Roboto" w:hAnsi="Roboto" w:eastAsia="Roboto" w:cs="Roboto"/>
                 <w:sz w:val="20"/>
               </w:rPr>
-              <w:t>1 Corinthians 15:26</w:t>
+              <w:t>2 Corinthians 5:10</w:t>
             </w:r>
           </w:p>
         </w:tc>
@@ -22129,7 +22122,7 @@
                 <w:rFonts w:ascii="Roboto" w:hAnsi="Roboto" w:eastAsia="Roboto" w:cs="Roboto"/>
                 <w:sz w:val="20"/>
               </w:rPr>
-              <w:t>ch. 8, p. 33</w:t>
+              <w:t>ch. 8, pp. 40, 41</w:t>
             </w:r>
           </w:p>
         </w:tc>
@@ -22161,7 +22154,7 @@
                 <w:rFonts w:ascii="Roboto" w:hAnsi="Roboto" w:eastAsia="Roboto" w:cs="Roboto"/>
                 <w:sz w:val="20"/>
               </w:rPr>
-              <w:t>2 Corinthians 5:10</w:t>
+              <w:t>Ephesians 2:1</w:t>
             </w:r>
           </w:p>
         </w:tc>
@@ -22178,7 +22171,7 @@
                 <w:rFonts w:ascii="Roboto" w:hAnsi="Roboto" w:eastAsia="Roboto" w:cs="Roboto"/>
                 <w:sz w:val="20"/>
               </w:rPr>
-              <w:t>ch. 8, pp. 40, 41</w:t>
+              <w:t>ch. 2, p. 5; ch. 3, p. 10; ch. 9, p. 43</w:t>
             </w:r>
           </w:p>
         </w:tc>
@@ -22210,7 +22203,7 @@
                 <w:rFonts w:ascii="Roboto" w:hAnsi="Roboto" w:eastAsia="Roboto" w:cs="Roboto"/>
                 <w:sz w:val="20"/>
               </w:rPr>
-              <w:t>Ephesians 2:1</w:t>
+              <w:t>Philippians 1:28</w:t>
             </w:r>
           </w:p>
         </w:tc>
@@ -22227,7 +22220,7 @@
                 <w:rFonts w:ascii="Roboto" w:hAnsi="Roboto" w:eastAsia="Roboto" w:cs="Roboto"/>
                 <w:sz w:val="20"/>
               </w:rPr>
-              <w:t>ch. 2, p. 5; ch. 3, p. 10; ch. 9, p. 43</w:t>
+              <w:t>ch. 4, p. 14</w:t>
             </w:r>
           </w:p>
         </w:tc>
@@ -22259,7 +22252,7 @@
                 <w:rFonts w:ascii="Roboto" w:hAnsi="Roboto" w:eastAsia="Roboto" w:cs="Roboto"/>
                 <w:sz w:val="20"/>
               </w:rPr>
-              <w:t>Philippians 1:28</w:t>
+              <w:t>Philippians 3:17</w:t>
             </w:r>
           </w:p>
         </w:tc>
@@ -22276,7 +22269,7 @@
                 <w:rFonts w:ascii="Roboto" w:hAnsi="Roboto" w:eastAsia="Roboto" w:cs="Roboto"/>
                 <w:sz w:val="20"/>
               </w:rPr>
-              <w:t>ch. 4, p. 14</w:t>
+              <w:t>ch. 4, p. 13</w:t>
             </w:r>
           </w:p>
         </w:tc>
@@ -22288,6 +22281,13 @@
             <w:pPr>
               <w:spacing w:after="0" w:before="0" w:line="259" w:lineRule="auto"/>
             </w:pPr>
+            <w:r>
+              <w:rPr>
+                <w:rFonts w:ascii="Roboto" w:hAnsi="Roboto" w:eastAsia="Roboto" w:cs="Roboto"/>
+                <w:sz w:val="20"/>
+              </w:rPr>
+              <w:t>In full, Appendix B</w:t>
+            </w:r>
           </w:p>
         </w:tc>
       </w:tr>
@@ -22308,7 +22308,7 @@
                 <w:rFonts w:ascii="Roboto" w:hAnsi="Roboto" w:eastAsia="Roboto" w:cs="Roboto"/>
                 <w:sz w:val="20"/>
               </w:rPr>
-              <w:t>Philippians 3:17</w:t>
+              <w:t>Philippians 3:18, 19</w:t>
             </w:r>
           </w:p>
         </w:tc>
@@ -22364,7 +22364,7 @@
                 <w:rFonts w:ascii="Roboto" w:hAnsi="Roboto" w:eastAsia="Roboto" w:cs="Roboto"/>
                 <w:sz w:val="20"/>
               </w:rPr>
-              <w:t>Philippians 3:18, 19</w:t>
+              <w:t>Philippians 3:19</w:t>
             </w:r>
           </w:p>
         </w:tc>
@@ -22381,7 +22381,7 @@
                 <w:rFonts w:ascii="Roboto" w:hAnsi="Roboto" w:eastAsia="Roboto" w:cs="Roboto"/>
                 <w:sz w:val="20"/>
               </w:rPr>
-              <w:t>ch. 4, p. 13</w:t>
+              <w:t>ch. 2, p. 5; ch. 4, pp. 13, 14, 15; ch. 5, p. 16</w:t>
             </w:r>
           </w:p>
         </w:tc>
@@ -22420,7 +22420,7 @@
                 <w:rFonts w:ascii="Roboto" w:hAnsi="Roboto" w:eastAsia="Roboto" w:cs="Roboto"/>
                 <w:sz w:val="20"/>
               </w:rPr>
-              <w:t>Philippians 3:19</w:t>
+              <w:t>Philippians 3:20, 21</w:t>
             </w:r>
           </w:p>
         </w:tc>
@@ -22437,7 +22437,7 @@
                 <w:rFonts w:ascii="Roboto" w:hAnsi="Roboto" w:eastAsia="Roboto" w:cs="Roboto"/>
                 <w:sz w:val="20"/>
               </w:rPr>
-              <w:t>ch. 2, p. 5; ch. 4, pp. 13, 14, 15; ch. 5, p. 16</w:t>
+              <w:t>ch. 4, p. 13</w:t>
             </w:r>
           </w:p>
         </w:tc>
@@ -22476,7 +22476,7 @@
                 <w:rFonts w:ascii="Roboto" w:hAnsi="Roboto" w:eastAsia="Roboto" w:cs="Roboto"/>
                 <w:sz w:val="20"/>
               </w:rPr>
-              <w:t>Philippians 3:20, 21</w:t>
+              <w:t>1 Thessalonians 5:3</w:t>
             </w:r>
           </w:p>
         </w:tc>
@@ -22493,7 +22493,7 @@
                 <w:rFonts w:ascii="Roboto" w:hAnsi="Roboto" w:eastAsia="Roboto" w:cs="Roboto"/>
                 <w:sz w:val="20"/>
               </w:rPr>
-              <w:t>ch. 4, p. 13</w:t>
+              <w:t>ch. 5, p. 16</w:t>
             </w:r>
           </w:p>
         </w:tc>
@@ -22505,13 +22505,6 @@
             <w:pPr>
               <w:spacing w:after="0" w:before="0" w:line="259" w:lineRule="auto"/>
             </w:pPr>
-            <w:r>
-              <w:rPr>
-                <w:rFonts w:ascii="Roboto" w:hAnsi="Roboto" w:eastAsia="Roboto" w:cs="Roboto"/>
-                <w:sz w:val="20"/>
-              </w:rPr>
-              <w:t>In full, Appendix B</w:t>
-            </w:r>
           </w:p>
         </w:tc>
       </w:tr>
@@ -22532,7 +22525,7 @@
                 <w:rFonts w:ascii="Roboto" w:hAnsi="Roboto" w:eastAsia="Roboto" w:cs="Roboto"/>
                 <w:sz w:val="20"/>
               </w:rPr>
-              <w:t>1 Thessalonians 5:3</w:t>
+              <w:t>2 Thessalonians 1:1</w:t>
             </w:r>
           </w:p>
         </w:tc>
@@ -22549,7 +22542,7 @@
                 <w:rFonts w:ascii="Roboto" w:hAnsi="Roboto" w:eastAsia="Roboto" w:cs="Roboto"/>
                 <w:sz w:val="20"/>
               </w:rPr>
-              <w:t>ch. 5, p. 16</w:t>
+              <w:t>ch. 5, p. 15</w:t>
             </w:r>
           </w:p>
         </w:tc>
@@ -22581,7 +22574,7 @@
                 <w:rFonts w:ascii="Roboto" w:hAnsi="Roboto" w:eastAsia="Roboto" w:cs="Roboto"/>
                 <w:sz w:val="20"/>
               </w:rPr>
-              <w:t>2 Thessalonians 1:1</w:t>
+              <w:t>2 Thessalonians 1:4</w:t>
             </w:r>
           </w:p>
         </w:tc>
@@ -22610,6 +22603,13 @@
             <w:pPr>
               <w:spacing w:after="0" w:before="0" w:line="259" w:lineRule="auto"/>
             </w:pPr>
+            <w:r>
+              <w:rPr>
+                <w:rFonts w:ascii="Roboto" w:hAnsi="Roboto" w:eastAsia="Roboto" w:cs="Roboto"/>
+                <w:sz w:val="20"/>
+              </w:rPr>
+              <w:t>In full, Appendix B</w:t>
+            </w:r>
           </w:p>
         </w:tc>
       </w:tr>
@@ -22630,7 +22630,7 @@
                 <w:rFonts w:ascii="Roboto" w:hAnsi="Roboto" w:eastAsia="Roboto" w:cs="Roboto"/>
                 <w:sz w:val="20"/>
               </w:rPr>
-              <w:t>2 Thessalonians 1:4</w:t>
+              <w:t>2 Thessalonians 1:5</w:t>
             </w:r>
           </w:p>
         </w:tc>
@@ -22686,7 +22686,7 @@
                 <w:rFonts w:ascii="Roboto" w:hAnsi="Roboto" w:eastAsia="Roboto" w:cs="Roboto"/>
                 <w:sz w:val="20"/>
               </w:rPr>
-              <w:t>2 Thessalonians 1:5</w:t>
+              <w:t>2 Thessalonians 1:6</w:t>
             </w:r>
           </w:p>
         </w:tc>
@@ -22703,7 +22703,7 @@
                 <w:rFonts w:ascii="Roboto" w:hAnsi="Roboto" w:eastAsia="Roboto" w:cs="Roboto"/>
                 <w:sz w:val="20"/>
               </w:rPr>
-              <w:t>ch. 5, p. 15</w:t>
+              <w:t>ch. 5, p. 16</w:t>
             </w:r>
           </w:p>
         </w:tc>
@@ -22742,7 +22742,7 @@
                 <w:rFonts w:ascii="Roboto" w:hAnsi="Roboto" w:eastAsia="Roboto" w:cs="Roboto"/>
                 <w:sz w:val="20"/>
               </w:rPr>
-              <w:t>2 Thessalonians 1:6</w:t>
+              <w:t>2 Thessalonians 1:6–10</w:t>
             </w:r>
           </w:p>
         </w:tc>
@@ -22759,7 +22759,7 @@
                 <w:rFonts w:ascii="Roboto" w:hAnsi="Roboto" w:eastAsia="Roboto" w:cs="Roboto"/>
                 <w:sz w:val="20"/>
               </w:rPr>
-              <w:t>ch. 5, p. 16</w:t>
+              <w:t>ch. 5, p. 16; Conclusion, p. 50</w:t>
             </w:r>
           </w:p>
         </w:tc>
@@ -22798,7 +22798,7 @@
                 <w:rFonts w:ascii="Roboto" w:hAnsi="Roboto" w:eastAsia="Roboto" w:cs="Roboto"/>
                 <w:sz w:val="20"/>
               </w:rPr>
-              <w:t>2 Thessalonians 1:6–10</w:t>
+              <w:t>2 Thessalonians 1:7</w:t>
             </w:r>
           </w:p>
         </w:tc>
@@ -22815,7 +22815,7 @@
                 <w:rFonts w:ascii="Roboto" w:hAnsi="Roboto" w:eastAsia="Roboto" w:cs="Roboto"/>
                 <w:sz w:val="20"/>
               </w:rPr>
-              <w:t>ch. 5, p. 16; Conclusion, p. 50</w:t>
+              <w:t>ch. 5, p. 16</w:t>
             </w:r>
           </w:p>
         </w:tc>
@@ -22854,7 +22854,7 @@
                 <w:rFonts w:ascii="Roboto" w:hAnsi="Roboto" w:eastAsia="Roboto" w:cs="Roboto"/>
                 <w:sz w:val="20"/>
               </w:rPr>
-              <w:t>2 Thessalonians 1:7</w:t>
+              <w:t>2 Thessalonians 1:8</w:t>
             </w:r>
           </w:p>
         </w:tc>
@@ -22871,7 +22871,7 @@
                 <w:rFonts w:ascii="Roboto" w:hAnsi="Roboto" w:eastAsia="Roboto" w:cs="Roboto"/>
                 <w:sz w:val="20"/>
               </w:rPr>
-              <w:t>ch. 5, p. 16</w:t>
+              <w:t>ch. 5, pp. 16, 18</w:t>
             </w:r>
           </w:p>
         </w:tc>
@@ -22910,7 +22910,7 @@
                 <w:rFonts w:ascii="Roboto" w:hAnsi="Roboto" w:eastAsia="Roboto" w:cs="Roboto"/>
                 <w:sz w:val="20"/>
               </w:rPr>
-              <w:t>2 Thessalonians 1:8</w:t>
+              <w:t>2 Thessalonians 1:9</w:t>
             </w:r>
           </w:p>
         </w:tc>
@@ -22927,7 +22927,7 @@
                 <w:rFonts w:ascii="Roboto" w:hAnsi="Roboto" w:eastAsia="Roboto" w:cs="Roboto"/>
                 <w:sz w:val="20"/>
               </w:rPr>
-              <w:t>ch. 5, pp. 16, 18</w:t>
+              <w:t>ch. 2, p. 5; ch. 5, pp. 16, 17; ch. 9, p. 43</w:t>
             </w:r>
           </w:p>
         </w:tc>
@@ -22966,7 +22966,7 @@
                 <w:rFonts w:ascii="Roboto" w:hAnsi="Roboto" w:eastAsia="Roboto" w:cs="Roboto"/>
                 <w:sz w:val="20"/>
               </w:rPr>
-              <w:t>2 Thessalonians 1:9</w:t>
+              <w:t>2 Thessalonians 1:10</w:t>
             </w:r>
           </w:p>
         </w:tc>
@@ -22983,7 +22983,7 @@
                 <w:rFonts w:ascii="Roboto" w:hAnsi="Roboto" w:eastAsia="Roboto" w:cs="Roboto"/>
                 <w:sz w:val="20"/>
               </w:rPr>
-              <w:t>ch. 2, p. 5; ch. 5, pp. 16, 17; ch. 9, p. 43</w:t>
+              <w:t>ch. 5, p. 16</w:t>
             </w:r>
           </w:p>
         </w:tc>
@@ -23022,7 +23022,7 @@
                 <w:rFonts w:ascii="Roboto" w:hAnsi="Roboto" w:eastAsia="Roboto" w:cs="Roboto"/>
                 <w:sz w:val="20"/>
               </w:rPr>
-              <w:t>2 Thessalonians 1:10</w:t>
+              <w:t>1 Timothy 6:9</w:t>
             </w:r>
           </w:p>
         </w:tc>
@@ -23051,13 +23051,6 @@
             <w:pPr>
               <w:spacing w:after="0" w:before="0" w:line="259" w:lineRule="auto"/>
             </w:pPr>
-            <w:r>
-              <w:rPr>
-                <w:rFonts w:ascii="Roboto" w:hAnsi="Roboto" w:eastAsia="Roboto" w:cs="Roboto"/>
-                <w:sz w:val="20"/>
-              </w:rPr>
-              <w:t>In full, Appendix B</w:t>
-            </w:r>
           </w:p>
         </w:tc>
       </w:tr>
@@ -23078,7 +23071,7 @@
                 <w:rFonts w:ascii="Roboto" w:hAnsi="Roboto" w:eastAsia="Roboto" w:cs="Roboto"/>
                 <w:sz w:val="20"/>
               </w:rPr>
-              <w:t>1 Timothy 6:9</w:t>
+              <w:t>Hebrews 5:9</w:t>
             </w:r>
           </w:p>
         </w:tc>
@@ -23095,7 +23088,7 @@
                 <w:rFonts w:ascii="Roboto" w:hAnsi="Roboto" w:eastAsia="Roboto" w:cs="Roboto"/>
                 <w:sz w:val="20"/>
               </w:rPr>
-              <w:t>ch. 5, p. 16</w:t>
+              <w:t>ch. 6, pp. 19, 20; ch. 9, pp. 44, 48</w:t>
             </w:r>
           </w:p>
         </w:tc>
@@ -23127,7 +23120,7 @@
                 <w:rFonts w:ascii="Roboto" w:hAnsi="Roboto" w:eastAsia="Roboto" w:cs="Roboto"/>
                 <w:sz w:val="20"/>
               </w:rPr>
-              <w:t>Hebrews 5:9</w:t>
+              <w:t>Hebrews 6:2</w:t>
             </w:r>
           </w:p>
         </w:tc>
@@ -23144,7 +23137,7 @@
                 <w:rFonts w:ascii="Roboto" w:hAnsi="Roboto" w:eastAsia="Roboto" w:cs="Roboto"/>
                 <w:sz w:val="20"/>
               </w:rPr>
-              <w:t>ch. 6, pp. 19, 20; ch. 9, pp. 44, 48</w:t>
+              <w:t>ch. 2, p. 5; ch. 6, pp. 19, 20; ch. 9, pp. 44, 48</w:t>
             </w:r>
           </w:p>
         </w:tc>
@@ -23176,7 +23169,7 @@
                 <w:rFonts w:ascii="Roboto" w:hAnsi="Roboto" w:eastAsia="Roboto" w:cs="Roboto"/>
                 <w:sz w:val="20"/>
               </w:rPr>
-              <w:t>Hebrews 6:2</w:t>
+              <w:t>Hebrews 9:12</w:t>
             </w:r>
           </w:p>
         </w:tc>
@@ -23193,7 +23186,7 @@
                 <w:rFonts w:ascii="Roboto" w:hAnsi="Roboto" w:eastAsia="Roboto" w:cs="Roboto"/>
                 <w:sz w:val="20"/>
               </w:rPr>
-              <w:t>ch. 2, p. 5; ch. 6, pp. 19, 20; ch. 9, pp. 44, 48</w:t>
+              <w:t>ch. 6, pp. 19, 20; ch. 9, pp. 44, 48</w:t>
             </w:r>
           </w:p>
         </w:tc>
@@ -23225,7 +23218,7 @@
                 <w:rFonts w:ascii="Roboto" w:hAnsi="Roboto" w:eastAsia="Roboto" w:cs="Roboto"/>
                 <w:sz w:val="20"/>
               </w:rPr>
-              <w:t>Hebrews 9:12</w:t>
+              <w:t>Hebrews 10:29</w:t>
             </w:r>
           </w:p>
         </w:tc>
@@ -23242,7 +23235,7 @@
                 <w:rFonts w:ascii="Roboto" w:hAnsi="Roboto" w:eastAsia="Roboto" w:cs="Roboto"/>
                 <w:sz w:val="20"/>
               </w:rPr>
-              <w:t>ch. 6, pp. 19, 20; ch. 9, pp. 44, 48</w:t>
+              <w:t>ch. 8, p. 39</w:t>
             </w:r>
           </w:p>
         </w:tc>
@@ -23274,7 +23267,7 @@
                 <w:rFonts w:ascii="Roboto" w:hAnsi="Roboto" w:eastAsia="Roboto" w:cs="Roboto"/>
                 <w:sz w:val="20"/>
               </w:rPr>
-              <w:t>Hebrews 10:29</w:t>
+              <w:t>2 Peter 2:6</w:t>
             </w:r>
           </w:p>
         </w:tc>
@@ -23291,7 +23284,7 @@
                 <w:rFonts w:ascii="Roboto" w:hAnsi="Roboto" w:eastAsia="Roboto" w:cs="Roboto"/>
                 <w:sz w:val="20"/>
               </w:rPr>
-              <w:t>ch. 8, p. 39</w:t>
+              <w:t>ch. 6, p. 21</w:t>
             </w:r>
           </w:p>
         </w:tc>
@@ -23323,7 +23316,7 @@
                 <w:rFonts w:ascii="Roboto" w:hAnsi="Roboto" w:eastAsia="Roboto" w:cs="Roboto"/>
                 <w:sz w:val="20"/>
               </w:rPr>
-              <w:t>2 Peter 2:6</w:t>
+              <w:t>2 Peter 3:5</w:t>
             </w:r>
           </w:p>
         </w:tc>
@@ -23340,7 +23333,7 @@
                 <w:rFonts w:ascii="Roboto" w:hAnsi="Roboto" w:eastAsia="Roboto" w:cs="Roboto"/>
                 <w:sz w:val="20"/>
               </w:rPr>
-              <w:t>ch. 6, p. 21</w:t>
+              <w:t>ch. 3, p. 8</w:t>
             </w:r>
           </w:p>
         </w:tc>
@@ -23372,7 +23365,7 @@
                 <w:rFonts w:ascii="Roboto" w:hAnsi="Roboto" w:eastAsia="Roboto" w:cs="Roboto"/>
                 <w:sz w:val="20"/>
               </w:rPr>
-              <w:t>2 Peter 3:5</w:t>
+              <w:t>2 Peter 3:6</w:t>
             </w:r>
           </w:p>
         </w:tc>
@@ -23389,7 +23382,7 @@
                 <w:rFonts w:ascii="Roboto" w:hAnsi="Roboto" w:eastAsia="Roboto" w:cs="Roboto"/>
                 <w:sz w:val="20"/>
               </w:rPr>
-              <w:t>ch. 3, p. 8</w:t>
+              <w:t>ch. 3, pp. 8, 10</w:t>
             </w:r>
           </w:p>
         </w:tc>
@@ -23421,7 +23414,7 @@
                 <w:rFonts w:ascii="Roboto" w:hAnsi="Roboto" w:eastAsia="Roboto" w:cs="Roboto"/>
                 <w:sz w:val="20"/>
               </w:rPr>
-              <w:t>2 Peter 3:6</w:t>
+              <w:t>2 Peter 3:7</w:t>
             </w:r>
           </w:p>
         </w:tc>
@@ -23438,7 +23431,7 @@
                 <w:rFonts w:ascii="Roboto" w:hAnsi="Roboto" w:eastAsia="Roboto" w:cs="Roboto"/>
                 <w:sz w:val="20"/>
               </w:rPr>
-              <w:t>ch. 3, pp. 8, 10</w:t>
+              <w:t>ch. 3, p. 8</w:t>
             </w:r>
           </w:p>
         </w:tc>
@@ -23470,7 +23463,7 @@
                 <w:rFonts w:ascii="Roboto" w:hAnsi="Roboto" w:eastAsia="Roboto" w:cs="Roboto"/>
                 <w:sz w:val="20"/>
               </w:rPr>
-              <w:t>2 Peter 3:7</w:t>
+              <w:t>1 John 4:18</w:t>
             </w:r>
           </w:p>
         </w:tc>
@@ -23487,7 +23480,7 @@
                 <w:rFonts w:ascii="Roboto" w:hAnsi="Roboto" w:eastAsia="Roboto" w:cs="Roboto"/>
                 <w:sz w:val="20"/>
               </w:rPr>
-              <w:t>ch. 3, p. 8</w:t>
+              <w:t>ch. 6, p. 19</w:t>
             </w:r>
           </w:p>
         </w:tc>
@@ -23519,7 +23512,7 @@
                 <w:rFonts w:ascii="Roboto" w:hAnsi="Roboto" w:eastAsia="Roboto" w:cs="Roboto"/>
                 <w:sz w:val="20"/>
               </w:rPr>
-              <w:t>1 John 4:18</w:t>
+              <w:t>Jude 1:1</w:t>
             </w:r>
           </w:p>
         </w:tc>
@@ -23536,7 +23529,7 @@
                 <w:rFonts w:ascii="Roboto" w:hAnsi="Roboto" w:eastAsia="Roboto" w:cs="Roboto"/>
                 <w:sz w:val="20"/>
               </w:rPr>
-              <w:t>ch. 6, p. 19</w:t>
+              <w:t>ch. 6, p. 21</w:t>
             </w:r>
           </w:p>
         </w:tc>
@@ -23568,7 +23561,7 @@
                 <w:rFonts w:ascii="Roboto" w:hAnsi="Roboto" w:eastAsia="Roboto" w:cs="Roboto"/>
                 <w:sz w:val="20"/>
               </w:rPr>
-              <w:t>Jude 1:1</w:t>
+              <w:t>Jude 1:4</w:t>
             </w:r>
           </w:p>
         </w:tc>
@@ -23617,7 +23610,7 @@
                 <w:rFonts w:ascii="Roboto" w:hAnsi="Roboto" w:eastAsia="Roboto" w:cs="Roboto"/>
                 <w:sz w:val="20"/>
               </w:rPr>
-              <w:t>Jude 1:4</w:t>
+              <w:t>Jude 1:5</w:t>
             </w:r>
           </w:p>
         </w:tc>
@@ -23646,6 +23639,13 @@
             <w:pPr>
               <w:spacing w:after="0" w:before="0" w:line="259" w:lineRule="auto"/>
             </w:pPr>
+            <w:r>
+              <w:rPr>
+                <w:rFonts w:ascii="Roboto" w:hAnsi="Roboto" w:eastAsia="Roboto" w:cs="Roboto"/>
+                <w:sz w:val="20"/>
+              </w:rPr>
+              <w:t>In full, Appendix B</w:t>
+            </w:r>
           </w:p>
         </w:tc>
       </w:tr>
@@ -23666,7 +23666,7 @@
                 <w:rFonts w:ascii="Roboto" w:hAnsi="Roboto" w:eastAsia="Roboto" w:cs="Roboto"/>
                 <w:sz w:val="20"/>
               </w:rPr>
-              <w:t>Jude 1:5</w:t>
+              <w:t>Jude 1:6</w:t>
             </w:r>
           </w:p>
         </w:tc>
@@ -23722,7 +23722,7 @@
                 <w:rFonts w:ascii="Roboto" w:hAnsi="Roboto" w:eastAsia="Roboto" w:cs="Roboto"/>
                 <w:sz w:val="20"/>
               </w:rPr>
-              <w:t>Jude 1:6</w:t>
+              <w:t>Jude 1:7</w:t>
             </w:r>
           </w:p>
         </w:tc>
@@ -23739,7 +23739,7 @@
                 <w:rFonts w:ascii="Roboto" w:hAnsi="Roboto" w:eastAsia="Roboto" w:cs="Roboto"/>
                 <w:sz w:val="20"/>
               </w:rPr>
-              <w:t>ch. 6, p. 21</w:t>
+              <w:t>ch. 6, pp. 19, 21, 22, 23; Conclusion, p. 50</w:t>
             </w:r>
           </w:p>
         </w:tc>
@@ -23778,7 +23778,7 @@
                 <w:rFonts w:ascii="Roboto" w:hAnsi="Roboto" w:eastAsia="Roboto" w:cs="Roboto"/>
                 <w:sz w:val="20"/>
               </w:rPr>
-              <w:t>Jude 1:7</w:t>
+              <w:t>Jude 1:13</w:t>
             </w:r>
           </w:p>
         </w:tc>
@@ -23795,7 +23795,7 @@
                 <w:rFonts w:ascii="Roboto" w:hAnsi="Roboto" w:eastAsia="Roboto" w:cs="Roboto"/>
                 <w:sz w:val="20"/>
               </w:rPr>
-              <w:t>ch. 6, pp. 19, 21, 22, 23; Conclusion, p. 50</w:t>
+              <w:t>ch. 6, p. 22</w:t>
             </w:r>
           </w:p>
         </w:tc>
@@ -23834,7 +23834,7 @@
                 <w:rFonts w:ascii="Roboto" w:hAnsi="Roboto" w:eastAsia="Roboto" w:cs="Roboto"/>
                 <w:sz w:val="20"/>
               </w:rPr>
-              <w:t>Jude 1:13</w:t>
+              <w:t>Revelation 1:1</w:t>
             </w:r>
           </w:p>
         </w:tc>
@@ -23851,7 +23851,7 @@
                 <w:rFonts w:ascii="Roboto" w:hAnsi="Roboto" w:eastAsia="Roboto" w:cs="Roboto"/>
                 <w:sz w:val="20"/>
               </w:rPr>
-              <w:t>ch. 6, p. 22</w:t>
+              <w:t>ch. 8, p. 28</w:t>
             </w:r>
           </w:p>
         </w:tc>
@@ -23863,13 +23863,6 @@
             <w:pPr>
               <w:spacing w:after="0" w:before="0" w:line="259" w:lineRule="auto"/>
             </w:pPr>
-            <w:r>
-              <w:rPr>
-                <w:rFonts w:ascii="Roboto" w:hAnsi="Roboto" w:eastAsia="Roboto" w:cs="Roboto"/>
-                <w:sz w:val="20"/>
-              </w:rPr>
-              <w:t>In full, Appendix B</w:t>
-            </w:r>
           </w:p>
         </w:tc>
       </w:tr>
@@ -23890,7 +23883,7 @@
                 <w:rFonts w:ascii="Roboto" w:hAnsi="Roboto" w:eastAsia="Roboto" w:cs="Roboto"/>
                 <w:sz w:val="20"/>
               </w:rPr>
-              <w:t>Revelation 1:1</w:t>
+              <w:t>Revelation 1:4</w:t>
             </w:r>
           </w:p>
         </w:tc>
@@ -23939,7 +23932,7 @@
                 <w:rFonts w:ascii="Roboto" w:hAnsi="Roboto" w:eastAsia="Roboto" w:cs="Roboto"/>
                 <w:sz w:val="20"/>
               </w:rPr>
-              <w:t>Revelation 1:4</w:t>
+              <w:t>Revelation 2:11</w:t>
             </w:r>
           </w:p>
         </w:tc>
@@ -23956,7 +23949,7 @@
                 <w:rFonts w:ascii="Roboto" w:hAnsi="Roboto" w:eastAsia="Roboto" w:cs="Roboto"/>
                 <w:sz w:val="20"/>
               </w:rPr>
-              <w:t>ch. 8, p. 28</w:t>
+              <w:t>ch. 8, pp. 32, 36</w:t>
             </w:r>
           </w:p>
         </w:tc>
@@ -23988,7 +23981,7 @@
                 <w:rFonts w:ascii="Roboto" w:hAnsi="Roboto" w:eastAsia="Roboto" w:cs="Roboto"/>
                 <w:sz w:val="20"/>
               </w:rPr>
-              <w:t>Revelation 2:11</w:t>
+              <w:t>Revelation 3:5</w:t>
             </w:r>
           </w:p>
         </w:tc>
@@ -24005,7 +23998,7 @@
                 <w:rFonts w:ascii="Roboto" w:hAnsi="Roboto" w:eastAsia="Roboto" w:cs="Roboto"/>
                 <w:sz w:val="20"/>
               </w:rPr>
-              <w:t>ch. 8, pp. 32, 36</w:t>
+              <w:t>ch. 8, p. 40</w:t>
             </w:r>
           </w:p>
         </w:tc>
@@ -24037,7 +24030,7 @@
                 <w:rFonts w:ascii="Roboto" w:hAnsi="Roboto" w:eastAsia="Roboto" w:cs="Roboto"/>
                 <w:sz w:val="20"/>
               </w:rPr>
-              <w:t>Revelation 3:5</w:t>
+              <w:t>Revelation 4:9, 10</w:t>
             </w:r>
           </w:p>
         </w:tc>
@@ -24054,7 +24047,7 @@
                 <w:rFonts w:ascii="Roboto" w:hAnsi="Roboto" w:eastAsia="Roboto" w:cs="Roboto"/>
                 <w:sz w:val="20"/>
               </w:rPr>
-              <w:t>ch. 8, p. 40</w:t>
+              <w:t>ch. 8, p. 31</w:t>
             </w:r>
           </w:p>
         </w:tc>
@@ -24086,7 +24079,7 @@
                 <w:rFonts w:ascii="Roboto" w:hAnsi="Roboto" w:eastAsia="Roboto" w:cs="Roboto"/>
                 <w:sz w:val="20"/>
               </w:rPr>
-              <w:t>Revelation 4:9, 10</w:t>
+              <w:t>Revelation 6:8</w:t>
             </w:r>
           </w:p>
         </w:tc>
@@ -24103,7 +24096,7 @@
                 <w:rFonts w:ascii="Roboto" w:hAnsi="Roboto" w:eastAsia="Roboto" w:cs="Roboto"/>
                 <w:sz w:val="20"/>
               </w:rPr>
-              <w:t>ch. 8, p. 31</w:t>
+              <w:t>ch. 8, pp. 32, 34</w:t>
             </w:r>
           </w:p>
         </w:tc>
@@ -24135,7 +24128,7 @@
                 <w:rFonts w:ascii="Roboto" w:hAnsi="Roboto" w:eastAsia="Roboto" w:cs="Roboto"/>
                 <w:sz w:val="20"/>
               </w:rPr>
-              <w:t>Revelation 6:8</w:t>
+              <w:t>Revelation 9:5</w:t>
             </w:r>
           </w:p>
         </w:tc>
@@ -24152,7 +24145,7 @@
                 <w:rFonts w:ascii="Roboto" w:hAnsi="Roboto" w:eastAsia="Roboto" w:cs="Roboto"/>
                 <w:sz w:val="20"/>
               </w:rPr>
-              <w:t>ch. 8, pp. 32, 34</w:t>
+              <w:t>ch. 8, p. 29</w:t>
             </w:r>
           </w:p>
         </w:tc>
@@ -24184,7 +24177,7 @@
                 <w:rFonts w:ascii="Roboto" w:hAnsi="Roboto" w:eastAsia="Roboto" w:cs="Roboto"/>
                 <w:sz w:val="20"/>
               </w:rPr>
-              <w:t>Revelation 9:5</w:t>
+              <w:t>Revelation 9:5, 6</w:t>
             </w:r>
           </w:p>
         </w:tc>
@@ -24201,7 +24194,7 @@
                 <w:rFonts w:ascii="Roboto" w:hAnsi="Roboto" w:eastAsia="Roboto" w:cs="Roboto"/>
                 <w:sz w:val="20"/>
               </w:rPr>
-              <w:t>ch. 8, p. 29</w:t>
+              <w:t>ch. 8, p. 30</w:t>
             </w:r>
           </w:p>
         </w:tc>
@@ -24233,7 +24226,7 @@
                 <w:rFonts w:ascii="Roboto" w:hAnsi="Roboto" w:eastAsia="Roboto" w:cs="Roboto"/>
                 <w:sz w:val="20"/>
               </w:rPr>
-              <w:t>Revelation 9:5, 6</w:t>
+              <w:t>Revelation 9:6</w:t>
             </w:r>
           </w:p>
         </w:tc>
@@ -24250,7 +24243,7 @@
                 <w:rFonts w:ascii="Roboto" w:hAnsi="Roboto" w:eastAsia="Roboto" w:cs="Roboto"/>
                 <w:sz w:val="20"/>
               </w:rPr>
-              <w:t>ch. 8, p. 30</w:t>
+              <w:t>ch. 8, p. 29</w:t>
             </w:r>
           </w:p>
         </w:tc>
@@ -24282,7 +24275,7 @@
                 <w:rFonts w:ascii="Roboto" w:hAnsi="Roboto" w:eastAsia="Roboto" w:cs="Roboto"/>
                 <w:sz w:val="20"/>
               </w:rPr>
-              <w:t>Revelation 9:6</w:t>
+              <w:t>Revelation 10:6</w:t>
             </w:r>
           </w:p>
         </w:tc>
@@ -24299,7 +24292,7 @@
                 <w:rFonts w:ascii="Roboto" w:hAnsi="Roboto" w:eastAsia="Roboto" w:cs="Roboto"/>
                 <w:sz w:val="20"/>
               </w:rPr>
-              <w:t>ch. 8, p. 29</w:t>
+              <w:t>ch. 8, p. 31</w:t>
             </w:r>
           </w:p>
         </w:tc>
@@ -24331,7 +24324,7 @@
                 <w:rFonts w:ascii="Roboto" w:hAnsi="Roboto" w:eastAsia="Roboto" w:cs="Roboto"/>
                 <w:sz w:val="20"/>
               </w:rPr>
-              <w:t>Revelation 10:6</w:t>
+              <w:t>Revelation 11:10</w:t>
             </w:r>
           </w:p>
         </w:tc>
@@ -24348,7 +24341,7 @@
                 <w:rFonts w:ascii="Roboto" w:hAnsi="Roboto" w:eastAsia="Roboto" w:cs="Roboto"/>
                 <w:sz w:val="20"/>
               </w:rPr>
-              <w:t>ch. 8, p. 31</w:t>
+              <w:t>ch. 8, pp. 29, 30</w:t>
             </w:r>
           </w:p>
         </w:tc>
@@ -24380,7 +24373,7 @@
                 <w:rFonts w:ascii="Roboto" w:hAnsi="Roboto" w:eastAsia="Roboto" w:cs="Roboto"/>
                 <w:sz w:val="20"/>
               </w:rPr>
-              <w:t>Revelation 11:10</w:t>
+              <w:t>Revelation 11:15</w:t>
             </w:r>
           </w:p>
         </w:tc>
@@ -24397,7 +24390,7 @@
                 <w:rFonts w:ascii="Roboto" w:hAnsi="Roboto" w:eastAsia="Roboto" w:cs="Roboto"/>
                 <w:sz w:val="20"/>
               </w:rPr>
-              <w:t>ch. 8, pp. 29, 30</w:t>
+              <w:t>ch. 8, p. 32</w:t>
             </w:r>
           </w:p>
         </w:tc>
@@ -24429,7 +24422,7 @@
                 <w:rFonts w:ascii="Roboto" w:hAnsi="Roboto" w:eastAsia="Roboto" w:cs="Roboto"/>
                 <w:sz w:val="20"/>
               </w:rPr>
-              <w:t>Revelation 11:15</w:t>
+              <w:t>Revelation 13:18</w:t>
             </w:r>
           </w:p>
         </w:tc>
@@ -24446,7 +24439,7 @@
                 <w:rFonts w:ascii="Roboto" w:hAnsi="Roboto" w:eastAsia="Roboto" w:cs="Roboto"/>
                 <w:sz w:val="20"/>
               </w:rPr>
-              <w:t>ch. 8, p. 32</w:t>
+              <w:t>ch. 8, p. 35</w:t>
             </w:r>
           </w:p>
         </w:tc>
@@ -24478,7 +24471,7 @@
                 <w:rFonts w:ascii="Roboto" w:hAnsi="Roboto" w:eastAsia="Roboto" w:cs="Roboto"/>
                 <w:sz w:val="20"/>
               </w:rPr>
-              <w:t>Revelation 13:18</w:t>
+              <w:t>Revelation 14:1</w:t>
             </w:r>
           </w:p>
         </w:tc>
@@ -24495,7 +24488,7 @@
                 <w:rFonts w:ascii="Roboto" w:hAnsi="Roboto" w:eastAsia="Roboto" w:cs="Roboto"/>
                 <w:sz w:val="20"/>
               </w:rPr>
-              <w:t>ch. 8, p. 35</w:t>
+              <w:t>ch. 8, p. 28</w:t>
             </w:r>
           </w:p>
         </w:tc>
@@ -24527,7 +24520,7 @@
                 <w:rFonts w:ascii="Roboto" w:hAnsi="Roboto" w:eastAsia="Roboto" w:cs="Roboto"/>
                 <w:sz w:val="20"/>
               </w:rPr>
-              <w:t>Revelation 14:1</w:t>
+              <w:t>Revelation 14:6</w:t>
             </w:r>
           </w:p>
         </w:tc>
@@ -24544,7 +24537,7 @@
                 <w:rFonts w:ascii="Roboto" w:hAnsi="Roboto" w:eastAsia="Roboto" w:cs="Roboto"/>
                 <w:sz w:val="20"/>
               </w:rPr>
-              <w:t>ch. 8, p. 28</w:t>
+              <w:t>ch. 8, p. 29</w:t>
             </w:r>
           </w:p>
         </w:tc>
@@ -24556,6 +24549,13 @@
             <w:pPr>
               <w:spacing w:after="0" w:before="0" w:line="259" w:lineRule="auto"/>
             </w:pPr>
+            <w:r>
+              <w:rPr>
+                <w:rFonts w:ascii="Roboto" w:hAnsi="Roboto" w:eastAsia="Roboto" w:cs="Roboto"/>
+                <w:sz w:val="20"/>
+              </w:rPr>
+              <w:t>In full, Appendix B</w:t>
+            </w:r>
           </w:p>
         </w:tc>
       </w:tr>
@@ -24576,7 +24576,7 @@
                 <w:rFonts w:ascii="Roboto" w:hAnsi="Roboto" w:eastAsia="Roboto" w:cs="Roboto"/>
                 <w:sz w:val="20"/>
               </w:rPr>
-              <w:t>Revelation 14:6</w:t>
+              <w:t>Revelation 14:9–11</w:t>
             </w:r>
           </w:p>
         </w:tc>
@@ -24593,7 +24593,7 @@
                 <w:rFonts w:ascii="Roboto" w:hAnsi="Roboto" w:eastAsia="Roboto" w:cs="Roboto"/>
                 <w:sz w:val="20"/>
               </w:rPr>
-              <w:t>ch. 8, p. 29</w:t>
+              <w:t>ch. 8, pp. 28, 29, 35, 36, 42</w:t>
             </w:r>
           </w:p>
         </w:tc>
@@ -24632,7 +24632,7 @@
                 <w:rFonts w:ascii="Roboto" w:hAnsi="Roboto" w:eastAsia="Roboto" w:cs="Roboto"/>
                 <w:sz w:val="20"/>
               </w:rPr>
-              <w:t>Revelation 14:9–11</w:t>
+              <w:t>Revelation 14:10, 11</w:t>
             </w:r>
           </w:p>
         </w:tc>
@@ -24649,7 +24649,7 @@
                 <w:rFonts w:ascii="Roboto" w:hAnsi="Roboto" w:eastAsia="Roboto" w:cs="Roboto"/>
                 <w:sz w:val="20"/>
               </w:rPr>
-              <w:t>ch. 8, pp. 28, 29, 35, 36, 42</w:t>
+              <w:t>ch. 2, p. 5; ch. 8, p. 30; ch. 9, p. 44</w:t>
             </w:r>
           </w:p>
         </w:tc>
@@ -24688,7 +24688,7 @@
                 <w:rFonts w:ascii="Roboto" w:hAnsi="Roboto" w:eastAsia="Roboto" w:cs="Roboto"/>
                 <w:sz w:val="20"/>
               </w:rPr>
-              <w:t>Revelation 14:10, 11</w:t>
+              <w:t>Revelation 14:11</w:t>
             </w:r>
           </w:p>
         </w:tc>
@@ -24705,7 +24705,7 @@
                 <w:rFonts w:ascii="Roboto" w:hAnsi="Roboto" w:eastAsia="Roboto" w:cs="Roboto"/>
                 <w:sz w:val="20"/>
               </w:rPr>
-              <w:t>ch. 2, p. 5; ch. 8, p. 30; ch. 9, p. 44</w:t>
+              <w:t>ch. 8, p. 31; ch. 9, p. 45</w:t>
             </w:r>
           </w:p>
         </w:tc>
@@ -24744,7 +24744,7 @@
                 <w:rFonts w:ascii="Roboto" w:hAnsi="Roboto" w:eastAsia="Roboto" w:cs="Roboto"/>
                 <w:sz w:val="20"/>
               </w:rPr>
-              <w:t>Revelation 14:11</w:t>
+              <w:t>Revelation 14:13</w:t>
             </w:r>
           </w:p>
         </w:tc>
@@ -24761,7 +24761,7 @@
                 <w:rFonts w:ascii="Roboto" w:hAnsi="Roboto" w:eastAsia="Roboto" w:cs="Roboto"/>
                 <w:sz w:val="20"/>
               </w:rPr>
-              <w:t>ch. 8, p. 31; ch. 9, p. 45</w:t>
+              <w:t>ch. 8, p. 29</w:t>
             </w:r>
           </w:p>
         </w:tc>
@@ -24800,7 +24800,7 @@
                 <w:rFonts w:ascii="Roboto" w:hAnsi="Roboto" w:eastAsia="Roboto" w:cs="Roboto"/>
                 <w:sz w:val="20"/>
               </w:rPr>
-              <w:t>Revelation 14:13</w:t>
+              <w:t>Revelation 16:7</w:t>
             </w:r>
           </w:p>
         </w:tc>
@@ -24817,7 +24817,7 @@
                 <w:rFonts w:ascii="Roboto" w:hAnsi="Roboto" w:eastAsia="Roboto" w:cs="Roboto"/>
                 <w:sz w:val="20"/>
               </w:rPr>
-              <w:t>ch. 8, p. 29</w:t>
+              <w:t>ch. 9, p. 46</w:t>
             </w:r>
           </w:p>
         </w:tc>
@@ -24829,13 +24829,6 @@
             <w:pPr>
               <w:spacing w:after="0" w:before="0" w:line="259" w:lineRule="auto"/>
             </w:pPr>
-            <w:r>
-              <w:rPr>
-                <w:rFonts w:ascii="Roboto" w:hAnsi="Roboto" w:eastAsia="Roboto" w:cs="Roboto"/>
-                <w:sz w:val="20"/>
-              </w:rPr>
-              <w:t>In full, Appendix B</w:t>
-            </w:r>
           </w:p>
         </w:tc>
       </w:tr>
@@ -24856,7 +24849,7 @@
                 <w:rFonts w:ascii="Roboto" w:hAnsi="Roboto" w:eastAsia="Roboto" w:cs="Roboto"/>
                 <w:sz w:val="20"/>
               </w:rPr>
-              <w:t>Revelation 16:7</w:t>
+              <w:t>Revelation 16:10, 11</w:t>
             </w:r>
           </w:p>
         </w:tc>
@@ -24873,7 +24866,7 @@
                 <w:rFonts w:ascii="Roboto" w:hAnsi="Roboto" w:eastAsia="Roboto" w:cs="Roboto"/>
                 <w:sz w:val="20"/>
               </w:rPr>
-              <w:t>ch. 9, p. 46</w:t>
+              <w:t>ch. 8, pp. 29, 31</w:t>
             </w:r>
           </w:p>
         </w:tc>
@@ -24905,7 +24898,7 @@
                 <w:rFonts w:ascii="Roboto" w:hAnsi="Roboto" w:eastAsia="Roboto" w:cs="Roboto"/>
                 <w:sz w:val="20"/>
               </w:rPr>
-              <w:t>Revelation 16:10, 11</w:t>
+              <w:t>Revelation 19:2</w:t>
             </w:r>
           </w:p>
         </w:tc>
@@ -24922,7 +24915,7 @@
                 <w:rFonts w:ascii="Roboto" w:hAnsi="Roboto" w:eastAsia="Roboto" w:cs="Roboto"/>
                 <w:sz w:val="20"/>
               </w:rPr>
-              <w:t>ch. 8, pp. 29, 31</w:t>
+              <w:t>ch. 9, p. 46</w:t>
             </w:r>
           </w:p>
         </w:tc>
@@ -24954,7 +24947,7 @@
                 <w:rFonts w:ascii="Roboto" w:hAnsi="Roboto" w:eastAsia="Roboto" w:cs="Roboto"/>
                 <w:sz w:val="20"/>
               </w:rPr>
-              <w:t>Revelation 19:2</w:t>
+              <w:t>Revelation 19:3</w:t>
             </w:r>
           </w:p>
         </w:tc>
@@ -24971,7 +24964,7 @@
                 <w:rFonts w:ascii="Roboto" w:hAnsi="Roboto" w:eastAsia="Roboto" w:cs="Roboto"/>
                 <w:sz w:val="20"/>
               </w:rPr>
-              <w:t>ch. 9, p. 46</w:t>
+              <w:t>ch. 8, p. 29; ch. 9, pp. 45, 48</w:t>
             </w:r>
           </w:p>
         </w:tc>
@@ -25003,7 +24996,7 @@
                 <w:rFonts w:ascii="Roboto" w:hAnsi="Roboto" w:eastAsia="Roboto" w:cs="Roboto"/>
                 <w:sz w:val="20"/>
               </w:rPr>
-              <w:t>Revelation 19:3</w:t>
+              <w:t>Revelation 19:20</w:t>
             </w:r>
           </w:p>
         </w:tc>
@@ -25020,7 +25013,7 @@
                 <w:rFonts w:ascii="Roboto" w:hAnsi="Roboto" w:eastAsia="Roboto" w:cs="Roboto"/>
                 <w:sz w:val="20"/>
               </w:rPr>
-              <w:t>ch. 8, p. 29; ch. 9, pp. 45, 48</w:t>
+              <w:t>ch. 8, pp. 31, 32, 33, 34</w:t>
             </w:r>
           </w:p>
         </w:tc>
@@ -25032,6 +25025,13 @@
             <w:pPr>
               <w:spacing w:after="0" w:before="0" w:line="259" w:lineRule="auto"/>
             </w:pPr>
+            <w:r>
+              <w:rPr>
+                <w:rFonts w:ascii="Roboto" w:hAnsi="Roboto" w:eastAsia="Roboto" w:cs="Roboto"/>
+                <w:sz w:val="20"/>
+              </w:rPr>
+              <w:t>In full, Appendix B</w:t>
+            </w:r>
           </w:p>
         </w:tc>
       </w:tr>
@@ -25052,7 +25052,7 @@
                 <w:rFonts w:ascii="Roboto" w:hAnsi="Roboto" w:eastAsia="Roboto" w:cs="Roboto"/>
                 <w:sz w:val="20"/>
               </w:rPr>
-              <w:t>Revelation 19:20</w:t>
+              <w:t>Revelation 19:21</w:t>
             </w:r>
           </w:p>
         </w:tc>
@@ -25069,7 +25069,7 @@
                 <w:rFonts w:ascii="Roboto" w:hAnsi="Roboto" w:eastAsia="Roboto" w:cs="Roboto"/>
                 <w:sz w:val="20"/>
               </w:rPr>
-              <w:t>ch. 8, pp. 31, 32, 33, 34</w:t>
+              <w:t>ch. 8, p. 31</w:t>
             </w:r>
           </w:p>
         </w:tc>
@@ -25108,7 +25108,7 @@
                 <w:rFonts w:ascii="Roboto" w:hAnsi="Roboto" w:eastAsia="Roboto" w:cs="Roboto"/>
                 <w:sz w:val="20"/>
               </w:rPr>
-              <w:t>Revelation 19:21</w:t>
+              <w:t>Revelation 20:1–3</w:t>
             </w:r>
           </w:p>
         </w:tc>
@@ -25164,7 +25164,7 @@
                 <w:rFonts w:ascii="Roboto" w:hAnsi="Roboto" w:eastAsia="Roboto" w:cs="Roboto"/>
                 <w:sz w:val="20"/>
               </w:rPr>
-              <w:t>Revelation 20:1–3</w:t>
+              <w:t>Revelation 20:6</w:t>
             </w:r>
           </w:p>
         </w:tc>
@@ -25181,7 +25181,7 @@
                 <w:rFonts w:ascii="Roboto" w:hAnsi="Roboto" w:eastAsia="Roboto" w:cs="Roboto"/>
                 <w:sz w:val="20"/>
               </w:rPr>
-              <w:t>ch. 8, p. 31</w:t>
+              <w:t>ch. 8, pp. 32, 37, 40, 42</w:t>
             </w:r>
           </w:p>
         </w:tc>
@@ -25220,7 +25220,7 @@
                 <w:rFonts w:ascii="Roboto" w:hAnsi="Roboto" w:eastAsia="Roboto" w:cs="Roboto"/>
                 <w:sz w:val="20"/>
               </w:rPr>
-              <w:t>Revelation 20:6</w:t>
+              <w:t>Revelation 20:7–9</w:t>
             </w:r>
           </w:p>
         </w:tc>
@@ -25237,7 +25237,7 @@
                 <w:rFonts w:ascii="Roboto" w:hAnsi="Roboto" w:eastAsia="Roboto" w:cs="Roboto"/>
                 <w:sz w:val="20"/>
               </w:rPr>
-              <w:t>ch. 8, pp. 32, 36, 40, 42</w:t>
+              <w:t>ch. 8, p. 31</w:t>
             </w:r>
           </w:p>
         </w:tc>
@@ -25276,7 +25276,7 @@
                 <w:rFonts w:ascii="Roboto" w:hAnsi="Roboto" w:eastAsia="Roboto" w:cs="Roboto"/>
                 <w:sz w:val="20"/>
               </w:rPr>
-              <w:t>Revelation 20:7–9</w:t>
+              <w:t>Revelation 20:8, 9</w:t>
             </w:r>
           </w:p>
         </w:tc>
@@ -25293,7 +25293,7 @@
                 <w:rFonts w:ascii="Roboto" w:hAnsi="Roboto" w:eastAsia="Roboto" w:cs="Roboto"/>
                 <w:sz w:val="20"/>
               </w:rPr>
-              <w:t>ch. 8, p. 31</w:t>
+              <w:t>ch. 8, p. 41</w:t>
             </w:r>
           </w:p>
         </w:tc>
@@ -25332,7 +25332,7 @@
                 <w:rFonts w:ascii="Roboto" w:hAnsi="Roboto" w:eastAsia="Roboto" w:cs="Roboto"/>
                 <w:sz w:val="20"/>
               </w:rPr>
-              <w:t>Revelation 20:8, 9</w:t>
+              <w:t>Revelation 20:9</w:t>
             </w:r>
           </w:p>
         </w:tc>
@@ -25349,7 +25349,7 @@
                 <w:rFonts w:ascii="Roboto" w:hAnsi="Roboto" w:eastAsia="Roboto" w:cs="Roboto"/>
                 <w:sz w:val="20"/>
               </w:rPr>
-              <w:t>ch. 8, p. 40</w:t>
+              <w:t>ch. 9, p. 47</w:t>
             </w:r>
           </w:p>
         </w:tc>
@@ -25388,7 +25388,7 @@
                 <w:rFonts w:ascii="Roboto" w:hAnsi="Roboto" w:eastAsia="Roboto" w:cs="Roboto"/>
                 <w:sz w:val="20"/>
               </w:rPr>
-              <w:t>Revelation 20:9</w:t>
+              <w:t>Revelation 20:10</w:t>
             </w:r>
           </w:p>
         </w:tc>
@@ -25405,7 +25405,7 @@
                 <w:rFonts w:ascii="Roboto" w:hAnsi="Roboto" w:eastAsia="Roboto" w:cs="Roboto"/>
                 <w:sz w:val="20"/>
               </w:rPr>
-              <w:t>ch. 9, p. 47</w:t>
+              <w:t>ch. 2, p. 5; ch. 6, p. 21; ch. 8, pp. 29, 30, 31, 32, 33, 34, 35, 36, 37, 42; ch. 9, pp. 44, 45</w:t>
             </w:r>
           </w:p>
         </w:tc>
@@ -25444,7 +25444,7 @@
                 <w:rFonts w:ascii="Roboto" w:hAnsi="Roboto" w:eastAsia="Roboto" w:cs="Roboto"/>
                 <w:sz w:val="20"/>
               </w:rPr>
-              <w:t>Revelation 20:10</w:t>
+              <w:t>Revelation 20:10, 14</w:t>
             </w:r>
           </w:p>
         </w:tc>
@@ -25461,7 +25461,7 @@
                 <w:rFonts w:ascii="Roboto" w:hAnsi="Roboto" w:eastAsia="Roboto" w:cs="Roboto"/>
                 <w:sz w:val="20"/>
               </w:rPr>
-              <w:t>ch. 2, p. 5; ch. 6, p. 21; ch. 8, pp. 29, 30, 31, 32, 33, 34, 35, 36, 37, 42; ch. 9, pp. 44, 45</w:t>
+              <w:t>ch. 8, p. 34</w:t>
             </w:r>
           </w:p>
         </w:tc>
@@ -25500,7 +25500,7 @@
                 <w:rFonts w:ascii="Roboto" w:hAnsi="Roboto" w:eastAsia="Roboto" w:cs="Roboto"/>
                 <w:sz w:val="20"/>
               </w:rPr>
-              <w:t>Revelation 20:10, 14</w:t>
+              <w:t>Revelation 20:11</w:t>
             </w:r>
           </w:p>
         </w:tc>
@@ -25517,7 +25517,7 @@
                 <w:rFonts w:ascii="Roboto" w:hAnsi="Roboto" w:eastAsia="Roboto" w:cs="Roboto"/>
                 <w:sz w:val="20"/>
               </w:rPr>
-              <w:t>ch. 8, p. 34</w:t>
+              <w:t>ch. 5, p. 17; ch. 8, p. 38</w:t>
             </w:r>
           </w:p>
         </w:tc>
@@ -25556,7 +25556,7 @@
                 <w:rFonts w:ascii="Roboto" w:hAnsi="Roboto" w:eastAsia="Roboto" w:cs="Roboto"/>
                 <w:sz w:val="20"/>
               </w:rPr>
-              <w:t>Revelation 20:11</w:t>
+              <w:t>Revelation 20:11–15</w:t>
             </w:r>
           </w:p>
         </w:tc>
@@ -25573,7 +25573,7 @@
                 <w:rFonts w:ascii="Roboto" w:hAnsi="Roboto" w:eastAsia="Roboto" w:cs="Roboto"/>
                 <w:sz w:val="20"/>
               </w:rPr>
-              <w:t>ch. 5, p. 17; ch. 8, p. 38</w:t>
+              <w:t>ch. 2, p. 5; ch. 8, p. 38</w:t>
             </w:r>
           </w:p>
         </w:tc>
@@ -25612,7 +25612,7 @@
                 <w:rFonts w:ascii="Roboto" w:hAnsi="Roboto" w:eastAsia="Roboto" w:cs="Roboto"/>
                 <w:sz w:val="20"/>
               </w:rPr>
-              <w:t>Revelation 20:11–15</w:t>
+              <w:t>Revelation 20:12</w:t>
             </w:r>
           </w:p>
         </w:tc>
@@ -25629,7 +25629,7 @@
                 <w:rFonts w:ascii="Roboto" w:hAnsi="Roboto" w:eastAsia="Roboto" w:cs="Roboto"/>
                 <w:sz w:val="20"/>
               </w:rPr>
-              <w:t>ch. 2, p. 5; ch. 8, p. 38</w:t>
+              <w:t>ch. 8, pp. 33, 38, 39, 40</w:t>
             </w:r>
           </w:p>
         </w:tc>
@@ -25668,7 +25668,7 @@
                 <w:rFonts w:ascii="Roboto" w:hAnsi="Roboto" w:eastAsia="Roboto" w:cs="Roboto"/>
                 <w:sz w:val="20"/>
               </w:rPr>
-              <w:t>Revelation 20:12</w:t>
+              <w:t>Revelation 20:12, 13</w:t>
             </w:r>
           </w:p>
         </w:tc>
@@ -25685,7 +25685,7 @@
                 <w:rFonts w:ascii="Roboto" w:hAnsi="Roboto" w:eastAsia="Roboto" w:cs="Roboto"/>
                 <w:sz w:val="20"/>
               </w:rPr>
-              <w:t>ch. 8, pp. 33, 38, 39, 40</w:t>
+              <w:t>ch. 8, p. 34</w:t>
             </w:r>
           </w:p>
         </w:tc>
@@ -25724,7 +25724,7 @@
                 <w:rFonts w:ascii="Roboto" w:hAnsi="Roboto" w:eastAsia="Roboto" w:cs="Roboto"/>
                 <w:sz w:val="20"/>
               </w:rPr>
-              <w:t>Revelation 20:12, 13</w:t>
+              <w:t>Revelation 20:12–14</w:t>
             </w:r>
           </w:p>
         </w:tc>
@@ -25780,7 +25780,7 @@
                 <w:rFonts w:ascii="Roboto" w:hAnsi="Roboto" w:eastAsia="Roboto" w:cs="Roboto"/>
                 <w:sz w:val="20"/>
               </w:rPr>
-              <w:t>Revelation 20:12–14</w:t>
+              <w:t>Revelation 20:13</w:t>
             </w:r>
           </w:p>
         </w:tc>
@@ -25797,7 +25797,7 @@
                 <w:rFonts w:ascii="Roboto" w:hAnsi="Roboto" w:eastAsia="Roboto" w:cs="Roboto"/>
                 <w:sz w:val="20"/>
               </w:rPr>
-              <w:t>ch. 8, p. 34</w:t>
+              <w:t>ch. 8, pp. 33, 38</w:t>
             </w:r>
           </w:p>
         </w:tc>
@@ -25836,7 +25836,7 @@
                 <w:rFonts w:ascii="Roboto" w:hAnsi="Roboto" w:eastAsia="Roboto" w:cs="Roboto"/>
                 <w:sz w:val="20"/>
               </w:rPr>
-              <w:t>Revelation 20:13</w:t>
+              <w:t>Revelation 20:14</w:t>
             </w:r>
           </w:p>
         </w:tc>
@@ -25853,7 +25853,7 @@
                 <w:rFonts w:ascii="Roboto" w:hAnsi="Roboto" w:eastAsia="Roboto" w:cs="Roboto"/>
                 <w:sz w:val="20"/>
               </w:rPr>
-              <w:t>ch. 8, pp. 33, 38</w:t>
+              <w:t>ch. 2, p. 5; ch. 8, pp. 32, 33, 34, 40</w:t>
             </w:r>
           </w:p>
         </w:tc>
@@ -25892,7 +25892,7 @@
                 <w:rFonts w:ascii="Roboto" w:hAnsi="Roboto" w:eastAsia="Roboto" w:cs="Roboto"/>
                 <w:sz w:val="20"/>
               </w:rPr>
-              <w:t>Revelation 20:14</w:t>
+              <w:t>Revelation 20:14, 15</w:t>
             </w:r>
           </w:p>
         </w:tc>
@@ -25909,7 +25909,7 @@
                 <w:rFonts w:ascii="Roboto" w:hAnsi="Roboto" w:eastAsia="Roboto" w:cs="Roboto"/>
                 <w:sz w:val="20"/>
               </w:rPr>
-              <w:t>ch. 2, p. 5; ch. 8, pp. 32, 33, 34, 40</w:t>
+              <w:t>ch. 8, p. 38</w:t>
             </w:r>
           </w:p>
         </w:tc>
@@ -25948,7 +25948,7 @@
                 <w:rFonts w:ascii="Roboto" w:hAnsi="Roboto" w:eastAsia="Roboto" w:cs="Roboto"/>
                 <w:sz w:val="20"/>
               </w:rPr>
-              <w:t>Revelation 20:14, 15</w:t>
+              <w:t>Revelation 20:15</w:t>
             </w:r>
           </w:p>
         </w:tc>
@@ -25965,7 +25965,7 @@
                 <w:rFonts w:ascii="Roboto" w:hAnsi="Roboto" w:eastAsia="Roboto" w:cs="Roboto"/>
                 <w:sz w:val="20"/>
               </w:rPr>
-              <w:t>ch. 8, p. 38</w:t>
+              <w:t>ch. 8, pp. 32, 35, 36, 37, 40; ch. 9, p. 45</w:t>
             </w:r>
           </w:p>
         </w:tc>
@@ -26004,7 +26004,7 @@
                 <w:rFonts w:ascii="Roboto" w:hAnsi="Roboto" w:eastAsia="Roboto" w:cs="Roboto"/>
                 <w:sz w:val="20"/>
               </w:rPr>
-              <w:t>Revelation 20:15</w:t>
+              <w:t>Revelation 21:4</w:t>
             </w:r>
           </w:p>
         </w:tc>
@@ -26021,7 +26021,7 @@
                 <w:rFonts w:ascii="Roboto" w:hAnsi="Roboto" w:eastAsia="Roboto" w:cs="Roboto"/>
                 <w:sz w:val="20"/>
               </w:rPr>
-              <w:t>ch. 8, pp. 32, 35, 36, 37, 40; ch. 9, p. 45</w:t>
+              <w:t>ch. 8, p. 33</w:t>
             </w:r>
           </w:p>
         </w:tc>
@@ -26060,7 +26060,7 @@
                 <w:rFonts w:ascii="Roboto" w:hAnsi="Roboto" w:eastAsia="Roboto" w:cs="Roboto"/>
                 <w:sz w:val="20"/>
               </w:rPr>
-              <w:t>Revelation 21:4</w:t>
+              <w:t>Revelation 21:8</w:t>
             </w:r>
           </w:p>
         </w:tc>
@@ -26077,7 +26077,7 @@
                 <w:rFonts w:ascii="Roboto" w:hAnsi="Roboto" w:eastAsia="Roboto" w:cs="Roboto"/>
                 <w:sz w:val="20"/>
               </w:rPr>
-              <w:t>ch. 8, p. 33</w:t>
+              <w:t>ch. 2, p. 5; ch. 8, pp. 32, 33, 34, 35</w:t>
             </w:r>
           </w:p>
         </w:tc>
@@ -26116,7 +26116,7 @@
                 <w:rFonts w:ascii="Roboto" w:hAnsi="Roboto" w:eastAsia="Roboto" w:cs="Roboto"/>
                 <w:sz w:val="20"/>
               </w:rPr>
-              <w:t>Revelation 21:8</w:t>
+              <w:t>Revelation 21:24</w:t>
             </w:r>
           </w:p>
         </w:tc>
@@ -26133,7 +26133,7 @@
                 <w:rFonts w:ascii="Roboto" w:hAnsi="Roboto" w:eastAsia="Roboto" w:cs="Roboto"/>
                 <w:sz w:val="20"/>
               </w:rPr>
-              <w:t>ch. 2, p. 5; ch. 8, pp. 32, 33, 34, 35</w:t>
+              <w:t>ch. 8, p. 41</w:t>
             </w:r>
           </w:p>
         </w:tc>
@@ -26145,13 +26145,6 @@
             <w:pPr>
               <w:spacing w:after="0" w:before="0" w:line="259" w:lineRule="auto"/>
             </w:pPr>
-            <w:r>
-              <w:rPr>
-                <w:rFonts w:ascii="Roboto" w:hAnsi="Roboto" w:eastAsia="Roboto" w:cs="Roboto"/>
-                <w:sz w:val="20"/>
-              </w:rPr>
-              <w:t>In full, Appendix B</w:t>
-            </w:r>
           </w:p>
         </w:tc>
       </w:tr>
@@ -26172,7 +26165,7 @@
                 <w:rFonts w:ascii="Roboto" w:hAnsi="Roboto" w:eastAsia="Roboto" w:cs="Roboto"/>
                 <w:sz w:val="20"/>
               </w:rPr>
-              <w:t>Revelation 21:24</w:t>
+              <w:t>Revelation 21:27</w:t>
             </w:r>
           </w:p>
         </w:tc>
@@ -26189,56 +26182,7 @@
                 <w:rFonts w:ascii="Roboto" w:hAnsi="Roboto" w:eastAsia="Roboto" w:cs="Roboto"/>
                 <w:sz w:val="20"/>
               </w:rPr>
-              <w:t>ch. 8, p. 41</w:t>
-            </w:r>
-          </w:p>
-        </w:tc>
-        <w:tc>
-          <w:tcPr>
-            <w:tcW w:w="1903" w:type="dxa"/>
-          </w:tcPr>
-          <w:p>
-            <w:pPr>
-              <w:spacing w:after="0" w:before="0" w:line="259" w:lineRule="auto"/>
-            </w:pPr>
-          </w:p>
-        </w:tc>
-      </w:tr>
-      <w:tr>
-        <w:trPr>
-          <w:cantSplit/>
-        </w:trPr>
-        <w:tc>
-          <w:tcPr>
-            <w:tcW w:w="1904" w:type="dxa"/>
-          </w:tcPr>
-          <w:p>
-            <w:pPr>
-              <w:spacing w:after="0" w:before="0" w:line="259" w:lineRule="auto"/>
-            </w:pPr>
-            <w:r>
-              <w:rPr>
-                <w:rFonts w:ascii="Roboto" w:hAnsi="Roboto" w:eastAsia="Roboto" w:cs="Roboto"/>
-                <w:sz w:val="20"/>
-              </w:rPr>
-              <w:t>Revelation 21:27</w:t>
-            </w:r>
-          </w:p>
-        </w:tc>
-        <w:tc>
-          <w:tcPr>
-            <w:tcW w:w="3808" w:type="dxa"/>
-          </w:tcPr>
-          <w:p>
-            <w:pPr>
-              <w:spacing w:after="0" w:before="0" w:line="259" w:lineRule="auto"/>
-            </w:pPr>
-            <w:r>
-              <w:rPr>
-                <w:rFonts w:ascii="Roboto" w:hAnsi="Roboto" w:eastAsia="Roboto" w:cs="Roboto"/>
-                <w:sz w:val="20"/>
-              </w:rPr>
-              <w:t>ch. 8, pp. 33, 36, 40</w:t>
+              <w:t>ch. 8, pp. 33, 37, 40</w:t>
             </w:r>
           </w:p>
         </w:tc>

</xml_diff>